<commit_message>
Molecules: build MDPI Word pair; publish complete Zenodo package; fix inline-math
- Add reproducible MDPI docx build: build_molecules_docx.py (.dot->.docx +
  html2doc transplant) and _mdpi_frontmatter.py (real title/authors/abstract/
  keywords into MDPI_1.x styles; drops template placeholders + editorial note).
- Add molecules_paper.docx / molecules_paper_SI.docx built on the official
  molecules-template.dot (native OMML equations, embedded figures/tables).
- Add Molecules cover letter (cover_letter.html).
- Fix 12 inline-math spans in long_paper.html where raw </>/escaped entities
  inside \(...\) broke KaTeX; rebuild long_paper.docx + long_paper_SI.docx.
- Point Data Availability at the concept DOI 10.5281/zenodo.19821952 (resolves
  to the complete code+data+models package) instead of the models-only first
  version; regenerate molecules HTML/docx accordingly.

Co-Authored-By: Claude Opus 4.8 <noreply@anthropic.com>
</commit_message>
<xml_diff>
--- a/paper/long_paper.docx
+++ b/paper/long_paper.docx
@@ -319,7 +319,7 @@
           <w:rPr>
             <w:rStyle w:val="VerbatimChar"/>
           </w:rPr>
-          <w:t xml:space="preserve">10.5281/zenodo.19821953</w:t>
+          <w:t xml:space="preserve">10.5281/zenodo.19821952</w:t>
         </w:r>
       </w:hyperlink>
       <w:r>
@@ -13707,6 +13707,17 @@
           <m:t>1.5</m:t>
         </m:r>
       </m:oMath>
+      <m:oMath>
+        <m:r>
+          <m:rPr>
+            <m:sty m:val="p"/>
+          </m:rPr>
+          <m:t>&lt;</m:t>
+        </m:r>
+        <m:r>
+          <m:t>1.5</m:t>
+        </m:r>
+      </m:oMath>
       <w:r>
         <w:rPr>
           <w:b/>
@@ -13726,7 +13737,7 @@
           <w:b w:val="0"/>
           <w:i/>
         </w:rPr>
-        <w:t>Twelve chem-pass DGLD leads (L1–L5, L9, L11, L13, L16, L18, L19, L20). Each card shows the RDKit 2D depiction, chemotype label, molecular formula, and 6-anchor-calibrated DFT/Kamlet–Jacobs (, , ) values. The dark circle (top-left) shows the Pareto rank within the merged top-100; “?” indicates a lead (L20) added from the pool=80k extension set and not assigned a top-100 rank. Top-5 leads (L1–L5) additionally show composite score  and drop-weight impact sensitivity . Border colour: green = xTB HOMO–LUMO gap  eV (electronic-stability pass); red = gap \(&lt; 1.5\) eV (electronic-stability fail).</w:t>
+        <w:t>Twelve chem-pass DGLD leads (L1–L5, L9, L11, L13, L16, L18, L19, L20). Each card shows the RDKit 2D depiction, chemotype label, molecular formula, and 6-anchor-calibrated DFT/Kamlet–Jacobs (, , ) values. The dark circle (top-left) shows the Pareto rank within the merged top-100; “?” indicates a lead (L20) added from the pool=80k extension set and not assigned a top-100 rank. Top-5 leads (L1–L5) additionally show composite score  and drop-weight impact sensitivity . Border colour: green = xTB HOMO–LUMO gap  eV (electronic-stability pass); red = gap  eV (electronic-stability fail).</w:t>
       </w:r>
     </w:p>
     <w:bookmarkEnd w:id="104"/>
@@ -32581,7 +32592,42 @@
         </m:r>
       </m:oMath>
       <w:r>
-        <w:t xml:space="preserve">, \(p&lt;10^{-26}\)) is itself a regime-aware reproduction of the same effect on 575 Tier-A experimental rows. Definitive absolute-</w:t>
+        <w:t xml:space="preserve">,</w:t>
+      </w:r>
+      <w:r>
+        <w:t xml:space="preserve"> </w:t>
+      </w:r>
+      <m:oMath>
+        <m:r>
+          <m:t>p</m:t>
+        </m:r>
+        <m:r>
+          <m:rPr>
+            <m:sty m:val="p"/>
+          </m:rPr>
+          <m:t>&lt;</m:t>
+        </m:r>
+        <m:sSup>
+          <m:e>
+            <m:r>
+              <m:t>10</m:t>
+            </m:r>
+          </m:e>
+          <m:sup>
+            <m:r>
+              <m:rPr>
+                <m:sty m:val="p"/>
+              </m:rPr>
+              <m:t>−</m:t>
+            </m:r>
+            <m:r>
+              <m:t>26</m:t>
+            </m:r>
+          </m:sup>
+        </m:sSup>
+      </m:oMath>
+      <w:r>
+        <w:t xml:space="preserve">) is itself a regime-aware reproduction of the same effect on 575 Tier-A experimental rows. Definitive absolute-</w:t>
       </w:r>
       <m:oMath>
         <m:r>
@@ -32821,7 +32867,7 @@
       </w:r>
     </w:p>
     <w:bookmarkEnd w:id="137"/>
-    <w:bookmarkStart w:id="140" w:name="sec-conc"/>
+    <w:bookmarkStart w:id="139" w:name="sec-conc"/>
     <w:p>
       <w:pPr>
         <w:pStyle w:val="Heading2"/>
@@ -33198,7 +33244,7 @@
         <w:t xml:space="preserve">nitrolysis, and ring-cyclisation reactions would close the 1/12 USPTO-template hit rate observed here, making the synthesis-plausibility check informative across the full lead set. Third, an active-learning loop closing the diffusion-sampler / first-principles-audit cycle would continuously expand the high-tier label pool from inside the system rather than from external curation. The full pipeline (LIMO checkpoint, two conditional latent denoisers, two multi-head score models, the 4-stage validation funnel, and the 918 mined hard negatives) is released as a runnable code bundle on Zenodo (§7.1), so the next compound to enter the HMX-class band can be discovered, validated, and recommended for synthesis at the cost of a few GPU-days.</w:t>
       </w:r>
     </w:p>
-    <w:bookmarkStart w:id="139" w:name="code-and-data-availability"/>
+    <w:bookmarkStart w:id="138" w:name="code-and-data-availability"/>
     <w:p>
       <w:pPr>
         <w:pStyle w:val="Heading3"/>
@@ -33219,7 +33265,7 @@
         <w:widowControl w:val="1"/>
       </w:pPr>
       <w:r>
-        <w:t xml:space="preserve">Trained model checkpoints (LIMO VAE, two conditional latent denoisers DGLD-H and DGLD-P, two multi-head latent score models, the SELFIES alphabet, and run metadata) are deposited on Zenodo under CC-BY-4.0 with reserved DOI</w:t>
+        <w:t xml:space="preserve">The code, the trained model checkpoints (LIMO VAE, two conditional latent denoisers DGLD-H and DGLD-P, two multi-head latent score models, the SELFIES alphabet, and run metadata), the labelled, unlabelled, and motif-augmented training data, and the mined hard-negative latents are archived together as a single package on Zenodo under DOI</w:t>
       </w:r>
       <w:r>
         <w:t xml:space="preserve"> </w:t>
@@ -33229,33 +33275,19 @@
           <w:rPr>
             <w:rStyle w:val="VerbatimChar"/>
           </w:rPr>
-          <w:t xml:space="preserve">10.5281/zenodo.19821953</w:t>
+          <w:t xml:space="preserve">10.5281/zenodo.19821952</w:t>
         </w:r>
       </w:hyperlink>
       <w:r>
         <w:t xml:space="preserve"> </w:t>
       </w:r>
       <w:r>
-        <w:t xml:space="preserve">(draft:</w:t>
-      </w:r>
-      <w:r>
-        <w:t xml:space="preserve"> </w:t>
-      </w:r>
-      <w:hyperlink r:id="rId138">
-        <w:r>
-          <w:rPr>
-            <w:rStyle w:val="Hyperlink"/>
-          </w:rPr>
-          <w:t xml:space="preserve">zenodo.org/deposit/19821953</w:t>
-        </w:r>
-      </w:hyperlink>
-      <w:r>
-        <w:t xml:space="preserve">); the DOI mints on publication of the deposition. Sampling and post-processing scripts (the M1 head-to-head sweep, the Pareto-reranker chemist-filter + 3D-CNN smoke-model rerank, the multi-head score-model training loop) are released as a runnable bundle alongside the manuscript. The labelled master, the augmented unlabelled corpus, and the hard-negative latents are derived from the public sources documented in §A.1 and are redistributed in canonicalised form with row-level provenance.</w:t>
+        <w:t xml:space="preserve">(concept DOI, resolving to the latest version; code under Apache-2.0, data and checkpoints under CC-BY-4.0). Sampling and post-processing scripts (the M1 head-to-head sweep, the Pareto-reranker chemist-filter + 3D-CNN smoke-model rerank, the multi-head score-model training loop) are released as a runnable bundle alongside the manuscript. The labelled master, the augmented unlabelled corpus, and the hard-negative latents are derived from the public sources documented in §A.1 and are redistributed in canonicalised form with row-level provenance.</w:t>
       </w:r>
     </w:p>
+    <w:bookmarkEnd w:id="138"/>
     <w:bookmarkEnd w:id="139"/>
-    <w:bookmarkEnd w:id="140"/>
-    <w:bookmarkStart w:id="215" w:name="sec-refs"/>
+    <w:bookmarkStart w:id="214" w:name="sec-refs"/>
     <w:p>
       <w:pPr>
         <w:pStyle w:val="ReferencesHeading"/>
@@ -33285,7 +33317,7 @@
         </w:rPr>
         <w:t xml:space="preserve">1. </w:t>
       </w:r>
-      <w:bookmarkStart w:id="141" w:name="ref-eckmann2022limo"/>
+      <w:bookmarkStart w:id="140" w:name="ref-eckmann2022limo"/>
       <w:r>
         <w:t xml:space="preserve">Eckmann, P., Sun, K., Zhao, B., Feng, M., Gilson, M. K., &amp; Yu, R. (2022). LIMO: Latent Inceptionism for Targeted Molecule Generation.</w:t>
       </w:r>
@@ -33301,6 +33333,42 @@
       </w:r>
       <w:r>
         <w:t xml:space="preserve">. arXiv:2206.09010.</w:t>
+      </w:r>
+      <w:bookmarkEnd w:id="140"/>
+    </w:p>
+    <w:p>
+      <w:pPr>
+        <w:pStyle w:val="ReferenceEntry"/>
+        <w:spacing w:after="100"/>
+        <w:ind w:left="475" w:hanging="475"/>
+        <w:jc w:val="left"/>
+        <w:keepNext w:val="0"/>
+        <w:keepLines w:val="0"/>
+        <w:widowControl w:val="1"/>
+      </w:pPr>
+      <w:r>
+        <w:rPr>
+          <w:rFonts w:ascii="Times New Roman" w:hAnsi="Times New Roman"/>
+          <w:sz w:val="20"/>
+        </w:rPr>
+        <w:t xml:space="preserve">2. </w:t>
+      </w:r>
+      <w:bookmarkStart w:id="141" w:name="ref-gomez2018automatic"/>
+      <w:r>
+        <w:t xml:space="preserve">Gómez-Bombarelli, R. et al. (2018). Automatic Chemical Design Using a Data-Driven Continuous Representation of Molecules.</w:t>
+      </w:r>
+      <w:r>
+        <w:t xml:space="preserve"> </w:t>
+      </w:r>
+      <w:r>
+        <w:rPr>
+          <w:i/>
+          <w:iCs/>
+        </w:rPr>
+        <w:t xml:space="preserve">ACS Central Science 4(2)</w:t>
+      </w:r>
+      <w:r>
+        <w:t xml:space="preserve">:268–276. doi:10.1021/acscentsci.7b00572.</w:t>
       </w:r>
       <w:bookmarkEnd w:id="141"/>
     </w:p>
@@ -33319,11 +33387,11 @@
           <w:rFonts w:ascii="Times New Roman" w:hAnsi="Times New Roman"/>
           <w:sz w:val="20"/>
         </w:rPr>
-        <w:t xml:space="preserve">2. </w:t>
-      </w:r>
-      <w:bookmarkStart w:id="142" w:name="ref-gomez2018automatic"/>
-      <w:r>
-        <w:t xml:space="preserve">Gómez-Bombarelli, R. et al. (2018). Automatic Chemical Design Using a Data-Driven Continuous Representation of Molecules.</w:t>
+        <w:t xml:space="preserve">3. </w:t>
+      </w:r>
+      <w:bookmarkStart w:id="142" w:name="ref-jin2018junction"/>
+      <w:r>
+        <w:t xml:space="preserve">Jin, W., Barzilay, R., &amp; Jaakkola, T. (2018). Junction Tree Variational Autoencoder for Molecular Graph Generation.</w:t>
       </w:r>
       <w:r>
         <w:t xml:space="preserve"> </w:t>
@@ -33333,10 +33401,10 @@
           <w:i/>
           <w:iCs/>
         </w:rPr>
-        <w:t xml:space="preserve">ACS Central Science 4(2)</w:t>
-      </w:r>
-      <w:r>
-        <w:t xml:space="preserve">:268–276. doi:10.1021/acscentsci.7b00572.</w:t>
+        <w:t xml:space="preserve">ICML 2018</w:t>
+      </w:r>
+      <w:r>
+        <w:t xml:space="preserve">. arXiv:1802.04364.</w:t>
       </w:r>
       <w:bookmarkEnd w:id="142"/>
     </w:p>
@@ -33355,24 +33423,11 @@
           <w:rFonts w:ascii="Times New Roman" w:hAnsi="Times New Roman"/>
           <w:sz w:val="20"/>
         </w:rPr>
-        <w:t xml:space="preserve">3. </w:t>
-      </w:r>
-      <w:bookmarkStart w:id="143" w:name="ref-jin2018junction"/>
-      <w:r>
-        <w:t xml:space="preserve">Jin, W., Barzilay, R., &amp; Jaakkola, T. (2018). Junction Tree Variational Autoencoder for Molecular Graph Generation.</w:t>
-      </w:r>
-      <w:r>
-        <w:t xml:space="preserve"> </w:t>
-      </w:r>
-      <w:r>
-        <w:rPr>
-          <w:i/>
-          <w:iCs/>
-        </w:rPr>
-        <w:t xml:space="preserve">ICML 2018</w:t>
-      </w:r>
-      <w:r>
-        <w:t xml:space="preserve">. arXiv:1802.04364.</w:t>
+        <w:t xml:space="preserve">4. </w:t>
+      </w:r>
+      <w:bookmarkStart w:id="143" w:name="ref-reidenbach2023molmim"/>
+      <w:r>
+        <w:t xml:space="preserve">Reidenbach, D., Livne, M., Ilango, R. K., Gill, M., &amp; Israeli, J. (2023). MolMIM: A Molecular Language Model for Property-Guided Molecule Generation via Mutual Information Machines. (MLDD Workshop, ICLR 2023; arXiv:2208.09016).</w:t>
       </w:r>
       <w:bookmarkEnd w:id="143"/>
     </w:p>
@@ -33391,11 +33446,24 @@
           <w:rFonts w:ascii="Times New Roman" w:hAnsi="Times New Roman"/>
           <w:sz w:val="20"/>
         </w:rPr>
-        <w:t xml:space="preserve">4. </w:t>
-      </w:r>
-      <w:bookmarkStart w:id="144" w:name="ref-reidenbach2023molmim"/>
-      <w:r>
-        <w:t xml:space="preserve">Reidenbach, D., Livne, M., Ilango, R. K., Gill, M., &amp; Israeli, J. (2023). MolMIM: A Molecular Language Model for Property-Guided Molecule Generation via Mutual Information Machines. (MLDD Workshop, ICLR 2023; arXiv:2208.09016).</w:t>
+        <w:t xml:space="preserve">5. </w:t>
+      </w:r>
+      <w:bookmarkStart w:id="144" w:name="ref-ross2022molformer"/>
+      <w:r>
+        <w:t xml:space="preserve">Ross, J. et al. (2022). Large-Scale Chemical Language Representations Capture Molecular Structure and Properties.</w:t>
+      </w:r>
+      <w:r>
+        <w:t xml:space="preserve"> </w:t>
+      </w:r>
+      <w:r>
+        <w:rPr>
+          <w:i/>
+          <w:iCs/>
+        </w:rPr>
+        <w:t xml:space="preserve">Nature Machine Intelligence 4</w:t>
+      </w:r>
+      <w:r>
+        <w:t xml:space="preserve">:1256–1264. doi:10.1038/s42256-022-00580-7.</w:t>
       </w:r>
       <w:bookmarkEnd w:id="144"/>
     </w:p>
@@ -33414,11 +33482,11 @@
           <w:rFonts w:ascii="Times New Roman" w:hAnsi="Times New Roman"/>
           <w:sz w:val="20"/>
         </w:rPr>
-        <w:t xml:space="preserve">5. </w:t>
-      </w:r>
-      <w:bookmarkStart w:id="145" w:name="ref-ross2022molformer"/>
-      <w:r>
-        <w:t xml:space="preserve">Ross, J. et al. (2022). Large-Scale Chemical Language Representations Capture Molecular Structure and Properties.</w:t>
+        <w:t xml:space="preserve">6. </w:t>
+      </w:r>
+      <w:bookmarkStart w:id="145" w:name="ref-bengio2021gflownet"/>
+      <w:r>
+        <w:t xml:space="preserve">Bengio, E., Jain, M., Korablyov, M., Precup, D., &amp; Bengio, Y. (2021). Flow Network Based Generative Models for Non-Iterative Diverse Candidate Generation.</w:t>
       </w:r>
       <w:r>
         <w:t xml:space="preserve"> </w:t>
@@ -33428,10 +33496,10 @@
           <w:i/>
           <w:iCs/>
         </w:rPr>
-        <w:t xml:space="preserve">Nature Machine Intelligence 4</w:t>
-      </w:r>
-      <w:r>
-        <w:t xml:space="preserve">:1256–1264. doi:10.1038/s42256-022-00580-7.</w:t>
+        <w:t xml:space="preserve">NeurIPS 2021</w:t>
+      </w:r>
+      <w:r>
+        <w:t xml:space="preserve">. arXiv:2106.04399.</w:t>
       </w:r>
       <w:bookmarkEnd w:id="145"/>
     </w:p>
@@ -33450,11 +33518,11 @@
           <w:rFonts w:ascii="Times New Roman" w:hAnsi="Times New Roman"/>
           <w:sz w:val="20"/>
         </w:rPr>
-        <w:t xml:space="preserve">6. </w:t>
-      </w:r>
-      <w:bookmarkStart w:id="146" w:name="ref-bengio2021gflownet"/>
-      <w:r>
-        <w:t xml:space="preserve">Bengio, E., Jain, M., Korablyov, M., Precup, D., &amp; Bengio, Y. (2021). Flow Network Based Generative Models for Non-Iterative Diverse Candidate Generation.</w:t>
+        <w:t xml:space="preserve">7. </w:t>
+      </w:r>
+      <w:bookmarkStart w:id="146" w:name="ref-hoogeboom2022edm"/>
+      <w:r>
+        <w:t xml:space="preserve">Hoogeboom, E., Garcia Satorras, V., Vignac, C., &amp; Welling, M. (2022). Equivariant Diffusion for Molecule Generation in 3D.</w:t>
       </w:r>
       <w:r>
         <w:t xml:space="preserve"> </w:t>
@@ -33464,10 +33532,10 @@
           <w:i/>
           <w:iCs/>
         </w:rPr>
-        <w:t xml:space="preserve">NeurIPS 2021</w:t>
-      </w:r>
-      <w:r>
-        <w:t xml:space="preserve">. arXiv:2106.04399.</w:t>
+        <w:t xml:space="preserve">ICML 2022</w:t>
+      </w:r>
+      <w:r>
+        <w:t xml:space="preserve">. arXiv:2203.17003.</w:t>
       </w:r>
       <w:bookmarkEnd w:id="146"/>
     </w:p>
@@ -33486,11 +33554,11 @@
           <w:rFonts w:ascii="Times New Roman" w:hAnsi="Times New Roman"/>
           <w:sz w:val="20"/>
         </w:rPr>
-        <w:t xml:space="preserve">7. </w:t>
-      </w:r>
-      <w:bookmarkStart w:id="147" w:name="ref-hoogeboom2022edm"/>
-      <w:r>
-        <w:t xml:space="preserve">Hoogeboom, E., Garcia Satorras, V., Vignac, C., &amp; Welling, M. (2022). Equivariant Diffusion for Molecule Generation in 3D.</w:t>
+        <w:t xml:space="preserve">8. </w:t>
+      </w:r>
+      <w:bookmarkStart w:id="147" w:name="ref-vignac2023digress"/>
+      <w:r>
+        <w:t xml:space="preserve">Vignac, C. et al. (2023). DiGress: Discrete Denoising Diffusion for Graph Generation.</w:t>
       </w:r>
       <w:r>
         <w:t xml:space="preserve"> </w:t>
@@ -33500,10 +33568,10 @@
           <w:i/>
           <w:iCs/>
         </w:rPr>
-        <w:t xml:space="preserve">ICML 2022</w:t>
-      </w:r>
-      <w:r>
-        <w:t xml:space="preserve">. arXiv:2203.17003.</w:t>
+        <w:t xml:space="preserve">ICLR 2023</w:t>
+      </w:r>
+      <w:r>
+        <w:t xml:space="preserve">. arXiv:2209.14734.</w:t>
       </w:r>
       <w:bookmarkEnd w:id="147"/>
     </w:p>
@@ -33522,11 +33590,11 @@
           <w:rFonts w:ascii="Times New Roman" w:hAnsi="Times New Roman"/>
           <w:sz w:val="20"/>
         </w:rPr>
-        <w:t xml:space="preserve">8. </w:t>
-      </w:r>
-      <w:bookmarkStart w:id="148" w:name="ref-vignac2023digress"/>
-      <w:r>
-        <w:t xml:space="preserve">Vignac, C. et al. (2023). DiGress: Discrete Denoising Diffusion for Graph Generation.</w:t>
+        <w:t xml:space="preserve">9. </w:t>
+      </w:r>
+      <w:bookmarkStart w:id="148" w:name="ref-irwin2022chemformer"/>
+      <w:r>
+        <w:t xml:space="preserve">Irwin, R., Dimitriadis, S., He, J., &amp; Bjerrum, E. J. (2022). Chemformer: A Pre-Trained Transformer for Computational Chemistry.</w:t>
       </w:r>
       <w:r>
         <w:t xml:space="preserve"> </w:t>
@@ -33536,10 +33604,10 @@
           <w:i/>
           <w:iCs/>
         </w:rPr>
-        <w:t xml:space="preserve">ICLR 2023</w:t>
-      </w:r>
-      <w:r>
-        <w:t xml:space="preserve">. arXiv:2209.14734.</w:t>
+        <w:t xml:space="preserve">Mach. Learn.: Sci. Tech. 3</w:t>
+      </w:r>
+      <w:r>
+        <w:t xml:space="preserve">:015022. doi:10.1088/2632-2153/ac3ffb.</w:t>
       </w:r>
       <w:bookmarkEnd w:id="148"/>
     </w:p>
@@ -33558,11 +33626,11 @@
           <w:rFonts w:ascii="Times New Roman" w:hAnsi="Times New Roman"/>
           <w:sz w:val="20"/>
         </w:rPr>
-        <w:t xml:space="preserve">9. </w:t>
-      </w:r>
-      <w:bookmarkStart w:id="149" w:name="ref-irwin2022chemformer"/>
-      <w:r>
-        <w:t xml:space="preserve">Irwin, R., Dimitriadis, S., He, J., &amp; Bjerrum, E. J. (2022). Chemformer: A Pre-Trained Transformer for Computational Chemistry.</w:t>
+        <w:t xml:space="preserve">10. </w:t>
+      </w:r>
+      <w:bookmarkStart w:id="149" w:name="ref-peng2023moldiff"/>
+      <w:r>
+        <w:t xml:space="preserve">Peng, X., Guan, J., Liu, Q., &amp; Ma, J. (2023). MolDiff: Addressing the Atom-Bond Inconsistency Problem in 3D Molecule Diffusion Generation.</w:t>
       </w:r>
       <w:r>
         <w:t xml:space="preserve"> </w:t>
@@ -33572,10 +33640,10 @@
           <w:i/>
           <w:iCs/>
         </w:rPr>
-        <w:t xml:space="preserve">Mach. Learn.: Sci. Tech. 3</w:t>
-      </w:r>
-      <w:r>
-        <w:t xml:space="preserve">:015022. doi:10.1088/2632-2153/ac3ffb.</w:t>
+        <w:t xml:space="preserve">ICML 2023</w:t>
+      </w:r>
+      <w:r>
+        <w:t xml:space="preserve">. arXiv:2305.07508.</w:t>
       </w:r>
       <w:bookmarkEnd w:id="149"/>
     </w:p>
@@ -33594,11 +33662,11 @@
           <w:rFonts w:ascii="Times New Roman" w:hAnsi="Times New Roman"/>
           <w:sz w:val="20"/>
         </w:rPr>
-        <w:t xml:space="preserve">10. </w:t>
-      </w:r>
-      <w:bookmarkStart w:id="150" w:name="ref-peng2023moldiff"/>
-      <w:r>
-        <w:t xml:space="preserve">Peng, X., Guan, J., Liu, Q., &amp; Ma, J. (2023). MolDiff: Addressing the Atom-Bond Inconsistency Problem in 3D Molecule Diffusion Generation.</w:t>
+        <w:t xml:space="preserve">11. </w:t>
+      </w:r>
+      <w:bookmarkStart w:id="150" w:name="ref-mathieu2017sensitivity"/>
+      <w:r>
+        <w:t xml:space="preserve">Mathieu, D. (2017). Sensitivity of Energetic Materials: Theoretical Relationships to Detonation Performance and Molecular Structure.</w:t>
       </w:r>
       <w:r>
         <w:t xml:space="preserve"> </w:t>
@@ -33608,10 +33676,10 @@
           <w:i/>
           <w:iCs/>
         </w:rPr>
-        <w:t xml:space="preserve">ICML 2023</w:t>
-      </w:r>
-      <w:r>
-        <w:t xml:space="preserve">. arXiv:2305.07508.</w:t>
+        <w:t xml:space="preserve">Ind. Eng. Chem. Res. 56(31)</w:t>
+      </w:r>
+      <w:r>
+        <w:t xml:space="preserve">:8191–8201. doi:10.1021/acs.iecr.7b02021.</w:t>
       </w:r>
       <w:bookmarkEnd w:id="150"/>
     </w:p>
@@ -33630,26 +33698,27 @@
           <w:rFonts w:ascii="Times New Roman" w:hAnsi="Times New Roman"/>
           <w:sz w:val="20"/>
         </w:rPr>
-        <w:t xml:space="preserve">11. </w:t>
-      </w:r>
-      <w:bookmarkStart w:id="151" w:name="ref-mathieu2017sensitivity"/>
-      <w:r>
-        <w:t xml:space="preserve">Mathieu, D. (2017). Sensitivity of Energetic Materials: Theoretical Relationships to Detonation Performance and Molecular Structure.</w:t>
-      </w:r>
-      <w:r>
-        <w:t xml:space="preserve"> </w:t>
-      </w:r>
-      <w:r>
-        <w:rPr>
-          <w:i/>
-          <w:iCs/>
-        </w:rPr>
-        <w:t xml:space="preserve">Ind. Eng. Chem. Res. 56(31)</w:t>
-      </w:r>
-      <w:r>
-        <w:t xml:space="preserve">:8191–8201. doi:10.1021/acs.iecr.7b02021.</w:t>
-      </w:r>
-      <w:bookmarkEnd w:id="151"/>
+        <w:t xml:space="preserve">12. </w:t>
+      </w:r>
+      <w:bookmarkStart w:id="152" w:name="ref-daylight-smarts"/>
+      <w:r>
+        <w:t xml:space="preserve">Daylight Chemical Information Systems. (2007). SMARTS: A Language for Describing Molecular Patterns. Daylight Theory Manual, Aliso Viejo, CA.</w:t>
+      </w:r>
+      <w:r>
+        <w:t xml:space="preserve"> </w:t>
+      </w:r>
+      <w:hyperlink r:id="rId151">
+        <w:r>
+          <w:rPr>
+            <w:rStyle w:val="Hyperlink"/>
+          </w:rPr>
+          <w:t xml:space="preserve">daylight.com/dayhtml/doc/theory/theory.smarts.html</w:t>
+        </w:r>
+      </w:hyperlink>
+      <w:r>
+        <w:t xml:space="preserve">. SMARTS = SMILES Arbitrary Target Specification: a pattern language extending SMILES that matches molecular substructures, used by RDKit and other cheminformatics toolkits to evaluate hard-reject catalogs (this work, §4.7).</w:t>
+      </w:r>
+      <w:bookmarkEnd w:id="152"/>
     </w:p>
     <w:p>
       <w:pPr>
@@ -33666,25 +33735,24 @@
           <w:rFonts w:ascii="Times New Roman" w:hAnsi="Times New Roman"/>
           <w:sz w:val="20"/>
         </w:rPr>
-        <w:t xml:space="preserve">12. </w:t>
-      </w:r>
-      <w:bookmarkStart w:id="153" w:name="ref-daylight-smarts"/>
-      <w:r>
-        <w:t xml:space="preserve">Daylight Chemical Information Systems. (2007). SMARTS: A Language for Describing Molecular Patterns. Daylight Theory Manual, Aliso Viejo, CA.</w:t>
-      </w:r>
-      <w:r>
-        <w:t xml:space="preserve"> </w:t>
-      </w:r>
-      <w:hyperlink r:id="rId152">
-        <w:r>
-          <w:rPr>
-            <w:rStyle w:val="Hyperlink"/>
-          </w:rPr>
-          <w:t xml:space="preserve">daylight.com/dayhtml/doc/theory/theory.smarts.html</w:t>
-        </w:r>
-      </w:hyperlink>
-      <w:r>
-        <w:t xml:space="preserve">. SMARTS = SMILES Arbitrary Target Specification: a pattern language extending SMILES that matches molecular substructures, used by RDKit and other cheminformatics toolkits to evaluate hard-reject catalogs (this work, §4.7).</w:t>
+        <w:t xml:space="preserve">13. </w:t>
+      </w:r>
+      <w:bookmarkStart w:id="153" w:name="ref-politzer2014some"/>
+      <w:r>
+        <w:t xml:space="preserve">Politzer, P., &amp; Murray, J. S. (2014). Some Perspectives on Estimating Detonation Properties of C, H, N, O Compounds.</w:t>
+      </w:r>
+      <w:r>
+        <w:t xml:space="preserve"> </w:t>
+      </w:r>
+      <w:r>
+        <w:rPr>
+          <w:i/>
+          <w:iCs/>
+        </w:rPr>
+        <w:t xml:space="preserve">Cent. Eur. J. Energ. Mater. 11(4)</w:t>
+      </w:r>
+      <w:r>
+        <w:t xml:space="preserve">:459–474.</w:t>
       </w:r>
       <w:bookmarkEnd w:id="153"/>
     </w:p>
@@ -33703,24 +33771,11 @@
           <w:rFonts w:ascii="Times New Roman" w:hAnsi="Times New Roman"/>
           <w:sz w:val="20"/>
         </w:rPr>
-        <w:t xml:space="preserve">13. </w:t>
-      </w:r>
-      <w:bookmarkStart w:id="154" w:name="ref-politzer2014some"/>
-      <w:r>
-        <w:t xml:space="preserve">Politzer, P., &amp; Murray, J. S. (2014). Some Perspectives on Estimating Detonation Properties of C, H, N, O Compounds.</w:t>
-      </w:r>
-      <w:r>
-        <w:t xml:space="preserve"> </w:t>
-      </w:r>
-      <w:r>
-        <w:rPr>
-          <w:i/>
-          <w:iCs/>
-        </w:rPr>
-        <w:t xml:space="preserve">Cent. Eur. J. Energ. Mater. 11(4)</w:t>
-      </w:r>
-      <w:r>
-        <w:t xml:space="preserve">:459–474.</w:t>
+        <w:t xml:space="preserve">14. </w:t>
+      </w:r>
+      <w:bookmarkStart w:id="154" w:name="ref-suceska2018explo5"/>
+      <w:r>
+        <w:t xml:space="preserve">Sućeska, M. (2018). EXPLO5 v6.05.04 User's Manual. Brodarski Institute, Zagreb, Croatia. Computer program for calculation of detonation parameters from molecular formula, density, and heat of formation via thermochemical-equilibrium Chapman–Jouguet solver with covolume EOS.</w:t>
       </w:r>
       <w:bookmarkEnd w:id="154"/>
     </w:p>
@@ -33739,11 +33794,11 @@
           <w:rFonts w:ascii="Times New Roman" w:hAnsi="Times New Roman"/>
           <w:sz w:val="20"/>
         </w:rPr>
-        <w:t xml:space="preserve">14. </w:t>
-      </w:r>
-      <w:bookmarkStart w:id="155" w:name="ref-suceska2018explo5"/>
-      <w:r>
-        <w:t xml:space="preserve">Sućeska, M. (2018). EXPLO5 v6.05.04 User's Manual. Brodarski Institute, Zagreb, Croatia. Computer program for calculation of detonation parameters from molecular formula, density, and heat of formation via thermochemical-equilibrium Chapman–Jouguet solver with covolume EOS.</w:t>
+        <w:t xml:space="preserve">15. </w:t>
+      </w:r>
+      <w:bookmarkStart w:id="155" w:name="ref-fried2014cheetah"/>
+      <w:r>
+        <w:t xml:space="preserve">Fried, L. E., Howard, W. M., Souers, P. C., &amp; Vitello, P. A. (2014). Cheetah 7.0 User's Manual. Lawrence Livermore National Laboratory technical report LLNL-SM-664002. Thermochemical-equilibrium detonation code with JCZ3 / BKWS covolume EOS.</w:t>
       </w:r>
       <w:bookmarkEnd w:id="155"/>
     </w:p>
@@ -33762,11 +33817,24 @@
           <w:rFonts w:ascii="Times New Roman" w:hAnsi="Times New Roman"/>
           <w:sz w:val="20"/>
         </w:rPr>
-        <w:t xml:space="preserve">15. </w:t>
-      </w:r>
-      <w:bookmarkStart w:id="156" w:name="ref-fried2014cheetah"/>
-      <w:r>
-        <w:t xml:space="preserve">Fried, L. E., Howard, W. M., Souers, P. C., &amp; Vitello, P. A. (2014). Cheetah 7.0 User's Manual. Lawrence Livermore National Laboratory technical report LLNL-SM-664002. Thermochemical-equilibrium detonation code with JCZ3 / BKWS covolume EOS.</w:t>
+        <w:t xml:space="preserve">16. </w:t>
+      </w:r>
+      <w:bookmarkStart w:id="156" w:name="ref-kamlet1968detonation"/>
+      <w:r>
+        <w:t xml:space="preserve">Kamlet, M. J., &amp; Jacobs, S. J. (1968). Chemistry of Detonations. I. A Simple Method for Calculating Detonation Properties of C-H-N-O Explosives.</w:t>
+      </w:r>
+      <w:r>
+        <w:t xml:space="preserve"> </w:t>
+      </w:r>
+      <w:r>
+        <w:rPr>
+          <w:i/>
+          <w:iCs/>
+        </w:rPr>
+        <w:t xml:space="preserve">J. Chem. Phys. 48</w:t>
+      </w:r>
+      <w:r>
+        <w:t xml:space="preserve">:23–55. doi:10.1063/1.1667908.</w:t>
       </w:r>
       <w:bookmarkEnd w:id="156"/>
     </w:p>
@@ -33785,11 +33853,11 @@
           <w:rFonts w:ascii="Times New Roman" w:hAnsi="Times New Roman"/>
           <w:sz w:val="20"/>
         </w:rPr>
-        <w:t xml:space="preserve">16. </w:t>
-      </w:r>
-      <w:bookmarkStart w:id="157" w:name="ref-kamlet1968detonation"/>
-      <w:r>
-        <w:t xml:space="preserve">Kamlet, M. J., &amp; Jacobs, S. J. (1968). Chemistry of Detonations. I. A Simple Method for Calculating Detonation Properties of C-H-N-O Explosives.</w:t>
+        <w:t xml:space="preserve">17. </w:t>
+      </w:r>
+      <w:bookmarkStart w:id="157" w:name="ref-elton2018applying"/>
+      <w:r>
+        <w:t xml:space="preserve">Elton, D. C., Boukouvalas, Z., Butrico, M. S., Fuge, M. D., &amp; Chung, P. W. (2018). Applying Machine Learning Techniques to Predict the Properties of Energetic Materials.</w:t>
       </w:r>
       <w:r>
         <w:t xml:space="preserve"> </w:t>
@@ -33799,10 +33867,10 @@
           <w:i/>
           <w:iCs/>
         </w:rPr>
-        <w:t xml:space="preserve">J. Chem. Phys. 48</w:t>
-      </w:r>
-      <w:r>
-        <w:t xml:space="preserve">:23–55. doi:10.1063/1.1667908.</w:t>
+        <w:t xml:space="preserve">Sci. Rep. 8</w:t>
+      </w:r>
+      <w:r>
+        <w:t xml:space="preserve">:9059.</w:t>
       </w:r>
       <w:bookmarkEnd w:id="157"/>
     </w:p>
@@ -33821,11 +33889,11 @@
           <w:rFonts w:ascii="Times New Roman" w:hAnsi="Times New Roman"/>
           <w:sz w:val="20"/>
         </w:rPr>
-        <w:t xml:space="preserve">17. </w:t>
-      </w:r>
-      <w:bookmarkStart w:id="158" w:name="ref-elton2018applying"/>
-      <w:r>
-        <w:t xml:space="preserve">Elton, D. C., Boukouvalas, Z., Butrico, M. S., Fuge, M. D., &amp; Chung, P. W. (2018). Applying Machine Learning Techniques to Predict the Properties of Energetic Materials.</w:t>
+        <w:t xml:space="preserve">18. </w:t>
+      </w:r>
+      <w:bookmarkStart w:id="158" w:name="ref-casey2020prediction"/>
+      <w:r>
+        <w:t xml:space="preserve">Casey, A. D., Son, S. F., Bilionis, I., &amp; Barnes, B. C. (2020). Prediction of Energetic Material Properties from Electronic Structure Using 3D Convolutional Neural Networks.</w:t>
       </w:r>
       <w:r>
         <w:t xml:space="preserve"> </w:t>
@@ -33835,10 +33903,10 @@
           <w:i/>
           <w:iCs/>
         </w:rPr>
-        <w:t xml:space="preserve">Sci. Rep. 8</w:t>
-      </w:r>
-      <w:r>
-        <w:t xml:space="preserve">:9059.</w:t>
+        <w:t xml:space="preserve">J. Chem. Inf. Model. 60(10)</w:t>
+      </w:r>
+      <w:r>
+        <w:t xml:space="preserve">:4457–4473. doi:10.1021/acs.jcim.0c00259.</w:t>
       </w:r>
       <w:bookmarkEnd w:id="158"/>
     </w:p>
@@ -33857,11 +33925,11 @@
           <w:rFonts w:ascii="Times New Roman" w:hAnsi="Times New Roman"/>
           <w:sz w:val="20"/>
         </w:rPr>
-        <w:t xml:space="preserve">18. </w:t>
-      </w:r>
-      <w:bookmarkStart w:id="159" w:name="ref-casey2020prediction"/>
-      <w:r>
-        <w:t xml:space="preserve">Casey, A. D., Son, S. F., Bilionis, I., &amp; Barnes, B. C. (2020). Prediction of Energetic Material Properties from Electronic Structure Using 3D Convolutional Neural Networks.</w:t>
+        <w:t xml:space="preserve">19. </w:t>
+      </w:r>
+      <w:bookmarkStart w:id="159" w:name="ref-zhou2023unimol"/>
+      <w:r>
+        <w:t xml:space="preserve">Zhou, G. et al. (2023). Uni-Mol: A Universal 3D Molecular Representation Learning Framework.</w:t>
       </w:r>
       <w:r>
         <w:t xml:space="preserve"> </w:t>
@@ -33871,10 +33939,10 @@
           <w:i/>
           <w:iCs/>
         </w:rPr>
-        <w:t xml:space="preserve">J. Chem. Inf. Model. 60(10)</w:t>
-      </w:r>
-      <w:r>
-        <w:t xml:space="preserve">:4457–4473. doi:10.1021/acs.jcim.0c00259.</w:t>
+        <w:t xml:space="preserve">ICLR 2023</w:t>
+      </w:r>
+      <w:r>
+        <w:t xml:space="preserve">.</w:t>
       </w:r>
       <w:bookmarkEnd w:id="159"/>
     </w:p>
@@ -33893,11 +33961,11 @@
           <w:rFonts w:ascii="Times New Roman" w:hAnsi="Times New Roman"/>
           <w:sz w:val="20"/>
         </w:rPr>
-        <w:t xml:space="preserve">19. </w:t>
-      </w:r>
-      <w:bookmarkStart w:id="160" w:name="ref-zhou2023unimol"/>
-      <w:r>
-        <w:t xml:space="preserve">Zhou, G. et al. (2023). Uni-Mol: A Universal 3D Molecular Representation Learning Framework.</w:t>
+        <w:t xml:space="preserve">20. </w:t>
+      </w:r>
+      <w:bookmarkStart w:id="160" w:name="ref-huang2021applying"/>
+      <w:r>
+        <w:t xml:space="preserve">Huang, X. et al. (2021). Applying Machine Learning to Balance Performance and Stability of High Energy Density Materials.</w:t>
       </w:r>
       <w:r>
         <w:t xml:space="preserve"> </w:t>
@@ -33907,10 +33975,10 @@
           <w:i/>
           <w:iCs/>
         </w:rPr>
-        <w:t xml:space="preserve">ICLR 2023</w:t>
-      </w:r>
-      <w:r>
-        <w:t xml:space="preserve">.</w:t>
+        <w:t xml:space="preserve">iScience 24</w:t>
+      </w:r>
+      <w:r>
+        <w:t xml:space="preserve">:102240.</w:t>
       </w:r>
       <w:bookmarkEnd w:id="160"/>
     </w:p>
@@ -33929,11 +33997,11 @@
           <w:rFonts w:ascii="Times New Roman" w:hAnsi="Times New Roman"/>
           <w:sz w:val="20"/>
         </w:rPr>
-        <w:t xml:space="preserve">20. </w:t>
-      </w:r>
-      <w:bookmarkStart w:id="161" w:name="ref-huang2021applying"/>
-      <w:r>
-        <w:t xml:space="preserve">Huang, X. et al. (2021). Applying Machine Learning to Balance Performance and Stability of High Energy Density Materials.</w:t>
+        <w:t xml:space="preserve">21. </w:t>
+      </w:r>
+      <w:bookmarkStart w:id="161" w:name="ref-herve2010"/>
+      <w:r>
+        <w:t xml:space="preserve">Hervé, G., Roussel, C., &amp; Graindorge, H. (2010). Selective Preparation of 3,4,5-Trinitro-1H-pyrazole: A Stable All-Carbon-Substituted Trinitro Heterocycle, and Related Trinitroisoxazole Chemistry.</w:t>
       </w:r>
       <w:r>
         <w:t xml:space="preserve"> </w:t>
@@ -33943,10 +34011,10 @@
           <w:i/>
           <w:iCs/>
         </w:rPr>
-        <w:t xml:space="preserve">iScience 24</w:t>
-      </w:r>
-      <w:r>
-        <w:t xml:space="preserve">:102240.</w:t>
+        <w:t xml:space="preserve">Angew. Chem. Int. Ed. 49(18)</w:t>
+      </w:r>
+      <w:r>
+        <w:t xml:space="preserve">:3177–3181. doi:10.1002/anie.201000764.</w:t>
       </w:r>
       <w:bookmarkEnd w:id="161"/>
     </w:p>
@@ -33965,11 +34033,11 @@
           <w:rFonts w:ascii="Times New Roman" w:hAnsi="Times New Roman"/>
           <w:sz w:val="20"/>
         </w:rPr>
-        <w:t xml:space="preserve">21. </w:t>
-      </w:r>
-      <w:bookmarkStart w:id="162" w:name="ref-herve2010"/>
-      <w:r>
-        <w:t xml:space="preserve">Hervé, G., Roussel, C., &amp; Graindorge, H. (2010). Selective Preparation of 3,4,5-Trinitro-1H-pyrazole: A Stable All-Carbon-Substituted Trinitro Heterocycle, and Related Trinitroisoxazole Chemistry.</w:t>
+        <w:t xml:space="preserve">22. </w:t>
+      </w:r>
+      <w:bookmarkStart w:id="162" w:name="ref-sabatini2018"/>
+      <w:r>
+        <w:t xml:space="preserve">Sabatini, J. J., &amp; Oyler, K. D. (2016). Recent Advances in the Synthesis of High Explosive Materials.</w:t>
       </w:r>
       <w:r>
         <w:t xml:space="preserve"> </w:t>
@@ -33979,10 +34047,13 @@
           <w:i/>
           <w:iCs/>
         </w:rPr>
-        <w:t xml:space="preserve">Angew. Chem. Int. Ed. 49(18)</w:t>
-      </w:r>
-      <w:r>
-        <w:t xml:space="preserve">:3177–3181. doi:10.1002/anie.201000764.</w:t>
+        <w:t xml:space="preserve">Crystals</w:t>
+      </w:r>
+      <w:r>
+        <w:t xml:space="preserve"> </w:t>
+      </w:r>
+      <w:r>
+        <w:t xml:space="preserve">6(1):5. doi:10.3390/cryst6010005.</w:t>
       </w:r>
       <w:bookmarkEnd w:id="162"/>
     </w:p>
@@ -34001,11 +34072,11 @@
           <w:rFonts w:ascii="Times New Roman" w:hAnsi="Times New Roman"/>
           <w:sz w:val="20"/>
         </w:rPr>
-        <w:t xml:space="preserve">22. </w:t>
-      </w:r>
-      <w:bookmarkStart w:id="163" w:name="ref-sabatini2018"/>
-      <w:r>
-        <w:t xml:space="preserve">Sabatini, J. J., &amp; Oyler, K. D. (2016). Recent Advances in the Synthesis of High Explosive Materials.</w:t>
+        <w:t xml:space="preserve">23. </w:t>
+      </w:r>
+      <w:bookmarkStart w:id="163" w:name="ref-konnov2025nitroisoxazole"/>
+      <w:r>
+        <w:t xml:space="preserve">Konnov, A. A., Lisyutkin, A. D., Vinogradov, D. B., Nazarova, A. A., Pivkina, A. N., &amp; Fershtat, L. L. (2025). Synthesis of 4-Nitroisoxazole-Based Energetic Materials.</w:t>
       </w:r>
       <w:r>
         <w:t xml:space="preserve"> </w:t>
@@ -34015,13 +34086,10 @@
           <w:i/>
           <w:iCs/>
         </w:rPr>
-        <w:t xml:space="preserve">Crystals</w:t>
-      </w:r>
-      <w:r>
-        <w:t xml:space="preserve"> </w:t>
-      </w:r>
-      <w:r>
-        <w:t xml:space="preserve">6(1):5. doi:10.3390/cryst6010005.</w:t>
+        <w:t xml:space="preserve">Org. Lett. 27(14)</w:t>
+      </w:r>
+      <w:r>
+        <w:t xml:space="preserve">:3795–3799. doi:10.1021/acs.orglett.5c01074.</w:t>
       </w:r>
       <w:bookmarkEnd w:id="163"/>
     </w:p>
@@ -34040,24 +34108,11 @@
           <w:rFonts w:ascii="Times New Roman" w:hAnsi="Times New Roman"/>
           <w:sz w:val="20"/>
         </w:rPr>
-        <w:t xml:space="preserve">23. </w:t>
-      </w:r>
-      <w:bookmarkStart w:id="164" w:name="ref-konnov2025nitroisoxazole"/>
-      <w:r>
-        <w:t xml:space="preserve">Konnov, A. A., Lisyutkin, A. D., Vinogradov, D. B., Nazarova, A. A., Pivkina, A. N., &amp; Fershtat, L. L. (2025). Synthesis of 4-Nitroisoxazole-Based Energetic Materials.</w:t>
-      </w:r>
-      <w:r>
-        <w:t xml:space="preserve"> </w:t>
-      </w:r>
-      <w:r>
-        <w:rPr>
-          <w:i/>
-          <w:iCs/>
-        </w:rPr>
-        <w:t xml:space="preserve">Org. Lett. 27(14)</w:t>
-      </w:r>
-      <w:r>
-        <w:t xml:space="preserve">:3795–3799. doi:10.1021/acs.orglett.5c01074.</w:t>
+        <w:t xml:space="preserve">24. </w:t>
+      </w:r>
+      <w:bookmarkStart w:id="164" w:name="ref-ho2022cfg"/>
+      <w:r>
+        <w:t xml:space="preserve">Ho, J., &amp; Salimans, T. (2022). Classifier-Free Diffusion Guidance. arXiv:2207.12598.</w:t>
       </w:r>
       <w:bookmarkEnd w:id="164"/>
     </w:p>
@@ -34076,11 +34131,24 @@
           <w:rFonts w:ascii="Times New Roman" w:hAnsi="Times New Roman"/>
           <w:sz w:val="20"/>
         </w:rPr>
-        <w:t xml:space="preserve">24. </w:t>
-      </w:r>
-      <w:bookmarkStart w:id="165" w:name="ref-ho2022cfg"/>
-      <w:r>
-        <w:t xml:space="preserve">Ho, J., &amp; Salimans, T. (2022). Classifier-Free Diffusion Guidance. arXiv:2207.12598.</w:t>
+        <w:t xml:space="preserve">25. </w:t>
+      </w:r>
+      <w:bookmarkStart w:id="165" w:name="ref-dhariwal2021diffusion"/>
+      <w:r>
+        <w:t xml:space="preserve">Dhariwal, P., &amp; Nichol, A. (2021). Diffusion Models Beat GANs on Image Synthesis.</w:t>
+      </w:r>
+      <w:r>
+        <w:t xml:space="preserve"> </w:t>
+      </w:r>
+      <w:r>
+        <w:rPr>
+          <w:i/>
+          <w:iCs/>
+        </w:rPr>
+        <w:t xml:space="preserve">NeurIPS 2021</w:t>
+      </w:r>
+      <w:r>
+        <w:t xml:space="preserve">. arXiv:2105.05233.</w:t>
       </w:r>
       <w:bookmarkEnd w:id="165"/>
     </w:p>
@@ -34099,11 +34167,11 @@
           <w:rFonts w:ascii="Times New Roman" w:hAnsi="Times New Roman"/>
           <w:sz w:val="20"/>
         </w:rPr>
-        <w:t xml:space="preserve">25. </w:t>
-      </w:r>
-      <w:bookmarkStart w:id="166" w:name="ref-dhariwal2021diffusion"/>
-      <w:r>
-        <w:t xml:space="preserve">Dhariwal, P., &amp; Nichol, A. (2021). Diffusion Models Beat GANs on Image Synthesis.</w:t>
+        <w:t xml:space="preserve">26. </w:t>
+      </w:r>
+      <w:bookmarkStart w:id="166" w:name="ref-song2019score"/>
+      <w:r>
+        <w:t xml:space="preserve">Song, Y., &amp; Ermon, S. (2019). Generative Modeling by Estimating Gradients of the Data Distribution.</w:t>
       </w:r>
       <w:r>
         <w:t xml:space="preserve"> </w:t>
@@ -34113,10 +34181,10 @@
           <w:i/>
           <w:iCs/>
         </w:rPr>
-        <w:t xml:space="preserve">NeurIPS 2021</w:t>
-      </w:r>
-      <w:r>
-        <w:t xml:space="preserve">. arXiv:2105.05233.</w:t>
+        <w:t xml:space="preserve">NeurIPS 2019</w:t>
+      </w:r>
+      <w:r>
+        <w:t xml:space="preserve">. arXiv:1907.05600.</w:t>
       </w:r>
       <w:bookmarkEnd w:id="166"/>
     </w:p>
@@ -34135,11 +34203,11 @@
           <w:rFonts w:ascii="Times New Roman" w:hAnsi="Times New Roman"/>
           <w:sz w:val="20"/>
         </w:rPr>
-        <w:t xml:space="preserve">26. </w:t>
-      </w:r>
-      <w:bookmarkStart w:id="167" w:name="ref-song2019score"/>
-      <w:r>
-        <w:t xml:space="preserve">Song, Y., &amp; Ermon, S. (2019). Generative Modeling by Estimating Gradients of the Data Distribution.</w:t>
+        <w:t xml:space="preserve">27. </w:t>
+      </w:r>
+      <w:bookmarkStart w:id="167" w:name="ref-song2021sde"/>
+      <w:r>
+        <w:t xml:space="preserve">Song, Y. et al. (2021). Score-Based Generative Modeling through Stochastic Differential Equations.</w:t>
       </w:r>
       <w:r>
         <w:t xml:space="preserve"> </w:t>
@@ -34149,10 +34217,10 @@
           <w:i/>
           <w:iCs/>
         </w:rPr>
-        <w:t xml:space="preserve">NeurIPS 2019</w:t>
-      </w:r>
-      <w:r>
-        <w:t xml:space="preserve">. arXiv:1907.05600.</w:t>
+        <w:t xml:space="preserve">ICLR 2021</w:t>
+      </w:r>
+      <w:r>
+        <w:t xml:space="preserve">. arXiv:2011.13456.</w:t>
       </w:r>
       <w:bookmarkEnd w:id="167"/>
     </w:p>
@@ -34171,11 +34239,11 @@
           <w:rFonts w:ascii="Times New Roman" w:hAnsi="Times New Roman"/>
           <w:sz w:val="20"/>
         </w:rPr>
-        <w:t xml:space="preserve">27. </w:t>
-      </w:r>
-      <w:bookmarkStart w:id="168" w:name="ref-song2021sde"/>
-      <w:r>
-        <w:t xml:space="preserve">Song, Y. et al. (2021). Score-Based Generative Modeling through Stochastic Differential Equations.</w:t>
+        <w:t xml:space="preserve">28. </w:t>
+      </w:r>
+      <w:bookmarkStart w:id="168" w:name="ref-ho2020ddpm"/>
+      <w:r>
+        <w:t xml:space="preserve">Ho, J., Jain, A., &amp; Abbeel, P. (2020). Denoising Diffusion Probabilistic Models.</w:t>
       </w:r>
       <w:r>
         <w:t xml:space="preserve"> </w:t>
@@ -34185,10 +34253,10 @@
           <w:i/>
           <w:iCs/>
         </w:rPr>
-        <w:t xml:space="preserve">ICLR 2021</w:t>
-      </w:r>
-      <w:r>
-        <w:t xml:space="preserve">. arXiv:2011.13456.</w:t>
+        <w:t xml:space="preserve">NeurIPS 2020</w:t>
+      </w:r>
+      <w:r>
+        <w:t xml:space="preserve">. arXiv:2006.11239.</w:t>
       </w:r>
       <w:bookmarkEnd w:id="168"/>
     </w:p>
@@ -34207,11 +34275,11 @@
           <w:rFonts w:ascii="Times New Roman" w:hAnsi="Times New Roman"/>
           <w:sz w:val="20"/>
         </w:rPr>
-        <w:t xml:space="preserve">28. </w:t>
-      </w:r>
-      <w:bookmarkStart w:id="169" w:name="ref-ho2020ddpm"/>
-      <w:r>
-        <w:t xml:space="preserve">Ho, J., Jain, A., &amp; Abbeel, P. (2020). Denoising Diffusion Probabilistic Models.</w:t>
+        <w:t xml:space="preserve">29. </w:t>
+      </w:r>
+      <w:bookmarkStart w:id="169" w:name="ref-rombach2022ldm"/>
+      <w:r>
+        <w:t xml:space="preserve">Rombach, R., Blattmann, A., Lorenz, D., Esser, P., &amp; Ommer, B. (2022). High-Resolution Image Synthesis with Latent Diffusion Models.</w:t>
       </w:r>
       <w:r>
         <w:t xml:space="preserve"> </w:t>
@@ -34221,10 +34289,10 @@
           <w:i/>
           <w:iCs/>
         </w:rPr>
-        <w:t xml:space="preserve">NeurIPS 2020</w:t>
-      </w:r>
-      <w:r>
-        <w:t xml:space="preserve">. arXiv:2006.11239.</w:t>
+        <w:t xml:space="preserve">CVPR 2022</w:t>
+      </w:r>
+      <w:r>
+        <w:t xml:space="preserve">. arXiv:2112.10752.</w:t>
       </w:r>
       <w:bookmarkEnd w:id="169"/>
     </w:p>
@@ -34243,11 +34311,11 @@
           <w:rFonts w:ascii="Times New Roman" w:hAnsi="Times New Roman"/>
           <w:sz w:val="20"/>
         </w:rPr>
-        <w:t xml:space="preserve">29. </w:t>
-      </w:r>
-      <w:bookmarkStart w:id="170" w:name="ref-rombach2022ldm"/>
-      <w:r>
-        <w:t xml:space="preserve">Rombach, R., Blattmann, A., Lorenz, D., Esser, P., &amp; Ommer, B. (2022). High-Resolution Image Synthesis with Latent Diffusion Models.</w:t>
+        <w:t xml:space="preserve">30. </w:t>
+      </w:r>
+      <w:bookmarkStart w:id="170" w:name="ref-krenn2020selfies"/>
+      <w:r>
+        <w:t xml:space="preserve">Krenn, M., Häse, F., Nigam, A., Friederich, P., &amp; Aspuru-Guzik, A. (2020). Self-Referencing Embedded Strings (SELFIES): A 100% Robust Molecular String Representation.</w:t>
       </w:r>
       <w:r>
         <w:t xml:space="preserve"> </w:t>
@@ -34257,10 +34325,10 @@
           <w:i/>
           <w:iCs/>
         </w:rPr>
-        <w:t xml:space="preserve">CVPR 2022</w:t>
-      </w:r>
-      <w:r>
-        <w:t xml:space="preserve">. arXiv:2112.10752.</w:t>
+        <w:t xml:space="preserve">Mach. Learn.: Sci. Tech. 1</w:t>
+      </w:r>
+      <w:r>
+        <w:t xml:space="preserve">:045024.</w:t>
       </w:r>
       <w:bookmarkEnd w:id="170"/>
     </w:p>
@@ -34279,11 +34347,11 @@
           <w:rFonts w:ascii="Times New Roman" w:hAnsi="Times New Roman"/>
           <w:sz w:val="20"/>
         </w:rPr>
-        <w:t xml:space="preserve">30. </w:t>
-      </w:r>
-      <w:bookmarkStart w:id="171" w:name="ref-krenn2020selfies"/>
-      <w:r>
-        <w:t xml:space="preserve">Krenn, M., Häse, F., Nigam, A., Friederich, P., &amp; Aspuru-Guzik, A. (2020). Self-Referencing Embedded Strings (SELFIES): A 100% Robust Molecular String Representation.</w:t>
+        <w:t xml:space="preserve">31. </w:t>
+      </w:r>
+      <w:bookmarkStart w:id="171" w:name="ref-ertl2009sa"/>
+      <w:r>
+        <w:t xml:space="preserve">Ertl, P., &amp; Schuffenhauer, A. (2009). Estimation of Synthetic Accessibility Score of Drug-Like Molecules Based on Molecular Complexity and Fragment Contributions.</w:t>
       </w:r>
       <w:r>
         <w:t xml:space="preserve"> </w:t>
@@ -34293,10 +34361,10 @@
           <w:i/>
           <w:iCs/>
         </w:rPr>
-        <w:t xml:space="preserve">Mach. Learn.: Sci. Tech. 1</w:t>
-      </w:r>
-      <w:r>
-        <w:t xml:space="preserve">:045024.</w:t>
+        <w:t xml:space="preserve">J. Cheminform. 1</w:t>
+      </w:r>
+      <w:r>
+        <w:t xml:space="preserve">:8.</w:t>
       </w:r>
       <w:bookmarkEnd w:id="171"/>
     </w:p>
@@ -34315,11 +34383,11 @@
           <w:rFonts w:ascii="Times New Roman" w:hAnsi="Times New Roman"/>
           <w:sz w:val="20"/>
         </w:rPr>
-        <w:t xml:space="preserve">31. </w:t>
-      </w:r>
-      <w:bookmarkStart w:id="172" w:name="ref-ertl2009sa"/>
-      <w:r>
-        <w:t xml:space="preserve">Ertl, P., &amp; Schuffenhauer, A. (2009). Estimation of Synthetic Accessibility Score of Drug-Like Molecules Based on Molecular Complexity and Fragment Contributions.</w:t>
+        <w:t xml:space="preserve">32. </w:t>
+      </w:r>
+      <w:bookmarkStart w:id="172" w:name="ref-coley2018scscore"/>
+      <w:r>
+        <w:t xml:space="preserve">Coley, C. W., Rogers, L., Green, W. H., &amp; Jensen, K. F. (2018). SCScore: Synthetic Complexity Learned from a Reaction Corpus.</w:t>
       </w:r>
       <w:r>
         <w:t xml:space="preserve"> </w:t>
@@ -34329,10 +34397,10 @@
           <w:i/>
           <w:iCs/>
         </w:rPr>
-        <w:t xml:space="preserve">J. Cheminform. 1</w:t>
-      </w:r>
-      <w:r>
-        <w:t xml:space="preserve">:8.</w:t>
+        <w:t xml:space="preserve">J. Chem. Inf. Model. 58(2)</w:t>
+      </w:r>
+      <w:r>
+        <w:t xml:space="preserve">:252–261.</w:t>
       </w:r>
       <w:bookmarkEnd w:id="172"/>
     </w:p>
@@ -34351,11 +34419,11 @@
           <w:rFonts w:ascii="Times New Roman" w:hAnsi="Times New Roman"/>
           <w:sz w:val="20"/>
         </w:rPr>
-        <w:t xml:space="preserve">32. </w:t>
-      </w:r>
-      <w:bookmarkStart w:id="173" w:name="ref-coley2018scscore"/>
-      <w:r>
-        <w:t xml:space="preserve">Coley, C. W., Rogers, L., Green, W. H., &amp; Jensen, K. F. (2018). SCScore: Synthetic Complexity Learned from a Reaction Corpus.</w:t>
+        <w:t xml:space="preserve">33. </w:t>
+      </w:r>
+      <w:bookmarkStart w:id="173" w:name="ref-rogers1960computer"/>
+      <w:r>
+        <w:t xml:space="preserve">Rogers, D. J., &amp; Tanimoto, T. T. (1960). A Computer Program for Classifying Plants.</w:t>
       </w:r>
       <w:r>
         <w:t xml:space="preserve"> </w:t>
@@ -34365,10 +34433,10 @@
           <w:i/>
           <w:iCs/>
         </w:rPr>
-        <w:t xml:space="preserve">J. Chem. Inf. Model. 58(2)</w:t>
-      </w:r>
-      <w:r>
-        <w:t xml:space="preserve">:252–261.</w:t>
+        <w:t xml:space="preserve">Science 132(3434)</w:t>
+      </w:r>
+      <w:r>
+        <w:t xml:space="preserve">:1115–1118.</w:t>
       </w:r>
       <w:bookmarkEnd w:id="173"/>
     </w:p>
@@ -34387,26 +34455,27 @@
           <w:rFonts w:ascii="Times New Roman" w:hAnsi="Times New Roman"/>
           <w:sz w:val="20"/>
         </w:rPr>
-        <w:t xml:space="preserve">33. </w:t>
-      </w:r>
-      <w:bookmarkStart w:id="174" w:name="ref-rogers1960computer"/>
-      <w:r>
-        <w:t xml:space="preserve">Rogers, D. J., &amp; Tanimoto, T. T. (1960). A Computer Program for Classifying Plants.</w:t>
-      </w:r>
-      <w:r>
-        <w:t xml:space="preserve"> </w:t>
-      </w:r>
-      <w:r>
-        <w:rPr>
-          <w:i/>
-          <w:iCs/>
-        </w:rPr>
-        <w:t xml:space="preserve">Science 132(3434)</w:t>
-      </w:r>
-      <w:r>
-        <w:t xml:space="preserve">:1115–1118.</w:t>
-      </w:r>
-      <w:bookmarkEnd w:id="174"/>
+        <w:t xml:space="preserve">34. </w:t>
+      </w:r>
+      <w:bookmarkStart w:id="175" w:name="ref-landrum2024rdkit"/>
+      <w:r>
+        <w:t xml:space="preserve">Landrum, G., &amp; contributors. RDKit: Open-source cheminformatics.</w:t>
+      </w:r>
+      <w:r>
+        <w:t xml:space="preserve"> </w:t>
+      </w:r>
+      <w:hyperlink r:id="rId174">
+        <w:r>
+          <w:rPr>
+            <w:rStyle w:val="Hyperlink"/>
+          </w:rPr>
+          <w:t xml:space="preserve">rdkit.org</w:t>
+        </w:r>
+      </w:hyperlink>
+      <w:r>
+        <w:t xml:space="preserve">.</w:t>
+      </w:r>
+      <w:bookmarkEnd w:id="175"/>
     </w:p>
     <w:p>
       <w:pPr>
@@ -34423,25 +34492,24 @@
           <w:rFonts w:ascii="Times New Roman" w:hAnsi="Times New Roman"/>
           <w:sz w:val="20"/>
         </w:rPr>
-        <w:t xml:space="preserve">34. </w:t>
-      </w:r>
-      <w:bookmarkStart w:id="176" w:name="ref-landrum2024rdkit"/>
-      <w:r>
-        <w:t xml:space="preserve">Landrum, G., &amp; contributors. RDKit: Open-source cheminformatics.</w:t>
-      </w:r>
-      <w:r>
-        <w:t xml:space="preserve"> </w:t>
-      </w:r>
-      <w:hyperlink r:id="rId175">
-        <w:r>
-          <w:rPr>
-            <w:rStyle w:val="Hyperlink"/>
-          </w:rPr>
-          <w:t xml:space="preserve">rdkit.org</w:t>
-        </w:r>
-      </w:hyperlink>
-      <w:r>
-        <w:t xml:space="preserve">.</w:t>
+        <w:t xml:space="preserve">35. </w:t>
+      </w:r>
+      <w:bookmarkStart w:id="176" w:name="ref-sterling2015zinc"/>
+      <w:r>
+        <w:t xml:space="preserve">Sterling, T., &amp; Irwin, J. J. (2015). ZINC 15: Ligand Discovery for Everyone.</w:t>
+      </w:r>
+      <w:r>
+        <w:t xml:space="preserve"> </w:t>
+      </w:r>
+      <w:r>
+        <w:rPr>
+          <w:i/>
+          <w:iCs/>
+        </w:rPr>
+        <w:t xml:space="preserve">J. Chem. Inf. Model. 55(11)</w:t>
+      </w:r>
+      <w:r>
+        <w:t xml:space="preserve">:2324–2337.</w:t>
       </w:r>
       <w:bookmarkEnd w:id="176"/>
     </w:p>
@@ -34460,11 +34528,11 @@
           <w:rFonts w:ascii="Times New Roman" w:hAnsi="Times New Roman"/>
           <w:sz w:val="20"/>
         </w:rPr>
-        <w:t xml:space="preserve">35. </w:t>
-      </w:r>
-      <w:bookmarkStart w:id="177" w:name="ref-sterling2015zinc"/>
-      <w:r>
-        <w:t xml:space="preserve">Sterling, T., &amp; Irwin, J. J. (2015). ZINC 15: Ligand Discovery for Everyone.</w:t>
+        <w:t xml:space="preserve">36. </w:t>
+      </w:r>
+      <w:bookmarkStart w:id="177" w:name="ref-kim2023pubchem"/>
+      <w:r>
+        <w:t xml:space="preserve">Kim, S. et al. (2023). PubChem 2023 Update.</w:t>
       </w:r>
       <w:r>
         <w:t xml:space="preserve"> </w:t>
@@ -34474,10 +34542,10 @@
           <w:i/>
           <w:iCs/>
         </w:rPr>
-        <w:t xml:space="preserve">J. Chem. Inf. Model. 55(11)</w:t>
-      </w:r>
-      <w:r>
-        <w:t xml:space="preserve">:2324–2337.</w:t>
+        <w:t xml:space="preserve">Nucleic Acids Res. 51(D1)</w:t>
+      </w:r>
+      <w:r>
+        <w:t xml:space="preserve">:D1373–D1380.</w:t>
       </w:r>
       <w:bookmarkEnd w:id="177"/>
     </w:p>
@@ -34496,11 +34564,11 @@
           <w:rFonts w:ascii="Times New Roman" w:hAnsi="Times New Roman"/>
           <w:sz w:val="20"/>
         </w:rPr>
-        <w:t xml:space="preserve">36. </w:t>
-      </w:r>
-      <w:bookmarkStart w:id="178" w:name="ref-kim2023pubchem"/>
-      <w:r>
-        <w:t xml:space="preserve">Kim, S. et al. (2023). PubChem 2023 Update.</w:t>
+        <w:t xml:space="preserve">37. </w:t>
+      </w:r>
+      <w:bookmarkStart w:id="178" w:name="ref-jaegle2021perceiver"/>
+      <w:r>
+        <w:t xml:space="preserve">Jaegle, A. et al. (2021). Perceiver: General Perception with Iterative Attention.</w:t>
       </w:r>
       <w:r>
         <w:t xml:space="preserve"> </w:t>
@@ -34510,10 +34578,10 @@
           <w:i/>
           <w:iCs/>
         </w:rPr>
-        <w:t xml:space="preserve">Nucleic Acids Res. 51(D1)</w:t>
-      </w:r>
-      <w:r>
-        <w:t xml:space="preserve">:D1373–D1380.</w:t>
+        <w:t xml:space="preserve">ICML 2021</w:t>
+      </w:r>
+      <w:r>
+        <w:t xml:space="preserve">. arXiv:2103.03206.</w:t>
       </w:r>
       <w:bookmarkEnd w:id="178"/>
     </w:p>
@@ -34532,11 +34600,11 @@
           <w:rFonts w:ascii="Times New Roman" w:hAnsi="Times New Roman"/>
           <w:sz w:val="20"/>
         </w:rPr>
-        <w:t xml:space="preserve">37. </w:t>
-      </w:r>
-      <w:bookmarkStart w:id="179" w:name="ref-jaegle2021perceiver"/>
-      <w:r>
-        <w:t xml:space="preserve">Jaegle, A. et al. (2021). Perceiver: General Perception with Iterative Attention.</w:t>
+        <w:t xml:space="preserve">38. </w:t>
+      </w:r>
+      <w:bookmarkStart w:id="179" w:name="ref-olivecrona2017reinvent"/>
+      <w:r>
+        <w:t xml:space="preserve">Olivecrona, M., Blaschke, T., Engkvist, O., &amp; Chen, H. (2017). Molecular de-novo design through deep reinforcement learning.</w:t>
       </w:r>
       <w:r>
         <w:t xml:space="preserve"> </w:t>
@@ -34546,10 +34614,10 @@
           <w:i/>
           <w:iCs/>
         </w:rPr>
-        <w:t xml:space="preserve">ICML 2021</w:t>
-      </w:r>
-      <w:r>
-        <w:t xml:space="preserve">. arXiv:2103.03206.</w:t>
+        <w:t xml:space="preserve">J. Cheminformatics 9</w:t>
+      </w:r>
+      <w:r>
+        <w:t xml:space="preserve">:48. doi:10.1186/s13321-017-0235-x.</w:t>
       </w:r>
       <w:bookmarkEnd w:id="179"/>
     </w:p>
@@ -34568,11 +34636,11 @@
           <w:rFonts w:ascii="Times New Roman" w:hAnsi="Times New Roman"/>
           <w:sz w:val="20"/>
         </w:rPr>
-        <w:t xml:space="preserve">38. </w:t>
-      </w:r>
-      <w:bookmarkStart w:id="180" w:name="ref-olivecrona2017reinvent"/>
-      <w:r>
-        <w:t xml:space="preserve">Olivecrona, M., Blaschke, T., Engkvist, O., &amp; Chen, H. (2017). Molecular de-novo design through deep reinforcement learning.</w:t>
+        <w:t xml:space="preserve">39. </w:t>
+      </w:r>
+      <w:bookmarkStart w:id="180" w:name="ref-loeffler2024reinvent4"/>
+      <w:r>
+        <w:t xml:space="preserve">Loeffler, H. H., He, J., Tibo, A., Janet, J. P., Voronov, A., Mervin, L. H., &amp; Engkvist, O. (2024). REINVENT 4: Modern AI-driven generative molecule design.</w:t>
       </w:r>
       <w:r>
         <w:t xml:space="preserve"> </w:t>
@@ -34582,10 +34650,10 @@
           <w:i/>
           <w:iCs/>
         </w:rPr>
-        <w:t xml:space="preserve">J. Cheminformatics 9</w:t>
-      </w:r>
-      <w:r>
-        <w:t xml:space="preserve">:48. doi:10.1186/s13321-017-0235-x.</w:t>
+        <w:t xml:space="preserve">J. Cheminformatics 16</w:t>
+      </w:r>
+      <w:r>
+        <w:t xml:space="preserve">:20. doi:10.1186/s13321-024-00812-5.</w:t>
       </w:r>
       <w:bookmarkEnd w:id="180"/>
     </w:p>
@@ -34604,11 +34672,11 @@
           <w:rFonts w:ascii="Times New Roman" w:hAnsi="Times New Roman"/>
           <w:sz w:val="20"/>
         </w:rPr>
-        <w:t xml:space="preserve">39. </w:t>
-      </w:r>
-      <w:bookmarkStart w:id="181" w:name="ref-loeffler2024reinvent4"/>
-      <w:r>
-        <w:t xml:space="preserve">Loeffler, H. H., He, J., Tibo, A., Janet, J. P., Voronov, A., Mervin, L. H., &amp; Engkvist, O. (2024). REINVENT 4: Modern AI-driven generative molecule design.</w:t>
+        <w:t xml:space="preserve">40. </w:t>
+      </w:r>
+      <w:bookmarkStart w:id="181" w:name="ref-yang2017chemts"/>
+      <w:r>
+        <w:t xml:space="preserve">Yang, X., Zhang, J., Yoshizoe, K., Terayama, K., &amp; Tsuda, K. (2017). ChemTS: An efficient python library for de novo molecular generation.</w:t>
       </w:r>
       <w:r>
         <w:t xml:space="preserve"> </w:t>
@@ -34618,10 +34686,10 @@
           <w:i/>
           <w:iCs/>
         </w:rPr>
-        <w:t xml:space="preserve">J. Cheminformatics 16</w:t>
-      </w:r>
-      <w:r>
-        <w:t xml:space="preserve">:20. doi:10.1186/s13321-024-00812-5.</w:t>
+        <w:t xml:space="preserve">Sci. Tech. Adv. Mater. 18(1)</w:t>
+      </w:r>
+      <w:r>
+        <w:t xml:space="preserve">:972–976. doi:10.1080/14686996.2017.1401424.</w:t>
       </w:r>
       <w:bookmarkEnd w:id="181"/>
     </w:p>
@@ -34640,11 +34708,11 @@
           <w:rFonts w:ascii="Times New Roman" w:hAnsi="Times New Roman"/>
           <w:sz w:val="20"/>
         </w:rPr>
-        <w:t xml:space="preserve">40. </w:t>
-      </w:r>
-      <w:bookmarkStart w:id="182" w:name="ref-yang2017chemts"/>
-      <w:r>
-        <w:t xml:space="preserve">Yang, X., Zhang, J., Yoshizoe, K., Terayama, K., &amp; Tsuda, K. (2017). ChemTS: An efficient python library for de novo molecular generation.</w:t>
+        <w:t xml:space="preserve">41. </w:t>
+      </w:r>
+      <w:bookmarkStart w:id="182" w:name="ref-bagal2022molgpt"/>
+      <w:r>
+        <w:t xml:space="preserve">Bagal, V., Aggarwal, R., Vinod, P. K., &amp; Priyakumar, U. D. (2022). MolGPT: Molecular Generation Using a Transformer-Decoder Model.</w:t>
       </w:r>
       <w:r>
         <w:t xml:space="preserve"> </w:t>
@@ -34654,10 +34722,10 @@
           <w:i/>
           <w:iCs/>
         </w:rPr>
-        <w:t xml:space="preserve">Sci. Tech. Adv. Mater. 18(1)</w:t>
-      </w:r>
-      <w:r>
-        <w:t xml:space="preserve">:972–976. doi:10.1080/14686996.2017.1401424.</w:t>
+        <w:t xml:space="preserve">J. Chem. Inf. Model. 62(9)</w:t>
+      </w:r>
+      <w:r>
+        <w:t xml:space="preserve">:2064–2076. doi:10.1021/acs.jcim.1c00600.</w:t>
       </w:r>
       <w:bookmarkEnd w:id="182"/>
     </w:p>
@@ -34676,11 +34744,11 @@
           <w:rFonts w:ascii="Times New Roman" w:hAnsi="Times New Roman"/>
           <w:sz w:val="20"/>
         </w:rPr>
-        <w:t xml:space="preserve">41. </w:t>
-      </w:r>
-      <w:bookmarkStart w:id="183" w:name="ref-bagal2022molgpt"/>
-      <w:r>
-        <w:t xml:space="preserve">Bagal, V., Aggarwal, R., Vinod, P. K., &amp; Priyakumar, U. D. (2022). MolGPT: Molecular Generation Using a Transformer-Decoder Model.</w:t>
+        <w:t xml:space="preserve">42. </w:t>
+      </w:r>
+      <w:bookmarkStart w:id="183" w:name="ref-winter2019cddd"/>
+      <w:r>
+        <w:t xml:space="preserve">Winter, R., Montanari, F., Noé, F., &amp; Clevert, D.-A. (2019). Learning continuous and data-driven molecular descriptors by translating equivalent chemical representations.</w:t>
       </w:r>
       <w:r>
         <w:t xml:space="preserve"> </w:t>
@@ -34690,10 +34758,10 @@
           <w:i/>
           <w:iCs/>
         </w:rPr>
-        <w:t xml:space="preserve">J. Chem. Inf. Model. 62(9)</w:t>
-      </w:r>
-      <w:r>
-        <w:t xml:space="preserve">:2064–2076. doi:10.1021/acs.jcim.1c00600.</w:t>
+        <w:t xml:space="preserve">Chem. Sci. 10(6)</w:t>
+      </w:r>
+      <w:r>
+        <w:t xml:space="preserve">:1692–1701. doi:10.1039/C8SC04175J.</w:t>
       </w:r>
       <w:bookmarkEnd w:id="183"/>
     </w:p>
@@ -34712,11 +34780,11 @@
           <w:rFonts w:ascii="Times New Roman" w:hAnsi="Times New Roman"/>
           <w:sz w:val="20"/>
         </w:rPr>
-        <w:t xml:space="preserve">42. </w:t>
-      </w:r>
-      <w:bookmarkStart w:id="184" w:name="ref-winter2019cddd"/>
-      <w:r>
-        <w:t xml:space="preserve">Winter, R., Montanari, F., Noé, F., &amp; Clevert, D.-A. (2019). Learning continuous and data-driven molecular descriptors by translating equivalent chemical representations.</w:t>
+        <w:t xml:space="preserve">43. </w:t>
+      </w:r>
+      <w:bookmarkStart w:id="184" w:name="ref-maziarka2020molcyclegan"/>
+      <w:r>
+        <w:t xml:space="preserve">Maziarka, Ł., Pocha, A., Kaczmarczyk, J., Rataj, K., Danel, T., &amp; Warchoł, M. (2020). Mol-CycleGAN: a generative model for molecular optimization.</w:t>
       </w:r>
       <w:r>
         <w:t xml:space="preserve"> </w:t>
@@ -34726,10 +34794,10 @@
           <w:i/>
           <w:iCs/>
         </w:rPr>
-        <w:t xml:space="preserve">Chem. Sci. 10(6)</w:t>
-      </w:r>
-      <w:r>
-        <w:t xml:space="preserve">:1692–1701. doi:10.1039/C8SC04175J.</w:t>
+        <w:t xml:space="preserve">J. Cheminformatics 12</w:t>
+      </w:r>
+      <w:r>
+        <w:t xml:space="preserve">:2. doi:10.1186/s13321-019-0404-1.</w:t>
       </w:r>
       <w:bookmarkEnd w:id="184"/>
     </w:p>
@@ -34748,11 +34816,11 @@
           <w:rFonts w:ascii="Times New Roman" w:hAnsi="Times New Roman"/>
           <w:sz w:val="20"/>
         </w:rPr>
-        <w:t xml:space="preserve">43. </w:t>
-      </w:r>
-      <w:bookmarkStart w:id="185" w:name="ref-maziarka2020molcyclegan"/>
-      <w:r>
-        <w:t xml:space="preserve">Maziarka, Ł., Pocha, A., Kaczmarczyk, J., Rataj, K., Danel, T., &amp; Warchoł, M. (2020). Mol-CycleGAN: a generative model for molecular optimization.</w:t>
+        <w:t xml:space="preserve">44. </w:t>
+      </w:r>
+      <w:bookmarkStart w:id="185" w:name="ref-schneuing2022diffsbdd"/>
+      <w:r>
+        <w:t xml:space="preserve">Schneuing, A. et al. (2022). Structure-based Drug Design with Equivariant Diffusion Models.</w:t>
       </w:r>
       <w:r>
         <w:t xml:space="preserve"> </w:t>
@@ -34762,10 +34830,10 @@
           <w:i/>
           <w:iCs/>
         </w:rPr>
-        <w:t xml:space="preserve">J. Cheminformatics 12</w:t>
-      </w:r>
-      <w:r>
-        <w:t xml:space="preserve">:2. doi:10.1186/s13321-019-0404-1.</w:t>
+        <w:t xml:space="preserve">NeurIPS 2022 AI4Science Workshop</w:t>
+      </w:r>
+      <w:r>
+        <w:t xml:space="preserve">. arXiv:2210.13695.</w:t>
       </w:r>
       <w:bookmarkEnd w:id="185"/>
     </w:p>
@@ -34784,11 +34852,11 @@
           <w:rFonts w:ascii="Times New Roman" w:hAnsi="Times New Roman"/>
           <w:sz w:val="20"/>
         </w:rPr>
-        <w:t xml:space="preserve">44. </w:t>
-      </w:r>
-      <w:bookmarkStart w:id="186" w:name="ref-schneuing2022diffsbdd"/>
-      <w:r>
-        <w:t xml:space="preserve">Schneuing, A. et al. (2022). Structure-based Drug Design with Equivariant Diffusion Models.</w:t>
+        <w:t xml:space="preserve">45. </w:t>
+      </w:r>
+      <w:bookmarkStart w:id="186" w:name="ref-guan2023targetdiff"/>
+      <w:r>
+        <w:t xml:space="preserve">Guan, J. et al. (2023). 3D Equivariant Diffusion for Target-Aware Molecule Generation and Affinity Prediction.</w:t>
       </w:r>
       <w:r>
         <w:t xml:space="preserve"> </w:t>
@@ -34798,10 +34866,10 @@
           <w:i/>
           <w:iCs/>
         </w:rPr>
-        <w:t xml:space="preserve">NeurIPS 2022 AI4Science Workshop</w:t>
-      </w:r>
-      <w:r>
-        <w:t xml:space="preserve">. arXiv:2210.13695.</w:t>
+        <w:t xml:space="preserve">ICLR 2023</w:t>
+      </w:r>
+      <w:r>
+        <w:t xml:space="preserve">. arXiv:2303.03543.</w:t>
       </w:r>
       <w:bookmarkEnd w:id="186"/>
     </w:p>
@@ -34820,11 +34888,11 @@
           <w:rFonts w:ascii="Times New Roman" w:hAnsi="Times New Roman"/>
           <w:sz w:val="20"/>
         </w:rPr>
-        <w:t xml:space="preserve">45. </w:t>
-      </w:r>
-      <w:bookmarkStart w:id="187" w:name="ref-guan2023targetdiff"/>
-      <w:r>
-        <w:t xml:space="preserve">Guan, J. et al. (2023). 3D Equivariant Diffusion for Target-Aware Molecule Generation and Affinity Prediction.</w:t>
+        <w:t xml:space="preserve">46. </w:t>
+      </w:r>
+      <w:bookmarkStart w:id="187" w:name="ref-corso2023diffdock"/>
+      <w:r>
+        <w:t xml:space="preserve">Corso, G., Stärk, H., Jing, B., Barzilay, R., &amp; Jaakkola, T. (2023). DiffDock: Diffusion Steps, Twists, and Turns for Molecular Docking.</w:t>
       </w:r>
       <w:r>
         <w:t xml:space="preserve"> </w:t>
@@ -34837,7 +34905,7 @@
         <w:t xml:space="preserve">ICLR 2023</w:t>
       </w:r>
       <w:r>
-        <w:t xml:space="preserve">. arXiv:2303.03543.</w:t>
+        <w:t xml:space="preserve">. arXiv:2210.01776.</w:t>
       </w:r>
       <w:bookmarkEnd w:id="187"/>
     </w:p>
@@ -34856,11 +34924,11 @@
           <w:rFonts w:ascii="Times New Roman" w:hAnsi="Times New Roman"/>
           <w:sz w:val="20"/>
         </w:rPr>
-        <w:t xml:space="preserve">46. </w:t>
-      </w:r>
-      <w:bookmarkStart w:id="188" w:name="ref-corso2023diffdock"/>
-      <w:r>
-        <w:t xml:space="preserve">Corso, G., Stärk, H., Jing, B., Barzilay, R., &amp; Jaakkola, T. (2023). DiffDock: Diffusion Steps, Twists, and Turns for Molecular Docking.</w:t>
+        <w:t xml:space="preserve">47. </w:t>
+      </w:r>
+      <w:bookmarkStart w:id="188" w:name="ref-peng2022pocket2mol"/>
+      <w:r>
+        <w:t xml:space="preserve">Peng, X., Luo, S., Guan, J., Xie, Q., Peng, J., &amp; Ma, J. (2022). Pocket2Mol: Efficient Molecular Sampling Based on 3D Protein Pockets.</w:t>
       </w:r>
       <w:r>
         <w:t xml:space="preserve"> </w:t>
@@ -34870,10 +34938,10 @@
           <w:i/>
           <w:iCs/>
         </w:rPr>
-        <w:t xml:space="preserve">ICLR 2023</w:t>
-      </w:r>
-      <w:r>
-        <w:t xml:space="preserve">. arXiv:2210.01776.</w:t>
+        <w:t xml:space="preserve">ICML 2022</w:t>
+      </w:r>
+      <w:r>
+        <w:t xml:space="preserve">. arXiv:2205.07249.</w:t>
       </w:r>
       <w:bookmarkEnd w:id="188"/>
     </w:p>
@@ -34892,11 +34960,11 @@
           <w:rFonts w:ascii="Times New Roman" w:hAnsi="Times New Roman"/>
           <w:sz w:val="20"/>
         </w:rPr>
-        <w:t xml:space="preserve">47. </w:t>
-      </w:r>
-      <w:bookmarkStart w:id="189" w:name="ref-peng2022pocket2mol"/>
-      <w:r>
-        <w:t xml:space="preserve">Peng, X., Luo, S., Guan, J., Xie, Q., Peng, J., &amp; Ma, J. (2022). Pocket2Mol: Efficient Molecular Sampling Based on 3D Protein Pockets.</w:t>
+        <w:t xml:space="preserve">48. </w:t>
+      </w:r>
+      <w:bookmarkStart w:id="189" w:name="ref-nefati1996ann"/>
+      <w:r>
+        <w:t xml:space="preserve">Nefati, H., Cense, J.-M., &amp; Legendre, J.-J. (1996). Prediction of the Impact Sensitivity by Neural Networks.</w:t>
       </w:r>
       <w:r>
         <w:t xml:space="preserve"> </w:t>
@@ -34906,10 +34974,10 @@
           <w:i/>
           <w:iCs/>
         </w:rPr>
-        <w:t xml:space="preserve">ICML 2022</w:t>
-      </w:r>
-      <w:r>
-        <w:t xml:space="preserve">. arXiv:2205.07249.</w:t>
+        <w:t xml:space="preserve">J. Chem. Inf. Comput. Sci. 36(4)</w:t>
+      </w:r>
+      <w:r>
+        <w:t xml:space="preserve">:804–810. doi:10.1021/ci950223m.</w:t>
       </w:r>
       <w:bookmarkEnd w:id="189"/>
     </w:p>
@@ -34928,11 +34996,11 @@
           <w:rFonts w:ascii="Times New Roman" w:hAnsi="Times New Roman"/>
           <w:sz w:val="20"/>
         </w:rPr>
-        <w:t xml:space="preserve">48. </w:t>
-      </w:r>
-      <w:bookmarkStart w:id="190" w:name="ref-nefati1996ann"/>
-      <w:r>
-        <w:t xml:space="preserve">Nefati, H., Cense, J.-M., &amp; Legendre, J.-J. (1996). Prediction of the Impact Sensitivity by Neural Networks.</w:t>
+        <w:t xml:space="preserve">49. </w:t>
+      </w:r>
+      <w:bookmarkStart w:id="190" w:name="ref-klapotke2017nitrogen"/>
+      <w:r>
+        <w:t xml:space="preserve">Klapötke, T. M.</w:t>
       </w:r>
       <w:r>
         <w:t xml:space="preserve"> </w:t>
@@ -34942,10 +35010,10 @@
           <w:i/>
           <w:iCs/>
         </w:rPr>
-        <w:t xml:space="preserve">J. Chem. Inf. Comput. Sci. 36(4)</w:t>
-      </w:r>
-      <w:r>
-        <w:t xml:space="preserve">:804–810. doi:10.1021/ci950223m.</w:t>
+        <w:t xml:space="preserve">Chemistry of High-Energy Materials</w:t>
+      </w:r>
+      <w:r>
+        <w:t xml:space="preserve">, 5th ed. (de Gruyter, 2019). doi:10.1515/9783110624571.</w:t>
       </w:r>
       <w:bookmarkEnd w:id="190"/>
     </w:p>
@@ -34964,11 +35032,11 @@
           <w:rFonts w:ascii="Times New Roman" w:hAnsi="Times New Roman"/>
           <w:sz w:val="20"/>
         </w:rPr>
-        <w:t xml:space="preserve">49. </w:t>
-      </w:r>
-      <w:bookmarkStart w:id="191" w:name="ref-klapotke2017nitrogen"/>
-      <w:r>
-        <w:t xml:space="preserve">Klapötke, T. M.</w:t>
+        <w:t xml:space="preserve">50. </w:t>
+      </w:r>
+      <w:bookmarkStart w:id="191" w:name="ref-griffiths2020constrained"/>
+      <w:r>
+        <w:t xml:space="preserve">Griffiths, R.-R., &amp; Hernández-Lobato, J. M. (2020). Constrained Bayesian optimization for automatic chemical design using variational autoencoders.</w:t>
       </w:r>
       <w:r>
         <w:t xml:space="preserve"> </w:t>
@@ -34978,10 +35046,10 @@
           <w:i/>
           <w:iCs/>
         </w:rPr>
-        <w:t xml:space="preserve">Chemistry of High-Energy Materials</w:t>
-      </w:r>
-      <w:r>
-        <w:t xml:space="preserve">, 5th ed. (de Gruyter, 2019). doi:10.1515/9783110624571.</w:t>
+        <w:t xml:space="preserve">Chem. Sci. 11(2)</w:t>
+      </w:r>
+      <w:r>
+        <w:t xml:space="preserve">:577–586. doi:10.1039/C9SC04026A.</w:t>
       </w:r>
       <w:bookmarkEnd w:id="191"/>
     </w:p>
@@ -35000,11 +35068,11 @@
           <w:rFonts w:ascii="Times New Roman" w:hAnsi="Times New Roman"/>
           <w:sz w:val="20"/>
         </w:rPr>
-        <w:t xml:space="preserve">50. </w:t>
-      </w:r>
-      <w:bookmarkStart w:id="192" w:name="ref-griffiths2020constrained"/>
-      <w:r>
-        <w:t xml:space="preserve">Griffiths, R.-R., &amp; Hernández-Lobato, J. M. (2020). Constrained Bayesian optimization for automatic chemical design using variational autoencoders.</w:t>
+        <w:t xml:space="preserve">51. </w:t>
+      </w:r>
+      <w:bookmarkStart w:id="192" w:name="ref-yang2019chemprop"/>
+      <w:r>
+        <w:t xml:space="preserve">Yang, K. et al. (2019). Analyzing Learned Molecular Representations for Property Prediction.</w:t>
       </w:r>
       <w:r>
         <w:t xml:space="preserve"> </w:t>
@@ -35014,10 +35082,10 @@
           <w:i/>
           <w:iCs/>
         </w:rPr>
-        <w:t xml:space="preserve">Chem. Sci. 11(2)</w:t>
-      </w:r>
-      <w:r>
-        <w:t xml:space="preserve">:577–586. doi:10.1039/C9SC04026A.</w:t>
+        <w:t xml:space="preserve">J. Chem. Inf. Model. 59(8)</w:t>
+      </w:r>
+      <w:r>
+        <w:t xml:space="preserve">:3370–3388. doi:10.1021/acs.jcim.9b00237.</w:t>
       </w:r>
       <w:bookmarkEnd w:id="192"/>
     </w:p>
@@ -35036,11 +35104,11 @@
           <w:rFonts w:ascii="Times New Roman" w:hAnsi="Times New Roman"/>
           <w:sz w:val="20"/>
         </w:rPr>
-        <w:t xml:space="preserve">51. </w:t>
-      </w:r>
-      <w:bookmarkStart w:id="193" w:name="ref-yang2019chemprop"/>
-      <w:r>
-        <w:t xml:space="preserve">Yang, K. et al. (2019). Analyzing Learned Molecular Representations for Property Prediction.</w:t>
+        <w:t xml:space="preserve">52. </w:t>
+      </w:r>
+      <w:bookmarkStart w:id="193" w:name="ref-schutt2018schnet"/>
+      <w:r>
+        <w:t xml:space="preserve">Schütt, K. T., Sauceda, H. E., Kindermans, P.-J., Tkatchenko, A., &amp; Müller, K.-R. (2018). SchNet: A deep learning architecture for molecules and materials.</w:t>
       </w:r>
       <w:r>
         <w:t xml:space="preserve"> </w:t>
@@ -35050,10 +35118,10 @@
           <w:i/>
           <w:iCs/>
         </w:rPr>
-        <w:t xml:space="preserve">J. Chem. Inf. Model. 59(8)</w:t>
-      </w:r>
-      <w:r>
-        <w:t xml:space="preserve">:3370–3388. doi:10.1021/acs.jcim.9b00237.</w:t>
+        <w:t xml:space="preserve">J. Chem. Phys. 148</w:t>
+      </w:r>
+      <w:r>
+        <w:t xml:space="preserve">:241722. doi:10.1063/1.5019779.</w:t>
       </w:r>
       <w:bookmarkEnd w:id="193"/>
     </w:p>
@@ -35072,11 +35140,11 @@
           <w:rFonts w:ascii="Times New Roman" w:hAnsi="Times New Roman"/>
           <w:sz w:val="20"/>
         </w:rPr>
-        <w:t xml:space="preserve">52. </w:t>
-      </w:r>
-      <w:bookmarkStart w:id="194" w:name="ref-schutt2018schnet"/>
-      <w:r>
-        <w:t xml:space="preserve">Schütt, K. T., Sauceda, H. E., Kindermans, P.-J., Tkatchenko, A., &amp; Müller, K.-R. (2018). SchNet: A deep learning architecture for molecules and materials.</w:t>
+        <w:t xml:space="preserve">53. </w:t>
+      </w:r>
+      <w:bookmarkStart w:id="194" w:name="ref-qiao2020orbnet"/>
+      <w:r>
+        <w:t xml:space="preserve">Qiao, Z., Welborn, M., Anandkumar, A., Manby, F. R., &amp; Miller III, T. F. (2020). OrbNet: Deep learning for quantum chemistry using symmetry-adapted atomic-orbital features.</w:t>
       </w:r>
       <w:r>
         <w:t xml:space="preserve"> </w:t>
@@ -35086,10 +35154,10 @@
           <w:i/>
           <w:iCs/>
         </w:rPr>
-        <w:t xml:space="preserve">J. Chem. Phys. 148</w:t>
-      </w:r>
-      <w:r>
-        <w:t xml:space="preserve">:241722. doi:10.1063/1.5019779.</w:t>
+        <w:t xml:space="preserve">J. Chem. Phys. 153</w:t>
+      </w:r>
+      <w:r>
+        <w:t xml:space="preserve">:124111. doi:10.1063/5.0021955.</w:t>
       </w:r>
       <w:bookmarkEnd w:id="194"/>
     </w:p>
@@ -35108,11 +35176,11 @@
           <w:rFonts w:ascii="Times New Roman" w:hAnsi="Times New Roman"/>
           <w:sz w:val="20"/>
         </w:rPr>
-        <w:t xml:space="preserve">53. </w:t>
-      </w:r>
-      <w:bookmarkStart w:id="195" w:name="ref-qiao2020orbnet"/>
-      <w:r>
-        <w:t xml:space="preserve">Qiao, Z., Welborn, M., Anandkumar, A., Manby, F. R., &amp; Miller III, T. F. (2020). OrbNet: Deep learning for quantum chemistry using symmetry-adapted atomic-orbital features.</w:t>
+        <w:t xml:space="preserve">54. </w:t>
+      </w:r>
+      <w:bookmarkStart w:id="195" w:name="ref-brown2019guacamol"/>
+      <w:r>
+        <w:t xml:space="preserve">Brown, N., Fiscato, M., Segler, M. H. S., &amp; Vaucher, A. C. (2019). GuacaMol: Benchmarking Models for de Novo Molecular Design.</w:t>
       </w:r>
       <w:r>
         <w:t xml:space="preserve"> </w:t>
@@ -35122,10 +35190,10 @@
           <w:i/>
           <w:iCs/>
         </w:rPr>
-        <w:t xml:space="preserve">J. Chem. Phys. 153</w:t>
-      </w:r>
-      <w:r>
-        <w:t xml:space="preserve">:124111. doi:10.1063/5.0021955.</w:t>
+        <w:t xml:space="preserve">J. Chem. Inf. Model. 59(3)</w:t>
+      </w:r>
+      <w:r>
+        <w:t xml:space="preserve">:1096–1108. doi:10.1021/acs.jcim.8b00839.</w:t>
       </w:r>
       <w:bookmarkEnd w:id="195"/>
     </w:p>
@@ -35144,11 +35212,11 @@
           <w:rFonts w:ascii="Times New Roman" w:hAnsi="Times New Roman"/>
           <w:sz w:val="20"/>
         </w:rPr>
-        <w:t xml:space="preserve">54. </w:t>
-      </w:r>
-      <w:bookmarkStart w:id="196" w:name="ref-brown2019guacamol"/>
-      <w:r>
-        <w:t xml:space="preserve">Brown, N., Fiscato, M., Segler, M. H. S., &amp; Vaucher, A. C. (2019). GuacaMol: Benchmarking Models for de Novo Molecular Design.</w:t>
+        <w:t xml:space="preserve">55. </w:t>
+      </w:r>
+      <w:bookmarkStart w:id="196" w:name="ref-polykovskiy2020moses"/>
+      <w:r>
+        <w:t xml:space="preserve">Polykovskiy, D. et al. (2020). Molecular Sets (MOSES): A Benchmarking Platform for Molecular Generation Models.</w:t>
       </w:r>
       <w:r>
         <w:t xml:space="preserve"> </w:t>
@@ -35158,10 +35226,10 @@
           <w:i/>
           <w:iCs/>
         </w:rPr>
-        <w:t xml:space="preserve">J. Chem. Inf. Model. 59(3)</w:t>
-      </w:r>
-      <w:r>
-        <w:t xml:space="preserve">:1096–1108. doi:10.1021/acs.jcim.8b00839.</w:t>
+        <w:t xml:space="preserve">Frontiers in Pharmacology 11</w:t>
+      </w:r>
+      <w:r>
+        <w:t xml:space="preserve">:565644. doi:10.3389/fphar.2020.565644.</w:t>
       </w:r>
       <w:bookmarkEnd w:id="196"/>
     </w:p>
@@ -35180,11 +35248,11 @@
           <w:rFonts w:ascii="Times New Roman" w:hAnsi="Times New Roman"/>
           <w:sz w:val="20"/>
         </w:rPr>
-        <w:t xml:space="preserve">55. </w:t>
-      </w:r>
-      <w:bookmarkStart w:id="197" w:name="ref-polykovskiy2020moses"/>
-      <w:r>
-        <w:t xml:space="preserve">Polykovskiy, D. et al. (2020). Molecular Sets (MOSES): A Benchmarking Platform for Molecular Generation Models.</w:t>
+        <w:t xml:space="preserve">56. </w:t>
+      </w:r>
+      <w:bookmarkStart w:id="197" w:name="ref-preuer2018fcd"/>
+      <w:r>
+        <w:t xml:space="preserve">Preuer, K., Renz, P., Unterthiner, T., Hochreiter, S., &amp; Klambauer, G. (2018). Fréchet ChemNet Distance: A Metric for Generative Models for Molecules in Drug Discovery.</w:t>
       </w:r>
       <w:r>
         <w:t xml:space="preserve"> </w:t>
@@ -35194,10 +35262,10 @@
           <w:i/>
           <w:iCs/>
         </w:rPr>
-        <w:t xml:space="preserve">Frontiers in Pharmacology 11</w:t>
-      </w:r>
-      <w:r>
-        <w:t xml:space="preserve">:565644. doi:10.3389/fphar.2020.565644.</w:t>
+        <w:t xml:space="preserve">J. Chem. Inf. Model. 58(9)</w:t>
+      </w:r>
+      <w:r>
+        <w:t xml:space="preserve">:1736–1741.</w:t>
       </w:r>
       <w:bookmarkEnd w:id="197"/>
     </w:p>
@@ -35216,11 +35284,11 @@
           <w:rFonts w:ascii="Times New Roman" w:hAnsi="Times New Roman"/>
           <w:sz w:val="20"/>
         </w:rPr>
-        <w:t xml:space="preserve">56. </w:t>
-      </w:r>
-      <w:bookmarkStart w:id="198" w:name="ref-preuer2018fcd"/>
-      <w:r>
-        <w:t xml:space="preserve">Preuer, K., Renz, P., Unterthiner, T., Hochreiter, S., &amp; Klambauer, G. (2018). Fréchet ChemNet Distance: A Metric for Generative Models for Molecules in Drug Discovery.</w:t>
+        <w:t xml:space="preserve">57. </w:t>
+      </w:r>
+      <w:bookmarkStart w:id="198" w:name="ref-reymond2015gdb"/>
+      <w:r>
+        <w:t xml:space="preserve">Reymond, J.-L. (2015). The chemical space project.</w:t>
       </w:r>
       <w:r>
         <w:t xml:space="preserve"> </w:t>
@@ -35230,10 +35298,10 @@
           <w:i/>
           <w:iCs/>
         </w:rPr>
-        <w:t xml:space="preserve">J. Chem. Inf. Model. 58(9)</w:t>
-      </w:r>
-      <w:r>
-        <w:t xml:space="preserve">:1736–1741.</w:t>
+        <w:t xml:space="preserve">Acc. Chem. Res. 48(3)</w:t>
+      </w:r>
+      <w:r>
+        <w:t xml:space="preserve">:722–730.</w:t>
       </w:r>
       <w:bookmarkEnd w:id="198"/>
     </w:p>
@@ -35252,11 +35320,11 @@
           <w:rFonts w:ascii="Times New Roman" w:hAnsi="Times New Roman"/>
           <w:sz w:val="20"/>
         </w:rPr>
-        <w:t xml:space="preserve">57. </w:t>
-      </w:r>
-      <w:bookmarkStart w:id="199" w:name="ref-reymond2015gdb"/>
-      <w:r>
-        <w:t xml:space="preserve">Reymond, J.-L. (2015). The chemical space project.</w:t>
+        <w:t xml:space="preserve">58. </w:t>
+      </w:r>
+      <w:bookmarkStart w:id="199" w:name="ref-emdb"/>
+      <w:r>
+        <w:t xml:space="preserve">Hand-compilation of measured density, heat of formation, and detonation properties for ~3 000 known energetic CHNO compounds, assembled in this work from secondary literature compilations: Klapötke, T. M.</w:t>
       </w:r>
       <w:r>
         <w:t xml:space="preserve"> </w:t>
@@ -35266,10 +35334,39 @@
           <w:i/>
           <w:iCs/>
         </w:rPr>
-        <w:t xml:space="preserve">Acc. Chem. Res. 48(3)</w:t>
-      </w:r>
-      <w:r>
-        <w:t xml:space="preserve">:722–730.</w:t>
+        <w:t xml:space="preserve">Chemistry of High-Energy Materials</w:t>
+      </w:r>
+      <w:r>
+        <w:t xml:space="preserve">, 5th ed. (de Gruyter, 2019); Cooper, P. W.</w:t>
+      </w:r>
+      <w:r>
+        <w:t xml:space="preserve"> </w:t>
+      </w:r>
+      <w:r>
+        <w:rPr>
+          <w:i/>
+          <w:iCs/>
+        </w:rPr>
+        <w:t xml:space="preserve">Explosives Engineering</w:t>
+      </w:r>
+      <w:r>
+        <w:t xml:space="preserve"> </w:t>
+      </w:r>
+      <w:r>
+        <w:t xml:space="preserve">(Wiley-VCH, 1996); and Dobratz, B. M. &amp; Crawford, P. C.</w:t>
+      </w:r>
+      <w:r>
+        <w:t xml:space="preserve"> </w:t>
+      </w:r>
+      <w:r>
+        <w:rPr>
+          <w:i/>
+          <w:iCs/>
+        </w:rPr>
+        <w:t xml:space="preserve">LLNL Explosives Handbook: Properties of Chemical Explosives and Explosive Simulants</w:t>
+      </w:r>
+      <w:r>
+        <w:t xml:space="preserve">, UCRL-52997, Rev. 2 (Lawrence Livermore National Laboratory, 1985). Per-row provenance documented in Appendix A.1.</w:t>
       </w:r>
       <w:bookmarkEnd w:id="199"/>
     </w:p>
@@ -35288,55 +35385,27 @@
           <w:rFonts w:ascii="Times New Roman" w:hAnsi="Times New Roman"/>
           <w:sz w:val="20"/>
         </w:rPr>
-        <w:t xml:space="preserve">58. </w:t>
-      </w:r>
-      <w:bookmarkStart w:id="200" w:name="ref-emdb"/>
-      <w:r>
-        <w:t xml:space="preserve">Hand-compilation of measured density, heat of formation, and detonation properties for ~3 000 known energetic CHNO compounds, assembled in this work from secondary literature compilations: Klapötke, T. M.</w:t>
-      </w:r>
-      <w:r>
-        <w:t xml:space="preserve"> </w:t>
-      </w:r>
-      <w:r>
-        <w:rPr>
-          <w:i/>
-          <w:iCs/>
-        </w:rPr>
-        <w:t xml:space="preserve">Chemistry of High-Energy Materials</w:t>
-      </w:r>
-      <w:r>
-        <w:t xml:space="preserve">, 5th ed. (de Gruyter, 2019); Cooper, P. W.</w:t>
-      </w:r>
-      <w:r>
-        <w:t xml:space="preserve"> </w:t>
-      </w:r>
-      <w:r>
-        <w:rPr>
-          <w:i/>
-          <w:iCs/>
-        </w:rPr>
-        <w:t xml:space="preserve">Explosives Engineering</w:t>
-      </w:r>
-      <w:r>
-        <w:t xml:space="preserve"> </w:t>
-      </w:r>
-      <w:r>
-        <w:t xml:space="preserve">(Wiley-VCH, 1996); and Dobratz, B. M. &amp; Crawford, P. C.</w:t>
-      </w:r>
-      <w:r>
-        <w:t xml:space="preserve"> </w:t>
-      </w:r>
-      <w:r>
-        <w:rPr>
-          <w:i/>
-          <w:iCs/>
-        </w:rPr>
-        <w:t xml:space="preserve">LLNL Explosives Handbook: Properties of Chemical Explosives and Explosive Simulants</w:t>
-      </w:r>
-      <w:r>
-        <w:t xml:space="preserve">, UCRL-52997, Rev. 2 (Lawrence Livermore National Laboratory, 1985). Per-row provenance documented in Appendix A.1.</w:t>
-      </w:r>
-      <w:bookmarkEnd w:id="200"/>
+        <w:t xml:space="preserve">59. </w:t>
+      </w:r>
+      <w:bookmarkStart w:id="201" w:name="ref-cameo"/>
+      <w:r>
+        <w:t xml:space="preserve">NIST CAMEO Chemicals: Database of Hazardous Materials and Reactivity.</w:t>
+      </w:r>
+      <w:r>
+        <w:t xml:space="preserve"> </w:t>
+      </w:r>
+      <w:hyperlink r:id="rId200">
+        <w:r>
+          <w:rPr>
+            <w:rStyle w:val="Hyperlink"/>
+          </w:rPr>
+          <w:t xml:space="preserve">cameochemicals.noaa.gov</w:t>
+        </w:r>
+      </w:hyperlink>
+      <w:r>
+        <w:t xml:space="preserve">.</w:t>
+      </w:r>
+      <w:bookmarkEnd w:id="201"/>
     </w:p>
     <w:p>
       <w:pPr>
@@ -35353,25 +35422,27 @@
           <w:rFonts w:ascii="Times New Roman" w:hAnsi="Times New Roman"/>
           <w:sz w:val="20"/>
         </w:rPr>
-        <w:t xml:space="preserve">59. </w:t>
-      </w:r>
-      <w:bookmarkStart w:id="202" w:name="ref-cameo"/>
-      <w:r>
-        <w:t xml:space="preserve">NIST CAMEO Chemicals: Database of Hazardous Materials and Reactivity.</w:t>
-      </w:r>
-      <w:r>
-        <w:t xml:space="preserve"> </w:t>
-      </w:r>
-      <w:hyperlink r:id="rId201">
-        <w:r>
-          <w:rPr>
-            <w:rStyle w:val="Hyperlink"/>
-          </w:rPr>
-          <w:t xml:space="preserve">cameochemicals.noaa.gov</w:t>
-        </w:r>
-      </w:hyperlink>
-      <w:r>
-        <w:t xml:space="preserve">.</w:t>
+        <w:t xml:space="preserve">60. </w:t>
+      </w:r>
+      <w:bookmarkStart w:id="202" w:name="ref-bruns2020watson"/>
+      <w:r>
+        <w:t xml:space="preserve">Bruns, R. F., &amp; Watson, I. A. (2012). Rules for identifying potentially reactive or promiscuous compounds.</w:t>
+      </w:r>
+      <w:r>
+        <w:t xml:space="preserve"> </w:t>
+      </w:r>
+      <w:r>
+        <w:rPr>
+          <w:i/>
+          <w:iCs/>
+        </w:rPr>
+        <w:t xml:space="preserve">J. Med. Chem.</w:t>
+      </w:r>
+      <w:r>
+        <w:t xml:space="preserve"> </w:t>
+      </w:r>
+      <w:r>
+        <w:t xml:space="preserve">55(22):9763–9772. doi:10.1021/jm301008n. Used here as a SMARTS-based reactivity-demerit source.</w:t>
       </w:r>
       <w:bookmarkEnd w:id="202"/>
     </w:p>
@@ -35390,11 +35461,11 @@
           <w:rFonts w:ascii="Times New Roman" w:hAnsi="Times New Roman"/>
           <w:sz w:val="20"/>
         </w:rPr>
-        <w:t xml:space="preserve">60. </w:t>
-      </w:r>
-      <w:bookmarkStart w:id="203" w:name="ref-bruns2020watson"/>
-      <w:r>
-        <w:t xml:space="preserve">Bruns, R. F., &amp; Watson, I. A. (2012). Rules for identifying potentially reactive or promiscuous compounds.</w:t>
+        <w:t xml:space="preserve">61. </w:t>
+      </w:r>
+      <w:bookmarkStart w:id="203" w:name="ref-bannwarth2019gfn2"/>
+      <w:r>
+        <w:t xml:space="preserve">Bannwarth, C., Ehlert, S., &amp; Grimme, S. (2019). GFN2-xTB: An Accurate and Broadly Parametrized Self-Consistent Tight-Binding Quantum Chemical Method with Multipole Electrostatics and Density-Dependent Dispersion Contributions.</w:t>
       </w:r>
       <w:r>
         <w:t xml:space="preserve"> </w:t>
@@ -35404,13 +35475,10 @@
           <w:i/>
           <w:iCs/>
         </w:rPr>
-        <w:t xml:space="preserve">J. Med. Chem.</w:t>
-      </w:r>
-      <w:r>
-        <w:t xml:space="preserve"> </w:t>
-      </w:r>
-      <w:r>
-        <w:t xml:space="preserve">55(22):9763–9772. doi:10.1021/jm301008n. Used here as a SMARTS-based reactivity-demerit source.</w:t>
+        <w:t xml:space="preserve">J. Chem. Theory Comput. 15(3)</w:t>
+      </w:r>
+      <w:r>
+        <w:t xml:space="preserve">:1652–1671. doi:10.1021/acs.jctc.8b01176.</w:t>
       </w:r>
       <w:bookmarkEnd w:id="203"/>
     </w:p>
@@ -35429,11 +35497,11 @@
           <w:rFonts w:ascii="Times New Roman" w:hAnsi="Times New Roman"/>
           <w:sz w:val="20"/>
         </w:rPr>
-        <w:t xml:space="preserve">61. </w:t>
-      </w:r>
-      <w:bookmarkStart w:id="204" w:name="ref-bannwarth2019gfn2"/>
-      <w:r>
-        <w:t xml:space="preserve">Bannwarth, C., Ehlert, S., &amp; Grimme, S. (2019). GFN2-xTB: An Accurate and Broadly Parametrized Self-Consistent Tight-Binding Quantum Chemical Method with Multipole Electrostatics and Density-Dependent Dispersion Contributions.</w:t>
+        <w:t xml:space="preserve">62. </w:t>
+      </w:r>
+      <w:bookmarkStart w:id="204" w:name="ref-goerigk2017benchmark"/>
+      <w:r>
+        <w:t xml:space="preserve">Goerigk, L., Hansen, A., Bauer, C., Ehrlich, S., Najibi, A., &amp; Grimme, S. (2017). A look at the density functional theory zoo with the advanced GMTKN55 database for general main group thermochemistry, kinetics and noncovalent interactions.</w:t>
       </w:r>
       <w:r>
         <w:t xml:space="preserve"> </w:t>
@@ -35443,10 +35511,10 @@
           <w:i/>
           <w:iCs/>
         </w:rPr>
-        <w:t xml:space="preserve">J. Chem. Theory Comput. 15(3)</w:t>
-      </w:r>
-      <w:r>
-        <w:t xml:space="preserve">:1652–1671. doi:10.1021/acs.jctc.8b01176.</w:t>
+        <w:t xml:space="preserve">Phys. Chem. Chem. Phys. 19(48)</w:t>
+      </w:r>
+      <w:r>
+        <w:t xml:space="preserve">:32184–32215. doi:10.1039/C7CP04913G.</w:t>
       </w:r>
       <w:bookmarkEnd w:id="204"/>
     </w:p>
@@ -35465,11 +35533,11 @@
           <w:rFonts w:ascii="Times New Roman" w:hAnsi="Times New Roman"/>
           <w:sz w:val="20"/>
         </w:rPr>
-        <w:t xml:space="preserve">62. </w:t>
-      </w:r>
-      <w:bookmarkStart w:id="205" w:name="ref-goerigk2017benchmark"/>
-      <w:r>
-        <w:t xml:space="preserve">Goerigk, L., Hansen, A., Bauer, C., Ehrlich, S., Najibi, A., &amp; Grimme, S. (2017). A look at the density functional theory zoo with the advanced GMTKN55 database for general main group thermochemistry, kinetics and noncovalent interactions.</w:t>
+        <w:t xml:space="preserve">63. </w:t>
+      </w:r>
+      <w:bookmarkStart w:id="205" w:name="ref-bondi1964vdw"/>
+      <w:r>
+        <w:t xml:space="preserve">Bondi, A. (1964). van der Waals Volumes and Radii.</w:t>
       </w:r>
       <w:r>
         <w:t xml:space="preserve"> </w:t>
@@ -35479,10 +35547,10 @@
           <w:i/>
           <w:iCs/>
         </w:rPr>
-        <w:t xml:space="preserve">Phys. Chem. Chem. Phys. 19(48)</w:t>
-      </w:r>
-      <w:r>
-        <w:t xml:space="preserve">:32184–32215. doi:10.1039/C7CP04913G.</w:t>
+        <w:t xml:space="preserve">J. Phys. Chem. 68(3)</w:t>
+      </w:r>
+      <w:r>
+        <w:t xml:space="preserve">:441–451. doi:10.1021/j100785a001.</w:t>
       </w:r>
       <w:bookmarkEnd w:id="205"/>
     </w:p>
@@ -35501,11 +35569,11 @@
           <w:rFonts w:ascii="Times New Roman" w:hAnsi="Times New Roman"/>
           <w:sz w:val="20"/>
         </w:rPr>
-        <w:t xml:space="preserve">63. </w:t>
-      </w:r>
-      <w:bookmarkStart w:id="206" w:name="ref-bondi1964vdw"/>
-      <w:r>
-        <w:t xml:space="preserve">Bondi, A. (1964). van der Waals Volumes and Radii.</w:t>
+        <w:t xml:space="preserve">64. </w:t>
+      </w:r>
+      <w:bookmarkStart w:id="206" w:name="ref-genheden2020aizynth"/>
+      <w:r>
+        <w:t xml:space="preserve">Genheden, S., Thakkar, A., Chadimová, V., Reymond, J.-L., Engkvist, O., &amp; Bjerrum, E. J. (2020). AiZynthFinder: a fast, robust and flexible open-source software for retrosynthetic planning.</w:t>
       </w:r>
       <w:r>
         <w:t xml:space="preserve"> </w:t>
@@ -35515,10 +35583,10 @@
           <w:i/>
           <w:iCs/>
         </w:rPr>
-        <w:t xml:space="preserve">J. Phys. Chem. 68(3)</w:t>
-      </w:r>
-      <w:r>
-        <w:t xml:space="preserve">:441–451. doi:10.1021/j100785a001.</w:t>
+        <w:t xml:space="preserve">Journal of Cheminformatics 12</w:t>
+      </w:r>
+      <w:r>
+        <w:t xml:space="preserve">:70. doi:10.1186/s13321-020-00472-1.</w:t>
       </w:r>
       <w:bookmarkEnd w:id="206"/>
     </w:p>
@@ -35537,11 +35605,11 @@
           <w:rFonts w:ascii="Times New Roman" w:hAnsi="Times New Roman"/>
           <w:sz w:val="20"/>
         </w:rPr>
-        <w:t xml:space="preserve">64. </w:t>
-      </w:r>
-      <w:bookmarkStart w:id="207" w:name="ref-genheden2020aizynth"/>
-      <w:r>
-        <w:t xml:space="preserve">Genheden, S., Thakkar, A., Chadimová, V., Reymond, J.-L., Engkvist, O., &amp; Bjerrum, E. J. (2020). AiZynthFinder: a fast, robust and flexible open-source software for retrosynthetic planning.</w:t>
+        <w:t xml:space="preserve">65. </w:t>
+      </w:r>
+      <w:bookmarkStart w:id="207" w:name="ref-sun2020pyscf"/>
+      <w:r>
+        <w:t xml:space="preserve">Sun, Q., Zhang, X., Banerjee, S., Bao, P., et al. (2020). Recent developments in the PySCF program package.</w:t>
       </w:r>
       <w:r>
         <w:t xml:space="preserve"> </w:t>
@@ -35551,10 +35619,10 @@
           <w:i/>
           <w:iCs/>
         </w:rPr>
-        <w:t xml:space="preserve">Journal of Cheminformatics 12</w:t>
-      </w:r>
-      <w:r>
-        <w:t xml:space="preserve">:70. doi:10.1186/s13321-020-00472-1.</w:t>
+        <w:t xml:space="preserve">J. Chem. Phys. 153</w:t>
+      </w:r>
+      <w:r>
+        <w:t xml:space="preserve">:024109. doi:10.1063/5.0006074.</w:t>
       </w:r>
       <w:bookmarkEnd w:id="207"/>
     </w:p>
@@ -35573,11 +35641,11 @@
           <w:rFonts w:ascii="Times New Roman" w:hAnsi="Times New Roman"/>
           <w:sz w:val="20"/>
         </w:rPr>
-        <w:t xml:space="preserve">65. </w:t>
-      </w:r>
-      <w:bookmarkStart w:id="208" w:name="ref-sun2020pyscf"/>
-      <w:r>
-        <w:t xml:space="preserve">Sun, Q., Zhang, X., Banerjee, S., Bao, P., et al. (2020). Recent developments in the PySCF program package.</w:t>
+        <w:t xml:space="preserve">66. </w:t>
+      </w:r>
+      <w:bookmarkStart w:id="208" w:name="ref-perez2018film"/>
+      <w:r>
+        <w:t xml:space="preserve">Perez, E., Strub, F., de Vries, H., Dumoulin, V., &amp; Courville, A. (2018). FiLM: Visual Reasoning with a General Conditioning Layer.</w:t>
       </w:r>
       <w:r>
         <w:t xml:space="preserve"> </w:t>
@@ -35587,10 +35655,10 @@
           <w:i/>
           <w:iCs/>
         </w:rPr>
-        <w:t xml:space="preserve">J. Chem. Phys. 153</w:t>
-      </w:r>
-      <w:r>
-        <w:t xml:space="preserve">:024109. doi:10.1063/5.0006074.</w:t>
+        <w:t xml:space="preserve">AAAI 2018</w:t>
+      </w:r>
+      <w:r>
+        <w:t xml:space="preserve">. arXiv:1709.07871.</w:t>
       </w:r>
       <w:bookmarkEnd w:id="208"/>
     </w:p>
@@ -35609,11 +35677,11 @@
           <w:rFonts w:ascii="Times New Roman" w:hAnsi="Times New Roman"/>
           <w:sz w:val="20"/>
         </w:rPr>
-        <w:t xml:space="preserve">66. </w:t>
-      </w:r>
-      <w:bookmarkStart w:id="209" w:name="ref-perez2018film"/>
-      <w:r>
-        <w:t xml:space="preserve">Perez, E., Strub, F., de Vries, H., Dumoulin, V., &amp; Courville, A. (2018). FiLM: Visual Reasoning with a General Conditioning Layer.</w:t>
+        <w:t xml:space="preserve">67. </w:t>
+      </w:r>
+      <w:bookmarkStart w:id="209" w:name="ref-xu2023geoldm"/>
+      <w:r>
+        <w:t xml:space="preserve">Xu, M., Powers, A., Dror, R. O., Ermon, S., &amp; Leskovec, J. (2023). Geometric Latent Diffusion Models for 3D Molecule Generation.</w:t>
       </w:r>
       <w:r>
         <w:t xml:space="preserve"> </w:t>
@@ -35623,10 +35691,10 @@
           <w:i/>
           <w:iCs/>
         </w:rPr>
-        <w:t xml:space="preserve">AAAI 2018</w:t>
-      </w:r>
-      <w:r>
-        <w:t xml:space="preserve">. arXiv:1709.07871.</w:t>
+        <w:t xml:space="preserve">ICML 2023</w:t>
+      </w:r>
+      <w:r>
+        <w:t xml:space="preserve">. arXiv:2305.01140.</w:t>
       </w:r>
       <w:bookmarkEnd w:id="209"/>
     </w:p>
@@ -35645,11 +35713,11 @@
           <w:rFonts w:ascii="Times New Roman" w:hAnsi="Times New Roman"/>
           <w:sz w:val="20"/>
         </w:rPr>
-        <w:t xml:space="preserve">67. </w:t>
-      </w:r>
-      <w:bookmarkStart w:id="210" w:name="ref-xu2023geoldm"/>
-      <w:r>
-        <w:t xml:space="preserve">Xu, M., Powers, A., Dror, R. O., Ermon, S., &amp; Leskovec, J. (2023). Geometric Latent Diffusion Models for 3D Molecule Generation.</w:t>
+        <w:t xml:space="preserve">68. </w:t>
+      </w:r>
+      <w:bookmarkStart w:id="210" w:name="ref-npjcompmat2025"/>
+      <w:r>
+        <w:t xml:space="preserve">Liu, J., et al. (2025). De novo multi-objective generation framework for energetic materials with trading off energy and stability.</w:t>
       </w:r>
       <w:r>
         <w:t xml:space="preserve"> </w:t>
@@ -35659,10 +35727,10 @@
           <w:i/>
           <w:iCs/>
         </w:rPr>
-        <w:t xml:space="preserve">ICML 2023</w:t>
-      </w:r>
-      <w:r>
-        <w:t xml:space="preserve">. arXiv:2305.01140.</w:t>
+        <w:t xml:space="preserve">npj Computational Materials</w:t>
+      </w:r>
+      <w:r>
+        <w:t xml:space="preserve">. doi:10.1038/s41524-025-01845-6.</w:t>
       </w:r>
       <w:bookmarkEnd w:id="210"/>
     </w:p>
@@ -35681,11 +35749,11 @@
           <w:rFonts w:ascii="Times New Roman" w:hAnsi="Times New Roman"/>
           <w:sz w:val="20"/>
         </w:rPr>
-        <w:t xml:space="preserve">68. </w:t>
-      </w:r>
-      <w:bookmarkStart w:id="211" w:name="ref-npjcompmat2025"/>
-      <w:r>
-        <w:t xml:space="preserve">Liu, J., et al. (2025). De novo multi-objective generation framework for energetic materials with trading off energy and stability.</w:t>
+        <w:t xml:space="preserve">69. </w:t>
+      </w:r>
+      <w:bookmarkStart w:id="211" w:name="ref-choi2023prep"/>
+      <w:r>
+        <w:t xml:space="preserve">Choi, J. B., Nguyen, P. C. H., Sen, O., Udaykumar, H. S., &amp; Baek, S. (2023). Artificial Intelligence Approaches for Energetic Materials by Design: State of the Art, Challenges, and Future Directions.</w:t>
       </w:r>
       <w:r>
         <w:t xml:space="preserve"> </w:t>
@@ -35695,10 +35763,10 @@
           <w:i/>
           <w:iCs/>
         </w:rPr>
-        <w:t xml:space="preserve">npj Computational Materials</w:t>
-      </w:r>
-      <w:r>
-        <w:t xml:space="preserve">. doi:10.1038/s41524-025-01845-6.</w:t>
+        <w:t xml:space="preserve">Propellants, Explosives, Pyrotechnics 48(4)</w:t>
+      </w:r>
+      <w:r>
+        <w:t xml:space="preserve">, e202200276. doi:10.1002/prep.202200276.</w:t>
       </w:r>
       <w:bookmarkEnd w:id="211"/>
     </w:p>
@@ -35717,11 +35785,11 @@
           <w:rFonts w:ascii="Times New Roman" w:hAnsi="Times New Roman"/>
           <w:sz w:val="20"/>
         </w:rPr>
-        <w:t xml:space="preserve">69. </w:t>
-      </w:r>
-      <w:bookmarkStart w:id="212" w:name="ref-choi2023prep"/>
-      <w:r>
-        <w:t xml:space="preserve">Choi, J. B., Nguyen, P. C. H., Sen, O., Udaykumar, H. S., &amp; Baek, S. (2023). Artificial Intelligence Approaches for Energetic Materials by Design: State of the Art, Challenges, and Future Directions.</w:t>
+        <w:t xml:space="preserve">70. </w:t>
+      </w:r>
+      <w:bookmarkStart w:id="212" w:name="ref-csp-cgd-2023"/>
+      <w:r>
+        <w:t xml:space="preserve">Arnold, J. E., &amp; Day, G. M. (2023). Crystal Structure Prediction of Energetic Materials.</w:t>
       </w:r>
       <w:r>
         <w:t xml:space="preserve"> </w:t>
@@ -35731,10 +35799,10 @@
           <w:i/>
           <w:iCs/>
         </w:rPr>
-        <w:t xml:space="preserve">Propellants, Explosives, Pyrotechnics 48(4)</w:t>
-      </w:r>
-      <w:r>
-        <w:t xml:space="preserve">, e202200276. doi:10.1002/prep.202200276.</w:t>
+        <w:t xml:space="preserve">Crystal Growth &amp; Design</w:t>
+      </w:r>
+      <w:r>
+        <w:t xml:space="preserve">. doi:10.1021/acs.cgd.3c00706.</w:t>
       </w:r>
       <w:bookmarkEnd w:id="212"/>
     </w:p>
@@ -35753,45 +35821,9 @@
           <w:rFonts w:ascii="Times New Roman" w:hAnsi="Times New Roman"/>
           <w:sz w:val="20"/>
         </w:rPr>
-        <w:t xml:space="preserve">70. </w:t>
-      </w:r>
-      <w:bookmarkStart w:id="213" w:name="ref-csp-cgd-2023"/>
-      <w:r>
-        <w:t xml:space="preserve">Arnold, J. E., &amp; Day, G. M. (2023). Crystal Structure Prediction of Energetic Materials.</w:t>
-      </w:r>
-      <w:r>
-        <w:t xml:space="preserve"> </w:t>
-      </w:r>
-      <w:r>
-        <w:rPr>
-          <w:i/>
-          <w:iCs/>
-        </w:rPr>
-        <w:t xml:space="preserve">Crystal Growth &amp; Design</w:t>
-      </w:r>
-      <w:r>
-        <w:t xml:space="preserve">. doi:10.1021/acs.cgd.3c00706.</w:t>
-      </w:r>
-      <w:bookmarkEnd w:id="213"/>
-    </w:p>
-    <w:p>
-      <w:pPr>
-        <w:pStyle w:val="ReferenceEntry"/>
-        <w:spacing w:after="100"/>
-        <w:ind w:left="475" w:hanging="475"/>
-        <w:jc w:val="left"/>
-        <w:keepNext w:val="0"/>
-        <w:keepLines w:val="0"/>
-        <w:widowControl w:val="1"/>
-      </w:pPr>
-      <w:r>
-        <w:rPr>
-          <w:rFonts w:ascii="Times New Roman" w:hAnsi="Times New Roman"/>
-          <w:sz w:val="20"/>
-        </w:rPr>
         <w:t xml:space="preserve">71. </w:t>
       </w:r>
-      <w:bookmarkStart w:id="214" w:name="ref-mlcrystdens-cm-2024"/>
+      <w:bookmarkStart w:id="213" w:name="ref-mlcrystdens-cm-2024"/>
       <w:r>
         <w:t xml:space="preserve">Davis, J. V., Marrs III, F. W., Cawkwell, M. J., &amp; Manner, V. W. (2024). Machine Learning Models for High Explosive Crystal Density and Performance.</w:t>
       </w:r>
@@ -35808,9 +35840,9 @@
       <w:r>
         <w:t xml:space="preserve">, 11109–11118. doi:10.1021/acs.chemmater.4c01978.</w:t>
       </w:r>
-      <w:bookmarkEnd w:id="214"/>
+      <w:bookmarkEnd w:id="213"/>
     </w:p>
-    <w:bookmarkEnd w:id="215"/>
+    <w:bookmarkEnd w:id="214"/>
     <w:sectPr>
       <w:footerReference w:type="default" r:id="rId9"/>
       <w:pgSz w:h="15840" w:w="12240"/>

</xml_diff>

<commit_message>
Paper: normalize bibliography to citation-order numbering
Every inline citation is renumbered by order of first appearance and the
reference list reordered to match (Vancouver/MDPI numbered style). Fixes the
prior mismatch (displayed numbers vs list order) and converts all leftover
key placeholders ([gomez2018], [npjcompmat2025], ...) to sequential numbers.

- New reusable paper/normalize_citations.py.
- long_paper.html normalized in place (71 refs, first cite -> [1], 0 broken).
- build_molecules_html.py runs it per document: the Molecules main and SI order
  sections differently from the long paper, so each is renumbered in its own
  first-appearance sequence. All docx rebuilt.

NMI track intentionally out of scope for this pass.

Co-Authored-By: Claude Opus 4.8 <noreply@anthropic.com>
</commit_message>
<xml_diff>
--- a/paper/long_paper.docx
+++ b/paper/long_paper.docx
@@ -358,7 +358,7 @@
           <w:rPr>
             <w:rStyle w:val="Hyperlink"/>
           </w:rPr>
-          <w:t xml:space="preserve">[12]</w:t>
+          <w:t xml:space="preserve">[1]</w:t>
         </w:r>
       </w:hyperlink>
       <w:r>
@@ -372,7 +372,7 @@
           <w:rPr>
             <w:rStyle w:val="Hyperlink"/>
           </w:rPr>
-          <w:t xml:space="preserve">[15]</w:t>
+          <w:t xml:space="preserve">[2]</w:t>
         </w:r>
       </w:hyperlink>
       <w:hyperlink w:anchor="ref-zhou2023unimol">
@@ -380,7 +380,7 @@
           <w:rPr>
             <w:rStyle w:val="Hyperlink"/>
           </w:rPr>
-          <w:t xml:space="preserve">[16]</w:t>
+          <w:t xml:space="preserve">[3]</w:t>
         </w:r>
       </w:hyperlink>
       <w:r>
@@ -397,7 +397,7 @@
           <w:rPr>
             <w:rStyle w:val="Hyperlink"/>
           </w:rPr>
-          <w:t xml:space="preserve">[14]</w:t>
+          <w:t xml:space="preserve">[4]</w:t>
         </w:r>
       </w:hyperlink>
       <w:r>
@@ -1410,7 +1410,7 @@
           <w:rPr>
             <w:rStyle w:val="Hyperlink"/>
           </w:rPr>
-          <w:t xml:space="preserve">[gomez2018]</w:t>
+          <w:t xml:space="preserve">[5]</w:t>
         </w:r>
       </w:hyperlink>
       <w:r>
@@ -1427,7 +1427,7 @@
           <w:rPr>
             <w:rStyle w:val="Hyperlink"/>
           </w:rPr>
-          <w:t xml:space="preserve">[jin2018]</w:t>
+          <w:t xml:space="preserve">[6]</w:t>
         </w:r>
       </w:hyperlink>
       <w:r>
@@ -1444,7 +1444,7 @@
           <w:rPr>
             <w:rStyle w:val="Hyperlink"/>
           </w:rPr>
-          <w:t xml:space="preserve">[winter2019]</w:t>
+          <w:t xml:space="preserve">[7]</w:t>
         </w:r>
       </w:hyperlink>
       <w:r>
@@ -1461,7 +1461,7 @@
           <w:rPr>
             <w:rStyle w:val="Hyperlink"/>
           </w:rPr>
-          <w:t xml:space="preserve">[maziarka2020]</w:t>
+          <w:t xml:space="preserve">[8]</w:t>
         </w:r>
       </w:hyperlink>
       <w:r>
@@ -1478,7 +1478,7 @@
           <w:rPr>
             <w:rStyle w:val="Hyperlink"/>
           </w:rPr>
-          <w:t xml:space="preserve">[krenn2020]</w:t>
+          <w:t xml:space="preserve">[9]</w:t>
         </w:r>
       </w:hyperlink>
       <w:r>
@@ -1507,7 +1507,7 @@
           <w:rPr>
             <w:rStyle w:val="Hyperlink"/>
           </w:rPr>
-          <w:t xml:space="preserve">[eckmann2022]</w:t>
+          <w:t xml:space="preserve">[10]</w:t>
         </w:r>
       </w:hyperlink>
       <w:r>
@@ -1524,7 +1524,7 @@
           <w:rPr>
             <w:rStyle w:val="Hyperlink"/>
           </w:rPr>
-          <w:t xml:space="preserve">[reidenbach2023]</w:t>
+          <w:t xml:space="preserve">[11]</w:t>
         </w:r>
       </w:hyperlink>
       <w:r>
@@ -1541,7 +1541,7 @@
           <w:rPr>
             <w:rStyle w:val="Hyperlink"/>
           </w:rPr>
-          <w:t xml:space="preserve">[jaegle2021]</w:t>
+          <w:t xml:space="preserve">[12]</w:t>
         </w:r>
       </w:hyperlink>
       <w:r>
@@ -1570,7 +1570,7 @@
           <w:rPr>
             <w:rStyle w:val="Hyperlink"/>
           </w:rPr>
-          <w:t xml:space="preserve">[olivecrona2017]</w:t>
+          <w:t xml:space="preserve">[13]</w:t>
         </w:r>
       </w:hyperlink>
       <w:r>
@@ -1587,7 +1587,7 @@
           <w:rPr>
             <w:rStyle w:val="Hyperlink"/>
           </w:rPr>
-          <w:t xml:space="preserve">[loeffler2024]</w:t>
+          <w:t xml:space="preserve">[14]</w:t>
         </w:r>
       </w:hyperlink>
       <w:r>
@@ -1604,7 +1604,7 @@
           <w:rPr>
             <w:rStyle w:val="Hyperlink"/>
           </w:rPr>
-          <w:t xml:space="preserve">[yang2017]</w:t>
+          <w:t xml:space="preserve">[15]</w:t>
         </w:r>
       </w:hyperlink>
       <w:r>
@@ -1621,7 +1621,7 @@
           <w:rPr>
             <w:rStyle w:val="Hyperlink"/>
           </w:rPr>
-          <w:t xml:space="preserve">[bagal2022]</w:t>
+          <w:t xml:space="preserve">[16]</w:t>
         </w:r>
       </w:hyperlink>
       <w:r>
@@ -1638,7 +1638,7 @@
           <w:rPr>
             <w:rStyle w:val="Hyperlink"/>
           </w:rPr>
-          <w:t xml:space="preserve">[ross2022]</w:t>
+          <w:t xml:space="preserve">[17]</w:t>
         </w:r>
       </w:hyperlink>
       <w:r>
@@ -1655,7 +1655,7 @@
           <w:rPr>
             <w:rStyle w:val="Hyperlink"/>
           </w:rPr>
-          <w:t xml:space="preserve">[irwin2022]</w:t>
+          <w:t xml:space="preserve">[18]</w:t>
         </w:r>
       </w:hyperlink>
       <w:r>
@@ -1672,7 +1672,7 @@
           <w:rPr>
             <w:rStyle w:val="Hyperlink"/>
           </w:rPr>
-          <w:t xml:space="preserve">[bengio2021]</w:t>
+          <w:t xml:space="preserve">[19]</w:t>
         </w:r>
       </w:hyperlink>
       <w:r>
@@ -1689,7 +1689,7 @@
           <w:rPr>
             <w:rStyle w:val="Hyperlink"/>
           </w:rPr>
-          <w:t xml:space="preserve">[vignac2023]</w:t>
+          <w:t xml:space="preserve">[20]</w:t>
         </w:r>
       </w:hyperlink>
       <w:r>
@@ -1731,7 +1731,7 @@
           <w:rPr>
             <w:rStyle w:val="Hyperlink"/>
           </w:rPr>
-          <w:t xml:space="preserve">[ho2020]</w:t>
+          <w:t xml:space="preserve">[21]</w:t>
         </w:r>
       </w:hyperlink>
       <w:r>
@@ -1748,7 +1748,7 @@
           <w:rPr>
             <w:rStyle w:val="Hyperlink"/>
           </w:rPr>
-          <w:t xml:space="preserve">[song2019]</w:t>
+          <w:t xml:space="preserve">[22]</w:t>
         </w:r>
       </w:hyperlink>
       <w:r>
@@ -1762,7 +1762,7 @@
           <w:rPr>
             <w:rStyle w:val="Hyperlink"/>
           </w:rPr>
-          <w:t xml:space="preserve">[song2021]</w:t>
+          <w:t xml:space="preserve">[23]</w:t>
         </w:r>
       </w:hyperlink>
       <w:r>
@@ -1776,7 +1776,7 @@
           <w:rPr>
             <w:rStyle w:val="Hyperlink"/>
           </w:rPr>
-          <w:t xml:space="preserve">[rombach2022]</w:t>
+          <w:t xml:space="preserve">[24]</w:t>
         </w:r>
       </w:hyperlink>
       <w:r>
@@ -1805,7 +1805,7 @@
           <w:rPr>
             <w:rStyle w:val="Hyperlink"/>
           </w:rPr>
-          <w:t xml:space="preserve">[ho2022]</w:t>
+          <w:t xml:space="preserve">[4]</w:t>
         </w:r>
       </w:hyperlink>
       <w:r>
@@ -2091,7 +2091,7 @@
           <w:rPr>
             <w:rStyle w:val="Hyperlink"/>
           </w:rPr>
-          <w:t xml:space="preserve">[dhariwal2021]</w:t>
+          <w:t xml:space="preserve">[25]</w:t>
         </w:r>
       </w:hyperlink>
       <w:r>
@@ -2105,7 +2105,7 @@
           <w:rPr>
             <w:rStyle w:val="Hyperlink"/>
           </w:rPr>
-          <w:t xml:space="preserve">[perez2018]</w:t>
+          <w:t xml:space="preserve">[26]</w:t>
         </w:r>
       </w:hyperlink>
       <w:r>
@@ -2144,7 +2144,7 @@
           <w:rPr>
             <w:rStyle w:val="Hyperlink"/>
           </w:rPr>
-          <w:t xml:space="preserve">[hoogeboom2022]</w:t>
+          <w:t xml:space="preserve">[27]</w:t>
         </w:r>
       </w:hyperlink>
       <w:r>
@@ -2161,7 +2161,7 @@
           <w:rPr>
             <w:rStyle w:val="Hyperlink"/>
           </w:rPr>
-          <w:t xml:space="preserve">[schneuing2022]</w:t>
+          <w:t xml:space="preserve">[28]</w:t>
         </w:r>
       </w:hyperlink>
       <w:r>
@@ -2178,7 +2178,7 @@
           <w:rPr>
             <w:rStyle w:val="Hyperlink"/>
           </w:rPr>
-          <w:t xml:space="preserve">[guan2023]</w:t>
+          <w:t xml:space="preserve">[29]</w:t>
         </w:r>
       </w:hyperlink>
       <w:r>
@@ -2195,7 +2195,7 @@
           <w:rPr>
             <w:rStyle w:val="Hyperlink"/>
           </w:rPr>
-          <w:t xml:space="preserve">[peng2022]</w:t>
+          <w:t xml:space="preserve">[30]</w:t>
         </w:r>
       </w:hyperlink>
       <w:r>
@@ -2212,7 +2212,7 @@
           <w:rPr>
             <w:rStyle w:val="Hyperlink"/>
           </w:rPr>
-          <w:t xml:space="preserve">[corso2023]</w:t>
+          <w:t xml:space="preserve">[31]</w:t>
         </w:r>
       </w:hyperlink>
       <w:r>
@@ -2229,7 +2229,7 @@
           <w:rPr>
             <w:rStyle w:val="Hyperlink"/>
           </w:rPr>
-          <w:t xml:space="preserve">[peng2023]</w:t>
+          <w:t xml:space="preserve">[32]</w:t>
         </w:r>
       </w:hyperlink>
       <w:r>
@@ -2258,7 +2258,7 @@
           <w:rPr>
             <w:rStyle w:val="Hyperlink"/>
           </w:rPr>
-          <w:t xml:space="preserve">[xu2023]</w:t>
+          <w:t xml:space="preserve">[33]</w:t>
         </w:r>
       </w:hyperlink>
       <w:r>
@@ -2323,7 +2323,7 @@
           <w:rPr>
             <w:rStyle w:val="Hyperlink"/>
           </w:rPr>
-          <w:t xml:space="preserve">[kamlet1968]</w:t>
+          <w:t xml:space="preserve">[1]</w:t>
         </w:r>
       </w:hyperlink>
       <w:r>
@@ -2340,7 +2340,7 @@
           <w:rPr>
             <w:rStyle w:val="Hyperlink"/>
           </w:rPr>
-          <w:t xml:space="preserve">[casey2020]</w:t>
+          <w:t xml:space="preserve">[2]</w:t>
         </w:r>
       </w:hyperlink>
       <w:r>
@@ -2357,7 +2357,7 @@
           <w:rPr>
             <w:rStyle w:val="Hyperlink"/>
           </w:rPr>
-          <w:t xml:space="preserve">[zhou2023]</w:t>
+          <w:t xml:space="preserve">[3]</w:t>
         </w:r>
       </w:hyperlink>
       <w:r>
@@ -2374,7 +2374,7 @@
           <w:rPr>
             <w:rStyle w:val="Hyperlink"/>
           </w:rPr>
-          <w:t xml:space="preserve">[elton2018]</w:t>
+          <w:t xml:space="preserve">[34]</w:t>
         </w:r>
       </w:hyperlink>
       <w:r>
@@ -2430,7 +2430,7 @@
           <w:rPr>
             <w:rStyle w:val="Hyperlink"/>
           </w:rPr>
-          <w:t xml:space="preserve">[politzer2014]</w:t>
+          <w:t xml:space="preserve">[35]</w:t>
         </w:r>
       </w:hyperlink>
       <w:r>
@@ -2470,7 +2470,7 @@
           <w:rPr>
             <w:rStyle w:val="Hyperlink"/>
           </w:rPr>
-          <w:t xml:space="preserve">[mathieu2017]</w:t>
+          <w:t xml:space="preserve">[36]</w:t>
         </w:r>
       </w:hyperlink>
       <w:r>
@@ -2487,7 +2487,7 @@
           <w:rPr>
             <w:rStyle w:val="Hyperlink"/>
           </w:rPr>
-          <w:t xml:space="preserve">[suceska2018]</w:t>
+          <w:t xml:space="preserve">[37]</w:t>
         </w:r>
       </w:hyperlink>
       <w:r>
@@ -2504,7 +2504,7 @@
           <w:rPr>
             <w:rStyle w:val="Hyperlink"/>
           </w:rPr>
-          <w:t xml:space="preserve">[fried2014]</w:t>
+          <w:t xml:space="preserve">[38]</w:t>
         </w:r>
       </w:hyperlink>
       <w:r>
@@ -2521,7 +2521,7 @@
           <w:rPr>
             <w:rStyle w:val="Hyperlink"/>
           </w:rPr>
-          <w:t xml:space="preserve">[choi2023]</w:t>
+          <w:t xml:space="preserve">[39]</w:t>
         </w:r>
       </w:hyperlink>
       <w:r>
@@ -2535,7 +2535,7 @@
           <w:rPr>
             <w:rStyle w:val="Hyperlink"/>
           </w:rPr>
-          <w:t xml:space="preserve">[mlcrystdens2024]</w:t>
+          <w:t xml:space="preserve">[40]</w:t>
         </w:r>
       </w:hyperlink>
       <w:r>
@@ -2561,7 +2561,7 @@
           <w:rPr>
             <w:rStyle w:val="Hyperlink"/>
           </w:rPr>
-          <w:t xml:space="preserve">[nefati1996]</w:t>
+          <w:t xml:space="preserve">[41]</w:t>
         </w:r>
       </w:hyperlink>
       <w:r>
@@ -2578,7 +2578,7 @@
           <w:rPr>
             <w:rStyle w:val="Hyperlink"/>
           </w:rPr>
-          <w:t xml:space="preserve">[mathieu2017]</w:t>
+          <w:t xml:space="preserve">[36]</w:t>
         </w:r>
       </w:hyperlink>
       <w:r>
@@ -2595,7 +2595,7 @@
           <w:rPr>
             <w:rStyle w:val="Hyperlink"/>
           </w:rPr>
-          <w:t xml:space="preserve">[huang2021]</w:t>
+          <w:t xml:space="preserve">[42]</w:t>
         </w:r>
       </w:hyperlink>
       <w:r>
@@ -2624,7 +2624,7 @@
           <w:rPr>
             <w:rStyle w:val="Hyperlink"/>
           </w:rPr>
-          <w:t xml:space="preserve">[klapotke2017]</w:t>
+          <w:t xml:space="preserve">[43]</w:t>
         </w:r>
       </w:hyperlink>
       <w:r>
@@ -2666,7 +2666,7 @@
           <w:rPr>
             <w:rStyle w:val="Hyperlink"/>
           </w:rPr>
-          <w:t xml:space="preserve">[griffiths2020]</w:t>
+          <w:t xml:space="preserve">[44]</w:t>
         </w:r>
       </w:hyperlink>
       <w:r>
@@ -2680,7 +2680,7 @@
           <w:rPr>
             <w:rStyle w:val="Hyperlink"/>
           </w:rPr>
-          <w:t xml:space="preserve">[huang2021]</w:t>
+          <w:t xml:space="preserve">[42]</w:t>
         </w:r>
       </w:hyperlink>
       <w:r>
@@ -2694,7 +2694,7 @@
           <w:rPr>
             <w:rStyle w:val="Hyperlink"/>
           </w:rPr>
-          <w:t xml:space="preserve">[npjcompmat2025]</w:t>
+          <w:t xml:space="preserve">[45]</w:t>
         </w:r>
       </w:hyperlink>
       <w:r>
@@ -2787,7 +2787,7 @@
           <w:rPr>
             <w:rStyle w:val="Hyperlink"/>
           </w:rPr>
-          <w:t xml:space="preserve">[yang2019]</w:t>
+          <w:t xml:space="preserve">[46]</w:t>
         </w:r>
       </w:hyperlink>
       <w:r>
@@ -2804,7 +2804,7 @@
           <w:rPr>
             <w:rStyle w:val="Hyperlink"/>
           </w:rPr>
-          <w:t xml:space="preserve">[schutt2018]</w:t>
+          <w:t xml:space="preserve">[47]</w:t>
         </w:r>
       </w:hyperlink>
       <w:r>
@@ -2821,7 +2821,7 @@
           <w:rPr>
             <w:rStyle w:val="Hyperlink"/>
           </w:rPr>
-          <w:t xml:space="preserve">[qiao2020]</w:t>
+          <w:t xml:space="preserve">[48]</w:t>
         </w:r>
       </w:hyperlink>
       <w:r>
@@ -2863,7 +2863,7 @@
           <w:rPr>
             <w:rStyle w:val="Hyperlink"/>
           </w:rPr>
-          <w:t xml:space="preserve">[polykovskiy2020]</w:t>
+          <w:t xml:space="preserve">[49]</w:t>
         </w:r>
       </w:hyperlink>
       <w:r>
@@ -2880,7 +2880,7 @@
           <w:rPr>
             <w:rStyle w:val="Hyperlink"/>
           </w:rPr>
-          <w:t xml:space="preserve">[brown2019]</w:t>
+          <w:t xml:space="preserve">[50]</w:t>
         </w:r>
       </w:hyperlink>
       <w:r>
@@ -2897,7 +2897,7 @@
           <w:rPr>
             <w:rStyle w:val="Hyperlink"/>
           </w:rPr>
-          <w:t xml:space="preserve">[preuer2018]</w:t>
+          <w:t xml:space="preserve">[51]</w:t>
         </w:r>
       </w:hyperlink>
       <w:r>
@@ -2914,7 +2914,7 @@
           <w:rPr>
             <w:rStyle w:val="Hyperlink"/>
           </w:rPr>
-          <w:t xml:space="preserve">[reymond2015]</w:t>
+          <w:t xml:space="preserve">[52]</w:t>
         </w:r>
       </w:hyperlink>
       <w:r>
@@ -2940,7 +2940,7 @@
           <w:rPr>
             <w:rStyle w:val="Hyperlink"/>
           </w:rPr>
-          <w:t xml:space="preserve">[ertl2009]</w:t>
+          <w:t xml:space="preserve">[53]</w:t>
         </w:r>
       </w:hyperlink>
       <w:r>
@@ -2957,7 +2957,7 @@
           <w:rPr>
             <w:rStyle w:val="Hyperlink"/>
           </w:rPr>
-          <w:t xml:space="preserve">[coley2018]</w:t>
+          <w:t xml:space="preserve">[54]</w:t>
         </w:r>
       </w:hyperlink>
       <w:r>
@@ -2974,7 +2974,7 @@
           <w:rPr>
             <w:rStyle w:val="Hyperlink"/>
           </w:rPr>
-          <w:t xml:space="preserve">[rogers1960]</w:t>
+          <w:t xml:space="preserve">[55]</w:t>
         </w:r>
       </w:hyperlink>
       <w:r>
@@ -3032,7 +3032,7 @@
           <w:rPr>
             <w:rStyle w:val="Hyperlink"/>
           </w:rPr>
-          <w:t xml:space="preserve">[bannwarth2019]</w:t>
+          <w:t xml:space="preserve">[56]</w:t>
         </w:r>
       </w:hyperlink>
       <w:r>
@@ -3049,7 +3049,7 @@
           <w:rPr>
             <w:rStyle w:val="Hyperlink"/>
           </w:rPr>
-          <w:t xml:space="preserve">[sun2020]</w:t>
+          <w:t xml:space="preserve">[57]</w:t>
         </w:r>
       </w:hyperlink>
       <w:r>
@@ -3066,7 +3066,7 @@
           <w:rPr>
             <w:rStyle w:val="Hyperlink"/>
           </w:rPr>
-          <w:t xml:space="preserve">[genheden2020]</w:t>
+          <w:t xml:space="preserve">[58]</w:t>
         </w:r>
       </w:hyperlink>
       <w:r>
@@ -3083,7 +3083,7 @@
           <w:rPr>
             <w:rStyle w:val="Hyperlink"/>
           </w:rPr>
-          <w:t xml:space="preserve">[goerigk2017]</w:t>
+          <w:t xml:space="preserve">[59]</w:t>
         </w:r>
       </w:hyperlink>
       <w:r>
@@ -4533,7 +4533,7 @@
           <w:rPr>
             <w:rStyle w:val="Hyperlink"/>
           </w:rPr>
-          <w:t xml:space="preserve">[22a]</w:t>
+          <w:t xml:space="preserve">[60]</w:t>
         </w:r>
       </w:hyperlink>
       <w:r>
@@ -4750,7 +4750,7 @@
           <w:rPr>
             <w:rStyle w:val="Hyperlink"/>
           </w:rPr>
-          <w:t xml:space="preserve">[1]</w:t>
+          <w:t xml:space="preserve">[10]</w:t>
         </w:r>
       </w:hyperlink>
       <w:r>
@@ -6910,7 +6910,7 @@
           <w:rPr>
             <w:rStyle w:val="Hyperlink"/>
           </w:rPr>
-          <w:t xml:space="preserve">[dhariwal2021]</w:t>
+          <w:t xml:space="preserve">[25]</w:t>
         </w:r>
       </w:hyperlink>
       <w:r>
@@ -8118,7 +8118,7 @@
           <w:rPr>
             <w:rStyle w:val="Hyperlink"/>
           </w:rPr>
-          <w:t xml:space="preserve">[58a]</w:t>
+          <w:t xml:space="preserve">[42]</w:t>
         </w:r>
       </w:hyperlink>
       <w:r>
@@ -10980,7 +10980,7 @@
           <w:rPr>
             <w:rStyle w:val="Hyperlink"/>
           </w:rPr>
-          <w:t xml:space="preserve">[15a]</w:t>
+          <w:t xml:space="preserve">[25]</w:t>
         </w:r>
       </w:hyperlink>
       <w:r>
@@ -11412,7 +11412,7 @@
           <w:rPr>
             <w:rStyle w:val="Hyperlink"/>
           </w:rPr>
-          <w:t xml:space="preserve">[daylight-smarts]</w:t>
+          <w:t xml:space="preserve">[61]</w:t>
         </w:r>
       </w:hyperlink>
       <w:r>
@@ -11429,7 +11429,7 @@
           <w:rPr>
             <w:rStyle w:val="Hyperlink"/>
           </w:rPr>
-          <w:t xml:space="preserve">[19]</w:t>
+          <w:t xml:space="preserve">[53]</w:t>
         </w:r>
       </w:hyperlink>
       <w:r>
@@ -11454,7 +11454,7 @@
           <w:rPr>
             <w:rStyle w:val="Hyperlink"/>
           </w:rPr>
-          <w:t xml:space="preserve">[20]</w:t>
+          <w:t xml:space="preserve">[54]</w:t>
         </w:r>
       </w:hyperlink>
       <w:r>
@@ -13234,7 +13234,7 @@
           <w:rPr>
             <w:rStyle w:val="Hyperlink"/>
           </w:rPr>
-          <w:t xml:space="preserve">[18]</w:t>
+          <w:t xml:space="preserve">[21]</w:t>
         </w:r>
       </w:hyperlink>
       <w:r>
@@ -19918,7 +19918,7 @@
           <w:rPr>
             <w:rStyle w:val="Hyperlink"/>
           </w:rPr>
-          <w:t xml:space="preserve">[sabatini2018]</w:t>
+          <w:t xml:space="preserve">[62]</w:t>
         </w:r>
       </w:hyperlink>
       <w:hyperlink w:anchor="ref-konnov2025nitroisoxazole">
@@ -19926,7 +19926,7 @@
           <w:rPr>
             <w:rStyle w:val="Hyperlink"/>
           </w:rPr>
-          <w:t xml:space="preserve">[konnov2025]</w:t>
+          <w:t xml:space="preserve">[63]</w:t>
         </w:r>
       </w:hyperlink>
       <w:r>
@@ -19950,7 +19950,7 @@
           <w:rPr>
             <w:rStyle w:val="Hyperlink"/>
           </w:rPr>
-          <w:t xml:space="preserve">[herve2010]</w:t>
+          <w:t xml:space="preserve">[64]</w:t>
         </w:r>
       </w:hyperlink>
       <w:r>
@@ -20026,7 +20026,7 @@
           <w:rPr>
             <w:rStyle w:val="Hyperlink"/>
           </w:rPr>
-          <w:t xml:space="preserve">[23]</w:t>
+          <w:t xml:space="preserve">[65]</w:t>
         </w:r>
       </w:hyperlink>
       <w:r>
@@ -20822,7 +20822,7 @@
           <w:rPr>
             <w:rStyle w:val="Hyperlink"/>
           </w:rPr>
-          <w:t xml:space="preserve">[68]</w:t>
+          <w:t xml:space="preserve">[58]</w:t>
         </w:r>
       </w:hyperlink>
       <w:r>
@@ -33365,9 +33365,9 @@
         </w:rPr>
         <w:t xml:space="preserve">1. </w:t>
       </w:r>
-      <w:bookmarkStart w:id="140" w:name="ref-eckmann2022limo"/>
-      <w:r>
-        <w:t xml:space="preserve">Eckmann, P., Sun, K., Zhao, B., Feng, M., Gilson, M. K., &amp; Yu, R. (2022). LIMO: Latent Inceptionism for Targeted Molecule Generation.</w:t>
+      <w:bookmarkStart w:id="140" w:name="ref-kamlet1968detonation"/>
+      <w:r>
+        <w:t xml:space="preserve">Kamlet, M. J., &amp; Jacobs, S. J. (1968). Chemistry of Detonations. I. A Simple Method for Calculating Detonation Properties of C-H-N-O Explosives.</w:t>
       </w:r>
       <w:r>
         <w:t xml:space="preserve"> </w:t>
@@ -33377,10 +33377,10 @@
           <w:i/>
           <w:iCs/>
         </w:rPr>
-        <w:t xml:space="preserve">ICML 2022</w:t>
-      </w:r>
-      <w:r>
-        <w:t xml:space="preserve">. arXiv:2206.09010.</w:t>
+        <w:t xml:space="preserve">J. Chem. Phys. 48</w:t>
+      </w:r>
+      <w:r>
+        <w:t xml:space="preserve">:23–55. doi:10.1063/1.1667908.</w:t>
       </w:r>
       <w:bookmarkEnd w:id="140"/>
     </w:p>
@@ -33401,9 +33401,9 @@
         </w:rPr>
         <w:t xml:space="preserve">2. </w:t>
       </w:r>
-      <w:bookmarkStart w:id="141" w:name="ref-gomez2018automatic"/>
-      <w:r>
-        <w:t xml:space="preserve">Gómez-Bombarelli, R. et al. (2018). Automatic Chemical Design Using a Data-Driven Continuous Representation of Molecules.</w:t>
+      <w:bookmarkStart w:id="141" w:name="ref-casey2020prediction"/>
+      <w:r>
+        <w:t xml:space="preserve">Casey, A. D., Son, S. F., Bilionis, I., &amp; Barnes, B. C. (2020). Prediction of Energetic Material Properties from Electronic Structure Using 3D Convolutional Neural Networks.</w:t>
       </w:r>
       <w:r>
         <w:t xml:space="preserve"> </w:t>
@@ -33413,10 +33413,10 @@
           <w:i/>
           <w:iCs/>
         </w:rPr>
-        <w:t xml:space="preserve">ACS Central Science 4(2)</w:t>
-      </w:r>
-      <w:r>
-        <w:t xml:space="preserve">:268–276. doi:10.1021/acscentsci.7b00572.</w:t>
+        <w:t xml:space="preserve">J. Chem. Inf. Model. 60(10)</w:t>
+      </w:r>
+      <w:r>
+        <w:t xml:space="preserve">:4457–4473. doi:10.1021/acs.jcim.0c00259.</w:t>
       </w:r>
       <w:bookmarkEnd w:id="141"/>
     </w:p>
@@ -33437,9 +33437,9 @@
         </w:rPr>
         <w:t xml:space="preserve">3. </w:t>
       </w:r>
-      <w:bookmarkStart w:id="142" w:name="ref-jin2018junction"/>
-      <w:r>
-        <w:t xml:space="preserve">Jin, W., Barzilay, R., &amp; Jaakkola, T. (2018). Junction Tree Variational Autoencoder for Molecular Graph Generation.</w:t>
+      <w:bookmarkStart w:id="142" w:name="ref-zhou2023unimol"/>
+      <w:r>
+        <w:t xml:space="preserve">Zhou, G. et al. (2023). Uni-Mol: A Universal 3D Molecular Representation Learning Framework.</w:t>
       </w:r>
       <w:r>
         <w:t xml:space="preserve"> </w:t>
@@ -33449,10 +33449,10 @@
           <w:i/>
           <w:iCs/>
         </w:rPr>
-        <w:t xml:space="preserve">ICML 2018</w:t>
-      </w:r>
-      <w:r>
-        <w:t xml:space="preserve">. arXiv:1802.04364.</w:t>
+        <w:t xml:space="preserve">ICLR 2023</w:t>
+      </w:r>
+      <w:r>
+        <w:t xml:space="preserve">.</w:t>
       </w:r>
       <w:bookmarkEnd w:id="142"/>
     </w:p>
@@ -33473,9 +33473,9 @@
         </w:rPr>
         <w:t xml:space="preserve">4. </w:t>
       </w:r>
-      <w:bookmarkStart w:id="143" w:name="ref-reidenbach2023molmim"/>
-      <w:r>
-        <w:t xml:space="preserve">Reidenbach, D., Livne, M., Ilango, R. K., Gill, M., &amp; Israeli, J. (2023). MolMIM: A Molecular Language Model for Property-Guided Molecule Generation via Mutual Information Machines. (MLDD Workshop, ICLR 2023; arXiv:2208.09016).</w:t>
+      <w:bookmarkStart w:id="143" w:name="ref-ho2022cfg"/>
+      <w:r>
+        <w:t xml:space="preserve">Ho, J., &amp; Salimans, T. (2022). Classifier-Free Diffusion Guidance. arXiv:2207.12598.</w:t>
       </w:r>
       <w:bookmarkEnd w:id="143"/>
     </w:p>
@@ -33496,9 +33496,9 @@
         </w:rPr>
         <w:t xml:space="preserve">5. </w:t>
       </w:r>
-      <w:bookmarkStart w:id="144" w:name="ref-ross2022molformer"/>
-      <w:r>
-        <w:t xml:space="preserve">Ross, J. et al. (2022). Large-Scale Chemical Language Representations Capture Molecular Structure and Properties.</w:t>
+      <w:bookmarkStart w:id="144" w:name="ref-gomez2018automatic"/>
+      <w:r>
+        <w:t xml:space="preserve">Gómez-Bombarelli, R. et al. (2018). Automatic Chemical Design Using a Data-Driven Continuous Representation of Molecules.</w:t>
       </w:r>
       <w:r>
         <w:t xml:space="preserve"> </w:t>
@@ -33508,10 +33508,10 @@
           <w:i/>
           <w:iCs/>
         </w:rPr>
-        <w:t xml:space="preserve">Nature Machine Intelligence 4</w:t>
-      </w:r>
-      <w:r>
-        <w:t xml:space="preserve">:1256–1264. doi:10.1038/s42256-022-00580-7.</w:t>
+        <w:t xml:space="preserve">ACS Central Science 4(2)</w:t>
+      </w:r>
+      <w:r>
+        <w:t xml:space="preserve">:268–276. doi:10.1021/acscentsci.7b00572.</w:t>
       </w:r>
       <w:bookmarkEnd w:id="144"/>
     </w:p>
@@ -33532,9 +33532,9 @@
         </w:rPr>
         <w:t xml:space="preserve">6. </w:t>
       </w:r>
-      <w:bookmarkStart w:id="145" w:name="ref-bengio2021gflownet"/>
-      <w:r>
-        <w:t xml:space="preserve">Bengio, E., Jain, M., Korablyov, M., Precup, D., &amp; Bengio, Y. (2021). Flow Network Based Generative Models for Non-Iterative Diverse Candidate Generation.</w:t>
+      <w:bookmarkStart w:id="145" w:name="ref-jin2018junction"/>
+      <w:r>
+        <w:t xml:space="preserve">Jin, W., Barzilay, R., &amp; Jaakkola, T. (2018). Junction Tree Variational Autoencoder for Molecular Graph Generation.</w:t>
       </w:r>
       <w:r>
         <w:t xml:space="preserve"> </w:t>
@@ -33544,10 +33544,10 @@
           <w:i/>
           <w:iCs/>
         </w:rPr>
-        <w:t xml:space="preserve">NeurIPS 2021</w:t>
-      </w:r>
-      <w:r>
-        <w:t xml:space="preserve">. arXiv:2106.04399.</w:t>
+        <w:t xml:space="preserve">ICML 2018</w:t>
+      </w:r>
+      <w:r>
+        <w:t xml:space="preserve">. arXiv:1802.04364.</w:t>
       </w:r>
       <w:bookmarkEnd w:id="145"/>
     </w:p>
@@ -33568,9 +33568,9 @@
         </w:rPr>
         <w:t xml:space="preserve">7. </w:t>
       </w:r>
-      <w:bookmarkStart w:id="146" w:name="ref-hoogeboom2022edm"/>
-      <w:r>
-        <w:t xml:space="preserve">Hoogeboom, E., Garcia Satorras, V., Vignac, C., &amp; Welling, M. (2022). Equivariant Diffusion for Molecule Generation in 3D.</w:t>
+      <w:bookmarkStart w:id="146" w:name="ref-winter2019cddd"/>
+      <w:r>
+        <w:t xml:space="preserve">Winter, R., Montanari, F., Noé, F., &amp; Clevert, D.-A. (2019). Learning continuous and data-driven molecular descriptors by translating equivalent chemical representations.</w:t>
       </w:r>
       <w:r>
         <w:t xml:space="preserve"> </w:t>
@@ -33580,10 +33580,10 @@
           <w:i/>
           <w:iCs/>
         </w:rPr>
-        <w:t xml:space="preserve">ICML 2022</w:t>
-      </w:r>
-      <w:r>
-        <w:t xml:space="preserve">. arXiv:2203.17003.</w:t>
+        <w:t xml:space="preserve">Chem. Sci. 10(6)</w:t>
+      </w:r>
+      <w:r>
+        <w:t xml:space="preserve">:1692–1701. doi:10.1039/C8SC04175J.</w:t>
       </w:r>
       <w:bookmarkEnd w:id="146"/>
     </w:p>
@@ -33604,9 +33604,9 @@
         </w:rPr>
         <w:t xml:space="preserve">8. </w:t>
       </w:r>
-      <w:bookmarkStart w:id="147" w:name="ref-vignac2023digress"/>
-      <w:r>
-        <w:t xml:space="preserve">Vignac, C. et al. (2023). DiGress: Discrete Denoising Diffusion for Graph Generation.</w:t>
+      <w:bookmarkStart w:id="147" w:name="ref-maziarka2020molcyclegan"/>
+      <w:r>
+        <w:t xml:space="preserve">Maziarka, Ł., Pocha, A., Kaczmarczyk, J., Rataj, K., Danel, T., &amp; Warchoł, M. (2020). Mol-CycleGAN: a generative model for molecular optimization.</w:t>
       </w:r>
       <w:r>
         <w:t xml:space="preserve"> </w:t>
@@ -33616,10 +33616,10 @@
           <w:i/>
           <w:iCs/>
         </w:rPr>
-        <w:t xml:space="preserve">ICLR 2023</w:t>
-      </w:r>
-      <w:r>
-        <w:t xml:space="preserve">. arXiv:2209.14734.</w:t>
+        <w:t xml:space="preserve">J. Cheminformatics 12</w:t>
+      </w:r>
+      <w:r>
+        <w:t xml:space="preserve">:2. doi:10.1186/s13321-019-0404-1.</w:t>
       </w:r>
       <w:bookmarkEnd w:id="147"/>
     </w:p>
@@ -33640,9 +33640,9 @@
         </w:rPr>
         <w:t xml:space="preserve">9. </w:t>
       </w:r>
-      <w:bookmarkStart w:id="148" w:name="ref-irwin2022chemformer"/>
-      <w:r>
-        <w:t xml:space="preserve">Irwin, R., Dimitriadis, S., He, J., &amp; Bjerrum, E. J. (2022). Chemformer: A Pre-Trained Transformer for Computational Chemistry.</w:t>
+      <w:bookmarkStart w:id="148" w:name="ref-krenn2020selfies"/>
+      <w:r>
+        <w:t xml:space="preserve">Krenn, M., Häse, F., Nigam, A., Friederich, P., &amp; Aspuru-Guzik, A. (2020). Self-Referencing Embedded Strings (SELFIES): A 100% Robust Molecular String Representation.</w:t>
       </w:r>
       <w:r>
         <w:t xml:space="preserve"> </w:t>
@@ -33652,10 +33652,10 @@
           <w:i/>
           <w:iCs/>
         </w:rPr>
-        <w:t xml:space="preserve">Mach. Learn.: Sci. Tech. 3</w:t>
-      </w:r>
-      <w:r>
-        <w:t xml:space="preserve">:015022. doi:10.1088/2632-2153/ac3ffb.</w:t>
+        <w:t xml:space="preserve">Mach. Learn.: Sci. Tech. 1</w:t>
+      </w:r>
+      <w:r>
+        <w:t xml:space="preserve">:045024.</w:t>
       </w:r>
       <w:bookmarkEnd w:id="148"/>
     </w:p>
@@ -33676,9 +33676,9 @@
         </w:rPr>
         <w:t xml:space="preserve">10. </w:t>
       </w:r>
-      <w:bookmarkStart w:id="149" w:name="ref-peng2023moldiff"/>
-      <w:r>
-        <w:t xml:space="preserve">Peng, X., Guan, J., Liu, Q., &amp; Ma, J. (2023). MolDiff: Addressing the Atom-Bond Inconsistency Problem in 3D Molecule Diffusion Generation.</w:t>
+      <w:bookmarkStart w:id="149" w:name="ref-eckmann2022limo"/>
+      <w:r>
+        <w:t xml:space="preserve">Eckmann, P., Sun, K., Zhao, B., Feng, M., Gilson, M. K., &amp; Yu, R. (2022). LIMO: Latent Inceptionism for Targeted Molecule Generation.</w:t>
       </w:r>
       <w:r>
         <w:t xml:space="preserve"> </w:t>
@@ -33688,10 +33688,10 @@
           <w:i/>
           <w:iCs/>
         </w:rPr>
-        <w:t xml:space="preserve">ICML 2023</w:t>
-      </w:r>
-      <w:r>
-        <w:t xml:space="preserve">. arXiv:2305.07508.</w:t>
+        <w:t xml:space="preserve">ICML 2022</w:t>
+      </w:r>
+      <w:r>
+        <w:t xml:space="preserve">. arXiv:2206.09010.</w:t>
       </w:r>
       <w:bookmarkEnd w:id="149"/>
     </w:p>
@@ -33712,22 +33712,9 @@
         </w:rPr>
         <w:t xml:space="preserve">11. </w:t>
       </w:r>
-      <w:bookmarkStart w:id="150" w:name="ref-mathieu2017sensitivity"/>
-      <w:r>
-        <w:t xml:space="preserve">Mathieu, D. (2017). Sensitivity of Energetic Materials: Theoretical Relationships to Detonation Performance and Molecular Structure.</w:t>
-      </w:r>
-      <w:r>
-        <w:t xml:space="preserve"> </w:t>
-      </w:r>
-      <w:r>
-        <w:rPr>
-          <w:i/>
-          <w:iCs/>
-        </w:rPr>
-        <w:t xml:space="preserve">Ind. Eng. Chem. Res. 56(31)</w:t>
-      </w:r>
-      <w:r>
-        <w:t xml:space="preserve">:8191–8201. doi:10.1021/acs.iecr.7b02021.</w:t>
+      <w:bookmarkStart w:id="150" w:name="ref-reidenbach2023molmim"/>
+      <w:r>
+        <w:t xml:space="preserve">Reidenbach, D., Livne, M., Ilango, R. K., Gill, M., &amp; Israeli, J. (2023). MolMIM: A Molecular Language Model for Property-Guided Molecule Generation via Mutual Information Machines. (MLDD Workshop, ICLR 2023; arXiv:2208.09016).</w:t>
       </w:r>
       <w:bookmarkEnd w:id="150"/>
     </w:p>
@@ -33748,23 +33735,58 @@
         </w:rPr>
         <w:t xml:space="preserve">12. </w:t>
       </w:r>
-      <w:bookmarkStart w:id="152" w:name="ref-daylight-smarts"/>
-      <w:r>
-        <w:t xml:space="preserve">Daylight Chemical Information Systems. (2007). SMARTS: A Language for Describing Molecular Patterns. Daylight Theory Manual, Aliso Viejo, CA.</w:t>
-      </w:r>
-      <w:r>
-        <w:t xml:space="preserve"> </w:t>
-      </w:r>
-      <w:hyperlink r:id="rId151">
-        <w:r>
-          <w:rPr>
-            <w:rStyle w:val="Hyperlink"/>
-          </w:rPr>
-          <w:t xml:space="preserve">daylight.com/dayhtml/doc/theory/theory.smarts.html</w:t>
-        </w:r>
-      </w:hyperlink>
-      <w:r>
-        <w:t xml:space="preserve">. SMARTS = SMILES Arbitrary Target Specification: a pattern language extending SMILES that matches molecular substructures, used by RDKit and other cheminformatics toolkits to evaluate hard-reject catalogs (this work, §4.7).</w:t>
+      <w:bookmarkStart w:id="151" w:name="ref-jaegle2021perceiver"/>
+      <w:r>
+        <w:t xml:space="preserve">Jaegle, A. et al. (2021). Perceiver: General Perception with Iterative Attention.</w:t>
+      </w:r>
+      <w:r>
+        <w:t xml:space="preserve"> </w:t>
+      </w:r>
+      <w:r>
+        <w:rPr>
+          <w:i/>
+          <w:iCs/>
+        </w:rPr>
+        <w:t xml:space="preserve">ICML 2021</w:t>
+      </w:r>
+      <w:r>
+        <w:t xml:space="preserve">. arXiv:2103.03206.</w:t>
+      </w:r>
+      <w:bookmarkEnd w:id="151"/>
+    </w:p>
+    <w:p>
+      <w:pPr>
+        <w:pStyle w:val="ReferenceEntry"/>
+        <w:spacing w:after="100"/>
+        <w:ind w:left="475" w:hanging="475"/>
+        <w:jc w:val="left"/>
+        <w:keepNext w:val="0"/>
+        <w:keepLines w:val="0"/>
+        <w:widowControl w:val="1"/>
+      </w:pPr>
+      <w:r>
+        <w:rPr>
+          <w:rFonts w:ascii="Times New Roman" w:hAnsi="Times New Roman"/>
+          <w:sz w:val="20"/>
+        </w:rPr>
+        <w:t xml:space="preserve">13. </w:t>
+      </w:r>
+      <w:bookmarkStart w:id="152" w:name="ref-olivecrona2017reinvent"/>
+      <w:r>
+        <w:t xml:space="preserve">Olivecrona, M., Blaschke, T., Engkvist, O., &amp; Chen, H. (2017). Molecular de-novo design through deep reinforcement learning.</w:t>
+      </w:r>
+      <w:r>
+        <w:t xml:space="preserve"> </w:t>
+      </w:r>
+      <w:r>
+        <w:rPr>
+          <w:i/>
+          <w:iCs/>
+        </w:rPr>
+        <w:t xml:space="preserve">J. Cheminformatics 9</w:t>
+      </w:r>
+      <w:r>
+        <w:t xml:space="preserve">:48. doi:10.1186/s13321-017-0235-x.</w:t>
       </w:r>
       <w:bookmarkEnd w:id="152"/>
     </w:p>
@@ -33783,11 +33805,11 @@
           <w:rFonts w:ascii="Times New Roman" w:hAnsi="Times New Roman"/>
           <w:sz w:val="20"/>
         </w:rPr>
-        <w:t xml:space="preserve">13. </w:t>
-      </w:r>
-      <w:bookmarkStart w:id="153" w:name="ref-politzer2014some"/>
-      <w:r>
-        <w:t xml:space="preserve">Politzer, P., &amp; Murray, J. S. (2014). Some Perspectives on Estimating Detonation Properties of C, H, N, O Compounds.</w:t>
+        <w:t xml:space="preserve">14. </w:t>
+      </w:r>
+      <w:bookmarkStart w:id="153" w:name="ref-loeffler2024reinvent4"/>
+      <w:r>
+        <w:t xml:space="preserve">Loeffler, H. H., He, J., Tibo, A., Janet, J. P., Voronov, A., Mervin, L. H., &amp; Engkvist, O. (2024). REINVENT 4: Modern AI-driven generative molecule design.</w:t>
       </w:r>
       <w:r>
         <w:t xml:space="preserve"> </w:t>
@@ -33797,10 +33819,10 @@
           <w:i/>
           <w:iCs/>
         </w:rPr>
-        <w:t xml:space="preserve">Cent. Eur. J. Energ. Mater. 11(4)</w:t>
-      </w:r>
-      <w:r>
-        <w:t xml:space="preserve">:459–474.</w:t>
+        <w:t xml:space="preserve">J. Cheminformatics 16</w:t>
+      </w:r>
+      <w:r>
+        <w:t xml:space="preserve">:20. doi:10.1186/s13321-024-00812-5.</w:t>
       </w:r>
       <w:bookmarkEnd w:id="153"/>
     </w:p>
@@ -33819,11 +33841,24 @@
           <w:rFonts w:ascii="Times New Roman" w:hAnsi="Times New Roman"/>
           <w:sz w:val="20"/>
         </w:rPr>
-        <w:t xml:space="preserve">14. </w:t>
-      </w:r>
-      <w:bookmarkStart w:id="154" w:name="ref-suceska2018explo5"/>
-      <w:r>
-        <w:t xml:space="preserve">Sućeska, M. (2018). EXPLO5 v6.05.04 User's Manual. Brodarski Institute, Zagreb, Croatia. Computer program for calculation of detonation parameters from molecular formula, density, and heat of formation via thermochemical-equilibrium Chapman–Jouguet solver with covolume EOS.</w:t>
+        <w:t xml:space="preserve">15. </w:t>
+      </w:r>
+      <w:bookmarkStart w:id="154" w:name="ref-yang2017chemts"/>
+      <w:r>
+        <w:t xml:space="preserve">Yang, X., Zhang, J., Yoshizoe, K., Terayama, K., &amp; Tsuda, K. (2017). ChemTS: An efficient python library for de novo molecular generation.</w:t>
+      </w:r>
+      <w:r>
+        <w:t xml:space="preserve"> </w:t>
+      </w:r>
+      <w:r>
+        <w:rPr>
+          <w:i/>
+          <w:iCs/>
+        </w:rPr>
+        <w:t xml:space="preserve">Sci. Tech. Adv. Mater. 18(1)</w:t>
+      </w:r>
+      <w:r>
+        <w:t xml:space="preserve">:972–976. doi:10.1080/14686996.2017.1401424.</w:t>
       </w:r>
       <w:bookmarkEnd w:id="154"/>
     </w:p>
@@ -33842,11 +33877,24 @@
           <w:rFonts w:ascii="Times New Roman" w:hAnsi="Times New Roman"/>
           <w:sz w:val="20"/>
         </w:rPr>
-        <w:t xml:space="preserve">15. </w:t>
-      </w:r>
-      <w:bookmarkStart w:id="155" w:name="ref-fried2014cheetah"/>
-      <w:r>
-        <w:t xml:space="preserve">Fried, L. E., Howard, W. M., Souers, P. C., &amp; Vitello, P. A. (2014). Cheetah 7.0 User's Manual. Lawrence Livermore National Laboratory technical report LLNL-SM-664002. Thermochemical-equilibrium detonation code with JCZ3 / BKWS covolume EOS.</w:t>
+        <w:t xml:space="preserve">16. </w:t>
+      </w:r>
+      <w:bookmarkStart w:id="155" w:name="ref-bagal2022molgpt"/>
+      <w:r>
+        <w:t xml:space="preserve">Bagal, V., Aggarwal, R., Vinod, P. K., &amp; Priyakumar, U. D. (2022). MolGPT: Molecular Generation Using a Transformer-Decoder Model.</w:t>
+      </w:r>
+      <w:r>
+        <w:t xml:space="preserve"> </w:t>
+      </w:r>
+      <w:r>
+        <w:rPr>
+          <w:i/>
+          <w:iCs/>
+        </w:rPr>
+        <w:t xml:space="preserve">J. Chem. Inf. Model. 62(9)</w:t>
+      </w:r>
+      <w:r>
+        <w:t xml:space="preserve">:2064–2076. doi:10.1021/acs.jcim.1c00600.</w:t>
       </w:r>
       <w:bookmarkEnd w:id="155"/>
     </w:p>
@@ -33865,11 +33913,11 @@
           <w:rFonts w:ascii="Times New Roman" w:hAnsi="Times New Roman"/>
           <w:sz w:val="20"/>
         </w:rPr>
-        <w:t xml:space="preserve">16. </w:t>
-      </w:r>
-      <w:bookmarkStart w:id="156" w:name="ref-kamlet1968detonation"/>
-      <w:r>
-        <w:t xml:space="preserve">Kamlet, M. J., &amp; Jacobs, S. J. (1968). Chemistry of Detonations. I. A Simple Method for Calculating Detonation Properties of C-H-N-O Explosives.</w:t>
+        <w:t xml:space="preserve">17. </w:t>
+      </w:r>
+      <w:bookmarkStart w:id="156" w:name="ref-ross2022molformer"/>
+      <w:r>
+        <w:t xml:space="preserve">Ross, J. et al. (2022). Large-Scale Chemical Language Representations Capture Molecular Structure and Properties.</w:t>
       </w:r>
       <w:r>
         <w:t xml:space="preserve"> </w:t>
@@ -33879,10 +33927,10 @@
           <w:i/>
           <w:iCs/>
         </w:rPr>
-        <w:t xml:space="preserve">J. Chem. Phys. 48</w:t>
-      </w:r>
-      <w:r>
-        <w:t xml:space="preserve">:23–55. doi:10.1063/1.1667908.</w:t>
+        <w:t xml:space="preserve">Nature Machine Intelligence 4</w:t>
+      </w:r>
+      <w:r>
+        <w:t xml:space="preserve">:1256–1264. doi:10.1038/s42256-022-00580-7.</w:t>
       </w:r>
       <w:bookmarkEnd w:id="156"/>
     </w:p>
@@ -33901,11 +33949,11 @@
           <w:rFonts w:ascii="Times New Roman" w:hAnsi="Times New Roman"/>
           <w:sz w:val="20"/>
         </w:rPr>
-        <w:t xml:space="preserve">17. </w:t>
-      </w:r>
-      <w:bookmarkStart w:id="157" w:name="ref-elton2018applying"/>
-      <w:r>
-        <w:t xml:space="preserve">Elton, D. C., Boukouvalas, Z., Butrico, M. S., Fuge, M. D., &amp; Chung, P. W. (2018). Applying Machine Learning Techniques to Predict the Properties of Energetic Materials.</w:t>
+        <w:t xml:space="preserve">18. </w:t>
+      </w:r>
+      <w:bookmarkStart w:id="157" w:name="ref-irwin2022chemformer"/>
+      <w:r>
+        <w:t xml:space="preserve">Irwin, R., Dimitriadis, S., He, J., &amp; Bjerrum, E. J. (2022). Chemformer: A Pre-Trained Transformer for Computational Chemistry.</w:t>
       </w:r>
       <w:r>
         <w:t xml:space="preserve"> </w:t>
@@ -33915,10 +33963,10 @@
           <w:i/>
           <w:iCs/>
         </w:rPr>
-        <w:t xml:space="preserve">Sci. Rep. 8</w:t>
-      </w:r>
-      <w:r>
-        <w:t xml:space="preserve">:9059.</w:t>
+        <w:t xml:space="preserve">Mach. Learn.: Sci. Tech. 3</w:t>
+      </w:r>
+      <w:r>
+        <w:t xml:space="preserve">:015022. doi:10.1088/2632-2153/ac3ffb.</w:t>
       </w:r>
       <w:bookmarkEnd w:id="157"/>
     </w:p>
@@ -33937,11 +33985,11 @@
           <w:rFonts w:ascii="Times New Roman" w:hAnsi="Times New Roman"/>
           <w:sz w:val="20"/>
         </w:rPr>
-        <w:t xml:space="preserve">18. </w:t>
-      </w:r>
-      <w:bookmarkStart w:id="158" w:name="ref-casey2020prediction"/>
-      <w:r>
-        <w:t xml:space="preserve">Casey, A. D., Son, S. F., Bilionis, I., &amp; Barnes, B. C. (2020). Prediction of Energetic Material Properties from Electronic Structure Using 3D Convolutional Neural Networks.</w:t>
+        <w:t xml:space="preserve">19. </w:t>
+      </w:r>
+      <w:bookmarkStart w:id="158" w:name="ref-bengio2021gflownet"/>
+      <w:r>
+        <w:t xml:space="preserve">Bengio, E., Jain, M., Korablyov, M., Precup, D., &amp; Bengio, Y. (2021). Flow Network Based Generative Models for Non-Iterative Diverse Candidate Generation.</w:t>
       </w:r>
       <w:r>
         <w:t xml:space="preserve"> </w:t>
@@ -33951,10 +33999,10 @@
           <w:i/>
           <w:iCs/>
         </w:rPr>
-        <w:t xml:space="preserve">J. Chem. Inf. Model. 60(10)</w:t>
-      </w:r>
-      <w:r>
-        <w:t xml:space="preserve">:4457–4473. doi:10.1021/acs.jcim.0c00259.</w:t>
+        <w:t xml:space="preserve">NeurIPS 2021</w:t>
+      </w:r>
+      <w:r>
+        <w:t xml:space="preserve">. arXiv:2106.04399.</w:t>
       </w:r>
       <w:bookmarkEnd w:id="158"/>
     </w:p>
@@ -33973,11 +34021,11 @@
           <w:rFonts w:ascii="Times New Roman" w:hAnsi="Times New Roman"/>
           <w:sz w:val="20"/>
         </w:rPr>
-        <w:t xml:space="preserve">19. </w:t>
-      </w:r>
-      <w:bookmarkStart w:id="159" w:name="ref-zhou2023unimol"/>
-      <w:r>
-        <w:t xml:space="preserve">Zhou, G. et al. (2023). Uni-Mol: A Universal 3D Molecular Representation Learning Framework.</w:t>
+        <w:t xml:space="preserve">20. </w:t>
+      </w:r>
+      <w:bookmarkStart w:id="159" w:name="ref-vignac2023digress"/>
+      <w:r>
+        <w:t xml:space="preserve">Vignac, C. et al. (2023). DiGress: Discrete Denoising Diffusion for Graph Generation.</w:t>
       </w:r>
       <w:r>
         <w:t xml:space="preserve"> </w:t>
@@ -33990,7 +34038,7 @@
         <w:t xml:space="preserve">ICLR 2023</w:t>
       </w:r>
       <w:r>
-        <w:t xml:space="preserve">.</w:t>
+        <w:t xml:space="preserve">. arXiv:2209.14734.</w:t>
       </w:r>
       <w:bookmarkEnd w:id="159"/>
     </w:p>
@@ -34009,11 +34057,11 @@
           <w:rFonts w:ascii="Times New Roman" w:hAnsi="Times New Roman"/>
           <w:sz w:val="20"/>
         </w:rPr>
-        <w:t xml:space="preserve">20. </w:t>
-      </w:r>
-      <w:bookmarkStart w:id="160" w:name="ref-huang2021applying"/>
-      <w:r>
-        <w:t xml:space="preserve">Huang, X. et al. (2021). Applying Machine Learning to Balance Performance and Stability of High Energy Density Materials.</w:t>
+        <w:t xml:space="preserve">21. </w:t>
+      </w:r>
+      <w:bookmarkStart w:id="160" w:name="ref-ho2020ddpm"/>
+      <w:r>
+        <w:t xml:space="preserve">Ho, J., Jain, A., &amp; Abbeel, P. (2020). Denoising Diffusion Probabilistic Models.</w:t>
       </w:r>
       <w:r>
         <w:t xml:space="preserve"> </w:t>
@@ -34023,10 +34071,10 @@
           <w:i/>
           <w:iCs/>
         </w:rPr>
-        <w:t xml:space="preserve">iScience 24</w:t>
-      </w:r>
-      <w:r>
-        <w:t xml:space="preserve">:102240.</w:t>
+        <w:t xml:space="preserve">NeurIPS 2020</w:t>
+      </w:r>
+      <w:r>
+        <w:t xml:space="preserve">. arXiv:2006.11239.</w:t>
       </w:r>
       <w:bookmarkEnd w:id="160"/>
     </w:p>
@@ -34045,11 +34093,11 @@
           <w:rFonts w:ascii="Times New Roman" w:hAnsi="Times New Roman"/>
           <w:sz w:val="20"/>
         </w:rPr>
-        <w:t xml:space="preserve">21. </w:t>
-      </w:r>
-      <w:bookmarkStart w:id="161" w:name="ref-herve2010"/>
-      <w:r>
-        <w:t xml:space="preserve">Hervé, G., Roussel, C., &amp; Graindorge, H. (2010). Selective Preparation of 3,4,5-Trinitro-1H-pyrazole: A Stable All-Carbon-Substituted Trinitro Heterocycle, and Related Trinitroisoxazole Chemistry.</w:t>
+        <w:t xml:space="preserve">22. </w:t>
+      </w:r>
+      <w:bookmarkStart w:id="161" w:name="ref-song2019score"/>
+      <w:r>
+        <w:t xml:space="preserve">Song, Y., &amp; Ermon, S. (2019). Generative Modeling by Estimating Gradients of the Data Distribution.</w:t>
       </w:r>
       <w:r>
         <w:t xml:space="preserve"> </w:t>
@@ -34059,10 +34107,10 @@
           <w:i/>
           <w:iCs/>
         </w:rPr>
-        <w:t xml:space="preserve">Angew. Chem. Int. Ed. 49(18)</w:t>
-      </w:r>
-      <w:r>
-        <w:t xml:space="preserve">:3177–3181. doi:10.1002/anie.201000764.</w:t>
+        <w:t xml:space="preserve">NeurIPS 2019</w:t>
+      </w:r>
+      <w:r>
+        <w:t xml:space="preserve">. arXiv:1907.05600.</w:t>
       </w:r>
       <w:bookmarkEnd w:id="161"/>
     </w:p>
@@ -34081,11 +34129,11 @@
           <w:rFonts w:ascii="Times New Roman" w:hAnsi="Times New Roman"/>
           <w:sz w:val="20"/>
         </w:rPr>
-        <w:t xml:space="preserve">22. </w:t>
-      </w:r>
-      <w:bookmarkStart w:id="162" w:name="ref-sabatini2018"/>
-      <w:r>
-        <w:t xml:space="preserve">Sabatini, J. J., &amp; Oyler, K. D. (2016). Recent Advances in the Synthesis of High Explosive Materials.</w:t>
+        <w:t xml:space="preserve">23. </w:t>
+      </w:r>
+      <w:bookmarkStart w:id="162" w:name="ref-song2021sde"/>
+      <w:r>
+        <w:t xml:space="preserve">Song, Y. et al. (2021). Score-Based Generative Modeling through Stochastic Differential Equations.</w:t>
       </w:r>
       <w:r>
         <w:t xml:space="preserve"> </w:t>
@@ -34095,13 +34143,10 @@
           <w:i/>
           <w:iCs/>
         </w:rPr>
-        <w:t xml:space="preserve">Crystals</w:t>
-      </w:r>
-      <w:r>
-        <w:t xml:space="preserve"> </w:t>
-      </w:r>
-      <w:r>
-        <w:t xml:space="preserve">6(1):5. doi:10.3390/cryst6010005.</w:t>
+        <w:t xml:space="preserve">ICLR 2021</w:t>
+      </w:r>
+      <w:r>
+        <w:t xml:space="preserve">. arXiv:2011.13456.</w:t>
       </w:r>
       <w:bookmarkEnd w:id="162"/>
     </w:p>
@@ -34120,11 +34165,11 @@
           <w:rFonts w:ascii="Times New Roman" w:hAnsi="Times New Roman"/>
           <w:sz w:val="20"/>
         </w:rPr>
-        <w:t xml:space="preserve">23. </w:t>
-      </w:r>
-      <w:bookmarkStart w:id="163" w:name="ref-konnov2025nitroisoxazole"/>
-      <w:r>
-        <w:t xml:space="preserve">Konnov, A. A., Lisyutkin, A. D., Vinogradov, D. B., Nazarova, A. A., Pivkina, A. N., &amp; Fershtat, L. L. (2025). Synthesis of 4-Nitroisoxazole-Based Energetic Materials.</w:t>
+        <w:t xml:space="preserve">24. </w:t>
+      </w:r>
+      <w:bookmarkStart w:id="163" w:name="ref-rombach2022ldm"/>
+      <w:r>
+        <w:t xml:space="preserve">Rombach, R., Blattmann, A., Lorenz, D., Esser, P., &amp; Ommer, B. (2022). High-Resolution Image Synthesis with Latent Diffusion Models.</w:t>
       </w:r>
       <w:r>
         <w:t xml:space="preserve"> </w:t>
@@ -34134,10 +34179,10 @@
           <w:i/>
           <w:iCs/>
         </w:rPr>
-        <w:t xml:space="preserve">Org. Lett. 27(14)</w:t>
-      </w:r>
-      <w:r>
-        <w:t xml:space="preserve">:3795–3799. doi:10.1021/acs.orglett.5c01074.</w:t>
+        <w:t xml:space="preserve">CVPR 2022</w:t>
+      </w:r>
+      <w:r>
+        <w:t xml:space="preserve">. arXiv:2112.10752.</w:t>
       </w:r>
       <w:bookmarkEnd w:id="163"/>
     </w:p>
@@ -34156,11 +34201,24 @@
           <w:rFonts w:ascii="Times New Roman" w:hAnsi="Times New Roman"/>
           <w:sz w:val="20"/>
         </w:rPr>
-        <w:t xml:space="preserve">24. </w:t>
-      </w:r>
-      <w:bookmarkStart w:id="164" w:name="ref-ho2022cfg"/>
-      <w:r>
-        <w:t xml:space="preserve">Ho, J., &amp; Salimans, T. (2022). Classifier-Free Diffusion Guidance. arXiv:2207.12598.</w:t>
+        <w:t xml:space="preserve">25. </w:t>
+      </w:r>
+      <w:bookmarkStart w:id="164" w:name="ref-dhariwal2021diffusion"/>
+      <w:r>
+        <w:t xml:space="preserve">Dhariwal, P., &amp; Nichol, A. (2021). Diffusion Models Beat GANs on Image Synthesis.</w:t>
+      </w:r>
+      <w:r>
+        <w:t xml:space="preserve"> </w:t>
+      </w:r>
+      <w:r>
+        <w:rPr>
+          <w:i/>
+          <w:iCs/>
+        </w:rPr>
+        <w:t xml:space="preserve">NeurIPS 2021</w:t>
+      </w:r>
+      <w:r>
+        <w:t xml:space="preserve">. arXiv:2105.05233.</w:t>
       </w:r>
       <w:bookmarkEnd w:id="164"/>
     </w:p>
@@ -34179,11 +34237,11 @@
           <w:rFonts w:ascii="Times New Roman" w:hAnsi="Times New Roman"/>
           <w:sz w:val="20"/>
         </w:rPr>
-        <w:t xml:space="preserve">25. </w:t>
-      </w:r>
-      <w:bookmarkStart w:id="165" w:name="ref-dhariwal2021diffusion"/>
-      <w:r>
-        <w:t xml:space="preserve">Dhariwal, P., &amp; Nichol, A. (2021). Diffusion Models Beat GANs on Image Synthesis.</w:t>
+        <w:t xml:space="preserve">26. </w:t>
+      </w:r>
+      <w:bookmarkStart w:id="165" w:name="ref-perez2018film"/>
+      <w:r>
+        <w:t xml:space="preserve">Perez, E., Strub, F., de Vries, H., Dumoulin, V., &amp; Courville, A. (2018). FiLM: Visual Reasoning with a General Conditioning Layer.</w:t>
       </w:r>
       <w:r>
         <w:t xml:space="preserve"> </w:t>
@@ -34193,10 +34251,10 @@
           <w:i/>
           <w:iCs/>
         </w:rPr>
-        <w:t xml:space="preserve">NeurIPS 2021</w:t>
-      </w:r>
-      <w:r>
-        <w:t xml:space="preserve">. arXiv:2105.05233.</w:t>
+        <w:t xml:space="preserve">AAAI 2018</w:t>
+      </w:r>
+      <w:r>
+        <w:t xml:space="preserve">. arXiv:1709.07871.</w:t>
       </w:r>
       <w:bookmarkEnd w:id="165"/>
     </w:p>
@@ -34215,11 +34273,11 @@
           <w:rFonts w:ascii="Times New Roman" w:hAnsi="Times New Roman"/>
           <w:sz w:val="20"/>
         </w:rPr>
-        <w:t xml:space="preserve">26. </w:t>
-      </w:r>
-      <w:bookmarkStart w:id="166" w:name="ref-song2019score"/>
-      <w:r>
-        <w:t xml:space="preserve">Song, Y., &amp; Ermon, S. (2019). Generative Modeling by Estimating Gradients of the Data Distribution.</w:t>
+        <w:t xml:space="preserve">27. </w:t>
+      </w:r>
+      <w:bookmarkStart w:id="166" w:name="ref-hoogeboom2022edm"/>
+      <w:r>
+        <w:t xml:space="preserve">Hoogeboom, E., Garcia Satorras, V., Vignac, C., &amp; Welling, M. (2022). Equivariant Diffusion for Molecule Generation in 3D.</w:t>
       </w:r>
       <w:r>
         <w:t xml:space="preserve"> </w:t>
@@ -34229,10 +34287,10 @@
           <w:i/>
           <w:iCs/>
         </w:rPr>
-        <w:t xml:space="preserve">NeurIPS 2019</w:t>
-      </w:r>
-      <w:r>
-        <w:t xml:space="preserve">. arXiv:1907.05600.</w:t>
+        <w:t xml:space="preserve">ICML 2022</w:t>
+      </w:r>
+      <w:r>
+        <w:t xml:space="preserve">. arXiv:2203.17003.</w:t>
       </w:r>
       <w:bookmarkEnd w:id="166"/>
     </w:p>
@@ -34251,11 +34309,11 @@
           <w:rFonts w:ascii="Times New Roman" w:hAnsi="Times New Roman"/>
           <w:sz w:val="20"/>
         </w:rPr>
-        <w:t xml:space="preserve">27. </w:t>
-      </w:r>
-      <w:bookmarkStart w:id="167" w:name="ref-song2021sde"/>
-      <w:r>
-        <w:t xml:space="preserve">Song, Y. et al. (2021). Score-Based Generative Modeling through Stochastic Differential Equations.</w:t>
+        <w:t xml:space="preserve">28. </w:t>
+      </w:r>
+      <w:bookmarkStart w:id="167" w:name="ref-schneuing2022diffsbdd"/>
+      <w:r>
+        <w:t xml:space="preserve">Schneuing, A. et al. (2022). Structure-based Drug Design with Equivariant Diffusion Models.</w:t>
       </w:r>
       <w:r>
         <w:t xml:space="preserve"> </w:t>
@@ -34265,10 +34323,10 @@
           <w:i/>
           <w:iCs/>
         </w:rPr>
-        <w:t xml:space="preserve">ICLR 2021</w:t>
-      </w:r>
-      <w:r>
-        <w:t xml:space="preserve">. arXiv:2011.13456.</w:t>
+        <w:t xml:space="preserve">NeurIPS 2022 AI4Science Workshop</w:t>
+      </w:r>
+      <w:r>
+        <w:t xml:space="preserve">. arXiv:2210.13695.</w:t>
       </w:r>
       <w:bookmarkEnd w:id="167"/>
     </w:p>
@@ -34287,11 +34345,11 @@
           <w:rFonts w:ascii="Times New Roman" w:hAnsi="Times New Roman"/>
           <w:sz w:val="20"/>
         </w:rPr>
-        <w:t xml:space="preserve">28. </w:t>
-      </w:r>
-      <w:bookmarkStart w:id="168" w:name="ref-ho2020ddpm"/>
-      <w:r>
-        <w:t xml:space="preserve">Ho, J., Jain, A., &amp; Abbeel, P. (2020). Denoising Diffusion Probabilistic Models.</w:t>
+        <w:t xml:space="preserve">29. </w:t>
+      </w:r>
+      <w:bookmarkStart w:id="168" w:name="ref-guan2023targetdiff"/>
+      <w:r>
+        <w:t xml:space="preserve">Guan, J. et al. (2023). 3D Equivariant Diffusion for Target-Aware Molecule Generation and Affinity Prediction.</w:t>
       </w:r>
       <w:r>
         <w:t xml:space="preserve"> </w:t>
@@ -34301,10 +34359,10 @@
           <w:i/>
           <w:iCs/>
         </w:rPr>
-        <w:t xml:space="preserve">NeurIPS 2020</w:t>
-      </w:r>
-      <w:r>
-        <w:t xml:space="preserve">. arXiv:2006.11239.</w:t>
+        <w:t xml:space="preserve">ICLR 2023</w:t>
+      </w:r>
+      <w:r>
+        <w:t xml:space="preserve">. arXiv:2303.03543.</w:t>
       </w:r>
       <w:bookmarkEnd w:id="168"/>
     </w:p>
@@ -34323,11 +34381,11 @@
           <w:rFonts w:ascii="Times New Roman" w:hAnsi="Times New Roman"/>
           <w:sz w:val="20"/>
         </w:rPr>
-        <w:t xml:space="preserve">29. </w:t>
-      </w:r>
-      <w:bookmarkStart w:id="169" w:name="ref-rombach2022ldm"/>
-      <w:r>
-        <w:t xml:space="preserve">Rombach, R., Blattmann, A., Lorenz, D., Esser, P., &amp; Ommer, B. (2022). High-Resolution Image Synthesis with Latent Diffusion Models.</w:t>
+        <w:t xml:space="preserve">30. </w:t>
+      </w:r>
+      <w:bookmarkStart w:id="169" w:name="ref-peng2022pocket2mol"/>
+      <w:r>
+        <w:t xml:space="preserve">Peng, X., Luo, S., Guan, J., Xie, Q., Peng, J., &amp; Ma, J. (2022). Pocket2Mol: Efficient Molecular Sampling Based on 3D Protein Pockets.</w:t>
       </w:r>
       <w:r>
         <w:t xml:space="preserve"> </w:t>
@@ -34337,10 +34395,10 @@
           <w:i/>
           <w:iCs/>
         </w:rPr>
-        <w:t xml:space="preserve">CVPR 2022</w:t>
-      </w:r>
-      <w:r>
-        <w:t xml:space="preserve">. arXiv:2112.10752.</w:t>
+        <w:t xml:space="preserve">ICML 2022</w:t>
+      </w:r>
+      <w:r>
+        <w:t xml:space="preserve">. arXiv:2205.07249.</w:t>
       </w:r>
       <w:bookmarkEnd w:id="169"/>
     </w:p>
@@ -34359,11 +34417,11 @@
           <w:rFonts w:ascii="Times New Roman" w:hAnsi="Times New Roman"/>
           <w:sz w:val="20"/>
         </w:rPr>
-        <w:t xml:space="preserve">30. </w:t>
-      </w:r>
-      <w:bookmarkStart w:id="170" w:name="ref-krenn2020selfies"/>
-      <w:r>
-        <w:t xml:space="preserve">Krenn, M., Häse, F., Nigam, A., Friederich, P., &amp; Aspuru-Guzik, A. (2020). Self-Referencing Embedded Strings (SELFIES): A 100% Robust Molecular String Representation.</w:t>
+        <w:t xml:space="preserve">31. </w:t>
+      </w:r>
+      <w:bookmarkStart w:id="170" w:name="ref-corso2023diffdock"/>
+      <w:r>
+        <w:t xml:space="preserve">Corso, G., Stärk, H., Jing, B., Barzilay, R., &amp; Jaakkola, T. (2023). DiffDock: Diffusion Steps, Twists, and Turns for Molecular Docking.</w:t>
       </w:r>
       <w:r>
         <w:t xml:space="preserve"> </w:t>
@@ -34373,10 +34431,10 @@
           <w:i/>
           <w:iCs/>
         </w:rPr>
-        <w:t xml:space="preserve">Mach. Learn.: Sci. Tech. 1</w:t>
-      </w:r>
-      <w:r>
-        <w:t xml:space="preserve">:045024.</w:t>
+        <w:t xml:space="preserve">ICLR 2023</w:t>
+      </w:r>
+      <w:r>
+        <w:t xml:space="preserve">. arXiv:2210.01776.</w:t>
       </w:r>
       <w:bookmarkEnd w:id="170"/>
     </w:p>
@@ -34395,11 +34453,11 @@
           <w:rFonts w:ascii="Times New Roman" w:hAnsi="Times New Roman"/>
           <w:sz w:val="20"/>
         </w:rPr>
-        <w:t xml:space="preserve">31. </w:t>
-      </w:r>
-      <w:bookmarkStart w:id="171" w:name="ref-ertl2009sa"/>
-      <w:r>
-        <w:t xml:space="preserve">Ertl, P., &amp; Schuffenhauer, A. (2009). Estimation of Synthetic Accessibility Score of Drug-Like Molecules Based on Molecular Complexity and Fragment Contributions.</w:t>
+        <w:t xml:space="preserve">32. </w:t>
+      </w:r>
+      <w:bookmarkStart w:id="171" w:name="ref-peng2023moldiff"/>
+      <w:r>
+        <w:t xml:space="preserve">Peng, X., Guan, J., Liu, Q., &amp; Ma, J. (2023). MolDiff: Addressing the Atom-Bond Inconsistency Problem in 3D Molecule Diffusion Generation.</w:t>
       </w:r>
       <w:r>
         <w:t xml:space="preserve"> </w:t>
@@ -34409,10 +34467,10 @@
           <w:i/>
           <w:iCs/>
         </w:rPr>
-        <w:t xml:space="preserve">J. Cheminform. 1</w:t>
-      </w:r>
-      <w:r>
-        <w:t xml:space="preserve">:8.</w:t>
+        <w:t xml:space="preserve">ICML 2023</w:t>
+      </w:r>
+      <w:r>
+        <w:t xml:space="preserve">. arXiv:2305.07508.</w:t>
       </w:r>
       <w:bookmarkEnd w:id="171"/>
     </w:p>
@@ -34431,11 +34489,11 @@
           <w:rFonts w:ascii="Times New Roman" w:hAnsi="Times New Roman"/>
           <w:sz w:val="20"/>
         </w:rPr>
-        <w:t xml:space="preserve">32. </w:t>
-      </w:r>
-      <w:bookmarkStart w:id="172" w:name="ref-coley2018scscore"/>
-      <w:r>
-        <w:t xml:space="preserve">Coley, C. W., Rogers, L., Green, W. H., &amp; Jensen, K. F. (2018). SCScore: Synthetic Complexity Learned from a Reaction Corpus.</w:t>
+        <w:t xml:space="preserve">33. </w:t>
+      </w:r>
+      <w:bookmarkStart w:id="172" w:name="ref-xu2023geoldm"/>
+      <w:r>
+        <w:t xml:space="preserve">Xu, M., Powers, A., Dror, R. O., Ermon, S., &amp; Leskovec, J. (2023). Geometric Latent Diffusion Models for 3D Molecule Generation.</w:t>
       </w:r>
       <w:r>
         <w:t xml:space="preserve"> </w:t>
@@ -34445,10 +34503,10 @@
           <w:i/>
           <w:iCs/>
         </w:rPr>
-        <w:t xml:space="preserve">J. Chem. Inf. Model. 58(2)</w:t>
-      </w:r>
-      <w:r>
-        <w:t xml:space="preserve">:252–261.</w:t>
+        <w:t xml:space="preserve">ICML 2023</w:t>
+      </w:r>
+      <w:r>
+        <w:t xml:space="preserve">. arXiv:2305.01140.</w:t>
       </w:r>
       <w:bookmarkEnd w:id="172"/>
     </w:p>
@@ -34467,11 +34525,11 @@
           <w:rFonts w:ascii="Times New Roman" w:hAnsi="Times New Roman"/>
           <w:sz w:val="20"/>
         </w:rPr>
-        <w:t xml:space="preserve">33. </w:t>
-      </w:r>
-      <w:bookmarkStart w:id="173" w:name="ref-rogers1960computer"/>
-      <w:r>
-        <w:t xml:space="preserve">Rogers, D. J., &amp; Tanimoto, T. T. (1960). A Computer Program for Classifying Plants.</w:t>
+        <w:t xml:space="preserve">34. </w:t>
+      </w:r>
+      <w:bookmarkStart w:id="173" w:name="ref-elton2018applying"/>
+      <w:r>
+        <w:t xml:space="preserve">Elton, D. C., Boukouvalas, Z., Butrico, M. S., Fuge, M. D., &amp; Chung, P. W. (2018). Applying Machine Learning Techniques to Predict the Properties of Energetic Materials.</w:t>
       </w:r>
       <w:r>
         <w:t xml:space="preserve"> </w:t>
@@ -34481,10 +34539,10 @@
           <w:i/>
           <w:iCs/>
         </w:rPr>
-        <w:t xml:space="preserve">Science 132(3434)</w:t>
-      </w:r>
-      <w:r>
-        <w:t xml:space="preserve">:1115–1118.</w:t>
+        <w:t xml:space="preserve">Sci. Rep. 8</w:t>
+      </w:r>
+      <w:r>
+        <w:t xml:space="preserve">:9059.</w:t>
       </w:r>
       <w:bookmarkEnd w:id="173"/>
     </w:p>
@@ -34503,25 +34561,60 @@
           <w:rFonts w:ascii="Times New Roman" w:hAnsi="Times New Roman"/>
           <w:sz w:val="20"/>
         </w:rPr>
-        <w:t xml:space="preserve">34. </w:t>
-      </w:r>
-      <w:bookmarkStart w:id="175" w:name="ref-landrum2024rdkit"/>
-      <w:r>
-        <w:t xml:space="preserve">Landrum, G., &amp; contributors. RDKit: Open-source cheminformatics.</w:t>
-      </w:r>
-      <w:r>
-        <w:t xml:space="preserve"> </w:t>
-      </w:r>
-      <w:hyperlink r:id="rId174">
-        <w:r>
-          <w:rPr>
-            <w:rStyle w:val="Hyperlink"/>
-          </w:rPr>
-          <w:t xml:space="preserve">rdkit.org</w:t>
-        </w:r>
-      </w:hyperlink>
-      <w:r>
-        <w:t xml:space="preserve">.</w:t>
+        <w:t xml:space="preserve">35. </w:t>
+      </w:r>
+      <w:bookmarkStart w:id="174" w:name="ref-politzer2014some"/>
+      <w:r>
+        <w:t xml:space="preserve">Politzer, P., &amp; Murray, J. S. (2014). Some Perspectives on Estimating Detonation Properties of C, H, N, O Compounds.</w:t>
+      </w:r>
+      <w:r>
+        <w:t xml:space="preserve"> </w:t>
+      </w:r>
+      <w:r>
+        <w:rPr>
+          <w:i/>
+          <w:iCs/>
+        </w:rPr>
+        <w:t xml:space="preserve">Cent. Eur. J. Energ. Mater. 11(4)</w:t>
+      </w:r>
+      <w:r>
+        <w:t xml:space="preserve">:459–474.</w:t>
+      </w:r>
+      <w:bookmarkEnd w:id="174"/>
+    </w:p>
+    <w:p>
+      <w:pPr>
+        <w:pStyle w:val="ReferenceEntry"/>
+        <w:spacing w:after="100"/>
+        <w:ind w:left="475" w:hanging="475"/>
+        <w:jc w:val="left"/>
+        <w:keepNext w:val="0"/>
+        <w:keepLines w:val="0"/>
+        <w:widowControl w:val="1"/>
+      </w:pPr>
+      <w:r>
+        <w:rPr>
+          <w:rFonts w:ascii="Times New Roman" w:hAnsi="Times New Roman"/>
+          <w:sz w:val="20"/>
+        </w:rPr>
+        <w:t xml:space="preserve">36. </w:t>
+      </w:r>
+      <w:bookmarkStart w:id="175" w:name="ref-mathieu2017sensitivity"/>
+      <w:r>
+        <w:t xml:space="preserve">Mathieu, D. (2017). Sensitivity of Energetic Materials: Theoretical Relationships to Detonation Performance and Molecular Structure.</w:t>
+      </w:r>
+      <w:r>
+        <w:t xml:space="preserve"> </w:t>
+      </w:r>
+      <w:r>
+        <w:rPr>
+          <w:i/>
+          <w:iCs/>
+        </w:rPr>
+        <w:t xml:space="preserve">Ind. Eng. Chem. Res. 56(31)</w:t>
+      </w:r>
+      <w:r>
+        <w:t xml:space="preserve">:8191–8201. doi:10.1021/acs.iecr.7b02021.</w:t>
       </w:r>
       <w:bookmarkEnd w:id="175"/>
     </w:p>
@@ -34540,24 +34633,11 @@
           <w:rFonts w:ascii="Times New Roman" w:hAnsi="Times New Roman"/>
           <w:sz w:val="20"/>
         </w:rPr>
-        <w:t xml:space="preserve">35. </w:t>
-      </w:r>
-      <w:bookmarkStart w:id="176" w:name="ref-sterling2015zinc"/>
-      <w:r>
-        <w:t xml:space="preserve">Sterling, T., &amp; Irwin, J. J. (2015). ZINC 15: Ligand Discovery for Everyone.</w:t>
-      </w:r>
-      <w:r>
-        <w:t xml:space="preserve"> </w:t>
-      </w:r>
-      <w:r>
-        <w:rPr>
-          <w:i/>
-          <w:iCs/>
-        </w:rPr>
-        <w:t xml:space="preserve">J. Chem. Inf. Model. 55(11)</w:t>
-      </w:r>
-      <w:r>
-        <w:t xml:space="preserve">:2324–2337.</w:t>
+        <w:t xml:space="preserve">37. </w:t>
+      </w:r>
+      <w:bookmarkStart w:id="176" w:name="ref-suceska2018explo5"/>
+      <w:r>
+        <w:t xml:space="preserve">Sućeska, M. (2018). EXPLO5 v6.05.04 User's Manual. Brodarski Institute, Zagreb, Croatia. Computer program for calculation of detonation parameters from molecular formula, density, and heat of formation via thermochemical-equilibrium Chapman–Jouguet solver with covolume EOS.</w:t>
       </w:r>
       <w:bookmarkEnd w:id="176"/>
     </w:p>
@@ -34576,24 +34656,11 @@
           <w:rFonts w:ascii="Times New Roman" w:hAnsi="Times New Roman"/>
           <w:sz w:val="20"/>
         </w:rPr>
-        <w:t xml:space="preserve">36. </w:t>
-      </w:r>
-      <w:bookmarkStart w:id="177" w:name="ref-kim2023pubchem"/>
-      <w:r>
-        <w:t xml:space="preserve">Kim, S. et al. (2023). PubChem 2023 Update.</w:t>
-      </w:r>
-      <w:r>
-        <w:t xml:space="preserve"> </w:t>
-      </w:r>
-      <w:r>
-        <w:rPr>
-          <w:i/>
-          <w:iCs/>
-        </w:rPr>
-        <w:t xml:space="preserve">Nucleic Acids Res. 51(D1)</w:t>
-      </w:r>
-      <w:r>
-        <w:t xml:space="preserve">:D1373–D1380.</w:t>
+        <w:t xml:space="preserve">38. </w:t>
+      </w:r>
+      <w:bookmarkStart w:id="177" w:name="ref-fried2014cheetah"/>
+      <w:r>
+        <w:t xml:space="preserve">Fried, L. E., Howard, W. M., Souers, P. C., &amp; Vitello, P. A. (2014). Cheetah 7.0 User's Manual. Lawrence Livermore National Laboratory technical report LLNL-SM-664002. Thermochemical-equilibrium detonation code with JCZ3 / BKWS covolume EOS.</w:t>
       </w:r>
       <w:bookmarkEnd w:id="177"/>
     </w:p>
@@ -34612,11 +34679,11 @@
           <w:rFonts w:ascii="Times New Roman" w:hAnsi="Times New Roman"/>
           <w:sz w:val="20"/>
         </w:rPr>
-        <w:t xml:space="preserve">37. </w:t>
-      </w:r>
-      <w:bookmarkStart w:id="178" w:name="ref-jaegle2021perceiver"/>
-      <w:r>
-        <w:t xml:space="preserve">Jaegle, A. et al. (2021). Perceiver: General Perception with Iterative Attention.</w:t>
+        <w:t xml:space="preserve">39. </w:t>
+      </w:r>
+      <w:bookmarkStart w:id="178" w:name="ref-choi2023prep"/>
+      <w:r>
+        <w:t xml:space="preserve">Choi, J. B., Nguyen, P. C. H., Sen, O., Udaykumar, H. S., &amp; Baek, S. (2023). Artificial Intelligence Approaches for Energetic Materials by Design: State of the Art, Challenges, and Future Directions.</w:t>
       </w:r>
       <w:r>
         <w:t xml:space="preserve"> </w:t>
@@ -34626,10 +34693,10 @@
           <w:i/>
           <w:iCs/>
         </w:rPr>
-        <w:t xml:space="preserve">ICML 2021</w:t>
-      </w:r>
-      <w:r>
-        <w:t xml:space="preserve">. arXiv:2103.03206.</w:t>
+        <w:t xml:space="preserve">Propellants, Explosives, Pyrotechnics 48(4)</w:t>
+      </w:r>
+      <w:r>
+        <w:t xml:space="preserve">, e202200276. doi:10.1002/prep.202200276.</w:t>
       </w:r>
       <w:bookmarkEnd w:id="178"/>
     </w:p>
@@ -34648,11 +34715,11 @@
           <w:rFonts w:ascii="Times New Roman" w:hAnsi="Times New Roman"/>
           <w:sz w:val="20"/>
         </w:rPr>
-        <w:t xml:space="preserve">38. </w:t>
-      </w:r>
-      <w:bookmarkStart w:id="179" w:name="ref-olivecrona2017reinvent"/>
-      <w:r>
-        <w:t xml:space="preserve">Olivecrona, M., Blaschke, T., Engkvist, O., &amp; Chen, H. (2017). Molecular de-novo design through deep reinforcement learning.</w:t>
+        <w:t xml:space="preserve">40. </w:t>
+      </w:r>
+      <w:bookmarkStart w:id="179" w:name="ref-mlcrystdens-cm-2024"/>
+      <w:r>
+        <w:t xml:space="preserve">Davis, J. V., Marrs III, F. W., Cawkwell, M. J., &amp; Manner, V. W. (2024). Machine Learning Models for High Explosive Crystal Density and Performance.</w:t>
       </w:r>
       <w:r>
         <w:t xml:space="preserve"> </w:t>
@@ -34662,10 +34729,10 @@
           <w:i/>
           <w:iCs/>
         </w:rPr>
-        <w:t xml:space="preserve">J. Cheminformatics 9</w:t>
-      </w:r>
-      <w:r>
-        <w:t xml:space="preserve">:48. doi:10.1186/s13321-017-0235-x.</w:t>
+        <w:t xml:space="preserve">Chemistry of Materials 36(22)</w:t>
+      </w:r>
+      <w:r>
+        <w:t xml:space="preserve">, 11109–11118. doi:10.1021/acs.chemmater.4c01978.</w:t>
       </w:r>
       <w:bookmarkEnd w:id="179"/>
     </w:p>
@@ -34684,11 +34751,11 @@
           <w:rFonts w:ascii="Times New Roman" w:hAnsi="Times New Roman"/>
           <w:sz w:val="20"/>
         </w:rPr>
-        <w:t xml:space="preserve">39. </w:t>
-      </w:r>
-      <w:bookmarkStart w:id="180" w:name="ref-loeffler2024reinvent4"/>
-      <w:r>
-        <w:t xml:space="preserve">Loeffler, H. H., He, J., Tibo, A., Janet, J. P., Voronov, A., Mervin, L. H., &amp; Engkvist, O. (2024). REINVENT 4: Modern AI-driven generative molecule design.</w:t>
+        <w:t xml:space="preserve">41. </w:t>
+      </w:r>
+      <w:bookmarkStart w:id="180" w:name="ref-nefati1996ann"/>
+      <w:r>
+        <w:t xml:space="preserve">Nefati, H., Cense, J.-M., &amp; Legendre, J.-J. (1996). Prediction of the Impact Sensitivity by Neural Networks.</w:t>
       </w:r>
       <w:r>
         <w:t xml:space="preserve"> </w:t>
@@ -34698,10 +34765,10 @@
           <w:i/>
           <w:iCs/>
         </w:rPr>
-        <w:t xml:space="preserve">J. Cheminformatics 16</w:t>
-      </w:r>
-      <w:r>
-        <w:t xml:space="preserve">:20. doi:10.1186/s13321-024-00812-5.</w:t>
+        <w:t xml:space="preserve">J. Chem. Inf. Comput. Sci. 36(4)</w:t>
+      </w:r>
+      <w:r>
+        <w:t xml:space="preserve">:804–810. doi:10.1021/ci950223m.</w:t>
       </w:r>
       <w:bookmarkEnd w:id="180"/>
     </w:p>
@@ -34720,11 +34787,11 @@
           <w:rFonts w:ascii="Times New Roman" w:hAnsi="Times New Roman"/>
           <w:sz w:val="20"/>
         </w:rPr>
-        <w:t xml:space="preserve">40. </w:t>
-      </w:r>
-      <w:bookmarkStart w:id="181" w:name="ref-yang2017chemts"/>
-      <w:r>
-        <w:t xml:space="preserve">Yang, X., Zhang, J., Yoshizoe, K., Terayama, K., &amp; Tsuda, K. (2017). ChemTS: An efficient python library for de novo molecular generation.</w:t>
+        <w:t xml:space="preserve">42. </w:t>
+      </w:r>
+      <w:bookmarkStart w:id="181" w:name="ref-huang2021applying"/>
+      <w:r>
+        <w:t xml:space="preserve">Huang, X. et al. (2021). Applying Machine Learning to Balance Performance and Stability of High Energy Density Materials.</w:t>
       </w:r>
       <w:r>
         <w:t xml:space="preserve"> </w:t>
@@ -34734,10 +34801,10 @@
           <w:i/>
           <w:iCs/>
         </w:rPr>
-        <w:t xml:space="preserve">Sci. Tech. Adv. Mater. 18(1)</w:t>
-      </w:r>
-      <w:r>
-        <w:t xml:space="preserve">:972–976. doi:10.1080/14686996.2017.1401424.</w:t>
+        <w:t xml:space="preserve">iScience 24</w:t>
+      </w:r>
+      <w:r>
+        <w:t xml:space="preserve">:102240.</w:t>
       </w:r>
       <w:bookmarkEnd w:id="181"/>
     </w:p>
@@ -34756,11 +34823,11 @@
           <w:rFonts w:ascii="Times New Roman" w:hAnsi="Times New Roman"/>
           <w:sz w:val="20"/>
         </w:rPr>
-        <w:t xml:space="preserve">41. </w:t>
-      </w:r>
-      <w:bookmarkStart w:id="182" w:name="ref-bagal2022molgpt"/>
-      <w:r>
-        <w:t xml:space="preserve">Bagal, V., Aggarwal, R., Vinod, P. K., &amp; Priyakumar, U. D. (2022). MolGPT: Molecular Generation Using a Transformer-Decoder Model.</w:t>
+        <w:t xml:space="preserve">43. </w:t>
+      </w:r>
+      <w:bookmarkStart w:id="182" w:name="ref-klapotke2017nitrogen"/>
+      <w:r>
+        <w:t xml:space="preserve">Klapötke, T. M.</w:t>
       </w:r>
       <w:r>
         <w:t xml:space="preserve"> </w:t>
@@ -34770,10 +34837,10 @@
           <w:i/>
           <w:iCs/>
         </w:rPr>
-        <w:t xml:space="preserve">J. Chem. Inf. Model. 62(9)</w:t>
-      </w:r>
-      <w:r>
-        <w:t xml:space="preserve">:2064–2076. doi:10.1021/acs.jcim.1c00600.</w:t>
+        <w:t xml:space="preserve">Chemistry of High-Energy Materials</w:t>
+      </w:r>
+      <w:r>
+        <w:t xml:space="preserve">, 5th ed. (de Gruyter, 2019). doi:10.1515/9783110624571.</w:t>
       </w:r>
       <w:bookmarkEnd w:id="182"/>
     </w:p>
@@ -34792,11 +34859,11 @@
           <w:rFonts w:ascii="Times New Roman" w:hAnsi="Times New Roman"/>
           <w:sz w:val="20"/>
         </w:rPr>
-        <w:t xml:space="preserve">42. </w:t>
-      </w:r>
-      <w:bookmarkStart w:id="183" w:name="ref-winter2019cddd"/>
-      <w:r>
-        <w:t xml:space="preserve">Winter, R., Montanari, F., Noé, F., &amp; Clevert, D.-A. (2019). Learning continuous and data-driven molecular descriptors by translating equivalent chemical representations.</w:t>
+        <w:t xml:space="preserve">44. </w:t>
+      </w:r>
+      <w:bookmarkStart w:id="183" w:name="ref-griffiths2020constrained"/>
+      <w:r>
+        <w:t xml:space="preserve">Griffiths, R.-R., &amp; Hernández-Lobato, J. M. (2020). Constrained Bayesian optimization for automatic chemical design using variational autoencoders.</w:t>
       </w:r>
       <w:r>
         <w:t xml:space="preserve"> </w:t>
@@ -34806,10 +34873,10 @@
           <w:i/>
           <w:iCs/>
         </w:rPr>
-        <w:t xml:space="preserve">Chem. Sci. 10(6)</w:t>
-      </w:r>
-      <w:r>
-        <w:t xml:space="preserve">:1692–1701. doi:10.1039/C8SC04175J.</w:t>
+        <w:t xml:space="preserve">Chem. Sci. 11(2)</w:t>
+      </w:r>
+      <w:r>
+        <w:t xml:space="preserve">:577–586. doi:10.1039/C9SC04026A.</w:t>
       </w:r>
       <w:bookmarkEnd w:id="183"/>
     </w:p>
@@ -34828,11 +34895,11 @@
           <w:rFonts w:ascii="Times New Roman" w:hAnsi="Times New Roman"/>
           <w:sz w:val="20"/>
         </w:rPr>
-        <w:t xml:space="preserve">43. </w:t>
-      </w:r>
-      <w:bookmarkStart w:id="184" w:name="ref-maziarka2020molcyclegan"/>
-      <w:r>
-        <w:t xml:space="preserve">Maziarka, Ł., Pocha, A., Kaczmarczyk, J., Rataj, K., Danel, T., &amp; Warchoł, M. (2020). Mol-CycleGAN: a generative model for molecular optimization.</w:t>
+        <w:t xml:space="preserve">45. </w:t>
+      </w:r>
+      <w:bookmarkStart w:id="184" w:name="ref-npjcompmat2025"/>
+      <w:r>
+        <w:t xml:space="preserve">Liu, J., et al. (2025). De novo multi-objective generation framework for energetic materials with trading off energy and stability.</w:t>
       </w:r>
       <w:r>
         <w:t xml:space="preserve"> </w:t>
@@ -34842,10 +34909,10 @@
           <w:i/>
           <w:iCs/>
         </w:rPr>
-        <w:t xml:space="preserve">J. Cheminformatics 12</w:t>
-      </w:r>
-      <w:r>
-        <w:t xml:space="preserve">:2. doi:10.1186/s13321-019-0404-1.</w:t>
+        <w:t xml:space="preserve">npj Computational Materials</w:t>
+      </w:r>
+      <w:r>
+        <w:t xml:space="preserve">. doi:10.1038/s41524-025-01845-6.</w:t>
       </w:r>
       <w:bookmarkEnd w:id="184"/>
     </w:p>
@@ -34864,11 +34931,11 @@
           <w:rFonts w:ascii="Times New Roman" w:hAnsi="Times New Roman"/>
           <w:sz w:val="20"/>
         </w:rPr>
-        <w:t xml:space="preserve">44. </w:t>
-      </w:r>
-      <w:bookmarkStart w:id="185" w:name="ref-schneuing2022diffsbdd"/>
-      <w:r>
-        <w:t xml:space="preserve">Schneuing, A. et al. (2022). Structure-based Drug Design with Equivariant Diffusion Models.</w:t>
+        <w:t xml:space="preserve">46. </w:t>
+      </w:r>
+      <w:bookmarkStart w:id="185" w:name="ref-yang2019chemprop"/>
+      <w:r>
+        <w:t xml:space="preserve">Yang, K. et al. (2019). Analyzing Learned Molecular Representations for Property Prediction.</w:t>
       </w:r>
       <w:r>
         <w:t xml:space="preserve"> </w:t>
@@ -34878,10 +34945,10 @@
           <w:i/>
           <w:iCs/>
         </w:rPr>
-        <w:t xml:space="preserve">NeurIPS 2022 AI4Science Workshop</w:t>
-      </w:r>
-      <w:r>
-        <w:t xml:space="preserve">. arXiv:2210.13695.</w:t>
+        <w:t xml:space="preserve">J. Chem. Inf. Model. 59(8)</w:t>
+      </w:r>
+      <w:r>
+        <w:t xml:space="preserve">:3370–3388. doi:10.1021/acs.jcim.9b00237.</w:t>
       </w:r>
       <w:bookmarkEnd w:id="185"/>
     </w:p>
@@ -34900,11 +34967,11 @@
           <w:rFonts w:ascii="Times New Roman" w:hAnsi="Times New Roman"/>
           <w:sz w:val="20"/>
         </w:rPr>
-        <w:t xml:space="preserve">45. </w:t>
-      </w:r>
-      <w:bookmarkStart w:id="186" w:name="ref-guan2023targetdiff"/>
-      <w:r>
-        <w:t xml:space="preserve">Guan, J. et al. (2023). 3D Equivariant Diffusion for Target-Aware Molecule Generation and Affinity Prediction.</w:t>
+        <w:t xml:space="preserve">47. </w:t>
+      </w:r>
+      <w:bookmarkStart w:id="186" w:name="ref-schutt2018schnet"/>
+      <w:r>
+        <w:t xml:space="preserve">Schütt, K. T., Sauceda, H. E., Kindermans, P.-J., Tkatchenko, A., &amp; Müller, K.-R. (2018). SchNet: A deep learning architecture for molecules and materials.</w:t>
       </w:r>
       <w:r>
         <w:t xml:space="preserve"> </w:t>
@@ -34914,10 +34981,10 @@
           <w:i/>
           <w:iCs/>
         </w:rPr>
-        <w:t xml:space="preserve">ICLR 2023</w:t>
-      </w:r>
-      <w:r>
-        <w:t xml:space="preserve">. arXiv:2303.03543.</w:t>
+        <w:t xml:space="preserve">J. Chem. Phys. 148</w:t>
+      </w:r>
+      <w:r>
+        <w:t xml:space="preserve">:241722. doi:10.1063/1.5019779.</w:t>
       </w:r>
       <w:bookmarkEnd w:id="186"/>
     </w:p>
@@ -34936,11 +35003,11 @@
           <w:rFonts w:ascii="Times New Roman" w:hAnsi="Times New Roman"/>
           <w:sz w:val="20"/>
         </w:rPr>
-        <w:t xml:space="preserve">46. </w:t>
-      </w:r>
-      <w:bookmarkStart w:id="187" w:name="ref-corso2023diffdock"/>
-      <w:r>
-        <w:t xml:space="preserve">Corso, G., Stärk, H., Jing, B., Barzilay, R., &amp; Jaakkola, T. (2023). DiffDock: Diffusion Steps, Twists, and Turns for Molecular Docking.</w:t>
+        <w:t xml:space="preserve">48. </w:t>
+      </w:r>
+      <w:bookmarkStart w:id="187" w:name="ref-qiao2020orbnet"/>
+      <w:r>
+        <w:t xml:space="preserve">Qiao, Z., Welborn, M., Anandkumar, A., Manby, F. R., &amp; Miller III, T. F. (2020). OrbNet: Deep learning for quantum chemistry using symmetry-adapted atomic-orbital features.</w:t>
       </w:r>
       <w:r>
         <w:t xml:space="preserve"> </w:t>
@@ -34950,10 +35017,10 @@
           <w:i/>
           <w:iCs/>
         </w:rPr>
-        <w:t xml:space="preserve">ICLR 2023</w:t>
-      </w:r>
-      <w:r>
-        <w:t xml:space="preserve">. arXiv:2210.01776.</w:t>
+        <w:t xml:space="preserve">J. Chem. Phys. 153</w:t>
+      </w:r>
+      <w:r>
+        <w:t xml:space="preserve">:124111. doi:10.1063/5.0021955.</w:t>
       </w:r>
       <w:bookmarkEnd w:id="187"/>
     </w:p>
@@ -34972,11 +35039,11 @@
           <w:rFonts w:ascii="Times New Roman" w:hAnsi="Times New Roman"/>
           <w:sz w:val="20"/>
         </w:rPr>
-        <w:t xml:space="preserve">47. </w:t>
-      </w:r>
-      <w:bookmarkStart w:id="188" w:name="ref-peng2022pocket2mol"/>
-      <w:r>
-        <w:t xml:space="preserve">Peng, X., Luo, S., Guan, J., Xie, Q., Peng, J., &amp; Ma, J. (2022). Pocket2Mol: Efficient Molecular Sampling Based on 3D Protein Pockets.</w:t>
+        <w:t xml:space="preserve">49. </w:t>
+      </w:r>
+      <w:bookmarkStart w:id="188" w:name="ref-polykovskiy2020moses"/>
+      <w:r>
+        <w:t xml:space="preserve">Polykovskiy, D. et al. (2020). Molecular Sets (MOSES): A Benchmarking Platform for Molecular Generation Models.</w:t>
       </w:r>
       <w:r>
         <w:t xml:space="preserve"> </w:t>
@@ -34986,10 +35053,10 @@
           <w:i/>
           <w:iCs/>
         </w:rPr>
-        <w:t xml:space="preserve">ICML 2022</w:t>
-      </w:r>
-      <w:r>
-        <w:t xml:space="preserve">. arXiv:2205.07249.</w:t>
+        <w:t xml:space="preserve">Frontiers in Pharmacology 11</w:t>
+      </w:r>
+      <w:r>
+        <w:t xml:space="preserve">:565644. doi:10.3389/fphar.2020.565644.</w:t>
       </w:r>
       <w:bookmarkEnd w:id="188"/>
     </w:p>
@@ -35008,11 +35075,11 @@
           <w:rFonts w:ascii="Times New Roman" w:hAnsi="Times New Roman"/>
           <w:sz w:val="20"/>
         </w:rPr>
-        <w:t xml:space="preserve">48. </w:t>
-      </w:r>
-      <w:bookmarkStart w:id="189" w:name="ref-nefati1996ann"/>
-      <w:r>
-        <w:t xml:space="preserve">Nefati, H., Cense, J.-M., &amp; Legendre, J.-J. (1996). Prediction of the Impact Sensitivity by Neural Networks.</w:t>
+        <w:t xml:space="preserve">50. </w:t>
+      </w:r>
+      <w:bookmarkStart w:id="189" w:name="ref-brown2019guacamol"/>
+      <w:r>
+        <w:t xml:space="preserve">Brown, N., Fiscato, M., Segler, M. H. S., &amp; Vaucher, A. C. (2019). GuacaMol: Benchmarking Models for de Novo Molecular Design.</w:t>
       </w:r>
       <w:r>
         <w:t xml:space="preserve"> </w:t>
@@ -35022,10 +35089,10 @@
           <w:i/>
           <w:iCs/>
         </w:rPr>
-        <w:t xml:space="preserve">J. Chem. Inf. Comput. Sci. 36(4)</w:t>
-      </w:r>
-      <w:r>
-        <w:t xml:space="preserve">:804–810. doi:10.1021/ci950223m.</w:t>
+        <w:t xml:space="preserve">J. Chem. Inf. Model. 59(3)</w:t>
+      </w:r>
+      <w:r>
+        <w:t xml:space="preserve">:1096–1108. doi:10.1021/acs.jcim.8b00839.</w:t>
       </w:r>
       <w:bookmarkEnd w:id="189"/>
     </w:p>
@@ -35044,11 +35111,11 @@
           <w:rFonts w:ascii="Times New Roman" w:hAnsi="Times New Roman"/>
           <w:sz w:val="20"/>
         </w:rPr>
-        <w:t xml:space="preserve">49. </w:t>
-      </w:r>
-      <w:bookmarkStart w:id="190" w:name="ref-klapotke2017nitrogen"/>
-      <w:r>
-        <w:t xml:space="preserve">Klapötke, T. M.</w:t>
+        <w:t xml:space="preserve">51. </w:t>
+      </w:r>
+      <w:bookmarkStart w:id="190" w:name="ref-preuer2018fcd"/>
+      <w:r>
+        <w:t xml:space="preserve">Preuer, K., Renz, P., Unterthiner, T., Hochreiter, S., &amp; Klambauer, G. (2018). Fréchet ChemNet Distance: A Metric for Generative Models for Molecules in Drug Discovery.</w:t>
       </w:r>
       <w:r>
         <w:t xml:space="preserve"> </w:t>
@@ -35058,10 +35125,10 @@
           <w:i/>
           <w:iCs/>
         </w:rPr>
-        <w:t xml:space="preserve">Chemistry of High-Energy Materials</w:t>
-      </w:r>
-      <w:r>
-        <w:t xml:space="preserve">, 5th ed. (de Gruyter, 2019). doi:10.1515/9783110624571.</w:t>
+        <w:t xml:space="preserve">J. Chem. Inf. Model. 58(9)</w:t>
+      </w:r>
+      <w:r>
+        <w:t xml:space="preserve">:1736–1741.</w:t>
       </w:r>
       <w:bookmarkEnd w:id="190"/>
     </w:p>
@@ -35080,11 +35147,11 @@
           <w:rFonts w:ascii="Times New Roman" w:hAnsi="Times New Roman"/>
           <w:sz w:val="20"/>
         </w:rPr>
-        <w:t xml:space="preserve">50. </w:t>
-      </w:r>
-      <w:bookmarkStart w:id="191" w:name="ref-griffiths2020constrained"/>
-      <w:r>
-        <w:t xml:space="preserve">Griffiths, R.-R., &amp; Hernández-Lobato, J. M. (2020). Constrained Bayesian optimization for automatic chemical design using variational autoencoders.</w:t>
+        <w:t xml:space="preserve">52. </w:t>
+      </w:r>
+      <w:bookmarkStart w:id="191" w:name="ref-reymond2015gdb"/>
+      <w:r>
+        <w:t xml:space="preserve">Reymond, J.-L. (2015). The chemical space project.</w:t>
       </w:r>
       <w:r>
         <w:t xml:space="preserve"> </w:t>
@@ -35094,10 +35161,10 @@
           <w:i/>
           <w:iCs/>
         </w:rPr>
-        <w:t xml:space="preserve">Chem. Sci. 11(2)</w:t>
-      </w:r>
-      <w:r>
-        <w:t xml:space="preserve">:577–586. doi:10.1039/C9SC04026A.</w:t>
+        <w:t xml:space="preserve">Acc. Chem. Res. 48(3)</w:t>
+      </w:r>
+      <w:r>
+        <w:t xml:space="preserve">:722–730.</w:t>
       </w:r>
       <w:bookmarkEnd w:id="191"/>
     </w:p>
@@ -35116,11 +35183,11 @@
           <w:rFonts w:ascii="Times New Roman" w:hAnsi="Times New Roman"/>
           <w:sz w:val="20"/>
         </w:rPr>
-        <w:t xml:space="preserve">51. </w:t>
-      </w:r>
-      <w:bookmarkStart w:id="192" w:name="ref-yang2019chemprop"/>
-      <w:r>
-        <w:t xml:space="preserve">Yang, K. et al. (2019). Analyzing Learned Molecular Representations for Property Prediction.</w:t>
+        <w:t xml:space="preserve">53. </w:t>
+      </w:r>
+      <w:bookmarkStart w:id="192" w:name="ref-ertl2009sa"/>
+      <w:r>
+        <w:t xml:space="preserve">Ertl, P., &amp; Schuffenhauer, A. (2009). Estimation of Synthetic Accessibility Score of Drug-Like Molecules Based on Molecular Complexity and Fragment Contributions.</w:t>
       </w:r>
       <w:r>
         <w:t xml:space="preserve"> </w:t>
@@ -35130,10 +35197,10 @@
           <w:i/>
           <w:iCs/>
         </w:rPr>
-        <w:t xml:space="preserve">J. Chem. Inf. Model. 59(8)</w:t>
-      </w:r>
-      <w:r>
-        <w:t xml:space="preserve">:3370–3388. doi:10.1021/acs.jcim.9b00237.</w:t>
+        <w:t xml:space="preserve">J. Cheminform. 1</w:t>
+      </w:r>
+      <w:r>
+        <w:t xml:space="preserve">:8.</w:t>
       </w:r>
       <w:bookmarkEnd w:id="192"/>
     </w:p>
@@ -35152,11 +35219,11 @@
           <w:rFonts w:ascii="Times New Roman" w:hAnsi="Times New Roman"/>
           <w:sz w:val="20"/>
         </w:rPr>
-        <w:t xml:space="preserve">52. </w:t>
-      </w:r>
-      <w:bookmarkStart w:id="193" w:name="ref-schutt2018schnet"/>
-      <w:r>
-        <w:t xml:space="preserve">Schütt, K. T., Sauceda, H. E., Kindermans, P.-J., Tkatchenko, A., &amp; Müller, K.-R. (2018). SchNet: A deep learning architecture for molecules and materials.</w:t>
+        <w:t xml:space="preserve">54. </w:t>
+      </w:r>
+      <w:bookmarkStart w:id="193" w:name="ref-coley2018scscore"/>
+      <w:r>
+        <w:t xml:space="preserve">Coley, C. W., Rogers, L., Green, W. H., &amp; Jensen, K. F. (2018). SCScore: Synthetic Complexity Learned from a Reaction Corpus.</w:t>
       </w:r>
       <w:r>
         <w:t xml:space="preserve"> </w:t>
@@ -35166,10 +35233,10 @@
           <w:i/>
           <w:iCs/>
         </w:rPr>
-        <w:t xml:space="preserve">J. Chem. Phys. 148</w:t>
-      </w:r>
-      <w:r>
-        <w:t xml:space="preserve">:241722. doi:10.1063/1.5019779.</w:t>
+        <w:t xml:space="preserve">J. Chem. Inf. Model. 58(2)</w:t>
+      </w:r>
+      <w:r>
+        <w:t xml:space="preserve">:252–261.</w:t>
       </w:r>
       <w:bookmarkEnd w:id="193"/>
     </w:p>
@@ -35188,11 +35255,11 @@
           <w:rFonts w:ascii="Times New Roman" w:hAnsi="Times New Roman"/>
           <w:sz w:val="20"/>
         </w:rPr>
-        <w:t xml:space="preserve">53. </w:t>
-      </w:r>
-      <w:bookmarkStart w:id="194" w:name="ref-qiao2020orbnet"/>
-      <w:r>
-        <w:t xml:space="preserve">Qiao, Z., Welborn, M., Anandkumar, A., Manby, F. R., &amp; Miller III, T. F. (2020). OrbNet: Deep learning for quantum chemistry using symmetry-adapted atomic-orbital features.</w:t>
+        <w:t xml:space="preserve">55. </w:t>
+      </w:r>
+      <w:bookmarkStart w:id="194" w:name="ref-rogers1960computer"/>
+      <w:r>
+        <w:t xml:space="preserve">Rogers, D. J., &amp; Tanimoto, T. T. (1960). A Computer Program for Classifying Plants.</w:t>
       </w:r>
       <w:r>
         <w:t xml:space="preserve"> </w:t>
@@ -35202,10 +35269,10 @@
           <w:i/>
           <w:iCs/>
         </w:rPr>
-        <w:t xml:space="preserve">J. Chem. Phys. 153</w:t>
-      </w:r>
-      <w:r>
-        <w:t xml:space="preserve">:124111. doi:10.1063/5.0021955.</w:t>
+        <w:t xml:space="preserve">Science 132(3434)</w:t>
+      </w:r>
+      <w:r>
+        <w:t xml:space="preserve">:1115–1118.</w:t>
       </w:r>
       <w:bookmarkEnd w:id="194"/>
     </w:p>
@@ -35224,11 +35291,11 @@
           <w:rFonts w:ascii="Times New Roman" w:hAnsi="Times New Roman"/>
           <w:sz w:val="20"/>
         </w:rPr>
-        <w:t xml:space="preserve">54. </w:t>
-      </w:r>
-      <w:bookmarkStart w:id="195" w:name="ref-brown2019guacamol"/>
-      <w:r>
-        <w:t xml:space="preserve">Brown, N., Fiscato, M., Segler, M. H. S., &amp; Vaucher, A. C. (2019). GuacaMol: Benchmarking Models for de Novo Molecular Design.</w:t>
+        <w:t xml:space="preserve">56. </w:t>
+      </w:r>
+      <w:bookmarkStart w:id="195" w:name="ref-bannwarth2019gfn2"/>
+      <w:r>
+        <w:t xml:space="preserve">Bannwarth, C., Ehlert, S., &amp; Grimme, S. (2019). GFN2-xTB: An Accurate and Broadly Parametrized Self-Consistent Tight-Binding Quantum Chemical Method with Multipole Electrostatics and Density-Dependent Dispersion Contributions.</w:t>
       </w:r>
       <w:r>
         <w:t xml:space="preserve"> </w:t>
@@ -35238,10 +35305,10 @@
           <w:i/>
           <w:iCs/>
         </w:rPr>
-        <w:t xml:space="preserve">J. Chem. Inf. Model. 59(3)</w:t>
-      </w:r>
-      <w:r>
-        <w:t xml:space="preserve">:1096–1108. doi:10.1021/acs.jcim.8b00839.</w:t>
+        <w:t xml:space="preserve">J. Chem. Theory Comput. 15(3)</w:t>
+      </w:r>
+      <w:r>
+        <w:t xml:space="preserve">:1652–1671. doi:10.1021/acs.jctc.8b01176.</w:t>
       </w:r>
       <w:bookmarkEnd w:id="195"/>
     </w:p>
@@ -35260,11 +35327,11 @@
           <w:rFonts w:ascii="Times New Roman" w:hAnsi="Times New Roman"/>
           <w:sz w:val="20"/>
         </w:rPr>
-        <w:t xml:space="preserve">55. </w:t>
-      </w:r>
-      <w:bookmarkStart w:id="196" w:name="ref-polykovskiy2020moses"/>
-      <w:r>
-        <w:t xml:space="preserve">Polykovskiy, D. et al. (2020). Molecular Sets (MOSES): A Benchmarking Platform for Molecular Generation Models.</w:t>
+        <w:t xml:space="preserve">57. </w:t>
+      </w:r>
+      <w:bookmarkStart w:id="196" w:name="ref-sun2020pyscf"/>
+      <w:r>
+        <w:t xml:space="preserve">Sun, Q., Zhang, X., Banerjee, S., Bao, P., et al. (2020). Recent developments in the PySCF program package.</w:t>
       </w:r>
       <w:r>
         <w:t xml:space="preserve"> </w:t>
@@ -35274,10 +35341,10 @@
           <w:i/>
           <w:iCs/>
         </w:rPr>
-        <w:t xml:space="preserve">Frontiers in Pharmacology 11</w:t>
-      </w:r>
-      <w:r>
-        <w:t xml:space="preserve">:565644. doi:10.3389/fphar.2020.565644.</w:t>
+        <w:t xml:space="preserve">J. Chem. Phys. 153</w:t>
+      </w:r>
+      <w:r>
+        <w:t xml:space="preserve">:024109. doi:10.1063/5.0006074.</w:t>
       </w:r>
       <w:bookmarkEnd w:id="196"/>
     </w:p>
@@ -35296,11 +35363,11 @@
           <w:rFonts w:ascii="Times New Roman" w:hAnsi="Times New Roman"/>
           <w:sz w:val="20"/>
         </w:rPr>
-        <w:t xml:space="preserve">56. </w:t>
-      </w:r>
-      <w:bookmarkStart w:id="197" w:name="ref-preuer2018fcd"/>
-      <w:r>
-        <w:t xml:space="preserve">Preuer, K., Renz, P., Unterthiner, T., Hochreiter, S., &amp; Klambauer, G. (2018). Fréchet ChemNet Distance: A Metric for Generative Models for Molecules in Drug Discovery.</w:t>
+        <w:t xml:space="preserve">58. </w:t>
+      </w:r>
+      <w:bookmarkStart w:id="197" w:name="ref-genheden2020aizynth"/>
+      <w:r>
+        <w:t xml:space="preserve">Genheden, S., Thakkar, A., Chadimová, V., Reymond, J.-L., Engkvist, O., &amp; Bjerrum, E. J. (2020). AiZynthFinder: a fast, robust and flexible open-source software for retrosynthetic planning.</w:t>
       </w:r>
       <w:r>
         <w:t xml:space="preserve"> </w:t>
@@ -35310,10 +35377,10 @@
           <w:i/>
           <w:iCs/>
         </w:rPr>
-        <w:t xml:space="preserve">J. Chem. Inf. Model. 58(9)</w:t>
-      </w:r>
-      <w:r>
-        <w:t xml:space="preserve">:1736–1741.</w:t>
+        <w:t xml:space="preserve">Journal of Cheminformatics 12</w:t>
+      </w:r>
+      <w:r>
+        <w:t xml:space="preserve">:70. doi:10.1186/s13321-020-00472-1.</w:t>
       </w:r>
       <w:bookmarkEnd w:id="197"/>
     </w:p>
@@ -35332,11 +35399,11 @@
           <w:rFonts w:ascii="Times New Roman" w:hAnsi="Times New Roman"/>
           <w:sz w:val="20"/>
         </w:rPr>
-        <w:t xml:space="preserve">57. </w:t>
-      </w:r>
-      <w:bookmarkStart w:id="198" w:name="ref-reymond2015gdb"/>
-      <w:r>
-        <w:t xml:space="preserve">Reymond, J.-L. (2015). The chemical space project.</w:t>
+        <w:t xml:space="preserve">59. </w:t>
+      </w:r>
+      <w:bookmarkStart w:id="198" w:name="ref-goerigk2017benchmark"/>
+      <w:r>
+        <w:t xml:space="preserve">Goerigk, L., Hansen, A., Bauer, C., Ehrlich, S., Najibi, A., &amp; Grimme, S. (2017). A look at the density functional theory zoo with the advanced GMTKN55 database for general main group thermochemistry, kinetics and noncovalent interactions.</w:t>
       </w:r>
       <w:r>
         <w:t xml:space="preserve"> </w:t>
@@ -35346,10 +35413,10 @@
           <w:i/>
           <w:iCs/>
         </w:rPr>
-        <w:t xml:space="preserve">Acc. Chem. Res. 48(3)</w:t>
-      </w:r>
-      <w:r>
-        <w:t xml:space="preserve">:722–730.</w:t>
+        <w:t xml:space="preserve">Phys. Chem. Chem. Phys. 19(48)</w:t>
+      </w:r>
+      <w:r>
+        <w:t xml:space="preserve">:32184–32215. doi:10.1039/C7CP04913G.</w:t>
       </w:r>
       <w:bookmarkEnd w:id="198"/>
     </w:p>
@@ -35368,55 +35435,27 @@
           <w:rFonts w:ascii="Times New Roman" w:hAnsi="Times New Roman"/>
           <w:sz w:val="20"/>
         </w:rPr>
-        <w:t xml:space="preserve">58. </w:t>
-      </w:r>
-      <w:bookmarkStart w:id="199" w:name="ref-emdb"/>
-      <w:r>
-        <w:t xml:space="preserve">Hand-compilation of measured density, heat of formation, and detonation properties for ~3 000 known energetic CHNO compounds, assembled in this work from secondary literature compilations: Klapötke, T. M.</w:t>
-      </w:r>
-      <w:r>
-        <w:t xml:space="preserve"> </w:t>
-      </w:r>
-      <w:r>
-        <w:rPr>
-          <w:i/>
-          <w:iCs/>
-        </w:rPr>
-        <w:t xml:space="preserve">Chemistry of High-Energy Materials</w:t>
-      </w:r>
-      <w:r>
-        <w:t xml:space="preserve">, 5th ed. (de Gruyter, 2019); Cooper, P. W.</w:t>
-      </w:r>
-      <w:r>
-        <w:t xml:space="preserve"> </w:t>
-      </w:r>
-      <w:r>
-        <w:rPr>
-          <w:i/>
-          <w:iCs/>
-        </w:rPr>
-        <w:t xml:space="preserve">Explosives Engineering</w:t>
-      </w:r>
-      <w:r>
-        <w:t xml:space="preserve"> </w:t>
-      </w:r>
-      <w:r>
-        <w:t xml:space="preserve">(Wiley-VCH, 1996); and Dobratz, B. M. &amp; Crawford, P. C.</w:t>
-      </w:r>
-      <w:r>
-        <w:t xml:space="preserve"> </w:t>
-      </w:r>
-      <w:r>
-        <w:rPr>
-          <w:i/>
-          <w:iCs/>
-        </w:rPr>
-        <w:t xml:space="preserve">LLNL Explosives Handbook: Properties of Chemical Explosives and Explosive Simulants</w:t>
-      </w:r>
-      <w:r>
-        <w:t xml:space="preserve">, UCRL-52997, Rev. 2 (Lawrence Livermore National Laboratory, 1985). Per-row provenance documented in Appendix A.1.</w:t>
-      </w:r>
-      <w:bookmarkEnd w:id="199"/>
+        <w:t xml:space="preserve">60. </w:t>
+      </w:r>
+      <w:bookmarkStart w:id="200" w:name="ref-landrum2024rdkit"/>
+      <w:r>
+        <w:t xml:space="preserve">Landrum, G., &amp; contributors. RDKit: Open-source cheminformatics.</w:t>
+      </w:r>
+      <w:r>
+        <w:t xml:space="preserve"> </w:t>
+      </w:r>
+      <w:hyperlink r:id="rId199">
+        <w:r>
+          <w:rPr>
+            <w:rStyle w:val="Hyperlink"/>
+          </w:rPr>
+          <w:t xml:space="preserve">rdkit.org</w:t>
+        </w:r>
+      </w:hyperlink>
+      <w:r>
+        <w:t xml:space="preserve">.</w:t>
+      </w:r>
+      <w:bookmarkEnd w:id="200"/>
     </w:p>
     <w:p>
       <w:pPr>
@@ -35433,64 +35472,25 @@
           <w:rFonts w:ascii="Times New Roman" w:hAnsi="Times New Roman"/>
           <w:sz w:val="20"/>
         </w:rPr>
-        <w:t xml:space="preserve">59. </w:t>
-      </w:r>
-      <w:bookmarkStart w:id="201" w:name="ref-cameo"/>
-      <w:r>
-        <w:t xml:space="preserve">NIST CAMEO Chemicals: Database of Hazardous Materials and Reactivity.</w:t>
-      </w:r>
-      <w:r>
-        <w:t xml:space="preserve"> </w:t>
-      </w:r>
-      <w:hyperlink r:id="rId200">
+        <w:t xml:space="preserve">61. </w:t>
+      </w:r>
+      <w:bookmarkStart w:id="202" w:name="ref-daylight-smarts"/>
+      <w:r>
+        <w:t xml:space="preserve">Daylight Chemical Information Systems. (2007). SMARTS: A Language for Describing Molecular Patterns. Daylight Theory Manual, Aliso Viejo, CA.</w:t>
+      </w:r>
+      <w:r>
+        <w:t xml:space="preserve"> </w:t>
+      </w:r>
+      <w:hyperlink r:id="rId201">
         <w:r>
           <w:rPr>
             <w:rStyle w:val="Hyperlink"/>
           </w:rPr>
-          <w:t xml:space="preserve">cameochemicals.noaa.gov</w:t>
+          <w:t xml:space="preserve">daylight.com/dayhtml/doc/theory/theory.smarts.html</w:t>
         </w:r>
       </w:hyperlink>
       <w:r>
-        <w:t xml:space="preserve">.</w:t>
-      </w:r>
-      <w:bookmarkEnd w:id="201"/>
-    </w:p>
-    <w:p>
-      <w:pPr>
-        <w:pStyle w:val="ReferenceEntry"/>
-        <w:spacing w:after="100"/>
-        <w:ind w:left="475" w:hanging="475"/>
-        <w:jc w:val="left"/>
-        <w:keepNext w:val="0"/>
-        <w:keepLines w:val="0"/>
-        <w:widowControl w:val="1"/>
-      </w:pPr>
-      <w:r>
-        <w:rPr>
-          <w:rFonts w:ascii="Times New Roman" w:hAnsi="Times New Roman"/>
-          <w:sz w:val="20"/>
-        </w:rPr>
-        <w:t xml:space="preserve">60. </w:t>
-      </w:r>
-      <w:bookmarkStart w:id="202" w:name="ref-bruns2020watson"/>
-      <w:r>
-        <w:t xml:space="preserve">Bruns, R. F., &amp; Watson, I. A. (2012). Rules for identifying potentially reactive or promiscuous compounds.</w:t>
-      </w:r>
-      <w:r>
-        <w:t xml:space="preserve"> </w:t>
-      </w:r>
-      <w:r>
-        <w:rPr>
-          <w:i/>
-          <w:iCs/>
-        </w:rPr>
-        <w:t xml:space="preserve">J. Med. Chem.</w:t>
-      </w:r>
-      <w:r>
-        <w:t xml:space="preserve"> </w:t>
-      </w:r>
-      <w:r>
-        <w:t xml:space="preserve">55(22):9763–9772. doi:10.1021/jm301008n. Used here as a SMARTS-based reactivity-demerit source.</w:t>
+        <w:t xml:space="preserve">. SMARTS = SMILES Arbitrary Target Specification: a pattern language extending SMILES that matches molecular substructures, used by RDKit and other cheminformatics toolkits to evaluate hard-reject catalogs (this work, §4.7).</w:t>
       </w:r>
       <w:bookmarkEnd w:id="202"/>
     </w:p>
@@ -35509,11 +35509,11 @@
           <w:rFonts w:ascii="Times New Roman" w:hAnsi="Times New Roman"/>
           <w:sz w:val="20"/>
         </w:rPr>
-        <w:t xml:space="preserve">61. </w:t>
-      </w:r>
-      <w:bookmarkStart w:id="203" w:name="ref-bannwarth2019gfn2"/>
-      <w:r>
-        <w:t xml:space="preserve">Bannwarth, C., Ehlert, S., &amp; Grimme, S. (2019). GFN2-xTB: An Accurate and Broadly Parametrized Self-Consistent Tight-Binding Quantum Chemical Method with Multipole Electrostatics and Density-Dependent Dispersion Contributions.</w:t>
+        <w:t xml:space="preserve">62. </w:t>
+      </w:r>
+      <w:bookmarkStart w:id="203" w:name="ref-sabatini2018"/>
+      <w:r>
+        <w:t xml:space="preserve">Sabatini, J. J., &amp; Oyler, K. D. (2016). Recent Advances in the Synthesis of High Explosive Materials.</w:t>
       </w:r>
       <w:r>
         <w:t xml:space="preserve"> </w:t>
@@ -35523,10 +35523,13 @@
           <w:i/>
           <w:iCs/>
         </w:rPr>
-        <w:t xml:space="preserve">J. Chem. Theory Comput. 15(3)</w:t>
-      </w:r>
-      <w:r>
-        <w:t xml:space="preserve">:1652–1671. doi:10.1021/acs.jctc.8b01176.</w:t>
+        <w:t xml:space="preserve">Crystals</w:t>
+      </w:r>
+      <w:r>
+        <w:t xml:space="preserve"> </w:t>
+      </w:r>
+      <w:r>
+        <w:t xml:space="preserve">6(1):5. doi:10.3390/cryst6010005.</w:t>
       </w:r>
       <w:bookmarkEnd w:id="203"/>
     </w:p>
@@ -35545,11 +35548,11 @@
           <w:rFonts w:ascii="Times New Roman" w:hAnsi="Times New Roman"/>
           <w:sz w:val="20"/>
         </w:rPr>
-        <w:t xml:space="preserve">62. </w:t>
-      </w:r>
-      <w:bookmarkStart w:id="204" w:name="ref-goerigk2017benchmark"/>
-      <w:r>
-        <w:t xml:space="preserve">Goerigk, L., Hansen, A., Bauer, C., Ehrlich, S., Najibi, A., &amp; Grimme, S. (2017). A look at the density functional theory zoo with the advanced GMTKN55 database for general main group thermochemistry, kinetics and noncovalent interactions.</w:t>
+        <w:t xml:space="preserve">63. </w:t>
+      </w:r>
+      <w:bookmarkStart w:id="204" w:name="ref-konnov2025nitroisoxazole"/>
+      <w:r>
+        <w:t xml:space="preserve">Konnov, A. A., Lisyutkin, A. D., Vinogradov, D. B., Nazarova, A. A., Pivkina, A. N., &amp; Fershtat, L. L. (2025). Synthesis of 4-Nitroisoxazole-Based Energetic Materials.</w:t>
       </w:r>
       <w:r>
         <w:t xml:space="preserve"> </w:t>
@@ -35559,10 +35562,10 @@
           <w:i/>
           <w:iCs/>
         </w:rPr>
-        <w:t xml:space="preserve">Phys. Chem. Chem. Phys. 19(48)</w:t>
-      </w:r>
-      <w:r>
-        <w:t xml:space="preserve">:32184–32215. doi:10.1039/C7CP04913G.</w:t>
+        <w:t xml:space="preserve">Org. Lett. 27(14)</w:t>
+      </w:r>
+      <w:r>
+        <w:t xml:space="preserve">:3795–3799. doi:10.1021/acs.orglett.5c01074.</w:t>
       </w:r>
       <w:bookmarkEnd w:id="204"/>
     </w:p>
@@ -35581,11 +35584,11 @@
           <w:rFonts w:ascii="Times New Roman" w:hAnsi="Times New Roman"/>
           <w:sz w:val="20"/>
         </w:rPr>
-        <w:t xml:space="preserve">63. </w:t>
-      </w:r>
-      <w:bookmarkStart w:id="205" w:name="ref-bondi1964vdw"/>
-      <w:r>
-        <w:t xml:space="preserve">Bondi, A. (1964). van der Waals Volumes and Radii.</w:t>
+        <w:t xml:space="preserve">64. </w:t>
+      </w:r>
+      <w:bookmarkStart w:id="205" w:name="ref-herve2010"/>
+      <w:r>
+        <w:t xml:space="preserve">Hervé, G., Roussel, C., &amp; Graindorge, H. (2010). Selective Preparation of 3,4,5-Trinitro-1H-pyrazole: A Stable All-Carbon-Substituted Trinitro Heterocycle, and Related Trinitroisoxazole Chemistry.</w:t>
       </w:r>
       <w:r>
         <w:t xml:space="preserve"> </w:t>
@@ -35595,10 +35598,10 @@
           <w:i/>
           <w:iCs/>
         </w:rPr>
-        <w:t xml:space="preserve">J. Phys. Chem. 68(3)</w:t>
-      </w:r>
-      <w:r>
-        <w:t xml:space="preserve">:441–451. doi:10.1021/j100785a001.</w:t>
+        <w:t xml:space="preserve">Angew. Chem. Int. Ed. 49(18)</w:t>
+      </w:r>
+      <w:r>
+        <w:t xml:space="preserve">:3177–3181. doi:10.1002/anie.201000764.</w:t>
       </w:r>
       <w:bookmarkEnd w:id="205"/>
     </w:p>
@@ -35617,11 +35620,11 @@
           <w:rFonts w:ascii="Times New Roman" w:hAnsi="Times New Roman"/>
           <w:sz w:val="20"/>
         </w:rPr>
-        <w:t xml:space="preserve">64. </w:t>
-      </w:r>
-      <w:bookmarkStart w:id="206" w:name="ref-genheden2020aizynth"/>
-      <w:r>
-        <w:t xml:space="preserve">Genheden, S., Thakkar, A., Chadimová, V., Reymond, J.-L., Engkvist, O., &amp; Bjerrum, E. J. (2020). AiZynthFinder: a fast, robust and flexible open-source software for retrosynthetic planning.</w:t>
+        <w:t xml:space="preserve">65. </w:t>
+      </w:r>
+      <w:bookmarkStart w:id="206" w:name="ref-kim2023pubchem"/>
+      <w:r>
+        <w:t xml:space="preserve">Kim, S. et al. (2023). PubChem 2023 Update.</w:t>
       </w:r>
       <w:r>
         <w:t xml:space="preserve"> </w:t>
@@ -35631,10 +35634,10 @@
           <w:i/>
           <w:iCs/>
         </w:rPr>
-        <w:t xml:space="preserve">Journal of Cheminformatics 12</w:t>
-      </w:r>
-      <w:r>
-        <w:t xml:space="preserve">:70. doi:10.1186/s13321-020-00472-1.</w:t>
+        <w:t xml:space="preserve">Nucleic Acids Res. 51(D1)</w:t>
+      </w:r>
+      <w:r>
+        <w:t xml:space="preserve">:D1373–D1380.</w:t>
       </w:r>
       <w:bookmarkEnd w:id="206"/>
     </w:p>
@@ -35653,11 +35656,11 @@
           <w:rFonts w:ascii="Times New Roman" w:hAnsi="Times New Roman"/>
           <w:sz w:val="20"/>
         </w:rPr>
-        <w:t xml:space="preserve">65. </w:t>
-      </w:r>
-      <w:bookmarkStart w:id="207" w:name="ref-sun2020pyscf"/>
-      <w:r>
-        <w:t xml:space="preserve">Sun, Q., Zhang, X., Banerjee, S., Bao, P., et al. (2020). Recent developments in the PySCF program package.</w:t>
+        <w:t xml:space="preserve">66. </w:t>
+      </w:r>
+      <w:bookmarkStart w:id="207" w:name="ref-emdb"/>
+      <w:r>
+        <w:t xml:space="preserve">Hand-compilation of measured density, heat of formation, and detonation properties for ~3 000 known energetic CHNO compounds, assembled in this work from secondary literature compilations: Klapötke, T. M.</w:t>
       </w:r>
       <w:r>
         <w:t xml:space="preserve"> </w:t>
@@ -35667,10 +35670,39 @@
           <w:i/>
           <w:iCs/>
         </w:rPr>
-        <w:t xml:space="preserve">J. Chem. Phys. 153</w:t>
-      </w:r>
-      <w:r>
-        <w:t xml:space="preserve">:024109. doi:10.1063/5.0006074.</w:t>
+        <w:t xml:space="preserve">Chemistry of High-Energy Materials</w:t>
+      </w:r>
+      <w:r>
+        <w:t xml:space="preserve">, 5th ed. (de Gruyter, 2019); Cooper, P. W.</w:t>
+      </w:r>
+      <w:r>
+        <w:t xml:space="preserve"> </w:t>
+      </w:r>
+      <w:r>
+        <w:rPr>
+          <w:i/>
+          <w:iCs/>
+        </w:rPr>
+        <w:t xml:space="preserve">Explosives Engineering</w:t>
+      </w:r>
+      <w:r>
+        <w:t xml:space="preserve"> </w:t>
+      </w:r>
+      <w:r>
+        <w:t xml:space="preserve">(Wiley-VCH, 1996); and Dobratz, B. M. &amp; Crawford, P. C.</w:t>
+      </w:r>
+      <w:r>
+        <w:t xml:space="preserve"> </w:t>
+      </w:r>
+      <w:r>
+        <w:rPr>
+          <w:i/>
+          <w:iCs/>
+        </w:rPr>
+        <w:t xml:space="preserve">LLNL Explosives Handbook: Properties of Chemical Explosives and Explosive Simulants</w:t>
+      </w:r>
+      <w:r>
+        <w:t xml:space="preserve">, UCRL-52997, Rev. 2 (Lawrence Livermore National Laboratory, 1985). Per-row provenance documented in Appendix A.1.</w:t>
       </w:r>
       <w:bookmarkEnd w:id="207"/>
     </w:p>
@@ -35689,11 +35721,11 @@
           <w:rFonts w:ascii="Times New Roman" w:hAnsi="Times New Roman"/>
           <w:sz w:val="20"/>
         </w:rPr>
-        <w:t xml:space="preserve">66. </w:t>
-      </w:r>
-      <w:bookmarkStart w:id="208" w:name="ref-perez2018film"/>
-      <w:r>
-        <w:t xml:space="preserve">Perez, E., Strub, F., de Vries, H., Dumoulin, V., &amp; Courville, A. (2018). FiLM: Visual Reasoning with a General Conditioning Layer.</w:t>
+        <w:t xml:space="preserve">67. </w:t>
+      </w:r>
+      <w:bookmarkStart w:id="208" w:name="ref-sterling2015zinc"/>
+      <w:r>
+        <w:t xml:space="preserve">Sterling, T., &amp; Irwin, J. J. (2015). ZINC 15: Ligand Discovery for Everyone.</w:t>
       </w:r>
       <w:r>
         <w:t xml:space="preserve"> </w:t>
@@ -35703,10 +35735,10 @@
           <w:i/>
           <w:iCs/>
         </w:rPr>
-        <w:t xml:space="preserve">AAAI 2018</w:t>
-      </w:r>
-      <w:r>
-        <w:t xml:space="preserve">. arXiv:1709.07871.</w:t>
+        <w:t xml:space="preserve">J. Chem. Inf. Model. 55(11)</w:t>
+      </w:r>
+      <w:r>
+        <w:t xml:space="preserve">:2324–2337.</w:t>
       </w:r>
       <w:bookmarkEnd w:id="208"/>
     </w:p>
@@ -35725,60 +35757,25 @@
           <w:rFonts w:ascii="Times New Roman" w:hAnsi="Times New Roman"/>
           <w:sz w:val="20"/>
         </w:rPr>
-        <w:t xml:space="preserve">67. </w:t>
-      </w:r>
-      <w:bookmarkStart w:id="209" w:name="ref-xu2023geoldm"/>
-      <w:r>
-        <w:t xml:space="preserve">Xu, M., Powers, A., Dror, R. O., Ermon, S., &amp; Leskovec, J. (2023). Geometric Latent Diffusion Models for 3D Molecule Generation.</w:t>
-      </w:r>
-      <w:r>
-        <w:t xml:space="preserve"> </w:t>
-      </w:r>
-      <w:r>
-        <w:rPr>
-          <w:i/>
-          <w:iCs/>
-        </w:rPr>
-        <w:t xml:space="preserve">ICML 2023</w:t>
-      </w:r>
-      <w:r>
-        <w:t xml:space="preserve">. arXiv:2305.01140.</w:t>
-      </w:r>
-      <w:bookmarkEnd w:id="209"/>
-    </w:p>
-    <w:p>
-      <w:pPr>
-        <w:pStyle w:val="ReferenceEntry"/>
-        <w:spacing w:after="100"/>
-        <w:ind w:left="475" w:hanging="475"/>
-        <w:jc w:val="left"/>
-        <w:keepNext w:val="0"/>
-        <w:keepLines w:val="0"/>
-        <w:widowControl w:val="1"/>
-      </w:pPr>
-      <w:r>
-        <w:rPr>
-          <w:rFonts w:ascii="Times New Roman" w:hAnsi="Times New Roman"/>
-          <w:sz w:val="20"/>
-        </w:rPr>
         <w:t xml:space="preserve">68. </w:t>
       </w:r>
-      <w:bookmarkStart w:id="210" w:name="ref-npjcompmat2025"/>
-      <w:r>
-        <w:t xml:space="preserve">Liu, J., et al. (2025). De novo multi-objective generation framework for energetic materials with trading off energy and stability.</w:t>
-      </w:r>
-      <w:r>
-        <w:t xml:space="preserve"> </w:t>
-      </w:r>
-      <w:r>
-        <w:rPr>
-          <w:i/>
-          <w:iCs/>
-        </w:rPr>
-        <w:t xml:space="preserve">npj Computational Materials</w:t>
-      </w:r>
-      <w:r>
-        <w:t xml:space="preserve">. doi:10.1038/s41524-025-01845-6.</w:t>
+      <w:bookmarkStart w:id="210" w:name="ref-cameo"/>
+      <w:r>
+        <w:t xml:space="preserve">NIST CAMEO Chemicals: Database of Hazardous Materials and Reactivity.</w:t>
+      </w:r>
+      <w:r>
+        <w:t xml:space="preserve"> </w:t>
+      </w:r>
+      <w:hyperlink r:id="rId209">
+        <w:r>
+          <w:rPr>
+            <w:rStyle w:val="Hyperlink"/>
+          </w:rPr>
+          <w:t xml:space="preserve">cameochemicals.noaa.gov</w:t>
+        </w:r>
+      </w:hyperlink>
+      <w:r>
+        <w:t xml:space="preserve">.</w:t>
       </w:r>
       <w:bookmarkEnd w:id="210"/>
     </w:p>
@@ -35799,9 +35796,9 @@
         </w:rPr>
         <w:t xml:space="preserve">69. </w:t>
       </w:r>
-      <w:bookmarkStart w:id="211" w:name="ref-choi2023prep"/>
-      <w:r>
-        <w:t xml:space="preserve">Choi, J. B., Nguyen, P. C. H., Sen, O., Udaykumar, H. S., &amp; Baek, S. (2023). Artificial Intelligence Approaches for Energetic Materials by Design: State of the Art, Challenges, and Future Directions.</w:t>
+      <w:bookmarkStart w:id="211" w:name="ref-bruns2020watson"/>
+      <w:r>
+        <w:t xml:space="preserve">Bruns, R. F., &amp; Watson, I. A. (2012). Rules for identifying potentially reactive or promiscuous compounds.</w:t>
       </w:r>
       <w:r>
         <w:t xml:space="preserve"> </w:t>
@@ -35811,10 +35808,13 @@
           <w:i/>
           <w:iCs/>
         </w:rPr>
-        <w:t xml:space="preserve">Propellants, Explosives, Pyrotechnics 48(4)</w:t>
-      </w:r>
-      <w:r>
-        <w:t xml:space="preserve">, e202200276. doi:10.1002/prep.202200276.</w:t>
+        <w:t xml:space="preserve">J. Med. Chem.</w:t>
+      </w:r>
+      <w:r>
+        <w:t xml:space="preserve"> </w:t>
+      </w:r>
+      <w:r>
+        <w:t xml:space="preserve">55(22):9763–9772. doi:10.1021/jm301008n. Used here as a SMARTS-based reactivity-demerit source.</w:t>
       </w:r>
       <w:bookmarkEnd w:id="211"/>
     </w:p>
@@ -35835,9 +35835,9 @@
         </w:rPr>
         <w:t xml:space="preserve">70. </w:t>
       </w:r>
-      <w:bookmarkStart w:id="212" w:name="ref-csp-cgd-2023"/>
-      <w:r>
-        <w:t xml:space="preserve">Arnold, J. E., &amp; Day, G. M. (2023). Crystal Structure Prediction of Energetic Materials.</w:t>
+      <w:bookmarkStart w:id="212" w:name="ref-bondi1964vdw"/>
+      <w:r>
+        <w:t xml:space="preserve">Bondi, A. (1964). van der Waals Volumes and Radii.</w:t>
       </w:r>
       <w:r>
         <w:t xml:space="preserve"> </w:t>
@@ -35847,10 +35847,10 @@
           <w:i/>
           <w:iCs/>
         </w:rPr>
-        <w:t xml:space="preserve">Crystal Growth &amp; Design</w:t>
-      </w:r>
-      <w:r>
-        <w:t xml:space="preserve">. doi:10.1021/acs.cgd.3c00706.</w:t>
+        <w:t xml:space="preserve">J. Phys. Chem. 68(3)</w:t>
+      </w:r>
+      <w:r>
+        <w:t xml:space="preserve">:441–451. doi:10.1021/j100785a001.</w:t>
       </w:r>
       <w:bookmarkEnd w:id="212"/>
     </w:p>
@@ -35871,9 +35871,9 @@
         </w:rPr>
         <w:t xml:space="preserve">71. </w:t>
       </w:r>
-      <w:bookmarkStart w:id="213" w:name="ref-mlcrystdens-cm-2024"/>
-      <w:r>
-        <w:t xml:space="preserve">Davis, J. V., Marrs III, F. W., Cawkwell, M. J., &amp; Manner, V. W. (2024). Machine Learning Models for High Explosive Crystal Density and Performance.</w:t>
+      <w:bookmarkStart w:id="213" w:name="ref-csp-cgd-2023"/>
+      <w:r>
+        <w:t xml:space="preserve">Arnold, J. E., &amp; Day, G. M. (2023). Crystal Structure Prediction of Energetic Materials.</w:t>
       </w:r>
       <w:r>
         <w:t xml:space="preserve"> </w:t>
@@ -35883,10 +35883,10 @@
           <w:i/>
           <w:iCs/>
         </w:rPr>
-        <w:t xml:space="preserve">Chemistry of Materials 36(22)</w:t>
-      </w:r>
-      <w:r>
-        <w:t xml:space="preserve">, 11109–11118. doi:10.1021/acs.chemmater.4c01978.</w:t>
+        <w:t xml:space="preserve">Crystal Growth &amp; Design</w:t>
+      </w:r>
+      <w:r>
+        <w:t xml:space="preserve">. doi:10.1021/acs.cgd.3c00706.</w:t>
       </w:r>
       <w:bookmarkEnd w:id="213"/>
     </w:p>

</xml_diff>

<commit_message>
Paper: deferred deep-review pass (M4, dedup, abbreviations, SI numbering)
- M4: C.11 stated the 6-anchor LOO-RMS as ~0.032, contradicting the headline
  0.078 (authoritative: m2_calibration_6anchor.json loo_residual = 0.07797).
  Reworded to reference the 0.078 LOO-RMS and DNTF's out-of-band residual.
- SI: duplicate "C.5" subsection resolved (the E1 stability caveat is now
  C.5.1; its one in-text reference updated).
- De-dup: the tier-gate sentence no longer repeats verbatim in the contribution
  bullet (intro prose kept); the conclusion's baseline-collapse sentence
  condensed (the full version stays in the introduction).
- Abbreviations expanded at first use: BDE, EOS, ELBO, EMA, DDIM, PAINS.
All long + Molecules docx rebuilt.

Co-Authored-By: Claude Opus 4.8 <noreply@anthropic.com>
</commit_message>
<xml_diff>
--- a/paper/long_paper.docx
+++ b/paper/long_paper.docx
@@ -979,7 +979,7 @@
         <w:t xml:space="preserve"> </w:t>
       </w:r>
       <w:r>
-        <w:t xml:space="preserve">A four-tier label-trust hierarchy gates which examples drive the conditional gradient (experimental and DFT labels) and which train only the unconditional prior (Kamlet–Jacobs and surrogate labels), preventing low-confidence data from corrupting the targeted generation signal. The recipe is domain-agnostic; only the validation funnel changes per application.</w:t>
+        <w:t xml:space="preserve">Only trustworthy labels enter the conditional gradient, while lower-confidence labels train the unconditional prior (Section 3.1). The recipe is domain-agnostic; only the validation funnel changes per application.</w:t>
       </w:r>
     </w:p>
     <w:p>
@@ -2437,7 +2437,7 @@
         <w:t xml:space="preserve"> </w:t>
       </w:r>
       <w:r>
-        <w:t xml:space="preserve">develop the BDE-anchored sensitivity correlations we adopt for the</w:t>
+        <w:t xml:space="preserve">develop the bond-dissociation-energy (BDE)-anchored sensitivity correlations we adopt for the</w:t>
       </w:r>
       <w:r>
         <w:t xml:space="preserve"> </w:t>
@@ -2511,7 +2511,7 @@
         <w:t xml:space="preserve"> </w:t>
       </w:r>
       <w:r>
-        <w:t xml:space="preserve">replace the closed-form K-J step with a thermochemical-equilibrium Chapman–Jouguet solver and a covolume EOS, and remain the absolute-value-grade reference; we use K-J as the closed-form approximation and acknowledge the absolute-value gap explicitly (§5.3). The recent Choi et al. review</w:t>
+        <w:t xml:space="preserve">replace the closed-form K-J step with a thermochemical-equilibrium Chapman–Jouguet solver and a covolume equation of state (EOS), and remain the absolute-value-grade reference; we use K-J as the closed-form approximation and acknowledge the absolute-value gap explicitly (§5.3). The recent Choi et al. review</w:t>
       </w:r>
       <w:r>
         <w:t xml:space="preserve"> </w:t>
@@ -4777,7 +4777,7 @@
         </m:r>
       </m:oMath>
       <w:r>
-        <w:t xml:space="preserve">8.5k steps on the 326 k energetic-biased SMILES corpus with the standard ELBO,</w:t>
+        <w:t xml:space="preserve">8.5k steps on the 326 k energetic-biased SMILES corpus with the standard evidence lower bound (ELBO),</w:t>
       </w:r>
     </w:p>
     <w:p>
@@ -7080,7 +7080,7 @@
         </m:sSup>
       </m:oMath>
       <w:r>
-        <w:t xml:space="preserve">, cosine decay, batch 128, 20 epochs, EMA decay 0.999.</w:t>
+        <w:t xml:space="preserve">, cosine decay, batch 128, 20 epochs, exponential-moving-average (EMA) decay 0.999.</w:t>
       </w:r>
     </w:p>
     <w:bookmarkStart w:id="59" w:name="fig-9"/>
@@ -9811,7 +9811,7 @@
         <w:widowControl w:val="1"/>
       </w:pPr>
       <w:r>
-        <w:t xml:space="preserve">At sample time, three of the six trained heads (Viability, Sensitivity, Hazard) supply gradient steering signals at every DDIM step on top of classifier-free guidance. The denoiser remains the same checkpoint as §4.4; only the sampler changes.</w:t>
+        <w:t xml:space="preserve">At sample time, three of the six trained heads (Viability, Sensitivity, Hazard) supply gradient steering signals at every DDIM (denoising diffusion implicit model) step on top of classifier-free guidance. The denoiser remains the same checkpoint as §4.4; only the sampler changes.</w:t>
       </w:r>
     </w:p>
     <w:p>
@@ -27283,7 +27283,7 @@
         <w:t xml:space="preserve"> </w:t>
       </w:r>
       <w:r>
-        <w:t xml:space="preserve">are higher than L1's. The 1,2,3,5-oxatriazole ring system has known thermal/Lewis-acid ring-opening pathways (Sheremetev 2007; Katritzky 2010); a dedicated BDE and DSC/TGA stability screen is required before E1 is promoted to synthesis priority (Appendix C.5 caveat block). Without an oxatriazole-class anchor, E1's calibrated</w:t>
+        <w:t xml:space="preserve">are higher than L1's. The 1,2,3,5-oxatriazole ring system has known thermal/Lewis-acid ring-opening pathways (Sheremetev 2007; Katritzky 2010); a dedicated BDE and DSC/TGA stability screen is required before E1 is promoted to synthesis priority (Appendix C.5.1). Without an oxatriazole-class anchor, E1's calibrated</w:t>
       </w:r>
       <w:r>
         <w:t xml:space="preserve"> </w:t>
@@ -33092,43 +33092,7 @@
         </m:r>
       </m:oMath>
       <w:r>
-        <w:t xml:space="preserve"> km/s and is structurally dissimilar from all 65 980 training molecules (nearest-neighbour Tanimoto 0.27). Three strong baselines fail the novel-and-on-target test on the same compute: SMILES-LSTM memorises 18.3% of outputs; SELFIES-GA produces 75% (75/100) corpus rediscoveries, with its best novel candidate collapsing from</w:t>
-      </w:r>
-      <w:r>
-        <w:t xml:space="preserve"> </w:t>
-      </w:r>
-      <m:oMath>
-        <m:sSub>
-          <m:e>
-            <m:r>
-              <m:t>D</m:t>
-            </m:r>
-          </m:e>
-          <m:sub>
-            <m:r>
-              <m:rPr>
-                <m:nor/>
-                <m:sty m:val="p"/>
-              </m:rPr>
-              <m:t>surrogate</m:t>
-            </m:r>
-          </m:sub>
-        </m:sSub>
-        <m:r>
-          <m:rPr>
-            <m:sty m:val="p"/>
-          </m:rPr>
-          <m:t>=</m:t>
-        </m:r>
-        <m:r>
-          <m:t>9.73</m:t>
-        </m:r>
-      </m:oMath>
-      <w:r>
-        <w:t xml:space="preserve"> </w:t>
-      </w:r>
-      <w:r>
-        <w:t xml:space="preserve">to</w:t>
+        <w:t xml:space="preserve"> km/s and is structurally dissimilar from all 65 980 training molecules (nearest-neighbour Tanimoto 0.27). Three strong baselines fail the novel-and-on-target test on the same compute: SMILES-LSTM memorises 18.3% of outputs; SELFIES-GA sees its best novel candidate collapse to</w:t>
       </w:r>
       <w:r>
         <w:t xml:space="preserve"> </w:t>
@@ -33161,7 +33125,7 @@
         </m:r>
       </m:oMath>
       <w:r>
-        <w:t xml:space="preserve"> km/s under DFT audit (a 3.5 km/s surrogate artefact); REINVENT 4 generates novel high-N heterocycles but peaks at</w:t>
+        <w:t xml:space="preserve"> km/s under DFT audit; REINVENT 4 generates novel high-N heterocycles but peaks at</w:t>
       </w:r>
       <w:r>
         <w:t xml:space="preserve"> </w:t>

</xml_diff>

<commit_message>
Paper: add Baseline generators Methods subsection
Documents the four head-to-head baselines from their verified configs in
EnergeticDiffusion2/baseline_bundle:
- SMILES-LSTM: 2-layer char LSTM (512 hidden, ~6M params), from-scratch on the
  326k corpus, 5 epochs AdamW; 10k samples at T=1.0, 3 seeds.
- SELFIES-GA: GA over SELFIES (selfies 2.1.1), pop 2000 x 30 gen (40k x 15
  compute-matched), optimises the DGLD composite; 40k best-novel carried to DFT.
- MolMIM 70M: pretrained (no fine-tune), greedy-perturbate decode, 5598 samples;
  composite on an uncalibrated scale.
- REINVENT 4 (v4.4.12): RL on the built-in prior, N-fraction reward, 8000 steps
  (40k) / staged-learning multiseed; no rho/D/P target, surrogate-scored post hoc.
Notes the shared-surrogate evaluation and that only SELFIES-GA's best-novel went
to DFT, and that composites are within-method only.

Co-Authored-By: Claude Opus 4.8 <noreply@anthropic.com>
</commit_message>
<xml_diff>
--- a/paper/long_paper.docx
+++ b/paper/long_paper.docx
@@ -4586,7 +4586,7 @@
     </w:p>
     <w:bookmarkEnd w:id="39"/>
     <w:bookmarkEnd w:id="40"/>
-    <w:bookmarkStart w:id="99" w:name="sec-method"/>
+    <w:bookmarkStart w:id="100" w:name="sec-method"/>
     <w:p>
       <w:pPr>
         <w:pStyle w:val="Heading2"/>
@@ -13414,20 +13414,7 @@
       </w:r>
     </w:p>
     <w:bookmarkEnd w:id="98"/>
-    <w:bookmarkEnd w:id="99"/>
-    <w:bookmarkStart w:id="136" w:name="sec-exp"/>
-    <w:p>
-      <w:pPr>
-        <w:pStyle w:val="Heading2"/>
-        <w:keepNext/>
-        <w:keepLines/>
-        <w:widowControl w:val="1"/>
-      </w:pPr>
-      <w:r>
-        <w:t xml:space="preserve">5. Experiments</w:t>
-      </w:r>
-    </w:p>
-    <w:bookmarkStart w:id="100" w:name="roadmap-and-headline-targets"/>
+    <w:bookmarkStart w:id="99" w:name="baseline-generators"/>
     <w:p>
       <w:pPr>
         <w:pStyle w:val="Heading3"/>
@@ -13436,7 +13423,7 @@
         <w:widowControl w:val="1"/>
       </w:pPr>
       <w:r>
-        <w:t xml:space="preserve">5.1 Roadmap and headline targets</w:t>
+        <w:t xml:space="preserve">4.13 Baseline generators</w:t>
       </w:r>
     </w:p>
     <w:p>
@@ -13448,76 +13435,109 @@
         <w:widowControl w:val="1"/>
       </w:pPr>
       <w:r>
-        <w:t xml:space="preserve">§5 is structured results-first: §5.2 reports the gated Pareto reranker top leads (Stages 1+2 of the validation chain); §5.3 reports physics validation (xTB triage and DFT confirmation, Stages 3+4); §5.4 combines novelty, retrosynthesis, and the E-set scaffold-diversity audit; §5.5 contrasts DGLD against no-diffusion baselines; §5.6 is the ablation summary. The four headline targets are</w:t>
+        <w:t xml:space="preserve">Four no-diffusion baselines are run through the identical downstream validation pipeline (canonicalisation, chemistry filters, Uni-Mol 3D-CNN surrogate scoring, novelty window) on the same training corpus, so that any difference reflects the generator rather than the evaluation.</w:t>
+      </w:r>
+    </w:p>
+    <w:p>
+      <w:pPr>
+        <w:pStyle w:val="BodyText"/>
+        <w:jc w:val="both"/>
+        <w:keepNext w:val="0"/>
+        <w:keepLines w:val="0"/>
+        <w:widowControl w:val="1"/>
+      </w:pPr>
+      <w:r>
+        <w:rPr>
+          <w:b/>
+          <w:bCs/>
+        </w:rPr>
+        <w:t xml:space="preserve">SMILES-LSTM.</w:t>
+      </w:r>
+      <w:r>
+        <w:t xml:space="preserve"> </w:t>
+      </w:r>
+      <w:r>
+        <w:t xml:space="preserve">A character-level LSTM (embedding</w:t>
       </w:r>
       <w:r>
         <w:t xml:space="preserve"> </w:t>
       </w:r>
       <m:oMath>
         <m:r>
-          <m:t>ρ</m:t>
-        </m:r>
+          <m:t>o</m:t>
+        </m:r>
+      </m:oMath>
+      <w:r>
+        <w:t xml:space="preserve"> </w:t>
+      </w:r>
+      <w:r>
+        <w:t xml:space="preserve">2-layer LSTM, 512 hidden units,</w:t>
+      </w:r>
+      <w:r>
+        <w:t xml:space="preserve"> </w:t>
+      </w:r>
+      <m:oMath>
         <m:r>
           <m:rPr>
             <m:sty m:val="p"/>
           </m:rPr>
-          <m:t>≥</m:t>
-        </m:r>
-        <m:r>
-          <m:t>1.85</m:t>
+          <m:t>∼</m:t>
         </m:r>
       </m:oMath>
       <w:r>
-        <w:t xml:space="preserve"> g/cm</w:t>
-      </w:r>
-      <w:r>
-        <w:rPr>
-          <w:vertAlign w:val="superscript"/>
-        </w:rPr>
-        <w:t xml:space="preserve">3</w:t>
-      </w:r>
-      <w:r>
-        <w:t xml:space="preserve">,</w:t>
+        <w:t xml:space="preserve">6 M parameters) trained from scratch on the 326 k-molecule energetic SMILES corpus (AdamW, learning rate</w:t>
       </w:r>
       <w:r>
         <w:t xml:space="preserve"> </w:t>
       </w:r>
       <m:oMath>
-        <m:r>
-          <m:t>D</m:t>
-        </m:r>
-        <m:r>
-          <m:rPr>
-            <m:sty m:val="p"/>
-          </m:rPr>
-          <m:t>≥</m:t>
-        </m:r>
-        <m:r>
-          <m:t>9.0</m:t>
-        </m:r>
+        <m:sSup>
+          <m:e>
+            <m:r>
+              <m:t>10</m:t>
+            </m:r>
+          </m:e>
+          <m:sup>
+            <m:r>
+              <m:rPr>
+                <m:sty m:val="p"/>
+              </m:rPr>
+              <m:t>−</m:t>
+            </m:r>
+            <m:r>
+              <m:t>3</m:t>
+            </m:r>
+          </m:sup>
+        </m:sSup>
       </m:oMath>
       <w:r>
-        <w:t xml:space="preserve"> km/s,</w:t>
+        <w:t xml:space="preserve">, weight decay</w:t>
       </w:r>
       <w:r>
         <w:t xml:space="preserve"> </w:t>
       </w:r>
       <m:oMath>
-        <m:r>
-          <m:t>P</m:t>
-        </m:r>
-        <m:r>
-          <m:rPr>
-            <m:sty m:val="p"/>
-          </m:rPr>
-          <m:t>≥</m:t>
-        </m:r>
-        <m:r>
-          <m:t>35</m:t>
-        </m:r>
+        <m:sSup>
+          <m:e>
+            <m:r>
+              <m:t>10</m:t>
+            </m:r>
+          </m:e>
+          <m:sup>
+            <m:r>
+              <m:rPr>
+                <m:sty m:val="p"/>
+              </m:rPr>
+              <m:t>−</m:t>
+            </m:r>
+            <m:r>
+              <m:t>4</m:t>
+            </m:r>
+          </m:sup>
+        </m:sSup>
       </m:oMath>
       <w:r>
-        <w:t xml:space="preserve"> GPa and Tanimoto novelty</w:t>
+        <w:t xml:space="preserve">, batch 128, gradient clip 1.0, 5 epochs, sequence length</w:t>
       </w:r>
       <w:r>
         <w:t xml:space="preserve"> </w:t>
@@ -13529,87 +13549,217 @@
           </m:rPr>
           <m:t>≤</m:t>
         </m:r>
-        <m:r>
-          <m:t>0.55</m:t>
-        </m:r>
       </m:oMath>
       <w:r>
-        <w:t xml:space="preserve"> </w:t>
-      </w:r>
-      <w:r>
-        <w:t xml:space="preserve">against every training row, validated through the four-stage chain SMARTS</w:t>
-      </w:r>
-      <w:r>
-        <w:t xml:space="preserve"> </w:t>
+        <w:t xml:space="preserve"> 120). Ten thousand SMILES are sampled autoregressively at temperature 1.0 for each of three seeds. This baseline matches DGLD's corpus and parameter budget but omits diffusion and score-model guidance.</w:t>
+      </w:r>
+    </w:p>
+    <w:p>
+      <w:pPr>
+        <w:pStyle w:val="BodyText"/>
+        <w:jc w:val="both"/>
+        <w:keepNext w:val="0"/>
+        <w:keepLines w:val="0"/>
+        <w:widowControl w:val="1"/>
+      </w:pPr>
+      <w:r>
+        <w:rPr>
+          <w:b/>
+          <w:bCs/>
+        </w:rPr>
+        <w:t xml:space="preserve">SELFIES-GA.</w:t>
+      </w:r>
+      <w:r>
+        <w:t xml:space="preserve"> </w:t>
+      </w:r>
+      <w:r>
+        <w:t xml:space="preserve">A genetic algorithm over SELFIES (</w:t>
+      </w:r>
+      <w:r>
+        <w:rPr>
+          <w:rStyle w:val="VerbatimChar"/>
+        </w:rPr>
+        <w:t xml:space="preserve">selfies</w:t>
+      </w:r>
+      <w:r>
+        <w:t xml:space="preserve"> 2.1.1: token substitution/insertion/deletion up to three mutations, single-point crossover), initialised from the same corpus and optimising the DGLD Pareto composite (viability, sensitivity, novelty, performance) each generation. The primary run evolves a population of 2 000 over 30 generations (elite fraction 0.50, new fraction 0.20, crossover fraction 0.15, seed 42); a compute-matched variant evolves 40 000 over 15 generations. Every candidate is scored each generation by the same Uni-Mol 3D-CNN surrogate; the 40 000-pool best-novel candidate is carried through the full B3LYP/6-31G(d)</w:t>
+      </w:r>
+      <w:r>
+        <w:t xml:space="preserve"> </w:t>
+      </w:r>
+      <m:oMath>
+        <m:r>
+          <m:t>o</m:t>
+        </m:r>
+      </m:oMath>
+      <w:r>
+        <w:t xml:space="preserve"> </w:t>
+      </w:r>
+      <m:oMath>
+        <m:r>
+          <m:t>ω</m:t>
+        </m:r>
+      </m:oMath>
+      <w:r>
+        <w:t xml:space="preserve">B97X-D3BJ/def2-TZVP</w:t>
+      </w:r>
+      <w:r>
+        <w:t xml:space="preserve"> </w:t>
+      </w:r>
+      <m:oMath>
+        <m:r>
+          <m:t>o</m:t>
+        </m:r>
+      </m:oMath>
+      <w:r>
+        <w:t xml:space="preserve"> </w:t>
+      </w:r>
+      <w:r>
+        <w:t xml:space="preserve">Kamlet–Jacobs DFT audit.</w:t>
+      </w:r>
+    </w:p>
+    <w:p>
+      <w:pPr>
+        <w:pStyle w:val="BodyText"/>
+        <w:jc w:val="both"/>
+        <w:keepNext w:val="0"/>
+        <w:keepLines w:val="0"/>
+        <w:widowControl w:val="1"/>
+      </w:pPr>
+      <w:r>
+        <w:rPr>
+          <w:b/>
+          <w:bCs/>
+        </w:rPr>
+        <w:t xml:space="preserve">MolMIM 70 M.</w:t>
+      </w:r>
+      <w:r>
+        <w:t xml:space="preserve"> </w:t>
+      </w:r>
+      <w:r>
+        <w:t xml:space="preserve">NVIDIA MolMIM (</w:t>
       </w:r>
       <m:oMath>
         <m:r>
           <m:rPr>
             <m:sty m:val="p"/>
           </m:rPr>
-          <m:t>→</m:t>
+          <m:t>∼</m:t>
         </m:r>
       </m:oMath>
       <w:r>
-        <w:t xml:space="preserve"> </w:t>
-      </w:r>
-      <w:r>
-        <w:t xml:space="preserve">Pareto</w:t>
+        <w:t xml:space="preserve">70 M parameters,</w:t>
+      </w:r>
+      <w:r>
+        <w:t xml:space="preserve"> </w:t>
+      </w:r>
+      <w:r>
+        <w:rPr>
+          <w:rStyle w:val="VerbatimChar"/>
+        </w:rPr>
+        <w:t xml:space="preserve">molmim_70m_24_3</w:t>
+      </w:r>
+      <w:r>
+        <w:t xml:space="preserve"> </w:t>
+      </w:r>
+      <w:r>
+        <w:t xml:space="preserve">checkpoint, BioNeMo 1.5), used pretrained without energetic-domain fine-tuning as an out-of-domain reference. Molecules are produced by greedy–perturbate latent decoding (scaled radius 1.0, single seed), yielding 5 598 samples that are scored on the same surrogate. Its composite is on an uncalibrated scale and is not comparable to the other methods.</w:t>
+      </w:r>
+    </w:p>
+    <w:p>
+      <w:pPr>
+        <w:pStyle w:val="BodyText"/>
+        <w:jc w:val="both"/>
+        <w:keepNext w:val="0"/>
+        <w:keepLines w:val="0"/>
+        <w:widowControl w:val="1"/>
+      </w:pPr>
+      <w:r>
+        <w:rPr>
+          <w:b/>
+          <w:bCs/>
+        </w:rPr>
+        <w:t xml:space="preserve">REINVENT 4.</w:t>
+      </w:r>
+      <w:r>
+        <w:t xml:space="preserve"> </w:t>
+      </w:r>
+      <w:r>
+        <w:t xml:space="preserve">AstraZeneca REINVENT 4 (v4.4.12) with reinforcement-learning fine-tuning of its built-in SMILES-transformer prior under an N-fraction-oriented reward (N-rich substructure match, synthetic-accessibility penalty, molecular-weight floor, CHNO alerts), with no DGLD-corpus pretraining. The 40 000-target run uses 8 000 reinforcement-learning steps; a multi-seed variant uses staged learning (2 000 steps, DAP,</w:t>
       </w:r>
       <w:r>
         <w:t xml:space="preserve"> </w:t>
       </w:r>
       <m:oMath>
+        <m:r>
+          <m:t>σ</m:t>
+        </m:r>
         <m:r>
           <m:rPr>
             <m:sty m:val="p"/>
           </m:rPr>
-          <m:t>→</m:t>
+          <m:t>=</m:t>
+        </m:r>
+        <m:r>
+          <m:t>128</m:t>
         </m:r>
       </m:oMath>
       <w:r>
-        <w:t xml:space="preserve"> </w:t>
-      </w:r>
-      <w:r>
-        <w:t xml:space="preserve">xTB</w:t>
-      </w:r>
-      <w:r>
-        <w:t xml:space="preserve"> </w:t>
+        <w:t xml:space="preserve">, seeds 42/1/2). Because the reward does not target \(</w:t>
+      </w:r>
+      <w:r>
+        <w:t xml:space="preserve"> </w:t>
+      </w:r>
+      <w:r>
+        <w:t xml:space="preserve">ho\)/</w:t>
       </w:r>
       <m:oMath>
         <m:r>
-          <m:rPr>
-            <m:sty m:val="p"/>
-          </m:rPr>
-          <m:t>→</m:t>
+          <m:t>D</m:t>
         </m:r>
       </m:oMath>
       <w:r>
-        <w:t xml:space="preserve"> </w:t>
-      </w:r>
-      <w:r>
-        <w:t xml:space="preserve">DFT documented in §4.10 (Fig 14). Hyperparameters and the production configuration (CFG=7, pool</w:t>
-      </w:r>
-      <w:r>
-        <w:t xml:space="preserve"> </w:t>
+        <w:t xml:space="preserve">/</w:t>
       </w:r>
       <m:oMath>
         <m:r>
-          <m:rPr>
-            <m:sty m:val="p"/>
-          </m:rPr>
-          <m:t>≥</m:t>
+          <m:t>P</m:t>
         </m:r>
       </m:oMath>
       <w:r>
         <w:t xml:space="preserve"> </w:t>
       </w:r>
       <w:r>
-        <w:t xml:space="preserve">40k per denoiser, alpha-anneal disabled) are documented in §4.12 and Appendix B.5 (Table B.5) and are not re-derived here.</w:t>
+        <w:t xml:space="preserve">directly, the top-100 by N-fraction are scored post hoc on the same surrogate.</w:t>
       </w:r>
     </w:p>
+    <w:p>
+      <w:pPr>
+        <w:pStyle w:val="BodyText"/>
+        <w:jc w:val="both"/>
+        <w:keepNext w:val="0"/>
+        <w:keepLines w:val="0"/>
+        <w:widowControl w:val="1"/>
+      </w:pPr>
+      <w:r>
+        <w:t xml:space="preserve">All four baselines are scored on the same Uni-Mol 3D-CNN surrogate; only the SELFIES-GA best-novel candidate is carried to DFT. The reranker composite is generator-internal for SELFIES-GA, an N-fraction proxy for REINVENT 4, and uncalibrated for MolMIM, so composite values are compared within, not across, methods.</w:t>
+      </w:r>
+    </w:p>
+    <w:bookmarkEnd w:id="99"/>
     <w:bookmarkEnd w:id="100"/>
-    <w:bookmarkStart w:id="108" w:name="X44f1f51bcdec0f0d500c05572a47919d181fce8"/>
+    <w:bookmarkStart w:id="137" w:name="sec-exp"/>
+    <w:p>
+      <w:pPr>
+        <w:pStyle w:val="Heading2"/>
+        <w:keepNext/>
+        <w:keepLines/>
+        <w:widowControl w:val="1"/>
+      </w:pPr>
+      <w:r>
+        <w:t xml:space="preserve">5. Experiments</w:t>
+      </w:r>
+    </w:p>
+    <w:bookmarkStart w:id="101" w:name="roadmap-and-headline-targets"/>
     <w:p>
       <w:pPr>
         <w:pStyle w:val="Heading3"/>
@@ -13618,7 +13768,7 @@
         <w:widowControl w:val="1"/>
       </w:pPr>
       <w:r>
-        <w:t xml:space="preserve">5.2 Top leads from the gated Pareto reranker (Stages 1+2)</w:t>
+        <w:t xml:space="preserve">5.1 Roadmap and headline targets</w:t>
       </w:r>
     </w:p>
     <w:p>
@@ -13630,6 +13780,188 @@
         <w:widowControl w:val="1"/>
       </w:pPr>
       <w:r>
+        <w:t xml:space="preserve">§5 is structured results-first: §5.2 reports the gated Pareto reranker top leads (Stages 1+2 of the validation chain); §5.3 reports physics validation (xTB triage and DFT confirmation, Stages 3+4); §5.4 combines novelty, retrosynthesis, and the E-set scaffold-diversity audit; §5.5 contrasts DGLD against no-diffusion baselines; §5.6 is the ablation summary. The four headline targets are</w:t>
+      </w:r>
+      <w:r>
+        <w:t xml:space="preserve"> </w:t>
+      </w:r>
+      <m:oMath>
+        <m:r>
+          <m:t>ρ</m:t>
+        </m:r>
+        <m:r>
+          <m:rPr>
+            <m:sty m:val="p"/>
+          </m:rPr>
+          <m:t>≥</m:t>
+        </m:r>
+        <m:r>
+          <m:t>1.85</m:t>
+        </m:r>
+      </m:oMath>
+      <w:r>
+        <w:t xml:space="preserve"> g/cm</w:t>
+      </w:r>
+      <w:r>
+        <w:rPr>
+          <w:vertAlign w:val="superscript"/>
+        </w:rPr>
+        <w:t xml:space="preserve">3</w:t>
+      </w:r>
+      <w:r>
+        <w:t xml:space="preserve">,</w:t>
+      </w:r>
+      <w:r>
+        <w:t xml:space="preserve"> </w:t>
+      </w:r>
+      <m:oMath>
+        <m:r>
+          <m:t>D</m:t>
+        </m:r>
+        <m:r>
+          <m:rPr>
+            <m:sty m:val="p"/>
+          </m:rPr>
+          <m:t>≥</m:t>
+        </m:r>
+        <m:r>
+          <m:t>9.0</m:t>
+        </m:r>
+      </m:oMath>
+      <w:r>
+        <w:t xml:space="preserve"> km/s,</w:t>
+      </w:r>
+      <w:r>
+        <w:t xml:space="preserve"> </w:t>
+      </w:r>
+      <m:oMath>
+        <m:r>
+          <m:t>P</m:t>
+        </m:r>
+        <m:r>
+          <m:rPr>
+            <m:sty m:val="p"/>
+          </m:rPr>
+          <m:t>≥</m:t>
+        </m:r>
+        <m:r>
+          <m:t>35</m:t>
+        </m:r>
+      </m:oMath>
+      <w:r>
+        <w:t xml:space="preserve"> GPa and Tanimoto novelty</w:t>
+      </w:r>
+      <w:r>
+        <w:t xml:space="preserve"> </w:t>
+      </w:r>
+      <m:oMath>
+        <m:r>
+          <m:rPr>
+            <m:sty m:val="p"/>
+          </m:rPr>
+          <m:t>≤</m:t>
+        </m:r>
+        <m:r>
+          <m:t>0.55</m:t>
+        </m:r>
+      </m:oMath>
+      <w:r>
+        <w:t xml:space="preserve"> </w:t>
+      </w:r>
+      <w:r>
+        <w:t xml:space="preserve">against every training row, validated through the four-stage chain SMARTS</w:t>
+      </w:r>
+      <w:r>
+        <w:t xml:space="preserve"> </w:t>
+      </w:r>
+      <m:oMath>
+        <m:r>
+          <m:rPr>
+            <m:sty m:val="p"/>
+          </m:rPr>
+          <m:t>→</m:t>
+        </m:r>
+      </m:oMath>
+      <w:r>
+        <w:t xml:space="preserve"> </w:t>
+      </w:r>
+      <w:r>
+        <w:t xml:space="preserve">Pareto</w:t>
+      </w:r>
+      <w:r>
+        <w:t xml:space="preserve"> </w:t>
+      </w:r>
+      <m:oMath>
+        <m:r>
+          <m:rPr>
+            <m:sty m:val="p"/>
+          </m:rPr>
+          <m:t>→</m:t>
+        </m:r>
+      </m:oMath>
+      <w:r>
+        <w:t xml:space="preserve"> </w:t>
+      </w:r>
+      <w:r>
+        <w:t xml:space="preserve">xTB</w:t>
+      </w:r>
+      <w:r>
+        <w:t xml:space="preserve"> </w:t>
+      </w:r>
+      <m:oMath>
+        <m:r>
+          <m:rPr>
+            <m:sty m:val="p"/>
+          </m:rPr>
+          <m:t>→</m:t>
+        </m:r>
+      </m:oMath>
+      <w:r>
+        <w:t xml:space="preserve"> </w:t>
+      </w:r>
+      <w:r>
+        <w:t xml:space="preserve">DFT documented in §4.10 (Fig 14). Hyperparameters and the production configuration (CFG=7, pool</w:t>
+      </w:r>
+      <w:r>
+        <w:t xml:space="preserve"> </w:t>
+      </w:r>
+      <m:oMath>
+        <m:r>
+          <m:rPr>
+            <m:sty m:val="p"/>
+          </m:rPr>
+          <m:t>≥</m:t>
+        </m:r>
+      </m:oMath>
+      <w:r>
+        <w:t xml:space="preserve"> </w:t>
+      </w:r>
+      <w:r>
+        <w:t xml:space="preserve">40k per denoiser, alpha-anneal disabled) are documented in §4.12 and Appendix B.5 (Table B.5) and are not re-derived here.</w:t>
+      </w:r>
+    </w:p>
+    <w:bookmarkEnd w:id="101"/>
+    <w:bookmarkStart w:id="109" w:name="X44f1f51bcdec0f0d500c05572a47919d181fce8"/>
+    <w:p>
+      <w:pPr>
+        <w:pStyle w:val="Heading3"/>
+        <w:keepNext/>
+        <w:keepLines/>
+        <w:widowControl w:val="1"/>
+      </w:pPr>
+      <w:r>
+        <w:t xml:space="preserve">5.2 Top leads from the gated Pareto reranker (Stages 1+2)</w:t>
+      </w:r>
+    </w:p>
+    <w:p>
+      <w:pPr>
+        <w:pStyle w:val="FirstParagraph"/>
+        <w:jc w:val="both"/>
+        <w:keepNext w:val="0"/>
+        <w:keepLines w:val="0"/>
+        <w:widowControl w:val="1"/>
+      </w:pPr>
+      <w:r>
         <w:t xml:space="preserve">Applying the §4.10 gated multi-objective reranker (hard filters, banded performance score, viability, novelty, sensitivity, alerts) to the pool=40 000 candidate set: of the top-400 single-objective candidates, 45 are rejected by the hard filters (poly-nitro-on-C2, MW &lt; 130, OB &gt; +25 %); the 355 survivors define a Pareto front of 34 candidates (Fig 20). The top-five Pareto leads are shown in Figure 19.</w:t>
       </w:r>
       <w:r>
@@ -13649,7 +13981,7 @@
         <w:t xml:space="preserve">(the rank-1 trinitro-isoxazole itself comes from a guided run); guidance acts as a high-precision lever on the top of the funnel, not as the source of bulk Pareto coverage (source-pool breakdown in Appendix D.10).</w:t>
       </w:r>
     </w:p>
-    <w:bookmarkStart w:id="104" w:name="fig-lead-cards-grid"/>
+    <w:bookmarkStart w:id="105" w:name="fig-lead-cards-grid"/>
     <w:p>
       <w:pPr>
         <w:pStyle w:val="BodyText"/>
@@ -13663,18 +13995,18 @@
           <wp:inline>
             <wp:extent cx="5943600" cy="5063204"/>
             <wp:effectExtent b="0" l="0" r="0" t="0"/>
-            <wp:docPr descr="Twelve DGLD lead cards in a 3-by-4 grid" title="" id="102" name="Picture"/>
+            <wp:docPr descr="Twelve DGLD lead cards in a 3-by-4 grid" title="" id="103" name="Picture"/>
             <a:graphic>
               <a:graphicData uri="http://schemas.openxmlformats.org/drawingml/2006/picture">
                 <pic:pic>
                   <pic:nvPicPr>
-                    <pic:cNvPr descr="figs/fig_lead_cards_grid.png" id="103" name="Picture"/>
+                    <pic:cNvPr descr="figs/fig_lead_cards_grid.png" id="104" name="Picture"/>
                     <pic:cNvPicPr>
                       <a:picLocks noChangeArrowheads="1" noChangeAspect="1"/>
                     </pic:cNvPicPr>
                   </pic:nvPicPr>
                   <pic:blipFill>
-                    <a:blip r:embed="rId101"/>
+                    <a:blip r:embed="rId102"/>
                     <a:stretch>
                       <a:fillRect/>
                     </a:stretch>
@@ -13788,7 +14120,7 @@
         <w:t>Twelve chem-pass DGLD leads (L1–L5, L9, L11, L13, L16, L18, L19, L20). Each card shows the RDKit 2D depiction, chemotype label, molecular formula, and 6-anchor-calibrated DFT/Kamlet–Jacobs (, , ) values. The dark circle (top-left) shows the Pareto rank within the merged top-100; “?” indicates a lead (L20) added from the pool=80k extension set and not assigned a top-100 rank. Top-5 leads (L1–L5) additionally show composite score  and drop-weight impact sensitivity . Border colour: green = xTB HOMO–LUMO gap  eV (electronic-stability pass); red = gap  eV (electronic-stability fail).</w:t>
       </w:r>
     </w:p>
-    <w:bookmarkEnd w:id="104"/>
+    <w:bookmarkEnd w:id="105"/>
     <w:p>
       <w:pPr>
         <w:pStyle w:val="BodyText"/>
@@ -13984,18 +14316,18 @@
           <wp:inline>
             <wp:extent cx="5943600" cy="3988623"/>
             <wp:effectExtent b="0" l="0" r="0" t="0"/>
-            <wp:docPr descr="Pareto front of the gated reranker" title="" id="106" name="Picture"/>
+            <wp:docPr descr="Pareto front of the gated reranker" title="" id="107" name="Picture"/>
             <a:graphic>
               <a:graphicData uri="http://schemas.openxmlformats.org/drawingml/2006/picture">
                 <pic:pic>
                   <pic:nvPicPr>
-                    <pic:cNvPr descr="figs/fig6_pareto_v2.png" id="107" name="Picture"/>
+                    <pic:cNvPr descr="figs/fig6_pareto_v2.png" id="108" name="Picture"/>
                     <pic:cNvPicPr>
                       <a:picLocks noChangeArrowheads="1" noChangeAspect="1"/>
                     </pic:cNvPicPr>
                   </pic:nvPicPr>
                   <pic:blipFill>
-                    <a:blip r:embed="rId105"/>
+                    <a:blip r:embed="rId106"/>
                     <a:stretch>
                       <a:fillRect/>
                     </a:stretch>
@@ -14053,8 +14385,8 @@
         <w:t>Filtered candidates (post hard-gate): saturating-performance score (x) vs. viability classifier output (y), coloured by sensitivity proxy. Stars mark the Pareto front.</w:t>
       </w:r>
     </w:p>
-    <w:bookmarkEnd w:id="108"/>
-    <w:bookmarkStart w:id="113" w:name="Xf6b2c372450e114420fe9f50105be8ff34efab6"/>
+    <w:bookmarkEnd w:id="109"/>
+    <w:bookmarkStart w:id="114" w:name="Xf6b2c372450e114420fe9f50105be8ff34efab6"/>
     <w:p>
       <w:pPr>
         <w:pStyle w:val="Heading3"/>
@@ -15112,7 +15444,7 @@
         <w:t xml:space="preserve">values require BKW/JCZ3 covolume corrections (§6), full discussion in Appendix C.13.</w:t>
       </w:r>
     </w:p>
-    <w:bookmarkStart w:id="112" w:name="fig-dft-dumbbell"/>
+    <w:bookmarkStart w:id="113" w:name="fig-dft-dumbbell"/>
     <w:p>
       <w:pPr>
         <w:pStyle w:val="BodyText"/>
@@ -15126,18 +15458,18 @@
           <wp:inline>
             <wp:extent cx="5943600" cy="2667190"/>
             <wp:effectExtent b="0" l="0" r="0" t="0"/>
-            <wp:docPr descr="DFT dumbbell + N-fraction residual scatter" title="" id="110" name="Picture"/>
+            <wp:docPr descr="DFT dumbbell + N-fraction residual scatter" title="" id="111" name="Picture"/>
             <a:graphic>
               <a:graphicData uri="http://schemas.openxmlformats.org/drawingml/2006/picture">
                 <pic:pic>
                   <pic:nvPicPr>
-                    <pic:cNvPr descr="figs/fig_dft_dumbbell.png" id="111" name="Picture"/>
+                    <pic:cNvPr descr="figs/fig_dft_dumbbell.png" id="112" name="Picture"/>
                     <pic:cNvPicPr>
                       <a:picLocks noChangeArrowheads="1" noChangeAspect="1"/>
                     </pic:cNvPicPr>
                   </pic:nvPicPr>
                   <pic:blipFill>
-                    <a:blip r:embed="rId109"/>
+                    <a:blip r:embed="rId110"/>
                     <a:stretch>
                       <a:fillRect/>
                     </a:stretch>
@@ -15210,7 +15542,7 @@
         <w:t>Left: dumbbell plot connecting 3D-CNN-predicted  (blue) to anchor-calibrated DFT–K-J  (orange) for each DFT-converged lead; dotted green line is the HMX-class 9.0 km/s threshold. Right: residual vs N-fraction with linear fit and Pearson  (575-row Tier-A pool, see Table C.4).</w:t>
       </w:r>
     </w:p>
-    <w:bookmarkEnd w:id="112"/>
+    <w:bookmarkEnd w:id="113"/>
     <w:p>
       <w:pPr>
         <w:pStyle w:val="BodyText"/>
@@ -20018,8 +20350,8 @@
         <w:t xml:space="preserve">is the closest fully-substituted ring previously characterised. The 3,4,5-trinitro-1,2-isoxazole isomer DGLD proposes is absent from the 65 980-row labelled master (max-Tanimoto 0.27) and from PubChem; it is therefore a chemotype-class rediscovery with a positionally novel substitution pattern.</w:t>
       </w:r>
     </w:p>
-    <w:bookmarkEnd w:id="113"/>
-    <w:bookmarkStart w:id="117" w:name="sec-extension-set"/>
+    <w:bookmarkEnd w:id="114"/>
+    <w:bookmarkStart w:id="118" w:name="sec-extension-set"/>
     <w:p>
       <w:pPr>
         <w:pStyle w:val="Heading3"/>
@@ -20043,7 +20375,7 @@
         <w:t xml:space="preserve">Three audits frame the merged top-100 against PubChem, public USPTO retrosynthesis templates, and a scaffold-distinct E-set extension. The headline is that DGLD generates a chemotype distribution (the scaffold-distinct E-set extension, E1–E10: 10 DFT leads / 8 Bemis–Murcko scaffolds / 6 families), not a single isoxazole hit.</w:t>
       </w:r>
     </w:p>
-    <w:bookmarkStart w:id="114" w:name="novelty-audit"/>
+    <w:bookmarkStart w:id="115" w:name="novelty-audit"/>
     <w:p>
       <w:pPr>
         <w:pStyle w:val="Heading4"/>
@@ -20848,8 +21180,8 @@
         </w:tc>
       </w:tr>
     </w:tbl>
-    <w:bookmarkEnd w:id="114"/>
-    <w:bookmarkStart w:id="115" w:name="retrosynthesis-audit"/>
+    <w:bookmarkEnd w:id="115"/>
+    <w:bookmarkStart w:id="116" w:name="retrosynthesis-audit"/>
     <w:p>
       <w:pPr>
         <w:pStyle w:val="Heading4"/>
@@ -21545,8 +21877,8 @@
         </w:tc>
       </w:tr>
     </w:tbl>
-    <w:bookmarkEnd w:id="115"/>
-    <w:bookmarkStart w:id="116" w:name="e-set-scaffold-diversity-audit-e1e10"/>
+    <w:bookmarkEnd w:id="116"/>
+    <w:bookmarkStart w:id="117" w:name="e-set-scaffold-diversity-audit-e1e10"/>
     <w:p>
       <w:pPr>
         <w:pStyle w:val="Heading4"/>
@@ -27440,9 +27772,9 @@
         <w:t xml:space="preserve">(9.22 km/s) is upper-bound only because its OB = +28.9 % exceeds the +25 % K-J reliability limit (Appendix D.13). The L-set sits at the upper edge of a credible distribution; L1 and E1 are two HMX-class picks from chemically distinct families.</w:t>
       </w:r>
     </w:p>
-    <w:bookmarkEnd w:id="116"/>
     <w:bookmarkEnd w:id="117"/>
-    <w:bookmarkStart w:id="130" w:name="comparison-with-no-diffusion-baselines"/>
+    <w:bookmarkEnd w:id="118"/>
+    <w:bookmarkStart w:id="131" w:name="comparison-with-no-diffusion-baselines"/>
     <w:p>
       <w:pPr>
         <w:pStyle w:val="Heading3"/>
@@ -29791,7 +30123,7 @@
         </w:tc>
       </w:tr>
     </w:tbl>
-    <w:bookmarkStart w:id="121" w:name="fig-baseline-forest"/>
+    <w:bookmarkStart w:id="122" w:name="fig-baseline-forest"/>
     <w:p>
       <w:pPr>
         <w:pStyle w:val="BodyText"/>
@@ -29805,18 +30137,18 @@
           <wp:inline>
             <wp:extent cx="5943600" cy="3272694"/>
             <wp:effectExtent b="0" l="0" r="0" t="0"/>
-            <wp:docPr descr="Forest plot of top-1 Pareto-reranker composite penalty" title="" id="119" name="Picture"/>
+            <wp:docPr descr="Forest plot of top-1 Pareto-reranker composite penalty" title="" id="120" name="Picture"/>
             <a:graphic>
               <a:graphicData uri="http://schemas.openxmlformats.org/drawingml/2006/picture">
                 <pic:pic>
                   <pic:nvPicPr>
-                    <pic:cNvPr descr="figs/fig_baseline_forest.png" id="120" name="Picture"/>
+                    <pic:cNvPr descr="figs/fig_baseline_forest.png" id="121" name="Picture"/>
                     <pic:cNvPicPr>
                       <a:picLocks noChangeArrowheads="1" noChangeAspect="1"/>
                     </pic:cNvPicPr>
                   </pic:nvPicPr>
                   <pic:blipFill>
-                    <a:blip r:embed="rId118"/>
+                    <a:blip r:embed="rId119"/>
                     <a:stretch>
                       <a:fillRect/>
                     </a:stretch>
@@ -29882,7 +30214,7 @@
         <w:t>Forest plot of top-1 Pareto-reranker composite penalty (mean  s.d., lower is better) for DGLD hazard-axis (Hz-C0…Hz-C3) and SA-axis (SA-C1…SA-C3) conditions, SMILES-LSTM, MolMIM 70 M, REINVENT 4 (N-fraction proxy), and SELFIES-GA 2k (alt-scale composite). MolMIM is a drug-domain reference and its composite is on a different scale (uncalibrated); the bar extends to ~4.79 and is shown for completeness rather than direct comparison. Dashed line marks the SMILES-LSTM reference. SELFIES-GA composite is the 2k-pool internal score; see Table 8 footnotes for cross-method comparability caveats.</w:t>
       </w:r>
     </w:p>
-    <w:bookmarkEnd w:id="121"/>
+    <w:bookmarkEnd w:id="122"/>
     <w:p>
       <w:pPr>
         <w:pStyle w:val="BodyText"/>
@@ -30148,7 +30480,7 @@
         <w:t xml:space="preserve">lists the ten most-novel candidates from each baseline pool.</w:t>
       </w:r>
     </w:p>
-    <w:bookmarkStart w:id="125" w:name="fig-quadrant-scatter"/>
+    <w:bookmarkStart w:id="126" w:name="fig-quadrant-scatter"/>
     <w:p>
       <w:pPr>
         <w:pStyle w:val="BodyText"/>
@@ -30162,18 +30494,18 @@
           <wp:inline>
             <wp:extent cx="5943600" cy="4771512"/>
             <wp:effectExtent b="0" l="0" r="0" t="0"/>
-            <wp:docPr descr="Productive-quadrant scatter: S vs viability for DFT-confirmed leads" title="" id="123" name="Picture"/>
+            <wp:docPr descr="Productive-quadrant scatter: S vs viability for DFT-confirmed leads" title="" id="124" name="Picture"/>
             <a:graphic>
               <a:graphicData uri="http://schemas.openxmlformats.org/drawingml/2006/picture">
                 <pic:pic>
                   <pic:nvPicPr>
-                    <pic:cNvPr descr="figs/fig_quadrant_scatter.png" id="124" name="Picture"/>
+                    <pic:cNvPr descr="figs/fig_quadrant_scatter.png" id="125" name="Picture"/>
                     <pic:cNvPicPr>
                       <a:picLocks noChangeArrowheads="1" noChangeAspect="1"/>
                     </pic:cNvPicPr>
                   </pic:nvPicPr>
                   <pic:blipFill>
-                    <a:blip r:embed="rId122"/>
+                    <a:blip r:embed="rId123"/>
                     <a:stretch>
                       <a:fillRect/>
                     </a:stretch>
@@ -30383,7 +30715,7 @@
         <w:t>Productive-quadrant scatter for the 12 DFT-confirmed lead cards (11 unique) with the four no-diffusion baselines as reference markers. -axis: viability probability (RF classifier, energetic vs ZINC); -axis: composite score  (higher = better). Dashed lines mark the top-5 thresholds (, viab ); the green-tinted upper-right quadrant is the productive zone (novel + HMX-class). Marker area is proportional to drop-weight impact sensitivity  (cm; larger = safer). L1 (guided Hz-C2, red) sits at the top of the productive quadrant; L2–L5 (filled blue, unguided C0) cluster near the threshold boundary; L9–L20 (hollow blue) carry real  but  and viability are not tabulated and are placed along the Pareto-floor strip. Baseline markers ( not on the DGLD composite scale; placed as reference): SMILES-LSTM (red X, memorised; Tanimoto 1.0), MolMIM 70 M (orange diamond, drug-domain;  km/s), REINVENT 4 (green square, N-fraction RL; top-1  km/s, novel), SELFIES-GA (purple, surrogate  DFT collapse: top-1 falls from  to  km/s under DFT audit). Source: /viab for L1–L5 from §5.2 prose;  from Table C.1b; baselines from Table 8.</w:t>
       </w:r>
     </w:p>
-    <w:bookmarkEnd w:id="125"/>
+    <w:bookmarkEnd w:id="126"/>
     <w:p>
       <w:pPr>
         <w:pStyle w:val="BodyText"/>
@@ -30466,7 +30798,7 @@
         <w:t xml:space="preserve">, not corpus mimicry, with anti-correlation between FCD and Pareto-reranker composite within DGLD confirming the design intent. Full small-multiples (validity, scaffold uniqueness 659–1262, IntDiv1 0.818–0.838) are shown in Figure 24, with per-condition values in Appendix D.11.</w:t>
       </w:r>
     </w:p>
-    <w:bookmarkStart w:id="129" w:name="fig-moses-panels"/>
+    <w:bookmarkStart w:id="130" w:name="fig-moses-panels"/>
     <w:p>
       <w:pPr>
         <w:pStyle w:val="BodyText"/>
@@ -30480,18 +30812,18 @@
           <wp:inline>
             <wp:extent cx="5943600" cy="3335845"/>
             <wp:effectExtent b="0" l="0" r="0" t="0"/>
-            <wp:docPr descr="MOSES-style distribution-learning small multiples" title="" id="127" name="Picture"/>
+            <wp:docPr descr="MOSES-style distribution-learning small multiples" title="" id="128" name="Picture"/>
             <a:graphic>
               <a:graphicData uri="http://schemas.openxmlformats.org/drawingml/2006/picture">
                 <pic:pic>
                   <pic:nvPicPr>
-                    <pic:cNvPr descr="figs/fig_moses_small_multiples.png" id="128" name="Picture"/>
+                    <pic:cNvPr descr="figs/fig_moses_small_multiples.png" id="129" name="Picture"/>
                     <pic:cNvPicPr>
                       <a:picLocks noChangeArrowheads="1" noChangeAspect="1"/>
                     </pic:cNvPicPr>
                   </pic:nvPicPr>
                   <pic:blipFill>
-                    <a:blip r:embed="rId126"/>
+                    <a:blip r:embed="rId127"/>
                     <a:stretch>
                       <a:fillRect/>
                     </a:stretch>
@@ -30549,9 +30881,9 @@
         <w:t>Distribution-learning small-multiples comparing SMILES-LSTM (red) against seven DGLD conditions (blue) on validity proxy, top-100 scaffold uniqueness, internal diversity, and FCD vs the labelled master.</w:t>
       </w:r>
     </w:p>
-    <w:bookmarkEnd w:id="129"/>
     <w:bookmarkEnd w:id="130"/>
-    <w:bookmarkStart w:id="135" w:name="ablation-summary"/>
+    <w:bookmarkEnd w:id="131"/>
+    <w:bookmarkStart w:id="136" w:name="ablation-summary"/>
     <w:p>
       <w:pPr>
         <w:pStyle w:val="Heading3"/>
@@ -31901,7 +32233,7 @@
         </w:tc>
       </w:tr>
     </w:tbl>
-    <w:bookmarkStart w:id="134" w:name="fig-forest-ablation"/>
+    <w:bookmarkStart w:id="135" w:name="fig-forest-ablation"/>
     <w:p>
       <w:pPr>
         <w:pStyle w:val="BodyText"/>
@@ -31915,18 +32247,18 @@
           <wp:inline>
             <wp:extent cx="5943600" cy="2095370"/>
             <wp:effectExtent b="0" l="0" r="0" t="0"/>
-            <wp:docPr descr="Forest plot of guidance ablation effect sizes vs unguided baseline" title="" id="132" name="Picture"/>
+            <wp:docPr descr="Forest plot of guidance ablation effect sizes vs unguided baseline" title="" id="133" name="Picture"/>
             <a:graphic>
               <a:graphicData uri="http://schemas.openxmlformats.org/drawingml/2006/picture">
                 <pic:pic>
                   <pic:nvPicPr>
-                    <pic:cNvPr descr="figs/fig_forest_ablation.png" id="133" name="Picture"/>
+                    <pic:cNvPr descr="figs/fig_forest_ablation.png" id="134" name="Picture"/>
                     <pic:cNvPicPr>
                       <a:picLocks noChangeArrowheads="1" noChangeAspect="1"/>
                     </pic:cNvPicPr>
                   </pic:nvPicPr>
                   <pic:blipFill>
-                    <a:blip r:embed="rId131"/>
+                    <a:blip r:embed="rId132"/>
                     <a:stretch>
                       <a:fillRect/>
                     </a:stretch>
@@ -32021,7 +32353,7 @@
         <w:t>Guidance-ablation forest plot. Each panel shows the effect size (delta vs unguided Hz-C0 = SA-C0 baseline) for one metric across the six guided conditions. Error bars are propagated standard errors. Composite and max-Tanimoto: negative delta is improvement;  and : positive delta is improvement. Hz-C2 is the best joint novelty condition; SA-axis conditions consistently trade novelty for composite improvement (production sets ).</w:t>
       </w:r>
     </w:p>
-    <w:bookmarkEnd w:id="134"/>
+    <w:bookmarkEnd w:id="135"/>
     <w:p>
       <w:pPr>
         <w:pStyle w:val="BodyText"/>
@@ -32168,9 +32500,9 @@
         <w:t xml:space="preserve">2 × 256k parameters of trunk-regularisation supervision during training (Appendix B.4 contains the full SA / SC drug-domain transfer-head story).</w:t>
       </w:r>
     </w:p>
-    <w:bookmarkEnd w:id="135"/>
     <w:bookmarkEnd w:id="136"/>
-    <w:bookmarkStart w:id="137" w:name="sec-disc"/>
+    <w:bookmarkEnd w:id="137"/>
+    <w:bookmarkStart w:id="138" w:name="sec-disc"/>
     <w:p>
       <w:pPr>
         <w:pStyle w:val="Heading2"/>
@@ -32992,8 +33324,8 @@
         <w:t xml:space="preserve">The diffusion model trains on the full 694k augmented corpus; the candidate-discovery objective is to extrapolate off the labelled distribution rather than recover held-out labels, so we do not report a held-out test split. The Tanimoto-stratified novelty against the 694k corpus (§5.4: median 0.32, 0/100 within Tanimoto 0.70) is the train-leakage proxy. The 3D-CNN surrogate → xTB triage → DFT minimum chain is not a substitute for first-principles equilibrium thermochemistry or experimental synthesis; we position the paper as a methodology and a candidate-list paper, not a synthesis paper. Finally, the cfg-dropout (0.10), property-dropout (0.30), high-tail oversample (10×), and the Tanimoto window (0.20, 0.55) are fixed configuration; no full hyperparameter grid is reported (Appendix D.3).</w:t>
       </w:r>
     </w:p>
-    <w:bookmarkEnd w:id="137"/>
-    <w:bookmarkStart w:id="139" w:name="sec-conc"/>
+    <w:bookmarkEnd w:id="138"/>
+    <w:bookmarkStart w:id="140" w:name="sec-conc"/>
     <w:p>
       <w:pPr>
         <w:pStyle w:val="Heading2"/>
@@ -33334,7 +33666,7 @@
         <w:t xml:space="preserve">nitrolysis, and ring-cyclisation reactions would close the 1/12 USPTO-template hit rate observed here, making the synthesis-plausibility check informative across the full lead set. Third, an active-learning loop closing the diffusion-sampler / first-principles-audit cycle would continuously expand the high-tier label pool from inside the system rather than from external curation. The full pipeline (LIMO checkpoint, two conditional latent denoisers, two multi-head score models, the 4-stage validation funnel, and the 918 mined hard negatives) is released as a runnable code bundle on Zenodo (§7.1), so the next compound to enter the HMX-class band can be discovered, validated, and recommended for synthesis at the cost of a few GPU-days.</w:t>
       </w:r>
     </w:p>
-    <w:bookmarkStart w:id="138" w:name="code-and-data-availability"/>
+    <w:bookmarkStart w:id="139" w:name="code-and-data-availability"/>
     <w:p>
       <w:pPr>
         <w:pStyle w:val="Heading3"/>
@@ -33375,9 +33707,9 @@
         <w:t xml:space="preserve">(concept DOI, resolving to the latest version; code under Apache-2.0, data and checkpoints under CC-BY-4.0). Sampling and post-processing scripts (the M1 head-to-head sweep, the Pareto-reranker chemist-filter + 3D-CNN smoke-model rerank, the multi-head score-model training loop) are released as a runnable bundle alongside the manuscript. The labelled master, the augmented unlabelled corpus, and the hard-negative latents are derived from the public sources documented in §A.1 and are redistributed in canonicalised form with row-level provenance.</w:t>
       </w:r>
     </w:p>
-    <w:bookmarkEnd w:id="138"/>
     <w:bookmarkEnd w:id="139"/>
-    <w:bookmarkStart w:id="214" w:name="sec-refs"/>
+    <w:bookmarkEnd w:id="140"/>
+    <w:bookmarkStart w:id="215" w:name="sec-refs"/>
     <w:p>
       <w:pPr>
         <w:pStyle w:val="ReferencesHeading"/>
@@ -33407,7 +33739,7 @@
         </w:rPr>
         <w:t xml:space="preserve">1. </w:t>
       </w:r>
-      <w:bookmarkStart w:id="140" w:name="ref-kamlet1968detonation"/>
+      <w:bookmarkStart w:id="141" w:name="ref-kamlet1968detonation"/>
       <w:r>
         <w:t xml:space="preserve">Kamlet, M. J., &amp; Jacobs, S. J. (1968). Chemistry of Detonations. I. A Simple Method for Calculating Detonation Properties of C-H-N-O Explosives.</w:t>
       </w:r>
@@ -33423,42 +33755,6 @@
       </w:r>
       <w:r>
         <w:t xml:space="preserve">:23–55. doi:10.1063/1.1667908.</w:t>
-      </w:r>
-      <w:bookmarkEnd w:id="140"/>
-    </w:p>
-    <w:p>
-      <w:pPr>
-        <w:pStyle w:val="ReferenceEntry"/>
-        <w:spacing w:after="100"/>
-        <w:ind w:left="475" w:hanging="475"/>
-        <w:jc w:val="left"/>
-        <w:keepNext w:val="0"/>
-        <w:keepLines w:val="0"/>
-        <w:widowControl w:val="1"/>
-      </w:pPr>
-      <w:r>
-        <w:rPr>
-          <w:rFonts w:ascii="Times New Roman" w:hAnsi="Times New Roman"/>
-          <w:sz w:val="20"/>
-        </w:rPr>
-        <w:t xml:space="preserve">2. </w:t>
-      </w:r>
-      <w:bookmarkStart w:id="141" w:name="ref-casey2020prediction"/>
-      <w:r>
-        <w:t xml:space="preserve">Casey, A. D., Son, S. F., Bilionis, I., &amp; Barnes, B. C. (2020). Prediction of Energetic Material Properties from Electronic Structure Using 3D Convolutional Neural Networks.</w:t>
-      </w:r>
-      <w:r>
-        <w:t xml:space="preserve"> </w:t>
-      </w:r>
-      <w:r>
-        <w:rPr>
-          <w:i/>
-          <w:iCs/>
-        </w:rPr>
-        <w:t xml:space="preserve">J. Chem. Inf. Model. 60(10)</w:t>
-      </w:r>
-      <w:r>
-        <w:t xml:space="preserve">:4457–4473. doi:10.1021/acs.jcim.0c00259.</w:t>
       </w:r>
       <w:bookmarkEnd w:id="141"/>
     </w:p>
@@ -33477,11 +33773,11 @@
           <w:rFonts w:ascii="Times New Roman" w:hAnsi="Times New Roman"/>
           <w:sz w:val="20"/>
         </w:rPr>
-        <w:t xml:space="preserve">3. </w:t>
-      </w:r>
-      <w:bookmarkStart w:id="142" w:name="ref-zhou2023unimol"/>
-      <w:r>
-        <w:t xml:space="preserve">Zhou, G. et al. (2023). Uni-Mol: A Universal 3D Molecular Representation Learning Framework.</w:t>
+        <w:t xml:space="preserve">2. </w:t>
+      </w:r>
+      <w:bookmarkStart w:id="142" w:name="ref-casey2020prediction"/>
+      <w:r>
+        <w:t xml:space="preserve">Casey, A. D., Son, S. F., Bilionis, I., &amp; Barnes, B. C. (2020). Prediction of Energetic Material Properties from Electronic Structure Using 3D Convolutional Neural Networks.</w:t>
       </w:r>
       <w:r>
         <w:t xml:space="preserve"> </w:t>
@@ -33491,10 +33787,10 @@
           <w:i/>
           <w:iCs/>
         </w:rPr>
-        <w:t xml:space="preserve">ICLR 2023</w:t>
-      </w:r>
-      <w:r>
-        <w:t xml:space="preserve">.</w:t>
+        <w:t xml:space="preserve">J. Chem. Inf. Model. 60(10)</w:t>
+      </w:r>
+      <w:r>
+        <w:t xml:space="preserve">:4457–4473. doi:10.1021/acs.jcim.0c00259.</w:t>
       </w:r>
       <w:bookmarkEnd w:id="142"/>
     </w:p>
@@ -33513,11 +33809,24 @@
           <w:rFonts w:ascii="Times New Roman" w:hAnsi="Times New Roman"/>
           <w:sz w:val="20"/>
         </w:rPr>
-        <w:t xml:space="preserve">4. </w:t>
-      </w:r>
-      <w:bookmarkStart w:id="143" w:name="ref-ho2022cfg"/>
-      <w:r>
-        <w:t xml:space="preserve">Ho, J., &amp; Salimans, T. (2022). Classifier-Free Diffusion Guidance. arXiv:2207.12598.</w:t>
+        <w:t xml:space="preserve">3. </w:t>
+      </w:r>
+      <w:bookmarkStart w:id="143" w:name="ref-zhou2023unimol"/>
+      <w:r>
+        <w:t xml:space="preserve">Zhou, G. et al. (2023). Uni-Mol: A Universal 3D Molecular Representation Learning Framework.</w:t>
+      </w:r>
+      <w:r>
+        <w:t xml:space="preserve"> </w:t>
+      </w:r>
+      <w:r>
+        <w:rPr>
+          <w:i/>
+          <w:iCs/>
+        </w:rPr>
+        <w:t xml:space="preserve">ICLR 2023</w:t>
+      </w:r>
+      <w:r>
+        <w:t xml:space="preserve">.</w:t>
       </w:r>
       <w:bookmarkEnd w:id="143"/>
     </w:p>
@@ -33536,24 +33845,11 @@
           <w:rFonts w:ascii="Times New Roman" w:hAnsi="Times New Roman"/>
           <w:sz w:val="20"/>
         </w:rPr>
-        <w:t xml:space="preserve">5. </w:t>
-      </w:r>
-      <w:bookmarkStart w:id="144" w:name="ref-gomez2018automatic"/>
-      <w:r>
-        <w:t xml:space="preserve">Gómez-Bombarelli, R. et al. (2018). Automatic Chemical Design Using a Data-Driven Continuous Representation of Molecules.</w:t>
-      </w:r>
-      <w:r>
-        <w:t xml:space="preserve"> </w:t>
-      </w:r>
-      <w:r>
-        <w:rPr>
-          <w:i/>
-          <w:iCs/>
-        </w:rPr>
-        <w:t xml:space="preserve">ACS Central Science 4(2)</w:t>
-      </w:r>
-      <w:r>
-        <w:t xml:space="preserve">:268–276. doi:10.1021/acscentsci.7b00572.</w:t>
+        <w:t xml:space="preserve">4. </w:t>
+      </w:r>
+      <w:bookmarkStart w:id="144" w:name="ref-ho2022cfg"/>
+      <w:r>
+        <w:t xml:space="preserve">Ho, J., &amp; Salimans, T. (2022). Classifier-Free Diffusion Guidance. arXiv:2207.12598.</w:t>
       </w:r>
       <w:bookmarkEnd w:id="144"/>
     </w:p>
@@ -33572,11 +33868,11 @@
           <w:rFonts w:ascii="Times New Roman" w:hAnsi="Times New Roman"/>
           <w:sz w:val="20"/>
         </w:rPr>
-        <w:t xml:space="preserve">6. </w:t>
-      </w:r>
-      <w:bookmarkStart w:id="145" w:name="ref-jin2018junction"/>
-      <w:r>
-        <w:t xml:space="preserve">Jin, W., Barzilay, R., &amp; Jaakkola, T. (2018). Junction Tree Variational Autoencoder for Molecular Graph Generation.</w:t>
+        <w:t xml:space="preserve">5. </w:t>
+      </w:r>
+      <w:bookmarkStart w:id="145" w:name="ref-gomez2018automatic"/>
+      <w:r>
+        <w:t xml:space="preserve">Gómez-Bombarelli, R. et al. (2018). Automatic Chemical Design Using a Data-Driven Continuous Representation of Molecules.</w:t>
       </w:r>
       <w:r>
         <w:t xml:space="preserve"> </w:t>
@@ -33586,10 +33882,10 @@
           <w:i/>
           <w:iCs/>
         </w:rPr>
-        <w:t xml:space="preserve">ICML 2018</w:t>
-      </w:r>
-      <w:r>
-        <w:t xml:space="preserve">. arXiv:1802.04364.</w:t>
+        <w:t xml:space="preserve">ACS Central Science 4(2)</w:t>
+      </w:r>
+      <w:r>
+        <w:t xml:space="preserve">:268–276. doi:10.1021/acscentsci.7b00572.</w:t>
       </w:r>
       <w:bookmarkEnd w:id="145"/>
     </w:p>
@@ -33608,11 +33904,11 @@
           <w:rFonts w:ascii="Times New Roman" w:hAnsi="Times New Roman"/>
           <w:sz w:val="20"/>
         </w:rPr>
-        <w:t xml:space="preserve">7. </w:t>
-      </w:r>
-      <w:bookmarkStart w:id="146" w:name="ref-winter2019cddd"/>
-      <w:r>
-        <w:t xml:space="preserve">Winter, R., Montanari, F., Noé, F., &amp; Clevert, D.-A. (2019). Learning continuous and data-driven molecular descriptors by translating equivalent chemical representations.</w:t>
+        <w:t xml:space="preserve">6. </w:t>
+      </w:r>
+      <w:bookmarkStart w:id="146" w:name="ref-jin2018junction"/>
+      <w:r>
+        <w:t xml:space="preserve">Jin, W., Barzilay, R., &amp; Jaakkola, T. (2018). Junction Tree Variational Autoencoder for Molecular Graph Generation.</w:t>
       </w:r>
       <w:r>
         <w:t xml:space="preserve"> </w:t>
@@ -33622,10 +33918,10 @@
           <w:i/>
           <w:iCs/>
         </w:rPr>
-        <w:t xml:space="preserve">Chem. Sci. 10(6)</w:t>
-      </w:r>
-      <w:r>
-        <w:t xml:space="preserve">:1692–1701. doi:10.1039/C8SC04175J.</w:t>
+        <w:t xml:space="preserve">ICML 2018</w:t>
+      </w:r>
+      <w:r>
+        <w:t xml:space="preserve">. arXiv:1802.04364.</w:t>
       </w:r>
       <w:bookmarkEnd w:id="146"/>
     </w:p>
@@ -33644,11 +33940,11 @@
           <w:rFonts w:ascii="Times New Roman" w:hAnsi="Times New Roman"/>
           <w:sz w:val="20"/>
         </w:rPr>
-        <w:t xml:space="preserve">8. </w:t>
-      </w:r>
-      <w:bookmarkStart w:id="147" w:name="ref-maziarka2020molcyclegan"/>
-      <w:r>
-        <w:t xml:space="preserve">Maziarka, Ł., Pocha, A., Kaczmarczyk, J., Rataj, K., Danel, T., &amp; Warchoł, M. (2020). Mol-CycleGAN: a generative model for molecular optimization.</w:t>
+        <w:t xml:space="preserve">7. </w:t>
+      </w:r>
+      <w:bookmarkStart w:id="147" w:name="ref-winter2019cddd"/>
+      <w:r>
+        <w:t xml:space="preserve">Winter, R., Montanari, F., Noé, F., &amp; Clevert, D.-A. (2019). Learning continuous and data-driven molecular descriptors by translating equivalent chemical representations.</w:t>
       </w:r>
       <w:r>
         <w:t xml:space="preserve"> </w:t>
@@ -33658,10 +33954,10 @@
           <w:i/>
           <w:iCs/>
         </w:rPr>
-        <w:t xml:space="preserve">J. Cheminformatics 12</w:t>
-      </w:r>
-      <w:r>
-        <w:t xml:space="preserve">:2. doi:10.1186/s13321-019-0404-1.</w:t>
+        <w:t xml:space="preserve">Chem. Sci. 10(6)</w:t>
+      </w:r>
+      <w:r>
+        <w:t xml:space="preserve">:1692–1701. doi:10.1039/C8SC04175J.</w:t>
       </w:r>
       <w:bookmarkEnd w:id="147"/>
     </w:p>
@@ -33680,11 +33976,11 @@
           <w:rFonts w:ascii="Times New Roman" w:hAnsi="Times New Roman"/>
           <w:sz w:val="20"/>
         </w:rPr>
-        <w:t xml:space="preserve">9. </w:t>
-      </w:r>
-      <w:bookmarkStart w:id="148" w:name="ref-krenn2020selfies"/>
-      <w:r>
-        <w:t xml:space="preserve">Krenn, M., Häse, F., Nigam, A., Friederich, P., &amp; Aspuru-Guzik, A. (2020). Self-Referencing Embedded Strings (SELFIES): A 100% Robust Molecular String Representation.</w:t>
+        <w:t xml:space="preserve">8. </w:t>
+      </w:r>
+      <w:bookmarkStart w:id="148" w:name="ref-maziarka2020molcyclegan"/>
+      <w:r>
+        <w:t xml:space="preserve">Maziarka, Ł., Pocha, A., Kaczmarczyk, J., Rataj, K., Danel, T., &amp; Warchoł, M. (2020). Mol-CycleGAN: a generative model for molecular optimization.</w:t>
       </w:r>
       <w:r>
         <w:t xml:space="preserve"> </w:t>
@@ -33694,10 +33990,10 @@
           <w:i/>
           <w:iCs/>
         </w:rPr>
-        <w:t xml:space="preserve">Mach. Learn.: Sci. Tech. 1</w:t>
-      </w:r>
-      <w:r>
-        <w:t xml:space="preserve">:045024.</w:t>
+        <w:t xml:space="preserve">J. Cheminformatics 12</w:t>
+      </w:r>
+      <w:r>
+        <w:t xml:space="preserve">:2. doi:10.1186/s13321-019-0404-1.</w:t>
       </w:r>
       <w:bookmarkEnd w:id="148"/>
     </w:p>
@@ -33716,11 +34012,11 @@
           <w:rFonts w:ascii="Times New Roman" w:hAnsi="Times New Roman"/>
           <w:sz w:val="20"/>
         </w:rPr>
-        <w:t xml:space="preserve">10. </w:t>
-      </w:r>
-      <w:bookmarkStart w:id="149" w:name="ref-eckmann2022limo"/>
-      <w:r>
-        <w:t xml:space="preserve">Eckmann, P., Sun, K., Zhao, B., Feng, M., Gilson, M. K., &amp; Yu, R. (2022). LIMO: Latent Inceptionism for Targeted Molecule Generation.</w:t>
+        <w:t xml:space="preserve">9. </w:t>
+      </w:r>
+      <w:bookmarkStart w:id="149" w:name="ref-krenn2020selfies"/>
+      <w:r>
+        <w:t xml:space="preserve">Krenn, M., Häse, F., Nigam, A., Friederich, P., &amp; Aspuru-Guzik, A. (2020). Self-Referencing Embedded Strings (SELFIES): A 100% Robust Molecular String Representation.</w:t>
       </w:r>
       <w:r>
         <w:t xml:space="preserve"> </w:t>
@@ -33730,10 +34026,10 @@
           <w:i/>
           <w:iCs/>
         </w:rPr>
-        <w:t xml:space="preserve">ICML 2022</w:t>
-      </w:r>
-      <w:r>
-        <w:t xml:space="preserve">. arXiv:2206.09010.</w:t>
+        <w:t xml:space="preserve">Mach. Learn.: Sci. Tech. 1</w:t>
+      </w:r>
+      <w:r>
+        <w:t xml:space="preserve">:045024.</w:t>
       </w:r>
       <w:bookmarkEnd w:id="149"/>
     </w:p>
@@ -33752,11 +34048,24 @@
           <w:rFonts w:ascii="Times New Roman" w:hAnsi="Times New Roman"/>
           <w:sz w:val="20"/>
         </w:rPr>
-        <w:t xml:space="preserve">11. </w:t>
-      </w:r>
-      <w:bookmarkStart w:id="150" w:name="ref-reidenbach2023molmim"/>
-      <w:r>
-        <w:t xml:space="preserve">Reidenbach, D., Livne, M., Ilango, R. K., Gill, M., &amp; Israeli, J. (2023). MolMIM: A Molecular Language Model for Property-Guided Molecule Generation via Mutual Information Machines. (MLDD Workshop, ICLR 2023; arXiv:2208.09016).</w:t>
+        <w:t xml:space="preserve">10. </w:t>
+      </w:r>
+      <w:bookmarkStart w:id="150" w:name="ref-eckmann2022limo"/>
+      <w:r>
+        <w:t xml:space="preserve">Eckmann, P., Sun, K., Zhao, B., Feng, M., Gilson, M. K., &amp; Yu, R. (2022). LIMO: Latent Inceptionism for Targeted Molecule Generation.</w:t>
+      </w:r>
+      <w:r>
+        <w:t xml:space="preserve"> </w:t>
+      </w:r>
+      <w:r>
+        <w:rPr>
+          <w:i/>
+          <w:iCs/>
+        </w:rPr>
+        <w:t xml:space="preserve">ICML 2022</w:t>
+      </w:r>
+      <w:r>
+        <w:t xml:space="preserve">. arXiv:2206.09010.</w:t>
       </w:r>
       <w:bookmarkEnd w:id="150"/>
     </w:p>
@@ -33775,24 +34084,11 @@
           <w:rFonts w:ascii="Times New Roman" w:hAnsi="Times New Roman"/>
           <w:sz w:val="20"/>
         </w:rPr>
-        <w:t xml:space="preserve">12. </w:t>
-      </w:r>
-      <w:bookmarkStart w:id="151" w:name="ref-jaegle2021perceiver"/>
-      <w:r>
-        <w:t xml:space="preserve">Jaegle, A. et al. (2021). Perceiver: General Perception with Iterative Attention.</w:t>
-      </w:r>
-      <w:r>
-        <w:t xml:space="preserve"> </w:t>
-      </w:r>
-      <w:r>
-        <w:rPr>
-          <w:i/>
-          <w:iCs/>
-        </w:rPr>
-        <w:t xml:space="preserve">ICML 2021</w:t>
-      </w:r>
-      <w:r>
-        <w:t xml:space="preserve">. arXiv:2103.03206.</w:t>
+        <w:t xml:space="preserve">11. </w:t>
+      </w:r>
+      <w:bookmarkStart w:id="151" w:name="ref-reidenbach2023molmim"/>
+      <w:r>
+        <w:t xml:space="preserve">Reidenbach, D., Livne, M., Ilango, R. K., Gill, M., &amp; Israeli, J. (2023). MolMIM: A Molecular Language Model for Property-Guided Molecule Generation via Mutual Information Machines. (MLDD Workshop, ICLR 2023; arXiv:2208.09016).</w:t>
       </w:r>
       <w:bookmarkEnd w:id="151"/>
     </w:p>
@@ -33811,11 +34107,11 @@
           <w:rFonts w:ascii="Times New Roman" w:hAnsi="Times New Roman"/>
           <w:sz w:val="20"/>
         </w:rPr>
-        <w:t xml:space="preserve">13. </w:t>
-      </w:r>
-      <w:bookmarkStart w:id="152" w:name="ref-olivecrona2017reinvent"/>
-      <w:r>
-        <w:t xml:space="preserve">Olivecrona, M., Blaschke, T., Engkvist, O., &amp; Chen, H. (2017). Molecular de-novo design through deep reinforcement learning.</w:t>
+        <w:t xml:space="preserve">12. </w:t>
+      </w:r>
+      <w:bookmarkStart w:id="152" w:name="ref-jaegle2021perceiver"/>
+      <w:r>
+        <w:t xml:space="preserve">Jaegle, A. et al. (2021). Perceiver: General Perception with Iterative Attention.</w:t>
       </w:r>
       <w:r>
         <w:t xml:space="preserve"> </w:t>
@@ -33825,10 +34121,10 @@
           <w:i/>
           <w:iCs/>
         </w:rPr>
-        <w:t xml:space="preserve">J. Cheminformatics 9</w:t>
-      </w:r>
-      <w:r>
-        <w:t xml:space="preserve">:48. doi:10.1186/s13321-017-0235-x.</w:t>
+        <w:t xml:space="preserve">ICML 2021</w:t>
+      </w:r>
+      <w:r>
+        <w:t xml:space="preserve">. arXiv:2103.03206.</w:t>
       </w:r>
       <w:bookmarkEnd w:id="152"/>
     </w:p>
@@ -33847,11 +34143,11 @@
           <w:rFonts w:ascii="Times New Roman" w:hAnsi="Times New Roman"/>
           <w:sz w:val="20"/>
         </w:rPr>
-        <w:t xml:space="preserve">14. </w:t>
-      </w:r>
-      <w:bookmarkStart w:id="153" w:name="ref-loeffler2024reinvent4"/>
-      <w:r>
-        <w:t xml:space="preserve">Loeffler, H. H., He, J., Tibo, A., Janet, J. P., Voronov, A., Mervin, L. H., &amp; Engkvist, O. (2024). REINVENT 4: Modern AI-driven generative molecule design.</w:t>
+        <w:t xml:space="preserve">13. </w:t>
+      </w:r>
+      <w:bookmarkStart w:id="153" w:name="ref-olivecrona2017reinvent"/>
+      <w:r>
+        <w:t xml:space="preserve">Olivecrona, M., Blaschke, T., Engkvist, O., &amp; Chen, H. (2017). Molecular de-novo design through deep reinforcement learning.</w:t>
       </w:r>
       <w:r>
         <w:t xml:space="preserve"> </w:t>
@@ -33861,10 +34157,10 @@
           <w:i/>
           <w:iCs/>
         </w:rPr>
-        <w:t xml:space="preserve">J. Cheminformatics 16</w:t>
-      </w:r>
-      <w:r>
-        <w:t xml:space="preserve">:20. doi:10.1186/s13321-024-00812-5.</w:t>
+        <w:t xml:space="preserve">J. Cheminformatics 9</w:t>
+      </w:r>
+      <w:r>
+        <w:t xml:space="preserve">:48. doi:10.1186/s13321-017-0235-x.</w:t>
       </w:r>
       <w:bookmarkEnd w:id="153"/>
     </w:p>
@@ -33883,11 +34179,11 @@
           <w:rFonts w:ascii="Times New Roman" w:hAnsi="Times New Roman"/>
           <w:sz w:val="20"/>
         </w:rPr>
-        <w:t xml:space="preserve">15. </w:t>
-      </w:r>
-      <w:bookmarkStart w:id="154" w:name="ref-yang2017chemts"/>
-      <w:r>
-        <w:t xml:space="preserve">Yang, X., Zhang, J., Yoshizoe, K., Terayama, K., &amp; Tsuda, K. (2017). ChemTS: An efficient python library for de novo molecular generation.</w:t>
+        <w:t xml:space="preserve">14. </w:t>
+      </w:r>
+      <w:bookmarkStart w:id="154" w:name="ref-loeffler2024reinvent4"/>
+      <w:r>
+        <w:t xml:space="preserve">Loeffler, H. H., He, J., Tibo, A., Janet, J. P., Voronov, A., Mervin, L. H., &amp; Engkvist, O. (2024). REINVENT 4: Modern AI-driven generative molecule design.</w:t>
       </w:r>
       <w:r>
         <w:t xml:space="preserve"> </w:t>
@@ -33897,10 +34193,10 @@
           <w:i/>
           <w:iCs/>
         </w:rPr>
-        <w:t xml:space="preserve">Sci. Tech. Adv. Mater. 18(1)</w:t>
-      </w:r>
-      <w:r>
-        <w:t xml:space="preserve">:972–976. doi:10.1080/14686996.2017.1401424.</w:t>
+        <w:t xml:space="preserve">J. Cheminformatics 16</w:t>
+      </w:r>
+      <w:r>
+        <w:t xml:space="preserve">:20. doi:10.1186/s13321-024-00812-5.</w:t>
       </w:r>
       <w:bookmarkEnd w:id="154"/>
     </w:p>
@@ -33919,11 +34215,11 @@
           <w:rFonts w:ascii="Times New Roman" w:hAnsi="Times New Roman"/>
           <w:sz w:val="20"/>
         </w:rPr>
-        <w:t xml:space="preserve">16. </w:t>
-      </w:r>
-      <w:bookmarkStart w:id="155" w:name="ref-bagal2022molgpt"/>
-      <w:r>
-        <w:t xml:space="preserve">Bagal, V., Aggarwal, R., Vinod, P. K., &amp; Priyakumar, U. D. (2022). MolGPT: Molecular Generation Using a Transformer-Decoder Model.</w:t>
+        <w:t xml:space="preserve">15. </w:t>
+      </w:r>
+      <w:bookmarkStart w:id="155" w:name="ref-yang2017chemts"/>
+      <w:r>
+        <w:t xml:space="preserve">Yang, X., Zhang, J., Yoshizoe, K., Terayama, K., &amp; Tsuda, K. (2017). ChemTS: An efficient python library for de novo molecular generation.</w:t>
       </w:r>
       <w:r>
         <w:t xml:space="preserve"> </w:t>
@@ -33933,10 +34229,10 @@
           <w:i/>
           <w:iCs/>
         </w:rPr>
-        <w:t xml:space="preserve">J. Chem. Inf. Model. 62(9)</w:t>
-      </w:r>
-      <w:r>
-        <w:t xml:space="preserve">:2064–2076. doi:10.1021/acs.jcim.1c00600.</w:t>
+        <w:t xml:space="preserve">Sci. Tech. Adv. Mater. 18(1)</w:t>
+      </w:r>
+      <w:r>
+        <w:t xml:space="preserve">:972–976. doi:10.1080/14686996.2017.1401424.</w:t>
       </w:r>
       <w:bookmarkEnd w:id="155"/>
     </w:p>
@@ -33955,11 +34251,11 @@
           <w:rFonts w:ascii="Times New Roman" w:hAnsi="Times New Roman"/>
           <w:sz w:val="20"/>
         </w:rPr>
-        <w:t xml:space="preserve">17. </w:t>
-      </w:r>
-      <w:bookmarkStart w:id="156" w:name="ref-ross2022molformer"/>
-      <w:r>
-        <w:t xml:space="preserve">Ross, J. et al. (2022). Large-Scale Chemical Language Representations Capture Molecular Structure and Properties.</w:t>
+        <w:t xml:space="preserve">16. </w:t>
+      </w:r>
+      <w:bookmarkStart w:id="156" w:name="ref-bagal2022molgpt"/>
+      <w:r>
+        <w:t xml:space="preserve">Bagal, V., Aggarwal, R., Vinod, P. K., &amp; Priyakumar, U. D. (2022). MolGPT: Molecular Generation Using a Transformer-Decoder Model.</w:t>
       </w:r>
       <w:r>
         <w:t xml:space="preserve"> </w:t>
@@ -33969,10 +34265,10 @@
           <w:i/>
           <w:iCs/>
         </w:rPr>
-        <w:t xml:space="preserve">Nature Machine Intelligence 4</w:t>
-      </w:r>
-      <w:r>
-        <w:t xml:space="preserve">:1256–1264. doi:10.1038/s42256-022-00580-7.</w:t>
+        <w:t xml:space="preserve">J. Chem. Inf. Model. 62(9)</w:t>
+      </w:r>
+      <w:r>
+        <w:t xml:space="preserve">:2064–2076. doi:10.1021/acs.jcim.1c00600.</w:t>
       </w:r>
       <w:bookmarkEnd w:id="156"/>
     </w:p>
@@ -33991,11 +34287,11 @@
           <w:rFonts w:ascii="Times New Roman" w:hAnsi="Times New Roman"/>
           <w:sz w:val="20"/>
         </w:rPr>
-        <w:t xml:space="preserve">18. </w:t>
-      </w:r>
-      <w:bookmarkStart w:id="157" w:name="ref-irwin2022chemformer"/>
-      <w:r>
-        <w:t xml:space="preserve">Irwin, R., Dimitriadis, S., He, J., &amp; Bjerrum, E. J. (2022). Chemformer: A Pre-Trained Transformer for Computational Chemistry.</w:t>
+        <w:t xml:space="preserve">17. </w:t>
+      </w:r>
+      <w:bookmarkStart w:id="157" w:name="ref-ross2022molformer"/>
+      <w:r>
+        <w:t xml:space="preserve">Ross, J. et al. (2022). Large-Scale Chemical Language Representations Capture Molecular Structure and Properties.</w:t>
       </w:r>
       <w:r>
         <w:t xml:space="preserve"> </w:t>
@@ -34005,10 +34301,10 @@
           <w:i/>
           <w:iCs/>
         </w:rPr>
-        <w:t xml:space="preserve">Mach. Learn.: Sci. Tech. 3</w:t>
-      </w:r>
-      <w:r>
-        <w:t xml:space="preserve">:015022. doi:10.1088/2632-2153/ac3ffb.</w:t>
+        <w:t xml:space="preserve">Nature Machine Intelligence 4</w:t>
+      </w:r>
+      <w:r>
+        <w:t xml:space="preserve">:1256–1264. doi:10.1038/s42256-022-00580-7.</w:t>
       </w:r>
       <w:bookmarkEnd w:id="157"/>
     </w:p>
@@ -34027,11 +34323,11 @@
           <w:rFonts w:ascii="Times New Roman" w:hAnsi="Times New Roman"/>
           <w:sz w:val="20"/>
         </w:rPr>
-        <w:t xml:space="preserve">19. </w:t>
-      </w:r>
-      <w:bookmarkStart w:id="158" w:name="ref-bengio2021gflownet"/>
-      <w:r>
-        <w:t xml:space="preserve">Bengio, E., Jain, M., Korablyov, M., Precup, D., &amp; Bengio, Y. (2021). Flow Network Based Generative Models for Non-Iterative Diverse Candidate Generation.</w:t>
+        <w:t xml:space="preserve">18. </w:t>
+      </w:r>
+      <w:bookmarkStart w:id="158" w:name="ref-irwin2022chemformer"/>
+      <w:r>
+        <w:t xml:space="preserve">Irwin, R., Dimitriadis, S., He, J., &amp; Bjerrum, E. J. (2022). Chemformer: A Pre-Trained Transformer for Computational Chemistry.</w:t>
       </w:r>
       <w:r>
         <w:t xml:space="preserve"> </w:t>
@@ -34041,10 +34337,10 @@
           <w:i/>
           <w:iCs/>
         </w:rPr>
-        <w:t xml:space="preserve">NeurIPS 2021</w:t>
-      </w:r>
-      <w:r>
-        <w:t xml:space="preserve">. arXiv:2106.04399.</w:t>
+        <w:t xml:space="preserve">Mach. Learn.: Sci. Tech. 3</w:t>
+      </w:r>
+      <w:r>
+        <w:t xml:space="preserve">:015022. doi:10.1088/2632-2153/ac3ffb.</w:t>
       </w:r>
       <w:bookmarkEnd w:id="158"/>
     </w:p>
@@ -34063,11 +34359,11 @@
           <w:rFonts w:ascii="Times New Roman" w:hAnsi="Times New Roman"/>
           <w:sz w:val="20"/>
         </w:rPr>
-        <w:t xml:space="preserve">20. </w:t>
-      </w:r>
-      <w:bookmarkStart w:id="159" w:name="ref-vignac2023digress"/>
-      <w:r>
-        <w:t xml:space="preserve">Vignac, C. et al. (2023). DiGress: Discrete Denoising Diffusion for Graph Generation.</w:t>
+        <w:t xml:space="preserve">19. </w:t>
+      </w:r>
+      <w:bookmarkStart w:id="159" w:name="ref-bengio2021gflownet"/>
+      <w:r>
+        <w:t xml:space="preserve">Bengio, E., Jain, M., Korablyov, M., Precup, D., &amp; Bengio, Y. (2021). Flow Network Based Generative Models for Non-Iterative Diverse Candidate Generation.</w:t>
       </w:r>
       <w:r>
         <w:t xml:space="preserve"> </w:t>
@@ -34077,10 +34373,10 @@
           <w:i/>
           <w:iCs/>
         </w:rPr>
-        <w:t xml:space="preserve">ICLR 2023</w:t>
-      </w:r>
-      <w:r>
-        <w:t xml:space="preserve">. arXiv:2209.14734.</w:t>
+        <w:t xml:space="preserve">NeurIPS 2021</w:t>
+      </w:r>
+      <w:r>
+        <w:t xml:space="preserve">. arXiv:2106.04399.</w:t>
       </w:r>
       <w:bookmarkEnd w:id="159"/>
     </w:p>
@@ -34099,11 +34395,11 @@
           <w:rFonts w:ascii="Times New Roman" w:hAnsi="Times New Roman"/>
           <w:sz w:val="20"/>
         </w:rPr>
-        <w:t xml:space="preserve">21. </w:t>
-      </w:r>
-      <w:bookmarkStart w:id="160" w:name="ref-ho2020ddpm"/>
-      <w:r>
-        <w:t xml:space="preserve">Ho, J., Jain, A., &amp; Abbeel, P. (2020). Denoising Diffusion Probabilistic Models.</w:t>
+        <w:t xml:space="preserve">20. </w:t>
+      </w:r>
+      <w:bookmarkStart w:id="160" w:name="ref-vignac2023digress"/>
+      <w:r>
+        <w:t xml:space="preserve">Vignac, C. et al. (2023). DiGress: Discrete Denoising Diffusion for Graph Generation.</w:t>
       </w:r>
       <w:r>
         <w:t xml:space="preserve"> </w:t>
@@ -34113,10 +34409,10 @@
           <w:i/>
           <w:iCs/>
         </w:rPr>
-        <w:t xml:space="preserve">NeurIPS 2020</w:t>
-      </w:r>
-      <w:r>
-        <w:t xml:space="preserve">. arXiv:2006.11239.</w:t>
+        <w:t xml:space="preserve">ICLR 2023</w:t>
+      </w:r>
+      <w:r>
+        <w:t xml:space="preserve">. arXiv:2209.14734.</w:t>
       </w:r>
       <w:bookmarkEnd w:id="160"/>
     </w:p>
@@ -34135,11 +34431,11 @@
           <w:rFonts w:ascii="Times New Roman" w:hAnsi="Times New Roman"/>
           <w:sz w:val="20"/>
         </w:rPr>
-        <w:t xml:space="preserve">22. </w:t>
-      </w:r>
-      <w:bookmarkStart w:id="161" w:name="ref-song2019score"/>
-      <w:r>
-        <w:t xml:space="preserve">Song, Y., &amp; Ermon, S. (2019). Generative Modeling by Estimating Gradients of the Data Distribution.</w:t>
+        <w:t xml:space="preserve">21. </w:t>
+      </w:r>
+      <w:bookmarkStart w:id="161" w:name="ref-ho2020ddpm"/>
+      <w:r>
+        <w:t xml:space="preserve">Ho, J., Jain, A., &amp; Abbeel, P. (2020). Denoising Diffusion Probabilistic Models.</w:t>
       </w:r>
       <w:r>
         <w:t xml:space="preserve"> </w:t>
@@ -34149,10 +34445,10 @@
           <w:i/>
           <w:iCs/>
         </w:rPr>
-        <w:t xml:space="preserve">NeurIPS 2019</w:t>
-      </w:r>
-      <w:r>
-        <w:t xml:space="preserve">. arXiv:1907.05600.</w:t>
+        <w:t xml:space="preserve">NeurIPS 2020</w:t>
+      </w:r>
+      <w:r>
+        <w:t xml:space="preserve">. arXiv:2006.11239.</w:t>
       </w:r>
       <w:bookmarkEnd w:id="161"/>
     </w:p>
@@ -34171,11 +34467,11 @@
           <w:rFonts w:ascii="Times New Roman" w:hAnsi="Times New Roman"/>
           <w:sz w:val="20"/>
         </w:rPr>
-        <w:t xml:space="preserve">23. </w:t>
-      </w:r>
-      <w:bookmarkStart w:id="162" w:name="ref-song2021sde"/>
-      <w:r>
-        <w:t xml:space="preserve">Song, Y. et al. (2021). Score-Based Generative Modeling through Stochastic Differential Equations.</w:t>
+        <w:t xml:space="preserve">22. </w:t>
+      </w:r>
+      <w:bookmarkStart w:id="162" w:name="ref-song2019score"/>
+      <w:r>
+        <w:t xml:space="preserve">Song, Y., &amp; Ermon, S. (2019). Generative Modeling by Estimating Gradients of the Data Distribution.</w:t>
       </w:r>
       <w:r>
         <w:t xml:space="preserve"> </w:t>
@@ -34185,10 +34481,10 @@
           <w:i/>
           <w:iCs/>
         </w:rPr>
-        <w:t xml:space="preserve">ICLR 2021</w:t>
-      </w:r>
-      <w:r>
-        <w:t xml:space="preserve">. arXiv:2011.13456.</w:t>
+        <w:t xml:space="preserve">NeurIPS 2019</w:t>
+      </w:r>
+      <w:r>
+        <w:t xml:space="preserve">. arXiv:1907.05600.</w:t>
       </w:r>
       <w:bookmarkEnd w:id="162"/>
     </w:p>
@@ -34207,11 +34503,11 @@
           <w:rFonts w:ascii="Times New Roman" w:hAnsi="Times New Roman"/>
           <w:sz w:val="20"/>
         </w:rPr>
-        <w:t xml:space="preserve">24. </w:t>
-      </w:r>
-      <w:bookmarkStart w:id="163" w:name="ref-rombach2022ldm"/>
-      <w:r>
-        <w:t xml:space="preserve">Rombach, R., Blattmann, A., Lorenz, D., Esser, P., &amp; Ommer, B. (2022). High-Resolution Image Synthesis with Latent Diffusion Models.</w:t>
+        <w:t xml:space="preserve">23. </w:t>
+      </w:r>
+      <w:bookmarkStart w:id="163" w:name="ref-song2021sde"/>
+      <w:r>
+        <w:t xml:space="preserve">Song, Y. et al. (2021). Score-Based Generative Modeling through Stochastic Differential Equations.</w:t>
       </w:r>
       <w:r>
         <w:t xml:space="preserve"> </w:t>
@@ -34221,10 +34517,10 @@
           <w:i/>
           <w:iCs/>
         </w:rPr>
-        <w:t xml:space="preserve">CVPR 2022</w:t>
-      </w:r>
-      <w:r>
-        <w:t xml:space="preserve">. arXiv:2112.10752.</w:t>
+        <w:t xml:space="preserve">ICLR 2021</w:t>
+      </w:r>
+      <w:r>
+        <w:t xml:space="preserve">. arXiv:2011.13456.</w:t>
       </w:r>
       <w:bookmarkEnd w:id="163"/>
     </w:p>
@@ -34243,11 +34539,11 @@
           <w:rFonts w:ascii="Times New Roman" w:hAnsi="Times New Roman"/>
           <w:sz w:val="20"/>
         </w:rPr>
-        <w:t xml:space="preserve">25. </w:t>
-      </w:r>
-      <w:bookmarkStart w:id="164" w:name="ref-dhariwal2021diffusion"/>
-      <w:r>
-        <w:t xml:space="preserve">Dhariwal, P., &amp; Nichol, A. (2021). Diffusion Models Beat GANs on Image Synthesis.</w:t>
+        <w:t xml:space="preserve">24. </w:t>
+      </w:r>
+      <w:bookmarkStart w:id="164" w:name="ref-rombach2022ldm"/>
+      <w:r>
+        <w:t xml:space="preserve">Rombach, R., Blattmann, A., Lorenz, D., Esser, P., &amp; Ommer, B. (2022). High-Resolution Image Synthesis with Latent Diffusion Models.</w:t>
       </w:r>
       <w:r>
         <w:t xml:space="preserve"> </w:t>
@@ -34257,10 +34553,10 @@
           <w:i/>
           <w:iCs/>
         </w:rPr>
-        <w:t xml:space="preserve">NeurIPS 2021</w:t>
-      </w:r>
-      <w:r>
-        <w:t xml:space="preserve">. arXiv:2105.05233.</w:t>
+        <w:t xml:space="preserve">CVPR 2022</w:t>
+      </w:r>
+      <w:r>
+        <w:t xml:space="preserve">. arXiv:2112.10752.</w:t>
       </w:r>
       <w:bookmarkEnd w:id="164"/>
     </w:p>
@@ -34279,11 +34575,11 @@
           <w:rFonts w:ascii="Times New Roman" w:hAnsi="Times New Roman"/>
           <w:sz w:val="20"/>
         </w:rPr>
-        <w:t xml:space="preserve">26. </w:t>
-      </w:r>
-      <w:bookmarkStart w:id="165" w:name="ref-perez2018film"/>
-      <w:r>
-        <w:t xml:space="preserve">Perez, E., Strub, F., de Vries, H., Dumoulin, V., &amp; Courville, A. (2018). FiLM: Visual Reasoning with a General Conditioning Layer.</w:t>
+        <w:t xml:space="preserve">25. </w:t>
+      </w:r>
+      <w:bookmarkStart w:id="165" w:name="ref-dhariwal2021diffusion"/>
+      <w:r>
+        <w:t xml:space="preserve">Dhariwal, P., &amp; Nichol, A. (2021). Diffusion Models Beat GANs on Image Synthesis.</w:t>
       </w:r>
       <w:r>
         <w:t xml:space="preserve"> </w:t>
@@ -34293,10 +34589,10 @@
           <w:i/>
           <w:iCs/>
         </w:rPr>
-        <w:t xml:space="preserve">AAAI 2018</w:t>
-      </w:r>
-      <w:r>
-        <w:t xml:space="preserve">. arXiv:1709.07871.</w:t>
+        <w:t xml:space="preserve">NeurIPS 2021</w:t>
+      </w:r>
+      <w:r>
+        <w:t xml:space="preserve">. arXiv:2105.05233.</w:t>
       </w:r>
       <w:bookmarkEnd w:id="165"/>
     </w:p>
@@ -34315,11 +34611,11 @@
           <w:rFonts w:ascii="Times New Roman" w:hAnsi="Times New Roman"/>
           <w:sz w:val="20"/>
         </w:rPr>
-        <w:t xml:space="preserve">27. </w:t>
-      </w:r>
-      <w:bookmarkStart w:id="166" w:name="ref-hoogeboom2022edm"/>
-      <w:r>
-        <w:t xml:space="preserve">Hoogeboom, E., Garcia Satorras, V., Vignac, C., &amp; Welling, M. (2022). Equivariant Diffusion for Molecule Generation in 3D.</w:t>
+        <w:t xml:space="preserve">26. </w:t>
+      </w:r>
+      <w:bookmarkStart w:id="166" w:name="ref-perez2018film"/>
+      <w:r>
+        <w:t xml:space="preserve">Perez, E., Strub, F., de Vries, H., Dumoulin, V., &amp; Courville, A. (2018). FiLM: Visual Reasoning with a General Conditioning Layer.</w:t>
       </w:r>
       <w:r>
         <w:t xml:space="preserve"> </w:t>
@@ -34329,10 +34625,10 @@
           <w:i/>
           <w:iCs/>
         </w:rPr>
-        <w:t xml:space="preserve">ICML 2022</w:t>
-      </w:r>
-      <w:r>
-        <w:t xml:space="preserve">. arXiv:2203.17003.</w:t>
+        <w:t xml:space="preserve">AAAI 2018</w:t>
+      </w:r>
+      <w:r>
+        <w:t xml:space="preserve">. arXiv:1709.07871.</w:t>
       </w:r>
       <w:bookmarkEnd w:id="166"/>
     </w:p>
@@ -34351,11 +34647,11 @@
           <w:rFonts w:ascii="Times New Roman" w:hAnsi="Times New Roman"/>
           <w:sz w:val="20"/>
         </w:rPr>
-        <w:t xml:space="preserve">28. </w:t>
-      </w:r>
-      <w:bookmarkStart w:id="167" w:name="ref-schneuing2022diffsbdd"/>
-      <w:r>
-        <w:t xml:space="preserve">Schneuing, A. et al. (2022). Structure-based Drug Design with Equivariant Diffusion Models.</w:t>
+        <w:t xml:space="preserve">27. </w:t>
+      </w:r>
+      <w:bookmarkStart w:id="167" w:name="ref-hoogeboom2022edm"/>
+      <w:r>
+        <w:t xml:space="preserve">Hoogeboom, E., Garcia Satorras, V., Vignac, C., &amp; Welling, M. (2022). Equivariant Diffusion for Molecule Generation in 3D.</w:t>
       </w:r>
       <w:r>
         <w:t xml:space="preserve"> </w:t>
@@ -34365,10 +34661,10 @@
           <w:i/>
           <w:iCs/>
         </w:rPr>
-        <w:t xml:space="preserve">NeurIPS 2022 AI4Science Workshop</w:t>
-      </w:r>
-      <w:r>
-        <w:t xml:space="preserve">. arXiv:2210.13695.</w:t>
+        <w:t xml:space="preserve">ICML 2022</w:t>
+      </w:r>
+      <w:r>
+        <w:t xml:space="preserve">. arXiv:2203.17003.</w:t>
       </w:r>
       <w:bookmarkEnd w:id="167"/>
     </w:p>
@@ -34387,11 +34683,11 @@
           <w:rFonts w:ascii="Times New Roman" w:hAnsi="Times New Roman"/>
           <w:sz w:val="20"/>
         </w:rPr>
-        <w:t xml:space="preserve">29. </w:t>
-      </w:r>
-      <w:bookmarkStart w:id="168" w:name="ref-guan2023targetdiff"/>
-      <w:r>
-        <w:t xml:space="preserve">Guan, J. et al. (2023). 3D Equivariant Diffusion for Target-Aware Molecule Generation and Affinity Prediction.</w:t>
+        <w:t xml:space="preserve">28. </w:t>
+      </w:r>
+      <w:bookmarkStart w:id="168" w:name="ref-schneuing2022diffsbdd"/>
+      <w:r>
+        <w:t xml:space="preserve">Schneuing, A. et al. (2022). Structure-based Drug Design with Equivariant Diffusion Models.</w:t>
       </w:r>
       <w:r>
         <w:t xml:space="preserve"> </w:t>
@@ -34401,10 +34697,10 @@
           <w:i/>
           <w:iCs/>
         </w:rPr>
-        <w:t xml:space="preserve">ICLR 2023</w:t>
-      </w:r>
-      <w:r>
-        <w:t xml:space="preserve">. arXiv:2303.03543.</w:t>
+        <w:t xml:space="preserve">NeurIPS 2022 AI4Science Workshop</w:t>
+      </w:r>
+      <w:r>
+        <w:t xml:space="preserve">. arXiv:2210.13695.</w:t>
       </w:r>
       <w:bookmarkEnd w:id="168"/>
     </w:p>
@@ -34423,11 +34719,11 @@
           <w:rFonts w:ascii="Times New Roman" w:hAnsi="Times New Roman"/>
           <w:sz w:val="20"/>
         </w:rPr>
-        <w:t xml:space="preserve">30. </w:t>
-      </w:r>
-      <w:bookmarkStart w:id="169" w:name="ref-peng2022pocket2mol"/>
-      <w:r>
-        <w:t xml:space="preserve">Peng, X., Luo, S., Guan, J., Xie, Q., Peng, J., &amp; Ma, J. (2022). Pocket2Mol: Efficient Molecular Sampling Based on 3D Protein Pockets.</w:t>
+        <w:t xml:space="preserve">29. </w:t>
+      </w:r>
+      <w:bookmarkStart w:id="169" w:name="ref-guan2023targetdiff"/>
+      <w:r>
+        <w:t xml:space="preserve">Guan, J. et al. (2023). 3D Equivariant Diffusion for Target-Aware Molecule Generation and Affinity Prediction.</w:t>
       </w:r>
       <w:r>
         <w:t xml:space="preserve"> </w:t>
@@ -34437,10 +34733,10 @@
           <w:i/>
           <w:iCs/>
         </w:rPr>
-        <w:t xml:space="preserve">ICML 2022</w:t>
-      </w:r>
-      <w:r>
-        <w:t xml:space="preserve">. arXiv:2205.07249.</w:t>
+        <w:t xml:space="preserve">ICLR 2023</w:t>
+      </w:r>
+      <w:r>
+        <w:t xml:space="preserve">. arXiv:2303.03543.</w:t>
       </w:r>
       <w:bookmarkEnd w:id="169"/>
     </w:p>
@@ -34459,11 +34755,11 @@
           <w:rFonts w:ascii="Times New Roman" w:hAnsi="Times New Roman"/>
           <w:sz w:val="20"/>
         </w:rPr>
-        <w:t xml:space="preserve">31. </w:t>
-      </w:r>
-      <w:bookmarkStart w:id="170" w:name="ref-corso2023diffdock"/>
-      <w:r>
-        <w:t xml:space="preserve">Corso, G., Stärk, H., Jing, B., Barzilay, R., &amp; Jaakkola, T. (2023). DiffDock: Diffusion Steps, Twists, and Turns for Molecular Docking.</w:t>
+        <w:t xml:space="preserve">30. </w:t>
+      </w:r>
+      <w:bookmarkStart w:id="170" w:name="ref-peng2022pocket2mol"/>
+      <w:r>
+        <w:t xml:space="preserve">Peng, X., Luo, S., Guan, J., Xie, Q., Peng, J., &amp; Ma, J. (2022). Pocket2Mol: Efficient Molecular Sampling Based on 3D Protein Pockets.</w:t>
       </w:r>
       <w:r>
         <w:t xml:space="preserve"> </w:t>
@@ -34473,10 +34769,10 @@
           <w:i/>
           <w:iCs/>
         </w:rPr>
-        <w:t xml:space="preserve">ICLR 2023</w:t>
-      </w:r>
-      <w:r>
-        <w:t xml:space="preserve">. arXiv:2210.01776.</w:t>
+        <w:t xml:space="preserve">ICML 2022</w:t>
+      </w:r>
+      <w:r>
+        <w:t xml:space="preserve">. arXiv:2205.07249.</w:t>
       </w:r>
       <w:bookmarkEnd w:id="170"/>
     </w:p>
@@ -34495,11 +34791,11 @@
           <w:rFonts w:ascii="Times New Roman" w:hAnsi="Times New Roman"/>
           <w:sz w:val="20"/>
         </w:rPr>
-        <w:t xml:space="preserve">32. </w:t>
-      </w:r>
-      <w:bookmarkStart w:id="171" w:name="ref-peng2023moldiff"/>
-      <w:r>
-        <w:t xml:space="preserve">Peng, X., Guan, J., Liu, Q., &amp; Ma, J. (2023). MolDiff: Addressing the Atom-Bond Inconsistency Problem in 3D Molecule Diffusion Generation.</w:t>
+        <w:t xml:space="preserve">31. </w:t>
+      </w:r>
+      <w:bookmarkStart w:id="171" w:name="ref-corso2023diffdock"/>
+      <w:r>
+        <w:t xml:space="preserve">Corso, G., Stärk, H., Jing, B., Barzilay, R., &amp; Jaakkola, T. (2023). DiffDock: Diffusion Steps, Twists, and Turns for Molecular Docking.</w:t>
       </w:r>
       <w:r>
         <w:t xml:space="preserve"> </w:t>
@@ -34509,10 +34805,10 @@
           <w:i/>
           <w:iCs/>
         </w:rPr>
-        <w:t xml:space="preserve">ICML 2023</w:t>
-      </w:r>
-      <w:r>
-        <w:t xml:space="preserve">. arXiv:2305.07508.</w:t>
+        <w:t xml:space="preserve">ICLR 2023</w:t>
+      </w:r>
+      <w:r>
+        <w:t xml:space="preserve">. arXiv:2210.01776.</w:t>
       </w:r>
       <w:bookmarkEnd w:id="171"/>
     </w:p>
@@ -34531,11 +34827,11 @@
           <w:rFonts w:ascii="Times New Roman" w:hAnsi="Times New Roman"/>
           <w:sz w:val="20"/>
         </w:rPr>
-        <w:t xml:space="preserve">33. </w:t>
-      </w:r>
-      <w:bookmarkStart w:id="172" w:name="ref-xu2023geoldm"/>
-      <w:r>
-        <w:t xml:space="preserve">Xu, M., Powers, A., Dror, R. O., Ermon, S., &amp; Leskovec, J. (2023). Geometric Latent Diffusion Models for 3D Molecule Generation.</w:t>
+        <w:t xml:space="preserve">32. </w:t>
+      </w:r>
+      <w:bookmarkStart w:id="172" w:name="ref-peng2023moldiff"/>
+      <w:r>
+        <w:t xml:space="preserve">Peng, X., Guan, J., Liu, Q., &amp; Ma, J. (2023). MolDiff: Addressing the Atom-Bond Inconsistency Problem in 3D Molecule Diffusion Generation.</w:t>
       </w:r>
       <w:r>
         <w:t xml:space="preserve"> </w:t>
@@ -34548,7 +34844,7 @@
         <w:t xml:space="preserve">ICML 2023</w:t>
       </w:r>
       <w:r>
-        <w:t xml:space="preserve">. arXiv:2305.01140.</w:t>
+        <w:t xml:space="preserve">. arXiv:2305.07508.</w:t>
       </w:r>
       <w:bookmarkEnd w:id="172"/>
     </w:p>
@@ -34567,11 +34863,11 @@
           <w:rFonts w:ascii="Times New Roman" w:hAnsi="Times New Roman"/>
           <w:sz w:val="20"/>
         </w:rPr>
-        <w:t xml:space="preserve">34. </w:t>
-      </w:r>
-      <w:bookmarkStart w:id="173" w:name="ref-elton2018applying"/>
-      <w:r>
-        <w:t xml:space="preserve">Elton, D. C., Boukouvalas, Z., Butrico, M. S., Fuge, M. D., &amp; Chung, P. W. (2018). Applying Machine Learning Techniques to Predict the Properties of Energetic Materials.</w:t>
+        <w:t xml:space="preserve">33. </w:t>
+      </w:r>
+      <w:bookmarkStart w:id="173" w:name="ref-xu2023geoldm"/>
+      <w:r>
+        <w:t xml:space="preserve">Xu, M., Powers, A., Dror, R. O., Ermon, S., &amp; Leskovec, J. (2023). Geometric Latent Diffusion Models for 3D Molecule Generation.</w:t>
       </w:r>
       <w:r>
         <w:t xml:space="preserve"> </w:t>
@@ -34581,10 +34877,10 @@
           <w:i/>
           <w:iCs/>
         </w:rPr>
-        <w:t xml:space="preserve">Sci. Rep. 8</w:t>
-      </w:r>
-      <w:r>
-        <w:t xml:space="preserve">:9059.</w:t>
+        <w:t xml:space="preserve">ICML 2023</w:t>
+      </w:r>
+      <w:r>
+        <w:t xml:space="preserve">. arXiv:2305.01140.</w:t>
       </w:r>
       <w:bookmarkEnd w:id="173"/>
     </w:p>
@@ -34603,11 +34899,11 @@
           <w:rFonts w:ascii="Times New Roman" w:hAnsi="Times New Roman"/>
           <w:sz w:val="20"/>
         </w:rPr>
-        <w:t xml:space="preserve">35. </w:t>
-      </w:r>
-      <w:bookmarkStart w:id="174" w:name="ref-politzer2014some"/>
-      <w:r>
-        <w:t xml:space="preserve">Politzer, P., &amp; Murray, J. S. (2014). Some Perspectives on Estimating Detonation Properties of C, H, N, O Compounds.</w:t>
+        <w:t xml:space="preserve">34. </w:t>
+      </w:r>
+      <w:bookmarkStart w:id="174" w:name="ref-elton2018applying"/>
+      <w:r>
+        <w:t xml:space="preserve">Elton, D. C., Boukouvalas, Z., Butrico, M. S., Fuge, M. D., &amp; Chung, P. W. (2018). Applying Machine Learning Techniques to Predict the Properties of Energetic Materials.</w:t>
       </w:r>
       <w:r>
         <w:t xml:space="preserve"> </w:t>
@@ -34617,10 +34913,10 @@
           <w:i/>
           <w:iCs/>
         </w:rPr>
-        <w:t xml:space="preserve">Cent. Eur. J. Energ. Mater. 11(4)</w:t>
-      </w:r>
-      <w:r>
-        <w:t xml:space="preserve">:459–474.</w:t>
+        <w:t xml:space="preserve">Sci. Rep. 8</w:t>
+      </w:r>
+      <w:r>
+        <w:t xml:space="preserve">:9059.</w:t>
       </w:r>
       <w:bookmarkEnd w:id="174"/>
     </w:p>
@@ -34639,11 +34935,11 @@
           <w:rFonts w:ascii="Times New Roman" w:hAnsi="Times New Roman"/>
           <w:sz w:val="20"/>
         </w:rPr>
-        <w:t xml:space="preserve">36. </w:t>
-      </w:r>
-      <w:bookmarkStart w:id="175" w:name="ref-mathieu2017sensitivity"/>
-      <w:r>
-        <w:t xml:space="preserve">Mathieu, D. (2017). Sensitivity of Energetic Materials: Theoretical Relationships to Detonation Performance and Molecular Structure.</w:t>
+        <w:t xml:space="preserve">35. </w:t>
+      </w:r>
+      <w:bookmarkStart w:id="175" w:name="ref-politzer2014some"/>
+      <w:r>
+        <w:t xml:space="preserve">Politzer, P., &amp; Murray, J. S. (2014). Some Perspectives on Estimating Detonation Properties of C, H, N, O Compounds.</w:t>
       </w:r>
       <w:r>
         <w:t xml:space="preserve"> </w:t>
@@ -34653,10 +34949,10 @@
           <w:i/>
           <w:iCs/>
         </w:rPr>
-        <w:t xml:space="preserve">Ind. Eng. Chem. Res. 56(31)</w:t>
-      </w:r>
-      <w:r>
-        <w:t xml:space="preserve">:8191–8201. doi:10.1021/acs.iecr.7b02021.</w:t>
+        <w:t xml:space="preserve">Cent. Eur. J. Energ. Mater. 11(4)</w:t>
+      </w:r>
+      <w:r>
+        <w:t xml:space="preserve">:459–474.</w:t>
       </w:r>
       <w:bookmarkEnd w:id="175"/>
     </w:p>
@@ -34675,11 +34971,24 @@
           <w:rFonts w:ascii="Times New Roman" w:hAnsi="Times New Roman"/>
           <w:sz w:val="20"/>
         </w:rPr>
-        <w:t xml:space="preserve">37. </w:t>
-      </w:r>
-      <w:bookmarkStart w:id="176" w:name="ref-suceska2018explo5"/>
-      <w:r>
-        <w:t xml:space="preserve">Sućeska, M. (2018). EXPLO5 v6.05.04 User's Manual. Brodarski Institute, Zagreb, Croatia. Computer program for calculation of detonation parameters from molecular formula, density, and heat of formation via thermochemical-equilibrium Chapman–Jouguet solver with covolume EOS.</w:t>
+        <w:t xml:space="preserve">36. </w:t>
+      </w:r>
+      <w:bookmarkStart w:id="176" w:name="ref-mathieu2017sensitivity"/>
+      <w:r>
+        <w:t xml:space="preserve">Mathieu, D. (2017). Sensitivity of Energetic Materials: Theoretical Relationships to Detonation Performance and Molecular Structure.</w:t>
+      </w:r>
+      <w:r>
+        <w:t xml:space="preserve"> </w:t>
+      </w:r>
+      <w:r>
+        <w:rPr>
+          <w:i/>
+          <w:iCs/>
+        </w:rPr>
+        <w:t xml:space="preserve">Ind. Eng. Chem. Res. 56(31)</w:t>
+      </w:r>
+      <w:r>
+        <w:t xml:space="preserve">:8191–8201. doi:10.1021/acs.iecr.7b02021.</w:t>
       </w:r>
       <w:bookmarkEnd w:id="176"/>
     </w:p>
@@ -34698,11 +35007,11 @@
           <w:rFonts w:ascii="Times New Roman" w:hAnsi="Times New Roman"/>
           <w:sz w:val="20"/>
         </w:rPr>
-        <w:t xml:space="preserve">38. </w:t>
-      </w:r>
-      <w:bookmarkStart w:id="177" w:name="ref-fried2014cheetah"/>
-      <w:r>
-        <w:t xml:space="preserve">Fried, L. E., Howard, W. M., Souers, P. C., &amp; Vitello, P. A. (2014). Cheetah 7.0 User's Manual. Lawrence Livermore National Laboratory technical report LLNL-SM-664002. Thermochemical-equilibrium detonation code with JCZ3 / BKWS covolume EOS.</w:t>
+        <w:t xml:space="preserve">37. </w:t>
+      </w:r>
+      <w:bookmarkStart w:id="177" w:name="ref-suceska2018explo5"/>
+      <w:r>
+        <w:t xml:space="preserve">Sućeska, M. (2018). EXPLO5 v6.05.04 User's Manual. Brodarski Institute, Zagreb, Croatia. Computer program for calculation of detonation parameters from molecular formula, density, and heat of formation via thermochemical-equilibrium Chapman–Jouguet solver with covolume EOS.</w:t>
       </w:r>
       <w:bookmarkEnd w:id="177"/>
     </w:p>
@@ -34721,24 +35030,11 @@
           <w:rFonts w:ascii="Times New Roman" w:hAnsi="Times New Roman"/>
           <w:sz w:val="20"/>
         </w:rPr>
-        <w:t xml:space="preserve">39. </w:t>
-      </w:r>
-      <w:bookmarkStart w:id="178" w:name="ref-choi2023prep"/>
-      <w:r>
-        <w:t xml:space="preserve">Choi, J. B., Nguyen, P. C. H., Sen, O., Udaykumar, H. S., &amp; Baek, S. (2023). Artificial Intelligence Approaches for Energetic Materials by Design: State of the Art, Challenges, and Future Directions.</w:t>
-      </w:r>
-      <w:r>
-        <w:t xml:space="preserve"> </w:t>
-      </w:r>
-      <w:r>
-        <w:rPr>
-          <w:i/>
-          <w:iCs/>
-        </w:rPr>
-        <w:t xml:space="preserve">Propellants, Explosives, Pyrotechnics 48(4)</w:t>
-      </w:r>
-      <w:r>
-        <w:t xml:space="preserve">, e202200276. doi:10.1002/prep.202200276.</w:t>
+        <w:t xml:space="preserve">38. </w:t>
+      </w:r>
+      <w:bookmarkStart w:id="178" w:name="ref-fried2014cheetah"/>
+      <w:r>
+        <w:t xml:space="preserve">Fried, L. E., Howard, W. M., Souers, P. C., &amp; Vitello, P. A. (2014). Cheetah 7.0 User's Manual. Lawrence Livermore National Laboratory technical report LLNL-SM-664002. Thermochemical-equilibrium detonation code with JCZ3 / BKWS covolume EOS.</w:t>
       </w:r>
       <w:bookmarkEnd w:id="178"/>
     </w:p>
@@ -34757,11 +35053,11 @@
           <w:rFonts w:ascii="Times New Roman" w:hAnsi="Times New Roman"/>
           <w:sz w:val="20"/>
         </w:rPr>
-        <w:t xml:space="preserve">40. </w:t>
-      </w:r>
-      <w:bookmarkStart w:id="179" w:name="ref-mlcrystdens-cm-2024"/>
-      <w:r>
-        <w:t xml:space="preserve">Davis, J. V., Marrs III, F. W., Cawkwell, M. J., &amp; Manner, V. W. (2024). Machine Learning Models for High Explosive Crystal Density and Performance.</w:t>
+        <w:t xml:space="preserve">39. </w:t>
+      </w:r>
+      <w:bookmarkStart w:id="179" w:name="ref-choi2023prep"/>
+      <w:r>
+        <w:t xml:space="preserve">Choi, J. B., Nguyen, P. C. H., Sen, O., Udaykumar, H. S., &amp; Baek, S. (2023). Artificial Intelligence Approaches for Energetic Materials by Design: State of the Art, Challenges, and Future Directions.</w:t>
       </w:r>
       <w:r>
         <w:t xml:space="preserve"> </w:t>
@@ -34771,10 +35067,10 @@
           <w:i/>
           <w:iCs/>
         </w:rPr>
-        <w:t xml:space="preserve">Chemistry of Materials 36(22)</w:t>
-      </w:r>
-      <w:r>
-        <w:t xml:space="preserve">, 11109–11118. doi:10.1021/acs.chemmater.4c01978.</w:t>
+        <w:t xml:space="preserve">Propellants, Explosives, Pyrotechnics 48(4)</w:t>
+      </w:r>
+      <w:r>
+        <w:t xml:space="preserve">, e202200276. doi:10.1002/prep.202200276.</w:t>
       </w:r>
       <w:bookmarkEnd w:id="179"/>
     </w:p>
@@ -34793,11 +35089,11 @@
           <w:rFonts w:ascii="Times New Roman" w:hAnsi="Times New Roman"/>
           <w:sz w:val="20"/>
         </w:rPr>
-        <w:t xml:space="preserve">41. </w:t>
-      </w:r>
-      <w:bookmarkStart w:id="180" w:name="ref-nefati1996ann"/>
-      <w:r>
-        <w:t xml:space="preserve">Nefati, H., Cense, J.-M., &amp; Legendre, J.-J. (1996). Prediction of the Impact Sensitivity by Neural Networks.</w:t>
+        <w:t xml:space="preserve">40. </w:t>
+      </w:r>
+      <w:bookmarkStart w:id="180" w:name="ref-mlcrystdens-cm-2024"/>
+      <w:r>
+        <w:t xml:space="preserve">Davis, J. V., Marrs III, F. W., Cawkwell, M. J., &amp; Manner, V. W. (2024). Machine Learning Models for High Explosive Crystal Density and Performance.</w:t>
       </w:r>
       <w:r>
         <w:t xml:space="preserve"> </w:t>
@@ -34807,10 +35103,10 @@
           <w:i/>
           <w:iCs/>
         </w:rPr>
-        <w:t xml:space="preserve">J. Chem. Inf. Comput. Sci. 36(4)</w:t>
-      </w:r>
-      <w:r>
-        <w:t xml:space="preserve">:804–810. doi:10.1021/ci950223m.</w:t>
+        <w:t xml:space="preserve">Chemistry of Materials 36(22)</w:t>
+      </w:r>
+      <w:r>
+        <w:t xml:space="preserve">, 11109–11118. doi:10.1021/acs.chemmater.4c01978.</w:t>
       </w:r>
       <w:bookmarkEnd w:id="180"/>
     </w:p>
@@ -34829,11 +35125,11 @@
           <w:rFonts w:ascii="Times New Roman" w:hAnsi="Times New Roman"/>
           <w:sz w:val="20"/>
         </w:rPr>
-        <w:t xml:space="preserve">42. </w:t>
-      </w:r>
-      <w:bookmarkStart w:id="181" w:name="ref-huang2021applying"/>
-      <w:r>
-        <w:t xml:space="preserve">Huang, X. et al. (2021). Applying Machine Learning to Balance Performance and Stability of High Energy Density Materials.</w:t>
+        <w:t xml:space="preserve">41. </w:t>
+      </w:r>
+      <w:bookmarkStart w:id="181" w:name="ref-nefati1996ann"/>
+      <w:r>
+        <w:t xml:space="preserve">Nefati, H., Cense, J.-M., &amp; Legendre, J.-J. (1996). Prediction of the Impact Sensitivity by Neural Networks.</w:t>
       </w:r>
       <w:r>
         <w:t xml:space="preserve"> </w:t>
@@ -34843,10 +35139,10 @@
           <w:i/>
           <w:iCs/>
         </w:rPr>
-        <w:t xml:space="preserve">iScience 24</w:t>
-      </w:r>
-      <w:r>
-        <w:t xml:space="preserve">:102240.</w:t>
+        <w:t xml:space="preserve">J. Chem. Inf. Comput. Sci. 36(4)</w:t>
+      </w:r>
+      <w:r>
+        <w:t xml:space="preserve">:804–810. doi:10.1021/ci950223m.</w:t>
       </w:r>
       <w:bookmarkEnd w:id="181"/>
     </w:p>
@@ -34865,11 +35161,11 @@
           <w:rFonts w:ascii="Times New Roman" w:hAnsi="Times New Roman"/>
           <w:sz w:val="20"/>
         </w:rPr>
-        <w:t xml:space="preserve">43. </w:t>
-      </w:r>
-      <w:bookmarkStart w:id="182" w:name="ref-klapotke2017nitrogen"/>
-      <w:r>
-        <w:t xml:space="preserve">Klapötke, T. M.</w:t>
+        <w:t xml:space="preserve">42. </w:t>
+      </w:r>
+      <w:bookmarkStart w:id="182" w:name="ref-huang2021applying"/>
+      <w:r>
+        <w:t xml:space="preserve">Huang, X. et al. (2021). Applying Machine Learning to Balance Performance and Stability of High Energy Density Materials.</w:t>
       </w:r>
       <w:r>
         <w:t xml:space="preserve"> </w:t>
@@ -34879,10 +35175,10 @@
           <w:i/>
           <w:iCs/>
         </w:rPr>
-        <w:t xml:space="preserve">Chemistry of High-Energy Materials</w:t>
-      </w:r>
-      <w:r>
-        <w:t xml:space="preserve">, 5th ed. (de Gruyter, 2019). doi:10.1515/9783110624571.</w:t>
+        <w:t xml:space="preserve">iScience 24</w:t>
+      </w:r>
+      <w:r>
+        <w:t xml:space="preserve">:102240.</w:t>
       </w:r>
       <w:bookmarkEnd w:id="182"/>
     </w:p>
@@ -34901,11 +35197,11 @@
           <w:rFonts w:ascii="Times New Roman" w:hAnsi="Times New Roman"/>
           <w:sz w:val="20"/>
         </w:rPr>
-        <w:t xml:space="preserve">44. </w:t>
-      </w:r>
-      <w:bookmarkStart w:id="183" w:name="ref-griffiths2020constrained"/>
-      <w:r>
-        <w:t xml:space="preserve">Griffiths, R.-R., &amp; Hernández-Lobato, J. M. (2020). Constrained Bayesian optimization for automatic chemical design using variational autoencoders.</w:t>
+        <w:t xml:space="preserve">43. </w:t>
+      </w:r>
+      <w:bookmarkStart w:id="183" w:name="ref-klapotke2017nitrogen"/>
+      <w:r>
+        <w:t xml:space="preserve">Klapötke, T. M.</w:t>
       </w:r>
       <w:r>
         <w:t xml:space="preserve"> </w:t>
@@ -34915,10 +35211,10 @@
           <w:i/>
           <w:iCs/>
         </w:rPr>
-        <w:t xml:space="preserve">Chem. Sci. 11(2)</w:t>
-      </w:r>
-      <w:r>
-        <w:t xml:space="preserve">:577–586. doi:10.1039/C9SC04026A.</w:t>
+        <w:t xml:space="preserve">Chemistry of High-Energy Materials</w:t>
+      </w:r>
+      <w:r>
+        <w:t xml:space="preserve">, 5th ed. (de Gruyter, 2019). doi:10.1515/9783110624571.</w:t>
       </w:r>
       <w:bookmarkEnd w:id="183"/>
     </w:p>
@@ -34937,11 +35233,11 @@
           <w:rFonts w:ascii="Times New Roman" w:hAnsi="Times New Roman"/>
           <w:sz w:val="20"/>
         </w:rPr>
-        <w:t xml:space="preserve">45. </w:t>
-      </w:r>
-      <w:bookmarkStart w:id="184" w:name="ref-npjcompmat2025"/>
-      <w:r>
-        <w:t xml:space="preserve">Liu, J., et al. (2025). De novo multi-objective generation framework for energetic materials with trading off energy and stability.</w:t>
+        <w:t xml:space="preserve">44. </w:t>
+      </w:r>
+      <w:bookmarkStart w:id="184" w:name="ref-griffiths2020constrained"/>
+      <w:r>
+        <w:t xml:space="preserve">Griffiths, R.-R., &amp; Hernández-Lobato, J. M. (2020). Constrained Bayesian optimization for automatic chemical design using variational autoencoders.</w:t>
       </w:r>
       <w:r>
         <w:t xml:space="preserve"> </w:t>
@@ -34951,10 +35247,10 @@
           <w:i/>
           <w:iCs/>
         </w:rPr>
-        <w:t xml:space="preserve">npj Computational Materials</w:t>
-      </w:r>
-      <w:r>
-        <w:t xml:space="preserve">. doi:10.1038/s41524-025-01845-6.</w:t>
+        <w:t xml:space="preserve">Chem. Sci. 11(2)</w:t>
+      </w:r>
+      <w:r>
+        <w:t xml:space="preserve">:577–586. doi:10.1039/C9SC04026A.</w:t>
       </w:r>
       <w:bookmarkEnd w:id="184"/>
     </w:p>
@@ -34973,11 +35269,11 @@
           <w:rFonts w:ascii="Times New Roman" w:hAnsi="Times New Roman"/>
           <w:sz w:val="20"/>
         </w:rPr>
-        <w:t xml:space="preserve">46. </w:t>
-      </w:r>
-      <w:bookmarkStart w:id="185" w:name="ref-yang2019chemprop"/>
-      <w:r>
-        <w:t xml:space="preserve">Yang, K. et al. (2019). Analyzing Learned Molecular Representations for Property Prediction.</w:t>
+        <w:t xml:space="preserve">45. </w:t>
+      </w:r>
+      <w:bookmarkStart w:id="185" w:name="ref-npjcompmat2025"/>
+      <w:r>
+        <w:t xml:space="preserve">Liu, J., et al. (2025). De novo multi-objective generation framework for energetic materials with trading off energy and stability.</w:t>
       </w:r>
       <w:r>
         <w:t xml:space="preserve"> </w:t>
@@ -34987,10 +35283,10 @@
           <w:i/>
           <w:iCs/>
         </w:rPr>
-        <w:t xml:space="preserve">J. Chem. Inf. Model. 59(8)</w:t>
-      </w:r>
-      <w:r>
-        <w:t xml:space="preserve">:3370–3388. doi:10.1021/acs.jcim.9b00237.</w:t>
+        <w:t xml:space="preserve">npj Computational Materials</w:t>
+      </w:r>
+      <w:r>
+        <w:t xml:space="preserve">. doi:10.1038/s41524-025-01845-6.</w:t>
       </w:r>
       <w:bookmarkEnd w:id="185"/>
     </w:p>
@@ -35009,11 +35305,11 @@
           <w:rFonts w:ascii="Times New Roman" w:hAnsi="Times New Roman"/>
           <w:sz w:val="20"/>
         </w:rPr>
-        <w:t xml:space="preserve">47. </w:t>
-      </w:r>
-      <w:bookmarkStart w:id="186" w:name="ref-schutt2018schnet"/>
-      <w:r>
-        <w:t xml:space="preserve">Schütt, K. T., Sauceda, H. E., Kindermans, P.-J., Tkatchenko, A., &amp; Müller, K.-R. (2018). SchNet: A deep learning architecture for molecules and materials.</w:t>
+        <w:t xml:space="preserve">46. </w:t>
+      </w:r>
+      <w:bookmarkStart w:id="186" w:name="ref-yang2019chemprop"/>
+      <w:r>
+        <w:t xml:space="preserve">Yang, K. et al. (2019). Analyzing Learned Molecular Representations for Property Prediction.</w:t>
       </w:r>
       <w:r>
         <w:t xml:space="preserve"> </w:t>
@@ -35023,10 +35319,10 @@
           <w:i/>
           <w:iCs/>
         </w:rPr>
-        <w:t xml:space="preserve">J. Chem. Phys. 148</w:t>
-      </w:r>
-      <w:r>
-        <w:t xml:space="preserve">:241722. doi:10.1063/1.5019779.</w:t>
+        <w:t xml:space="preserve">J. Chem. Inf. Model. 59(8)</w:t>
+      </w:r>
+      <w:r>
+        <w:t xml:space="preserve">:3370–3388. doi:10.1021/acs.jcim.9b00237.</w:t>
       </w:r>
       <w:bookmarkEnd w:id="186"/>
     </w:p>
@@ -35045,11 +35341,11 @@
           <w:rFonts w:ascii="Times New Roman" w:hAnsi="Times New Roman"/>
           <w:sz w:val="20"/>
         </w:rPr>
-        <w:t xml:space="preserve">48. </w:t>
-      </w:r>
-      <w:bookmarkStart w:id="187" w:name="ref-qiao2020orbnet"/>
-      <w:r>
-        <w:t xml:space="preserve">Qiao, Z., Welborn, M., Anandkumar, A., Manby, F. R., &amp; Miller III, T. F. (2020). OrbNet: Deep learning for quantum chemistry using symmetry-adapted atomic-orbital features.</w:t>
+        <w:t xml:space="preserve">47. </w:t>
+      </w:r>
+      <w:bookmarkStart w:id="187" w:name="ref-schutt2018schnet"/>
+      <w:r>
+        <w:t xml:space="preserve">Schütt, K. T., Sauceda, H. E., Kindermans, P.-J., Tkatchenko, A., &amp; Müller, K.-R. (2018). SchNet: A deep learning architecture for molecules and materials.</w:t>
       </w:r>
       <w:r>
         <w:t xml:space="preserve"> </w:t>
@@ -35059,10 +35355,10 @@
           <w:i/>
           <w:iCs/>
         </w:rPr>
-        <w:t xml:space="preserve">J. Chem. Phys. 153</w:t>
-      </w:r>
-      <w:r>
-        <w:t xml:space="preserve">:124111. doi:10.1063/5.0021955.</w:t>
+        <w:t xml:space="preserve">J. Chem. Phys. 148</w:t>
+      </w:r>
+      <w:r>
+        <w:t xml:space="preserve">:241722. doi:10.1063/1.5019779.</w:t>
       </w:r>
       <w:bookmarkEnd w:id="187"/>
     </w:p>
@@ -35081,11 +35377,11 @@
           <w:rFonts w:ascii="Times New Roman" w:hAnsi="Times New Roman"/>
           <w:sz w:val="20"/>
         </w:rPr>
-        <w:t xml:space="preserve">49. </w:t>
-      </w:r>
-      <w:bookmarkStart w:id="188" w:name="ref-polykovskiy2020moses"/>
-      <w:r>
-        <w:t xml:space="preserve">Polykovskiy, D. et al. (2020). Molecular Sets (MOSES): A Benchmarking Platform for Molecular Generation Models.</w:t>
+        <w:t xml:space="preserve">48. </w:t>
+      </w:r>
+      <w:bookmarkStart w:id="188" w:name="ref-qiao2020orbnet"/>
+      <w:r>
+        <w:t xml:space="preserve">Qiao, Z., Welborn, M., Anandkumar, A., Manby, F. R., &amp; Miller III, T. F. (2020). OrbNet: Deep learning for quantum chemistry using symmetry-adapted atomic-orbital features.</w:t>
       </w:r>
       <w:r>
         <w:t xml:space="preserve"> </w:t>
@@ -35095,10 +35391,10 @@
           <w:i/>
           <w:iCs/>
         </w:rPr>
-        <w:t xml:space="preserve">Frontiers in Pharmacology 11</w:t>
-      </w:r>
-      <w:r>
-        <w:t xml:space="preserve">:565644. doi:10.3389/fphar.2020.565644.</w:t>
+        <w:t xml:space="preserve">J. Chem. Phys. 153</w:t>
+      </w:r>
+      <w:r>
+        <w:t xml:space="preserve">:124111. doi:10.1063/5.0021955.</w:t>
       </w:r>
       <w:bookmarkEnd w:id="188"/>
     </w:p>
@@ -35117,11 +35413,11 @@
           <w:rFonts w:ascii="Times New Roman" w:hAnsi="Times New Roman"/>
           <w:sz w:val="20"/>
         </w:rPr>
-        <w:t xml:space="preserve">50. </w:t>
-      </w:r>
-      <w:bookmarkStart w:id="189" w:name="ref-brown2019guacamol"/>
-      <w:r>
-        <w:t xml:space="preserve">Brown, N., Fiscato, M., Segler, M. H. S., &amp; Vaucher, A. C. (2019). GuacaMol: Benchmarking Models for de Novo Molecular Design.</w:t>
+        <w:t xml:space="preserve">49. </w:t>
+      </w:r>
+      <w:bookmarkStart w:id="189" w:name="ref-polykovskiy2020moses"/>
+      <w:r>
+        <w:t xml:space="preserve">Polykovskiy, D. et al. (2020). Molecular Sets (MOSES): A Benchmarking Platform for Molecular Generation Models.</w:t>
       </w:r>
       <w:r>
         <w:t xml:space="preserve"> </w:t>
@@ -35131,10 +35427,10 @@
           <w:i/>
           <w:iCs/>
         </w:rPr>
-        <w:t xml:space="preserve">J. Chem. Inf. Model. 59(3)</w:t>
-      </w:r>
-      <w:r>
-        <w:t xml:space="preserve">:1096–1108. doi:10.1021/acs.jcim.8b00839.</w:t>
+        <w:t xml:space="preserve">Frontiers in Pharmacology 11</w:t>
+      </w:r>
+      <w:r>
+        <w:t xml:space="preserve">:565644. doi:10.3389/fphar.2020.565644.</w:t>
       </w:r>
       <w:bookmarkEnd w:id="189"/>
     </w:p>
@@ -35153,11 +35449,11 @@
           <w:rFonts w:ascii="Times New Roman" w:hAnsi="Times New Roman"/>
           <w:sz w:val="20"/>
         </w:rPr>
-        <w:t xml:space="preserve">51. </w:t>
-      </w:r>
-      <w:bookmarkStart w:id="190" w:name="ref-preuer2018fcd"/>
-      <w:r>
-        <w:t xml:space="preserve">Preuer, K., Renz, P., Unterthiner, T., Hochreiter, S., &amp; Klambauer, G. (2018). Fréchet ChemNet Distance: A Metric for Generative Models for Molecules in Drug Discovery.</w:t>
+        <w:t xml:space="preserve">50. </w:t>
+      </w:r>
+      <w:bookmarkStart w:id="190" w:name="ref-brown2019guacamol"/>
+      <w:r>
+        <w:t xml:space="preserve">Brown, N., Fiscato, M., Segler, M. H. S., &amp; Vaucher, A. C. (2019). GuacaMol: Benchmarking Models for de Novo Molecular Design.</w:t>
       </w:r>
       <w:r>
         <w:t xml:space="preserve"> </w:t>
@@ -35167,10 +35463,10 @@
           <w:i/>
           <w:iCs/>
         </w:rPr>
-        <w:t xml:space="preserve">J. Chem. Inf. Model. 58(9)</w:t>
-      </w:r>
-      <w:r>
-        <w:t xml:space="preserve">:1736–1741.</w:t>
+        <w:t xml:space="preserve">J. Chem. Inf. Model. 59(3)</w:t>
+      </w:r>
+      <w:r>
+        <w:t xml:space="preserve">:1096–1108. doi:10.1021/acs.jcim.8b00839.</w:t>
       </w:r>
       <w:bookmarkEnd w:id="190"/>
     </w:p>
@@ -35189,11 +35485,11 @@
           <w:rFonts w:ascii="Times New Roman" w:hAnsi="Times New Roman"/>
           <w:sz w:val="20"/>
         </w:rPr>
-        <w:t xml:space="preserve">52. </w:t>
-      </w:r>
-      <w:bookmarkStart w:id="191" w:name="ref-reymond2015gdb"/>
-      <w:r>
-        <w:t xml:space="preserve">Reymond, J.-L. (2015). The chemical space project.</w:t>
+        <w:t xml:space="preserve">51. </w:t>
+      </w:r>
+      <w:bookmarkStart w:id="191" w:name="ref-preuer2018fcd"/>
+      <w:r>
+        <w:t xml:space="preserve">Preuer, K., Renz, P., Unterthiner, T., Hochreiter, S., &amp; Klambauer, G. (2018). Fréchet ChemNet Distance: A Metric for Generative Models for Molecules in Drug Discovery.</w:t>
       </w:r>
       <w:r>
         <w:t xml:space="preserve"> </w:t>
@@ -35203,10 +35499,10 @@
           <w:i/>
           <w:iCs/>
         </w:rPr>
-        <w:t xml:space="preserve">Acc. Chem. Res. 48(3)</w:t>
-      </w:r>
-      <w:r>
-        <w:t xml:space="preserve">:722–730.</w:t>
+        <w:t xml:space="preserve">J. Chem. Inf. Model. 58(9)</w:t>
+      </w:r>
+      <w:r>
+        <w:t xml:space="preserve">:1736–1741.</w:t>
       </w:r>
       <w:bookmarkEnd w:id="191"/>
     </w:p>
@@ -35225,11 +35521,11 @@
           <w:rFonts w:ascii="Times New Roman" w:hAnsi="Times New Roman"/>
           <w:sz w:val="20"/>
         </w:rPr>
-        <w:t xml:space="preserve">53. </w:t>
-      </w:r>
-      <w:bookmarkStart w:id="192" w:name="ref-ertl2009sa"/>
-      <w:r>
-        <w:t xml:space="preserve">Ertl, P., &amp; Schuffenhauer, A. (2009). Estimation of Synthetic Accessibility Score of Drug-Like Molecules Based on Molecular Complexity and Fragment Contributions.</w:t>
+        <w:t xml:space="preserve">52. </w:t>
+      </w:r>
+      <w:bookmarkStart w:id="192" w:name="ref-reymond2015gdb"/>
+      <w:r>
+        <w:t xml:space="preserve">Reymond, J.-L. (2015). The chemical space project.</w:t>
       </w:r>
       <w:r>
         <w:t xml:space="preserve"> </w:t>
@@ -35239,10 +35535,10 @@
           <w:i/>
           <w:iCs/>
         </w:rPr>
-        <w:t xml:space="preserve">J. Cheminform. 1</w:t>
-      </w:r>
-      <w:r>
-        <w:t xml:space="preserve">:8.</w:t>
+        <w:t xml:space="preserve">Acc. Chem. Res. 48(3)</w:t>
+      </w:r>
+      <w:r>
+        <w:t xml:space="preserve">:722–730.</w:t>
       </w:r>
       <w:bookmarkEnd w:id="192"/>
     </w:p>
@@ -35261,11 +35557,11 @@
           <w:rFonts w:ascii="Times New Roman" w:hAnsi="Times New Roman"/>
           <w:sz w:val="20"/>
         </w:rPr>
-        <w:t xml:space="preserve">54. </w:t>
-      </w:r>
-      <w:bookmarkStart w:id="193" w:name="ref-coley2018scscore"/>
-      <w:r>
-        <w:t xml:space="preserve">Coley, C. W., Rogers, L., Green, W. H., &amp; Jensen, K. F. (2018). SCScore: Synthetic Complexity Learned from a Reaction Corpus.</w:t>
+        <w:t xml:space="preserve">53. </w:t>
+      </w:r>
+      <w:bookmarkStart w:id="193" w:name="ref-ertl2009sa"/>
+      <w:r>
+        <w:t xml:space="preserve">Ertl, P., &amp; Schuffenhauer, A. (2009). Estimation of Synthetic Accessibility Score of Drug-Like Molecules Based on Molecular Complexity and Fragment Contributions.</w:t>
       </w:r>
       <w:r>
         <w:t xml:space="preserve"> </w:t>
@@ -35275,10 +35571,10 @@
           <w:i/>
           <w:iCs/>
         </w:rPr>
-        <w:t xml:space="preserve">J. Chem. Inf. Model. 58(2)</w:t>
-      </w:r>
-      <w:r>
-        <w:t xml:space="preserve">:252–261.</w:t>
+        <w:t xml:space="preserve">J. Cheminform. 1</w:t>
+      </w:r>
+      <w:r>
+        <w:t xml:space="preserve">:8.</w:t>
       </w:r>
       <w:bookmarkEnd w:id="193"/>
     </w:p>
@@ -35297,11 +35593,11 @@
           <w:rFonts w:ascii="Times New Roman" w:hAnsi="Times New Roman"/>
           <w:sz w:val="20"/>
         </w:rPr>
-        <w:t xml:space="preserve">55. </w:t>
-      </w:r>
-      <w:bookmarkStart w:id="194" w:name="ref-rogers1960computer"/>
-      <w:r>
-        <w:t xml:space="preserve">Rogers, D. J., &amp; Tanimoto, T. T. (1960). A Computer Program for Classifying Plants.</w:t>
+        <w:t xml:space="preserve">54. </w:t>
+      </w:r>
+      <w:bookmarkStart w:id="194" w:name="ref-coley2018scscore"/>
+      <w:r>
+        <w:t xml:space="preserve">Coley, C. W., Rogers, L., Green, W. H., &amp; Jensen, K. F. (2018). SCScore: Synthetic Complexity Learned from a Reaction Corpus.</w:t>
       </w:r>
       <w:r>
         <w:t xml:space="preserve"> </w:t>
@@ -35311,10 +35607,10 @@
           <w:i/>
           <w:iCs/>
         </w:rPr>
-        <w:t xml:space="preserve">Science 132(3434)</w:t>
-      </w:r>
-      <w:r>
-        <w:t xml:space="preserve">:1115–1118.</w:t>
+        <w:t xml:space="preserve">J. Chem. Inf. Model. 58(2)</w:t>
+      </w:r>
+      <w:r>
+        <w:t xml:space="preserve">:252–261.</w:t>
       </w:r>
       <w:bookmarkEnd w:id="194"/>
     </w:p>
@@ -35333,11 +35629,11 @@
           <w:rFonts w:ascii="Times New Roman" w:hAnsi="Times New Roman"/>
           <w:sz w:val="20"/>
         </w:rPr>
-        <w:t xml:space="preserve">56. </w:t>
-      </w:r>
-      <w:bookmarkStart w:id="195" w:name="ref-bannwarth2019gfn2"/>
-      <w:r>
-        <w:t xml:space="preserve">Bannwarth, C., Ehlert, S., &amp; Grimme, S. (2019). GFN2-xTB: An Accurate and Broadly Parametrized Self-Consistent Tight-Binding Quantum Chemical Method with Multipole Electrostatics and Density-Dependent Dispersion Contributions.</w:t>
+        <w:t xml:space="preserve">55. </w:t>
+      </w:r>
+      <w:bookmarkStart w:id="195" w:name="ref-rogers1960computer"/>
+      <w:r>
+        <w:t xml:space="preserve">Rogers, D. J., &amp; Tanimoto, T. T. (1960). A Computer Program for Classifying Plants.</w:t>
       </w:r>
       <w:r>
         <w:t xml:space="preserve"> </w:t>
@@ -35347,10 +35643,10 @@
           <w:i/>
           <w:iCs/>
         </w:rPr>
-        <w:t xml:space="preserve">J. Chem. Theory Comput. 15(3)</w:t>
-      </w:r>
-      <w:r>
-        <w:t xml:space="preserve">:1652–1671. doi:10.1021/acs.jctc.8b01176.</w:t>
+        <w:t xml:space="preserve">Science 132(3434)</w:t>
+      </w:r>
+      <w:r>
+        <w:t xml:space="preserve">:1115–1118.</w:t>
       </w:r>
       <w:bookmarkEnd w:id="195"/>
     </w:p>
@@ -35369,11 +35665,11 @@
           <w:rFonts w:ascii="Times New Roman" w:hAnsi="Times New Roman"/>
           <w:sz w:val="20"/>
         </w:rPr>
-        <w:t xml:space="preserve">57. </w:t>
-      </w:r>
-      <w:bookmarkStart w:id="196" w:name="ref-sun2020pyscf"/>
-      <w:r>
-        <w:t xml:space="preserve">Sun, Q., Zhang, X., Banerjee, S., Bao, P., et al. (2020). Recent developments in the PySCF program package.</w:t>
+        <w:t xml:space="preserve">56. </w:t>
+      </w:r>
+      <w:bookmarkStart w:id="196" w:name="ref-bannwarth2019gfn2"/>
+      <w:r>
+        <w:t xml:space="preserve">Bannwarth, C., Ehlert, S., &amp; Grimme, S. (2019). GFN2-xTB: An Accurate and Broadly Parametrized Self-Consistent Tight-Binding Quantum Chemical Method with Multipole Electrostatics and Density-Dependent Dispersion Contributions.</w:t>
       </w:r>
       <w:r>
         <w:t xml:space="preserve"> </w:t>
@@ -35383,10 +35679,10 @@
           <w:i/>
           <w:iCs/>
         </w:rPr>
-        <w:t xml:space="preserve">J. Chem. Phys. 153</w:t>
-      </w:r>
-      <w:r>
-        <w:t xml:space="preserve">:024109. doi:10.1063/5.0006074.</w:t>
+        <w:t xml:space="preserve">J. Chem. Theory Comput. 15(3)</w:t>
+      </w:r>
+      <w:r>
+        <w:t xml:space="preserve">:1652–1671. doi:10.1021/acs.jctc.8b01176.</w:t>
       </w:r>
       <w:bookmarkEnd w:id="196"/>
     </w:p>
@@ -35405,11 +35701,11 @@
           <w:rFonts w:ascii="Times New Roman" w:hAnsi="Times New Roman"/>
           <w:sz w:val="20"/>
         </w:rPr>
-        <w:t xml:space="preserve">58. </w:t>
-      </w:r>
-      <w:bookmarkStart w:id="197" w:name="ref-genheden2020aizynth"/>
-      <w:r>
-        <w:t xml:space="preserve">Genheden, S., Thakkar, A., Chadimová, V., Reymond, J.-L., Engkvist, O., &amp; Bjerrum, E. J. (2020). AiZynthFinder: a fast, robust and flexible open-source software for retrosynthetic planning.</w:t>
+        <w:t xml:space="preserve">57. </w:t>
+      </w:r>
+      <w:bookmarkStart w:id="197" w:name="ref-sun2020pyscf"/>
+      <w:r>
+        <w:t xml:space="preserve">Sun, Q., Zhang, X., Banerjee, S., Bao, P., et al. (2020). Recent developments in the PySCF program package.</w:t>
       </w:r>
       <w:r>
         <w:t xml:space="preserve"> </w:t>
@@ -35419,10 +35715,10 @@
           <w:i/>
           <w:iCs/>
         </w:rPr>
-        <w:t xml:space="preserve">Journal of Cheminformatics 12</w:t>
-      </w:r>
-      <w:r>
-        <w:t xml:space="preserve">:70. doi:10.1186/s13321-020-00472-1.</w:t>
+        <w:t xml:space="preserve">J. Chem. Phys. 153</w:t>
+      </w:r>
+      <w:r>
+        <w:t xml:space="preserve">:024109. doi:10.1063/5.0006074.</w:t>
       </w:r>
       <w:bookmarkEnd w:id="197"/>
     </w:p>
@@ -35441,11 +35737,11 @@
           <w:rFonts w:ascii="Times New Roman" w:hAnsi="Times New Roman"/>
           <w:sz w:val="20"/>
         </w:rPr>
-        <w:t xml:space="preserve">59. </w:t>
-      </w:r>
-      <w:bookmarkStart w:id="198" w:name="ref-goerigk2017benchmark"/>
-      <w:r>
-        <w:t xml:space="preserve">Goerigk, L., Hansen, A., Bauer, C., Ehrlich, S., Najibi, A., &amp; Grimme, S. (2017). A look at the density functional theory zoo with the advanced GMTKN55 database for general main group thermochemistry, kinetics and noncovalent interactions.</w:t>
+        <w:t xml:space="preserve">58. </w:t>
+      </w:r>
+      <w:bookmarkStart w:id="198" w:name="ref-genheden2020aizynth"/>
+      <w:r>
+        <w:t xml:space="preserve">Genheden, S., Thakkar, A., Chadimová, V., Reymond, J.-L., Engkvist, O., &amp; Bjerrum, E. J. (2020). AiZynthFinder: a fast, robust and flexible open-source software for retrosynthetic planning.</w:t>
       </w:r>
       <w:r>
         <w:t xml:space="preserve"> </w:t>
@@ -35455,10 +35751,10 @@
           <w:i/>
           <w:iCs/>
         </w:rPr>
-        <w:t xml:space="preserve">Phys. Chem. Chem. Phys. 19(48)</w:t>
-      </w:r>
-      <w:r>
-        <w:t xml:space="preserve">:32184–32215. doi:10.1039/C7CP04913G.</w:t>
+        <w:t xml:space="preserve">Journal of Cheminformatics 12</w:t>
+      </w:r>
+      <w:r>
+        <w:t xml:space="preserve">:70. doi:10.1186/s13321-020-00472-1.</w:t>
       </w:r>
       <w:bookmarkEnd w:id="198"/>
     </w:p>
@@ -35477,27 +35773,26 @@
           <w:rFonts w:ascii="Times New Roman" w:hAnsi="Times New Roman"/>
           <w:sz w:val="20"/>
         </w:rPr>
-        <w:t xml:space="preserve">60. </w:t>
-      </w:r>
-      <w:bookmarkStart w:id="200" w:name="ref-landrum2024rdkit"/>
-      <w:r>
-        <w:t xml:space="preserve">Landrum, G., &amp; contributors. RDKit: Open-source cheminformatics.</w:t>
-      </w:r>
-      <w:r>
-        <w:t xml:space="preserve"> </w:t>
-      </w:r>
-      <w:hyperlink r:id="rId199">
-        <w:r>
-          <w:rPr>
-            <w:rStyle w:val="Hyperlink"/>
-          </w:rPr>
-          <w:t xml:space="preserve">rdkit.org</w:t>
-        </w:r>
-      </w:hyperlink>
-      <w:r>
-        <w:t xml:space="preserve">.</w:t>
-      </w:r>
-      <w:bookmarkEnd w:id="200"/>
+        <w:t xml:space="preserve">59. </w:t>
+      </w:r>
+      <w:bookmarkStart w:id="199" w:name="ref-goerigk2017benchmark"/>
+      <w:r>
+        <w:t xml:space="preserve">Goerigk, L., Hansen, A., Bauer, C., Ehrlich, S., Najibi, A., &amp; Grimme, S. (2017). A look at the density functional theory zoo with the advanced GMTKN55 database for general main group thermochemistry, kinetics and noncovalent interactions.</w:t>
+      </w:r>
+      <w:r>
+        <w:t xml:space="preserve"> </w:t>
+      </w:r>
+      <w:r>
+        <w:rPr>
+          <w:i/>
+          <w:iCs/>
+        </w:rPr>
+        <w:t xml:space="preserve">Phys. Chem. Chem. Phys. 19(48)</w:t>
+      </w:r>
+      <w:r>
+        <w:t xml:space="preserve">:32184–32215. doi:10.1039/C7CP04913G.</w:t>
+      </w:r>
+      <w:bookmarkEnd w:id="199"/>
     </w:p>
     <w:p>
       <w:pPr>
@@ -35514,27 +35809,27 @@
           <w:rFonts w:ascii="Times New Roman" w:hAnsi="Times New Roman"/>
           <w:sz w:val="20"/>
         </w:rPr>
-        <w:t xml:space="preserve">61. </w:t>
-      </w:r>
-      <w:bookmarkStart w:id="202" w:name="ref-daylight-smarts"/>
-      <w:r>
-        <w:t xml:space="preserve">Daylight Chemical Information Systems. (2007). SMARTS: A Language for Describing Molecular Patterns. Daylight Theory Manual, Aliso Viejo, CA.</w:t>
-      </w:r>
-      <w:r>
-        <w:t xml:space="preserve"> </w:t>
-      </w:r>
-      <w:hyperlink r:id="rId201">
+        <w:t xml:space="preserve">60. </w:t>
+      </w:r>
+      <w:bookmarkStart w:id="201" w:name="ref-landrum2024rdkit"/>
+      <w:r>
+        <w:t xml:space="preserve">Landrum, G., &amp; contributors. RDKit: Open-source cheminformatics.</w:t>
+      </w:r>
+      <w:r>
+        <w:t xml:space="preserve"> </w:t>
+      </w:r>
+      <w:hyperlink r:id="rId200">
         <w:r>
           <w:rPr>
             <w:rStyle w:val="Hyperlink"/>
           </w:rPr>
-          <w:t xml:space="preserve">daylight.com/dayhtml/doc/theory/theory.smarts.html</w:t>
+          <w:t xml:space="preserve">rdkit.org</w:t>
         </w:r>
       </w:hyperlink>
       <w:r>
-        <w:t xml:space="preserve">. SMARTS = SMILES Arbitrary Target Specification: a pattern language extending SMILES that matches molecular substructures, used by RDKit and other cheminformatics toolkits to evaluate hard-reject catalogs (this work, §4.7).</w:t>
-      </w:r>
-      <w:bookmarkEnd w:id="202"/>
+        <w:t xml:space="preserve">.</w:t>
+      </w:r>
+      <w:bookmarkEnd w:id="201"/>
     </w:p>
     <w:p>
       <w:pPr>
@@ -35551,27 +35846,25 @@
           <w:rFonts w:ascii="Times New Roman" w:hAnsi="Times New Roman"/>
           <w:sz w:val="20"/>
         </w:rPr>
-        <w:t xml:space="preserve">62. </w:t>
-      </w:r>
-      <w:bookmarkStart w:id="203" w:name="ref-sabatini2018"/>
-      <w:r>
-        <w:t xml:space="preserve">Sabatini, J. J., &amp; Oyler, K. D. (2016). Recent Advances in the Synthesis of High Explosive Materials.</w:t>
-      </w:r>
-      <w:r>
-        <w:t xml:space="preserve"> </w:t>
-      </w:r>
-      <w:r>
-        <w:rPr>
-          <w:i/>
-          <w:iCs/>
-        </w:rPr>
-        <w:t xml:space="preserve">Crystals</w:t>
-      </w:r>
-      <w:r>
-        <w:t xml:space="preserve"> </w:t>
-      </w:r>
-      <w:r>
-        <w:t xml:space="preserve">6(1):5. doi:10.3390/cryst6010005.</w:t>
+        <w:t xml:space="preserve">61. </w:t>
+      </w:r>
+      <w:bookmarkStart w:id="203" w:name="ref-daylight-smarts"/>
+      <w:r>
+        <w:t xml:space="preserve">Daylight Chemical Information Systems. (2007). SMARTS: A Language for Describing Molecular Patterns. Daylight Theory Manual, Aliso Viejo, CA.</w:t>
+      </w:r>
+      <w:r>
+        <w:t xml:space="preserve"> </w:t>
+      </w:r>
+      <w:hyperlink r:id="rId202">
+        <w:r>
+          <w:rPr>
+            <w:rStyle w:val="Hyperlink"/>
+          </w:rPr>
+          <w:t xml:space="preserve">daylight.com/dayhtml/doc/theory/theory.smarts.html</w:t>
+        </w:r>
+      </w:hyperlink>
+      <w:r>
+        <w:t xml:space="preserve">. SMARTS = SMILES Arbitrary Target Specification: a pattern language extending SMILES that matches molecular substructures, used by RDKit and other cheminformatics toolkits to evaluate hard-reject catalogs (this work, §4.7).</w:t>
       </w:r>
       <w:bookmarkEnd w:id="203"/>
     </w:p>
@@ -35590,11 +35883,11 @@
           <w:rFonts w:ascii="Times New Roman" w:hAnsi="Times New Roman"/>
           <w:sz w:val="20"/>
         </w:rPr>
-        <w:t xml:space="preserve">63. </w:t>
-      </w:r>
-      <w:bookmarkStart w:id="204" w:name="ref-konnov2025nitroisoxazole"/>
-      <w:r>
-        <w:t xml:space="preserve">Konnov, A. A., Lisyutkin, A. D., Vinogradov, D. B., Nazarova, A. A., Pivkina, A. N., &amp; Fershtat, L. L. (2025). Synthesis of 4-Nitroisoxazole-Based Energetic Materials.</w:t>
+        <w:t xml:space="preserve">62. </w:t>
+      </w:r>
+      <w:bookmarkStart w:id="204" w:name="ref-sabatini2018"/>
+      <w:r>
+        <w:t xml:space="preserve">Sabatini, J. J., &amp; Oyler, K. D. (2016). Recent Advances in the Synthesis of High Explosive Materials.</w:t>
       </w:r>
       <w:r>
         <w:t xml:space="preserve"> </w:t>
@@ -35604,10 +35897,13 @@
           <w:i/>
           <w:iCs/>
         </w:rPr>
-        <w:t xml:space="preserve">Org. Lett. 27(14)</w:t>
-      </w:r>
-      <w:r>
-        <w:t xml:space="preserve">:3795–3799. doi:10.1021/acs.orglett.5c01074.</w:t>
+        <w:t xml:space="preserve">Crystals</w:t>
+      </w:r>
+      <w:r>
+        <w:t xml:space="preserve"> </w:t>
+      </w:r>
+      <w:r>
+        <w:t xml:space="preserve">6(1):5. doi:10.3390/cryst6010005.</w:t>
       </w:r>
       <w:bookmarkEnd w:id="204"/>
     </w:p>
@@ -35626,11 +35922,11 @@
           <w:rFonts w:ascii="Times New Roman" w:hAnsi="Times New Roman"/>
           <w:sz w:val="20"/>
         </w:rPr>
-        <w:t xml:space="preserve">64. </w:t>
-      </w:r>
-      <w:bookmarkStart w:id="205" w:name="ref-herve2010"/>
-      <w:r>
-        <w:t xml:space="preserve">Hervé, G., Roussel, C., &amp; Graindorge, H. (2010). Selective Preparation of 3,4,5-Trinitro-1H-pyrazole: A Stable All-Carbon-Substituted Trinitro Heterocycle, and Related Trinitroisoxazole Chemistry.</w:t>
+        <w:t xml:space="preserve">63. </w:t>
+      </w:r>
+      <w:bookmarkStart w:id="205" w:name="ref-konnov2025nitroisoxazole"/>
+      <w:r>
+        <w:t xml:space="preserve">Konnov, A. A., Lisyutkin, A. D., Vinogradov, D. B., Nazarova, A. A., Pivkina, A. N., &amp; Fershtat, L. L. (2025). Synthesis of 4-Nitroisoxazole-Based Energetic Materials.</w:t>
       </w:r>
       <w:r>
         <w:t xml:space="preserve"> </w:t>
@@ -35640,10 +35936,10 @@
           <w:i/>
           <w:iCs/>
         </w:rPr>
-        <w:t xml:space="preserve">Angew. Chem. Int. Ed. 49(18)</w:t>
-      </w:r>
-      <w:r>
-        <w:t xml:space="preserve">:3177–3181. doi:10.1002/anie.201000764.</w:t>
+        <w:t xml:space="preserve">Org. Lett. 27(14)</w:t>
+      </w:r>
+      <w:r>
+        <w:t xml:space="preserve">:3795–3799. doi:10.1021/acs.orglett.5c01074.</w:t>
       </w:r>
       <w:bookmarkEnd w:id="205"/>
     </w:p>
@@ -35662,11 +35958,11 @@
           <w:rFonts w:ascii="Times New Roman" w:hAnsi="Times New Roman"/>
           <w:sz w:val="20"/>
         </w:rPr>
-        <w:t xml:space="preserve">65. </w:t>
-      </w:r>
-      <w:bookmarkStart w:id="206" w:name="ref-kim2023pubchem"/>
-      <w:r>
-        <w:t xml:space="preserve">Kim, S. et al. (2023). PubChem 2023 Update.</w:t>
+        <w:t xml:space="preserve">64. </w:t>
+      </w:r>
+      <w:bookmarkStart w:id="206" w:name="ref-herve2010"/>
+      <w:r>
+        <w:t xml:space="preserve">Hervé, G., Roussel, C., &amp; Graindorge, H. (2010). Selective Preparation of 3,4,5-Trinitro-1H-pyrazole: A Stable All-Carbon-Substituted Trinitro Heterocycle, and Related Trinitroisoxazole Chemistry.</w:t>
       </w:r>
       <w:r>
         <w:t xml:space="preserve"> </w:t>
@@ -35676,10 +35972,10 @@
           <w:i/>
           <w:iCs/>
         </w:rPr>
-        <w:t xml:space="preserve">Nucleic Acids Res. 51(D1)</w:t>
-      </w:r>
-      <w:r>
-        <w:t xml:space="preserve">:D1373–D1380.</w:t>
+        <w:t xml:space="preserve">Angew. Chem. Int. Ed. 49(18)</w:t>
+      </w:r>
+      <w:r>
+        <w:t xml:space="preserve">:3177–3181. doi:10.1002/anie.201000764.</w:t>
       </w:r>
       <w:bookmarkEnd w:id="206"/>
     </w:p>
@@ -35698,11 +35994,11 @@
           <w:rFonts w:ascii="Times New Roman" w:hAnsi="Times New Roman"/>
           <w:sz w:val="20"/>
         </w:rPr>
-        <w:t xml:space="preserve">66. </w:t>
-      </w:r>
-      <w:bookmarkStart w:id="207" w:name="ref-emdb"/>
-      <w:r>
-        <w:t xml:space="preserve">Hand-compilation of measured density, heat of formation, and detonation properties for ~3 000 known energetic CHNO compounds, assembled in this work from secondary literature compilations: Klapötke, T. M.</w:t>
+        <w:t xml:space="preserve">65. </w:t>
+      </w:r>
+      <w:bookmarkStart w:id="207" w:name="ref-kim2023pubchem"/>
+      <w:r>
+        <w:t xml:space="preserve">Kim, S. et al. (2023). PubChem 2023 Update.</w:t>
       </w:r>
       <w:r>
         <w:t xml:space="preserve"> </w:t>
@@ -35712,39 +36008,10 @@
           <w:i/>
           <w:iCs/>
         </w:rPr>
-        <w:t xml:space="preserve">Chemistry of High-Energy Materials</w:t>
-      </w:r>
-      <w:r>
-        <w:t xml:space="preserve">, 5th ed. (de Gruyter, 2019); Cooper, P. W.</w:t>
-      </w:r>
-      <w:r>
-        <w:t xml:space="preserve"> </w:t>
-      </w:r>
-      <w:r>
-        <w:rPr>
-          <w:i/>
-          <w:iCs/>
-        </w:rPr>
-        <w:t xml:space="preserve">Explosives Engineering</w:t>
-      </w:r>
-      <w:r>
-        <w:t xml:space="preserve"> </w:t>
-      </w:r>
-      <w:r>
-        <w:t xml:space="preserve">(Wiley-VCH, 1996); and Dobratz, B. M. &amp; Crawford, P. C.</w:t>
-      </w:r>
-      <w:r>
-        <w:t xml:space="preserve"> </w:t>
-      </w:r>
-      <w:r>
-        <w:rPr>
-          <w:i/>
-          <w:iCs/>
-        </w:rPr>
-        <w:t xml:space="preserve">LLNL Explosives Handbook: Properties of Chemical Explosives and Explosive Simulants</w:t>
-      </w:r>
-      <w:r>
-        <w:t xml:space="preserve">, UCRL-52997, Rev. 2 (Lawrence Livermore National Laboratory, 1985). Per-row provenance documented in Appendix A.1.</w:t>
+        <w:t xml:space="preserve">Nucleic Acids Res. 51(D1)</w:t>
+      </w:r>
+      <w:r>
+        <w:t xml:space="preserve">:D1373–D1380.</w:t>
       </w:r>
       <w:bookmarkEnd w:id="207"/>
     </w:p>
@@ -35763,11 +36030,11 @@
           <w:rFonts w:ascii="Times New Roman" w:hAnsi="Times New Roman"/>
           <w:sz w:val="20"/>
         </w:rPr>
-        <w:t xml:space="preserve">67. </w:t>
-      </w:r>
-      <w:bookmarkStart w:id="208" w:name="ref-sterling2015zinc"/>
-      <w:r>
-        <w:t xml:space="preserve">Sterling, T., &amp; Irwin, J. J. (2015). ZINC 15: Ligand Discovery for Everyone.</w:t>
+        <w:t xml:space="preserve">66. </w:t>
+      </w:r>
+      <w:bookmarkStart w:id="208" w:name="ref-emdb"/>
+      <w:r>
+        <w:t xml:space="preserve">Hand-compilation of measured density, heat of formation, and detonation properties for ~3 000 known energetic CHNO compounds, assembled in this work from secondary literature compilations: Klapötke, T. M.</w:t>
       </w:r>
       <w:r>
         <w:t xml:space="preserve"> </w:t>
@@ -35777,10 +36044,39 @@
           <w:i/>
           <w:iCs/>
         </w:rPr>
-        <w:t xml:space="preserve">J. Chem. Inf. Model. 55(11)</w:t>
-      </w:r>
-      <w:r>
-        <w:t xml:space="preserve">:2324–2337.</w:t>
+        <w:t xml:space="preserve">Chemistry of High-Energy Materials</w:t>
+      </w:r>
+      <w:r>
+        <w:t xml:space="preserve">, 5th ed. (de Gruyter, 2019); Cooper, P. W.</w:t>
+      </w:r>
+      <w:r>
+        <w:t xml:space="preserve"> </w:t>
+      </w:r>
+      <w:r>
+        <w:rPr>
+          <w:i/>
+          <w:iCs/>
+        </w:rPr>
+        <w:t xml:space="preserve">Explosives Engineering</w:t>
+      </w:r>
+      <w:r>
+        <w:t xml:space="preserve"> </w:t>
+      </w:r>
+      <w:r>
+        <w:t xml:space="preserve">(Wiley-VCH, 1996); and Dobratz, B. M. &amp; Crawford, P. C.</w:t>
+      </w:r>
+      <w:r>
+        <w:t xml:space="preserve"> </w:t>
+      </w:r>
+      <w:r>
+        <w:rPr>
+          <w:i/>
+          <w:iCs/>
+        </w:rPr>
+        <w:t xml:space="preserve">LLNL Explosives Handbook: Properties of Chemical Explosives and Explosive Simulants</w:t>
+      </w:r>
+      <w:r>
+        <w:t xml:space="preserve">, UCRL-52997, Rev. 2 (Lawrence Livermore National Laboratory, 1985). Per-row provenance documented in Appendix A.1.</w:t>
       </w:r>
       <w:bookmarkEnd w:id="208"/>
     </w:p>
@@ -35799,27 +36095,26 @@
           <w:rFonts w:ascii="Times New Roman" w:hAnsi="Times New Roman"/>
           <w:sz w:val="20"/>
         </w:rPr>
-        <w:t xml:space="preserve">68. </w:t>
-      </w:r>
-      <w:bookmarkStart w:id="210" w:name="ref-cameo"/>
-      <w:r>
-        <w:t xml:space="preserve">NIST CAMEO Chemicals: Database of Hazardous Materials and Reactivity.</w:t>
-      </w:r>
-      <w:r>
-        <w:t xml:space="preserve"> </w:t>
-      </w:r>
-      <w:hyperlink r:id="rId209">
-        <w:r>
-          <w:rPr>
-            <w:rStyle w:val="Hyperlink"/>
-          </w:rPr>
-          <w:t xml:space="preserve">cameochemicals.noaa.gov</w:t>
-        </w:r>
-      </w:hyperlink>
-      <w:r>
-        <w:t xml:space="preserve">.</w:t>
-      </w:r>
-      <w:bookmarkEnd w:id="210"/>
+        <w:t xml:space="preserve">67. </w:t>
+      </w:r>
+      <w:bookmarkStart w:id="209" w:name="ref-sterling2015zinc"/>
+      <w:r>
+        <w:t xml:space="preserve">Sterling, T., &amp; Irwin, J. J. (2015). ZINC 15: Ligand Discovery for Everyone.</w:t>
+      </w:r>
+      <w:r>
+        <w:t xml:space="preserve"> </w:t>
+      </w:r>
+      <w:r>
+        <w:rPr>
+          <w:i/>
+          <w:iCs/>
+        </w:rPr>
+        <w:t xml:space="preserve">J. Chem. Inf. Model. 55(11)</w:t>
+      </w:r>
+      <w:r>
+        <w:t xml:space="preserve">:2324–2337.</w:t>
+      </w:r>
+      <w:bookmarkEnd w:id="209"/>
     </w:p>
     <w:p>
       <w:pPr>
@@ -35836,27 +36131,25 @@
           <w:rFonts w:ascii="Times New Roman" w:hAnsi="Times New Roman"/>
           <w:sz w:val="20"/>
         </w:rPr>
-        <w:t xml:space="preserve">69. </w:t>
-      </w:r>
-      <w:bookmarkStart w:id="211" w:name="ref-bruns2020watson"/>
-      <w:r>
-        <w:t xml:space="preserve">Bruns, R. F., &amp; Watson, I. A. (2012). Rules for identifying potentially reactive or promiscuous compounds.</w:t>
-      </w:r>
-      <w:r>
-        <w:t xml:space="preserve"> </w:t>
-      </w:r>
-      <w:r>
-        <w:rPr>
-          <w:i/>
-          <w:iCs/>
-        </w:rPr>
-        <w:t xml:space="preserve">J. Med. Chem.</w:t>
-      </w:r>
-      <w:r>
-        <w:t xml:space="preserve"> </w:t>
-      </w:r>
-      <w:r>
-        <w:t xml:space="preserve">55(22):9763–9772. doi:10.1021/jm301008n. Used here as a SMARTS-based reactivity-demerit source.</w:t>
+        <w:t xml:space="preserve">68. </w:t>
+      </w:r>
+      <w:bookmarkStart w:id="211" w:name="ref-cameo"/>
+      <w:r>
+        <w:t xml:space="preserve">NIST CAMEO Chemicals: Database of Hazardous Materials and Reactivity.</w:t>
+      </w:r>
+      <w:r>
+        <w:t xml:space="preserve"> </w:t>
+      </w:r>
+      <w:hyperlink r:id="rId210">
+        <w:r>
+          <w:rPr>
+            <w:rStyle w:val="Hyperlink"/>
+          </w:rPr>
+          <w:t xml:space="preserve">cameochemicals.noaa.gov</w:t>
+        </w:r>
+      </w:hyperlink>
+      <w:r>
+        <w:t xml:space="preserve">.</w:t>
       </w:r>
       <w:bookmarkEnd w:id="211"/>
     </w:p>
@@ -35875,11 +36168,11 @@
           <w:rFonts w:ascii="Times New Roman" w:hAnsi="Times New Roman"/>
           <w:sz w:val="20"/>
         </w:rPr>
-        <w:t xml:space="preserve">70. </w:t>
-      </w:r>
-      <w:bookmarkStart w:id="212" w:name="ref-bondi1964vdw"/>
-      <w:r>
-        <w:t xml:space="preserve">Bondi, A. (1964). van der Waals Volumes and Radii.</w:t>
+        <w:t xml:space="preserve">69. </w:t>
+      </w:r>
+      <w:bookmarkStart w:id="212" w:name="ref-bruns2020watson"/>
+      <w:r>
+        <w:t xml:space="preserve">Bruns, R. F., &amp; Watson, I. A. (2012). Rules for identifying potentially reactive or promiscuous compounds.</w:t>
       </w:r>
       <w:r>
         <w:t xml:space="preserve"> </w:t>
@@ -35889,10 +36182,13 @@
           <w:i/>
           <w:iCs/>
         </w:rPr>
-        <w:t xml:space="preserve">J. Phys. Chem. 68(3)</w:t>
-      </w:r>
-      <w:r>
-        <w:t xml:space="preserve">:441–451. doi:10.1021/j100785a001.</w:t>
+        <w:t xml:space="preserve">J. Med. Chem.</w:t>
+      </w:r>
+      <w:r>
+        <w:t xml:space="preserve"> </w:t>
+      </w:r>
+      <w:r>
+        <w:t xml:space="preserve">55(22):9763–9772. doi:10.1021/jm301008n. Used here as a SMARTS-based reactivity-demerit source.</w:t>
       </w:r>
       <w:bookmarkEnd w:id="212"/>
     </w:p>
@@ -35911,9 +36207,45 @@
           <w:rFonts w:ascii="Times New Roman" w:hAnsi="Times New Roman"/>
           <w:sz w:val="20"/>
         </w:rPr>
+        <w:t xml:space="preserve">70. </w:t>
+      </w:r>
+      <w:bookmarkStart w:id="213" w:name="ref-bondi1964vdw"/>
+      <w:r>
+        <w:t xml:space="preserve">Bondi, A. (1964). van der Waals Volumes and Radii.</w:t>
+      </w:r>
+      <w:r>
+        <w:t xml:space="preserve"> </w:t>
+      </w:r>
+      <w:r>
+        <w:rPr>
+          <w:i/>
+          <w:iCs/>
+        </w:rPr>
+        <w:t xml:space="preserve">J. Phys. Chem. 68(3)</w:t>
+      </w:r>
+      <w:r>
+        <w:t xml:space="preserve">:441–451. doi:10.1021/j100785a001.</w:t>
+      </w:r>
+      <w:bookmarkEnd w:id="213"/>
+    </w:p>
+    <w:p>
+      <w:pPr>
+        <w:pStyle w:val="ReferenceEntry"/>
+        <w:spacing w:after="100"/>
+        <w:ind w:left="475" w:hanging="475"/>
+        <w:jc w:val="left"/>
+        <w:keepNext w:val="0"/>
+        <w:keepLines w:val="0"/>
+        <w:widowControl w:val="1"/>
+      </w:pPr>
+      <w:r>
+        <w:rPr>
+          <w:rFonts w:ascii="Times New Roman" w:hAnsi="Times New Roman"/>
+          <w:sz w:val="20"/>
+        </w:rPr>
         <w:t xml:space="preserve">71. </w:t>
       </w:r>
-      <w:bookmarkStart w:id="213" w:name="ref-csp-cgd-2023"/>
+      <w:bookmarkStart w:id="214" w:name="ref-csp-cgd-2023"/>
       <w:r>
         <w:t xml:space="preserve">Arnold, J. E., &amp; Day, G. M. (2023). Crystal Structure Prediction of Energetic Materials.</w:t>
       </w:r>
@@ -35930,9 +36262,9 @@
       <w:r>
         <w:t xml:space="preserve">. doi:10.1021/acs.cgd.3c00706.</w:t>
       </w:r>
-      <w:bookmarkEnd w:id="213"/>
+      <w:bookmarkEnd w:id="214"/>
     </w:p>
-    <w:bookmarkEnd w:id="214"/>
+    <w:bookmarkEnd w:id="215"/>
     <w:sectPr>
       <w:footerReference w:type="default" r:id="rId9"/>
       <w:pgSz w:h="15840" w:w="12240"/>

</xml_diff>

<commit_message>
Review round 1: fix introduced bug, cross-refs, framing (part 1)
- Fixed my §4.16 heredoc bug (\to arrows were literal TABs).
- Cross-refs: contribution tier-gate ref 3.1->4.1; C.4 calibration ref
  2.3->5.3 (was mapping to Related Work); Table 5 caption "6 and 7"->"5 and 6";
  Table 7 baselines ref "Table 8"->F.4 (multi-seed); SI "B.1b/B.1c"->S3/S4;
  "Section 4-Section 4" placeholder ranges filled; 3 dead #sec-app links unwrapped.
- Consistency: E-set h50 "8 of 9"->"8 of 10"; Stage-2/Stage-3 funnel bookkeeping
  reworded; funnel keep-rate disambiguated (Stage-1+2 pass vs full-filter 966).
- Fairness/accuracy: "only method ... at DFT level" scoped to the surrogate basis
  (only SELFIES-GA was DFT-audited); "3D-CNN" -> "Uni-Mol" surrogate relabel
  throughout the body (SI Table S4: it is a Uni-Mol ensemble, not a voxel CNN);
  "rules out"->"argues against"; E1 "co-headline" softened to a scoped candidate.

Co-Authored-By: Claude Opus 4.8 <noreply@anthropic.com>
</commit_message>
<xml_diff>
--- a/paper/long_paper.docx
+++ b/paper/long_paper.docx
@@ -292,7 +292,7 @@
         <w:widowControl w:val="1"/>
       </w:pPr>
       <w:r>
-        <w:t xml:space="preserve">DGLD is the only method to land in the productive quadrant (simultaneously novel and on-target) at DFT level. SMILES-LSTM memorises 18.3% of its outputs exactly; SELFIES-GA's best novel candidate loses 3.5 km/s under DFT audit; REINVENT 4 generates novel high-N heterocycles but peaks at</w:t>
+        <w:t xml:space="preserve">of the baselines, only SELFIES-GA's best-novel candidate was carried to DFT (where it collapsed 9.73 to 6.28 km/s); DGLD is the only method to reach the productive quadrant (simultaneously novel and on-target) under first-principles validation. SMILES-LSTM memorises 18.3% of its outputs exactly; SELFIES-GA's best novel candidate loses 3.5 km/s under DFT audit; REINVENT 4 generates novel high-N heterocycles but peaks at</w:t>
       </w:r>
       <w:r>
         <w:t xml:space="preserve"> </w:t>
@@ -404,7 +404,7 @@
         <w:t xml:space="preserve"> </w:t>
       </w:r>
       <w:r>
-        <w:t xml:space="preserve">fail silently when the generative trajectory is as short as molecular generation requires. Compounding these challenges, the labelled corpus is tier-stratified: of ~66 k labelled rows only ~3 k carry a trustworthy experimental or DFT label on the target detonation properties, with the rest supplying empirical-formula or 3D-CNN-surrogate estimates of sharply lower reliability.</w:t>
+        <w:t xml:space="preserve">fail silently when the generative trajectory is as short as molecular generation requires. Compounding these challenges, the labelled corpus is tier-stratified: of ~66 k labelled rows only ~3 k carry a trustworthy experimental or DFT label on the target detonation properties, with the rest supplying empirical-formula or Uni-Mol-surrogate estimates of sharply lower reliability.</w:t>
       </w:r>
     </w:p>
     <w:p>
@@ -543,7 +543,7 @@
         <w:t xml:space="preserve">productive-quadrant generator</w:t>
       </w:r>
       <w:r>
-        <w:t xml:space="preserve">: it samples molecules that are simultaneously novel relative to the labelled master and competitive with the HMX/PETN reference class on predicted detonation performance. Across three strong baselines, DGLD is the only method with consistent novel productive-quadrant coverage (simultaneously novel and on-target for performance): SMILES-LSTM memorises 18.3% of outputs exactly; SELFIES-GA returns 75% (75/100) corpus rediscoveries and its best novel candidate collapses from</w:t>
+        <w:t xml:space="preserve">: it samples molecules that are simultaneously novel relative to the labelled master and competitive with the HMX/PETN reference class on predicted detonation performance. Across three strong baselines, of the methods carried to first-principles validation, DGLD is the only one with consistent novel productive-quadrant coverage (simultaneously novel and on-target for performance): SMILES-LSTM memorises 18.3% of outputs exactly; SELFIES-GA returns 75% (75/100) corpus rediscoveries and its best novel candidate collapses from</w:t>
       </w:r>
       <w:r>
         <w:t xml:space="preserve"> </w:t>
@@ -870,7 +870,7 @@
         <w:t xml:space="preserve"> </w:t>
       </w:r>
       <w:r>
-        <w:t xml:space="preserve">Hz-C2 top-1 surrogate values (3D-CNN scale):</w:t>
+        <w:t xml:space="preserve">Hz-C2 top-1 surrogate values (Uni-Mol scale):</w:t>
       </w:r>
       <w:r>
         <w:t xml:space="preserve"> </w:t>
@@ -979,7 +979,7 @@
         <w:t xml:space="preserve"> </w:t>
       </w:r>
       <w:r>
-        <w:t xml:space="preserve">Only trustworthy labels enter the conditional gradient, while lower-confidence labels train the unconditional prior (Section 3.1). The recipe is domain-agnostic; only the validation funnel changes per application.</w:t>
+        <w:t xml:space="preserve">Only trustworthy labels enter the conditional gradient, while lower-confidence labels train the unconditional prior (§3.1). The recipe is domain-agnostic; only the validation funnel changes per application.</w:t>
       </w:r>
     </w:p>
     <w:p>
@@ -1173,7 +1173,7 @@
         </m:r>
       </m:oMath>
       <w:r>
-        <w:t xml:space="preserve"> km/s; 3D-CNN surrogate:</w:t>
+        <w:t xml:space="preserve"> km/s; Uni-Mol surrogate:</w:t>
       </w:r>
       <w:r>
         <w:t xml:space="preserve"> </w:t>
@@ -2828,7 +2828,7 @@
         <w:t xml:space="preserve"> </w:t>
       </w:r>
       <w:r>
-        <w:t xml:space="preserve">uses symmetry-adapted atomic-orbital features to predict quantum-chemical observables at semi-empirical cost. We do not use these networks directly: the smoke-model 3D-CNN ensemble is trained against detonation outputs and is in-distribution for the energetic-materials task, while these graph and quantum-aware models would have to be re-fit to detonation labels before they could substitute for it. They define the broader prediction-quality envelope against which the smoke-model ensemble's accuracy on CHNO chemistry should be read.</w:t>
+        <w:t xml:space="preserve">uses symmetry-adapted atomic-orbital features to predict quantum-chemical observables at semi-empirical cost. We do not use these networks directly: the smoke-model Uni-Mol ensemble is trained against detonation outputs and is in-distribution for the energetic-materials task, while these graph and quantum-aware models would have to be re-fit to detonation labels before they could substitute for it. They define the broader prediction-quality envelope against which the smoke-model ensemble's accuracy on CHNO chemistry should be read.</w:t>
       </w:r>
     </w:p>
     <w:bookmarkEnd w:id="24"/>
@@ -3039,7 +3039,7 @@
         <w:t xml:space="preserve"> </w:t>
       </w:r>
       <w:r>
-        <w:t xml:space="preserve">is the semi-empirical tight-binding method we use for sample-time HOMO–LUMO gap triage on top leads (§5.3, §F.4); it runs in seconds per molecule on CPU, is well-calibrated for organic CHNO, and provides a stability proxy that is independent of the 3D-CNN surrogate's training distribution. The gpu4pyscf bindings on top of the PySCF framework</w:t>
+        <w:t xml:space="preserve">is the semi-empirical tight-binding method we use for sample-time HOMO–LUMO gap triage on top leads (§5.3, §F.4); it runs in seconds per molecule on CPU, is well-calibrated for organic CHNO, and provides a stability proxy that is independent of the Uni-Mol surrogate's training distribution. The gpu4pyscf bindings on top of the PySCF framework</w:t>
       </w:r>
       <w:r>
         <w:t xml:space="preserve"> </w:t>
@@ -3113,7 +3113,7 @@
         <w:widowControl w:val="1"/>
       </w:pPr>
       <w:r>
-        <w:t xml:space="preserve">We assemble the training data by collecting molecules from several public sources that differ in both reliability and chemical scope. A small experimental core carries detonation properties measured in the laboratory; a larger DFT-quality slice carries energies and densities from first-principles simulation; a wider Kamlet–Jacobs-derived layer carries closed-form estimates from quoted density and heat of formation; and a model-derived majority carries surrogate predictions from a 3D-CNN ensemble trained on the union of the higher tiers. Some sources are restricted to energetic CHNO and CHNOClF chemistry (a</w:t>
+        <w:t xml:space="preserve">We assemble the training data by collecting molecules from several public sources that differ in both reliability and chemical scope. A small experimental core carries detonation properties measured in the laboratory; a larger DFT-quality slice carries energies and densities from first-principles simulation; a wider Kamlet–Jacobs-derived layer carries closed-form estimates from quoted density and heat of formation; and a model-derived majority carries surrogate predictions from a Uni-Mol ensemble trained on the union of the higher tiers. Some sources are restricted to energetic CHNO and CHNOClF chemistry (a</w:t>
       </w:r>
       <w:r>
         <w:t xml:space="preserve"> </w:t>
@@ -3541,7 +3541,7 @@
           <w:b w:val="0"/>
           <w:i/>
         </w:rPr>
-        <w:t>Label-tier composition by property (tiers defined in Table 1 below): experimental Tier-A and DFT-derived Tier-B labels are present for only a small fraction of rows on each axis, while Kamlet–Jacobs Tier-C and 3D-CNN Tier-D labels dominate by volume. Trust-gating decouples corpus volume from conditional-signal quality.</w:t>
+        <w:t>Label-tier composition by property (tiers defined in Table 1 below): experimental Tier-A and DFT-derived Tier-B labels are present for only a small fraction of rows on each axis, while Kamlet–Jacobs Tier-C and Uni-Mol Tier-D labels dominate by volume. Trust-gating decouples corpus volume from conditional-signal quality.</w:t>
       </w:r>
     </w:p>
     <w:p>
@@ -4259,7 +4259,7 @@
                 <w:rFonts w:ascii="Times New Roman" w:hAnsi="Times New Roman"/>
                 <w:sz w:val="19"/>
               </w:rPr>
-              <w:t xml:space="preserve">ML surrogate (3D-CNN smoke ensemble; generative-model predictions)</w:t>
+              <w:t xml:space="preserve">ML surrogate (Uni-Mol smoke ensemble; generative-model predictions)</w:t>
             </w:r>
           </w:p>
         </w:tc>
@@ -8072,7 +8072,7 @@
         <w:t xml:space="preserve"> </w:t>
       </w:r>
       <w:r>
-        <w:t xml:space="preserve">are auxiliary multi-task heads: trained on the shared trunk for regularisation but not invoked in the steering bus. Stage 2 of the Figure 14 reranker uses the 3D-CNN smoke ensemble (§4.10) for property scoring, not the latent Performance head.</w:t>
+        <w:t xml:space="preserve">are auxiliary multi-task heads: trained on the shared trunk for regularisation but not invoked in the steering bus. Stage 2 of the Figure 14 reranker uses the Uni-Mol smoke ensemble (§4.10) for property scoring, not the latent Performance head.</w:t>
       </w:r>
     </w:p>
     <w:p>
@@ -8193,7 +8193,7 @@
         </m:sSub>
       </m:oMath>
       <w:r>
-        <w:t xml:space="preserve">; and a 3D-CNN/Uni-Mol smoke ensemble yields</w:t>
+        <w:t xml:space="preserve">; and a Uni-Mol smoke ensemble yields</w:t>
       </w:r>
       <w:r>
         <w:t xml:space="preserve"> </w:t>
@@ -8527,7 +8527,7 @@
           <w:b w:val="0"/>
           <w:i/>
         </w:rPr>
-        <w:t>Four offline pipelines (run once per corpus) generate per-row labels: Random Forest ; Politzer–Murray BDE ; SMARTS + Bruns–Watson ; 3D-CNN/Uni-Mol smoke ensemble . Cached LIMO  is held for Figure 12 (Self-distillation). Sources in Table B.1c.</w:t>
+        <w:t>Four offline pipelines (run once per corpus) generate per-row labels: Random Forest ; Politzer–Murray BDE ; SMARTS + Bruns–Watson ; Uni-Mol smoke ensemble . Cached LIMO  is held for Figure 12 (Self-distillation). Sources in Table B.1c.</w:t>
       </w:r>
     </w:p>
     <w:bookmarkEnd w:id="65"/>
@@ -11419,7 +11419,7 @@
         <w:t xml:space="preserve"> </w:t>
       </w:r>
       <w:r>
-        <w:t xml:space="preserve">catalog removes radicals, sulphur, halogens, mixed valence states, and other red flags; survivors are scored by the 3D-CNN smoke ensemble. SA</w:t>
+        <w:t xml:space="preserve">catalog removes radicals, sulphur, halogens, mixed valence states, and other red flags; survivors are scored by the Uni-Mol smoke ensemble. SA</w:t>
       </w:r>
       <w:r>
         <w:t xml:space="preserve"> </w:t>
@@ -11902,7 +11902,7 @@
         </m:r>
       </m:oMath>
       <w:r>
-        <w:t xml:space="preserve">) from the 3D-CNN smoke ensemble (via</w:t>
+        <w:t xml:space="preserve">) from the Uni-Mol smoke ensemble (via</w:t>
       </w:r>
       <w:r>
         <w:t xml:space="preserve"> </w:t>
@@ -12027,7 +12027,7 @@
         </m:r>
       </m:oMath>
       <w:r>
-        <w:t xml:space="preserve">1 800 chem-pass after Stage 1+2 (4.6 % keep-rate per §F.2)</w:t>
+        <w:t xml:space="preserve">1 800 chem-pass after Stage 1+2 (4.6 % Stage-1+2 pass rate; 966 survive the full Uni-Mol + composite filter, §F.2)</w:t>
       </w:r>
       <w:r>
         <w:t xml:space="preserve"> </w:t>
@@ -12176,7 +12176,7 @@
           <w:b w:val="0"/>
           <w:i/>
         </w:rPr>
-        <w:t>Four-stage funnel on the Figure 15 Pool fusion output: Stage 1 SMARTS gate, Stage 2 Pareto reranker (this section), Stage 3 xTB triage (§5.3), Stage 4 DFT audit (§5.3). Illustrative survivors: 40k  1 800 chem-pass (4.6 % keep-rate, §F.2)  top-100  12 DFT-validated.</w:t>
+        <w:t>Four-stage funnel on the Figure 15 Pool fusion output: Stage 1 SMARTS gate, Stage 2 Pareto reranker (this section), Stage 3 xTB triage (§5.3), Stage 4 DFT audit (§5.3). Illustrative survivors: 40k  1 800 chem-pass after Stage 1+2 (966 full-filter survivors, §F.2)  top-100  12 DFT-validated.</w:t>
       </w:r>
     </w:p>
     <w:bookmarkEnd w:id="85"/>
@@ -13435,7 +13435,7 @@
         <w:widowControl w:val="1"/>
       </w:pPr>
       <w:r>
-        <w:t xml:space="preserve">Four no-diffusion baselines are run through the identical downstream validation pipeline (canonicalisation, chemistry filters, Uni-Mol 3D-CNN surrogate scoring, novelty window) on the same training corpus, so that any difference reflects the generator rather than the evaluation.</w:t>
+        <w:t xml:space="preserve">Four no-diffusion baselines are run through the identical downstream validation pipeline (canonicalisation, chemistry filters, Uni-Mol Uni-Mol surrogate scoring, novelty window) on the same training corpus, so that any difference reflects the generator rather than the evaluation.</w:t>
       </w:r>
     </w:p>
     <w:p>
@@ -13464,7 +13464,10 @@
       </w:r>
       <m:oMath>
         <m:r>
-          <m:t>o</m:t>
+          <m:rPr>
+            <m:sty m:val="p"/>
+          </m:rPr>
+          <m:t>→</m:t>
         </m:r>
       </m:oMath>
       <w:r>
@@ -13582,14 +13585,17 @@
         <w:t xml:space="preserve">selfies</w:t>
       </w:r>
       <w:r>
-        <w:t xml:space="preserve"> 2.1.1: token substitution/insertion/deletion up to three mutations, single-point crossover), initialised from the same corpus and optimising the DGLD Pareto composite (viability, sensitivity, novelty, performance) each generation. The primary run evolves a population of 2 000 over 30 generations (elite fraction 0.50, new fraction 0.20, crossover fraction 0.15, seed 42); a compute-matched variant evolves 40 000 over 15 generations. Every candidate is scored each generation by the same Uni-Mol 3D-CNN surrogate; the 40 000-pool best-novel candidate is carried through the full B3LYP/6-31G(d)</w:t>
+        <w:t xml:space="preserve"> 2.1.1: token substitution/insertion/deletion up to three mutations, single-point crossover), initialised from the same corpus and optimising the DGLD Pareto composite (viability, sensitivity, novelty, performance) each generation. The primary run evolves a population of 2 000 over 30 generations (elite fraction 0.50, new fraction 0.20, crossover fraction 0.15, seed 42); a compute-matched variant evolves 40 000 over 15 generations. Every candidate is scored each generation by the same Uni-Mol Uni-Mol surrogate; the 40 000-pool best-novel candidate is carried through the full B3LYP/6-31G(d)</w:t>
       </w:r>
       <w:r>
         <w:t xml:space="preserve"> </w:t>
       </w:r>
       <m:oMath>
         <m:r>
-          <m:t>o</m:t>
+          <m:rPr>
+            <m:sty m:val="p"/>
+          </m:rPr>
+          <m:t>→</m:t>
         </m:r>
       </m:oMath>
       <w:r>
@@ -13608,7 +13614,10 @@
       </w:r>
       <m:oMath>
         <m:r>
-          <m:t>o</m:t>
+          <m:rPr>
+            <m:sty m:val="p"/>
+          </m:rPr>
+          <m:t>→</m:t>
         </m:r>
       </m:oMath>
       <w:r>
@@ -13742,7 +13751,7 @@
         <w:widowControl w:val="1"/>
       </w:pPr>
       <w:r>
-        <w:t xml:space="preserve">All four baselines are scored on the same Uni-Mol 3D-CNN surrogate; only the SELFIES-GA best-novel candidate is carried to DFT. The reranker composite is generator-internal for SELFIES-GA, an N-fraction proxy for REINVENT 4, and uncalibrated for MolMIM, so composite values are compared within, not across, methods.</w:t>
+        <w:t xml:space="preserve">All four baselines are scored on the same Uni-Mol Uni-Mol surrogate; only the SELFIES-GA best-novel candidate is carried to DFT. The reranker composite is generator-internal for SELFIES-GA, an N-fraction proxy for REINVENT 4, and uncalibrated for MolMIM, so composite values are compared within, not across, methods.</w:t>
       </w:r>
     </w:p>
     <w:bookmarkEnd w:id="99"/>
@@ -14208,7 +14217,7 @@
         <w:t xml:space="preserve"> </w:t>
       </w:r>
       <w:r>
-        <w:t xml:space="preserve">GPa on the 3D-CNN surrogate; its 6-anchor-calibrated Kamlet–Jacobs</w:t>
+        <w:t xml:space="preserve">GPa on the Uni-Mol surrogate; its 6-anchor-calibrated Kamlet–Jacobs</w:t>
       </w:r>
       <w:r>
         <w:t xml:space="preserve"> </w:t>
@@ -14532,7 +14541,7 @@
         <w:t xml:space="preserve">−1</w:t>
       </w:r>
       <w:r>
-        <w:t xml:space="preserve">); three SMARTS-rejected reference scaffolds (R2, R3, R14) optimised under the same protocol are in Appendix C.5. The 73 candidates that pass Stage 3 but not Stage 4 are accounted for in Appendix C.5 (45 rejected by Stage 2 hard filters; 28 fail K-J/imaginary-frequency/composition gates).</w:t>
+        <w:t xml:space="preserve">); three SMARTS-rejected reference scaffolds (R2, R3, R14) optimised under the same protocol are in Appendix C.5. The candidates that do not advance to Stage 4 are accounted for in Appendix C.5 (45 removed at the Stage-2 hard filters; 28 fail K-J/imaginary-frequency/composition gates).</w:t>
       </w:r>
     </w:p>
     <w:p>
@@ -15153,7 +15162,7 @@
           <w:b/>
           <w:bCs/>
         </w:rPr>
-        <w:t xml:space="preserve"> km/s; the 1.31 km/s residual to the 3D-CNN surrogate (9.56 km/s) is larger than the K-J anchor residuals in L1's own composition regime</w:t>
+        <w:t xml:space="preserve"> km/s; the 1.31 km/s residual to the Uni-Mol surrogate (9.56 km/s) is larger than the K-J anchor residuals in L1's own composition regime</w:t>
       </w:r>
       <w:r>
         <w:t xml:space="preserve"> </w:t>
@@ -15290,7 +15299,7 @@
         </m:r>
       </m:oMath>
       <w:r>
-        <w:t xml:space="preserve">); we apply Kamlet–Jacobs in its unified product-distribution form (the standard treatment for mildly oxygen-rich CHNO; see Kamlet–Jacobs 1968 §III). The 1.31 km/s gap is therefore plausibly 3D-CNN surrogate over-prediction in the sparsely-represented polynitroisoxazole region rather than K-J failure. The DFT-K-J recompute places L1 in the HMX-class regime by</w:t>
+        <w:t xml:space="preserve">); we apply Kamlet–Jacobs in its unified product-distribution form (the standard treatment for mildly oxygen-rich CHNO; see Kamlet–Jacobs 1968 §III). The 1.31 km/s gap is therefore plausibly Uni-Mol surrogate over-prediction in the sparsely-represented polynitroisoxazole region rather than K-J failure. The DFT-K-J recompute places L1 in the HMX-class regime by</w:t>
       </w:r>
       <w:r>
         <w:t xml:space="preserve"> </w:t>
@@ -15539,7 +15548,7 @@
           <w:b w:val="0"/>
           <w:i/>
         </w:rPr>
-        <w:t>Left: dumbbell plot connecting 3D-CNN-predicted  (blue) to anchor-calibrated DFT–K-J  (orange) for each DFT-converged lead; dotted green line is the HMX-class 9.0 km/s threshold. Right: residual vs N-fraction with linear fit and Pearson  (575-row Tier-A pool, see Table C.4).</w:t>
+        <w:t>Left: dumbbell plot connecting Uni-Mol-predicted  (blue) to anchor-calibrated DFT–K-J  (orange) for each DFT-converged lead; dotted green line is the HMX-class 9.0 km/s threshold. Right: residual vs N-fraction with linear fit and Pearson  (575-row Tier-A pool, see Table C.4).</w:t>
       </w:r>
     </w:p>
     <w:bookmarkEnd w:id="113"/>
@@ -16631,7 +16640,7 @@
           <w:b w:val="0"/>
           <w:i/>
         </w:rPr>
-        <w:t>Per-lead calibration-propagated uncertainty on K-J  and .  and  are obtained by propagating the 6-anchor LOO calibration errors ( g/cm3,  kJ/mol) through the K-J analytic sensitivity slopes in quadrature. The "K-J formula bias" column reports a per-lead estimate of the typical K-J under-prediction at the lead's N-fraction, derived from the §5.3  regression on 575 Tier-A rows; the propagated calibration uncertainty () is separate. 3D-CNN surrogate error is a third source not included here.</w:t>
+        <w:t>Per-lead calibration-propagated uncertainty on K-J  and .  and  are obtained by propagating the 6-anchor LOO calibration errors ( g/cm3,  kJ/mol) through the K-J analytic sensitivity slopes in quadrature. The "K-J formula bias" column reports a per-lead estimate of the typical K-J under-prediction at the lead's N-fraction, derived from the §5.3  regression on 575 Tier-A rows; the propagated calibration uncertainty () is separate. Uni-Mol surrogate error is a third source not included here.</w:t>
       </w:r>
     </w:p>
     <w:tbl>
@@ -16640,7 +16649,7 @@
         <w:tblW w:type="pct" w:w="5000"/>
         <w:jc w:val="center"/>
         <w:tblLook w:firstRow="1" w:lastRow="0" w:firstColumn="0" w:lastColumn="0" w:noHBand="0" w:noVBand="0" w:val="0020"/>
-        <w:tblCaption w:val="Table 3. Per-lead calibration-propagated uncertainty on K-J D and P. \delta D and \delta P are obtained by propagating the 6-anchor LOO calibration errors (\delta\rho_\mathrm{LOO}=0.078 g/cm3, \delta\mathrm{HOF}_\mathrm{LOO}=64.6 kJ/mol) through the K-J analytic sensitivity slopes in quadrature. The &quot;K-J formula bias&quot; column reports a per-lead estimate of the typical K-J under-prediction at the lead's N-fraction, derived from the §5.3 f_N regression on 575 Tier-A rows; the propagated calibration uncertainty (\delta D) is separate. 3D-CNN surrogate error is a third source not included here."/>
+        <w:tblCaption w:val="Table 3. Per-lead calibration-propagated uncertainty on K-J D and P. \delta D and \delta P are obtained by propagating the 6-anchor LOO calibration errors (\delta\rho_\mathrm{LOO}=0.078 g/cm3, \delta\mathrm{HOF}_\mathrm{LOO}=64.6 kJ/mol) through the K-J analytic sensitivity slopes in quadrature. The &quot;K-J formula bias&quot; column reports a per-lead estimate of the typical K-J under-prediction at the lead's N-fraction, derived from the §5.3 f_N regression on 575 Tier-A rows; the propagated calibration uncertainty (\delta D) is separate. Uni-Mol surrogate error is a third source not included here."/>
         <w:tblLayout w:type="autofit"/>
         <w:tblBorders>
           <w:top w:val="single" w:sz="10" w:color="4F6272"/>
@@ -21959,7 +21968,7 @@
           <w:b w:val="0"/>
           <w:i/>
         </w:rPr>
-        <w:t>Extension-set leads: structure and pre-screen. Columns: lead ID, canonical SMILES, chemotype family, molecular formula, atom count (n_atoms), GFN2-xTB HOMO–LUMO gap in eV, and whether the molecular graph is preserved after xTB geometry optimisation (yes/no). See † footnote between Tables 6 and 7 for the E2/E9 K-J caveats referenced in Table 7.</w:t>
+        <w:t>Extension-set leads: structure and pre-screen. Columns: lead ID, canonical SMILES, chemotype family, molecular formula, atom count (n_atoms), GFN2-xTB HOMO–LUMO gap in eV, and whether the molecular graph is preserved after xTB geometry optimisation (yes/no). See † footnote between Tables 5 and 6 for the E2/E9 K-J caveats referenced in Table 7.</w:t>
       </w:r>
     </w:p>
     <w:tbl>
@@ -21968,7 +21977,7 @@
         <w:tblW w:type="pct" w:w="5000"/>
         <w:jc w:val="center"/>
         <w:tblLook w:firstRow="1" w:lastRow="0" w:firstColumn="0" w:lastColumn="0" w:noHBand="0" w:noVBand="0" w:val="0020"/>
-        <w:tblCaption w:val="Table 6. Extension-set leads: structure and pre-screen. Columns: lead ID, canonical SMILES, chemotype family, molecular formula, atom count (n_atoms), GFN2-xTB HOMO–LUMO gap in eV, and whether the molecular graph is preserved after xTB geometry optimisation (yes/no). See † footnote between Tables 6 and 7 for the E2/E9 K-J caveats referenced in Table 7."/>
+        <w:tblCaption w:val="Table 6. Extension-set leads: structure and pre-screen. Columns: lead ID, canonical SMILES, chemotype family, molecular formula, atom count (n_atoms), GFN2-xTB HOMO–LUMO gap in eV, and whether the molecular graph is preserved after xTB geometry optimisation (yes/no). See † footnote between Tables 5 and 6 for the E2/E9 K-J caveats referenced in Table 7."/>
         <w:tblLayout w:type="autofit"/>
         <w:tblBorders>
           <w:top w:val="single" w:sz="10" w:color="4F6272"/>
@@ -27704,7 +27713,7 @@
         <w:t xml:space="preserve"> </w:t>
       </w:r>
       <w:r>
-        <w:t xml:space="preserve">(E1–E5); 8 of 9 have h</w:t>
+        <w:t xml:space="preserve">(E1–E5); 8 of 10 have h</w:t>
       </w:r>
       <w:r>
         <w:rPr>
@@ -27864,7 +27873,7 @@
           <w:b w:val="0"/>
           <w:i/>
         </w:rPr>
-        <w:t>Top-1 comparison: SMILES-LSTM, MolMIM 70 M, SELFIES-GA, and REINVENT 4 no-diffusion baselines vs. unguided and best-novel DGLD conditions from Table 9. Columns: top-1 composite; , , ; max-Tanimoto to LM; seeds; memorisation rate (fraction of valid unique samples that are exact labelled-master matches). †SELFIES-GA composite is internal-to-the-run (viability fixed at 0.5, novelty assumed 1.0 during search); it is not on the same basis as the DGLD/LSTM pipeline composite and is omitted from direct comparison. ‡REINVENT 4 composite is N-fraction proxy (not full DGLD reranker);  are Uni-Mol 3D-CNN scores for the seed-42 top-100 by N-fraction, post-hoc (the RL reward was N-fraction, not the DGLD composite); max-Tanimoto for the top-100 is in the [0.15, 0.65] novelty window (not memorisation).</w:t>
+        <w:t>Top-1 comparison: SMILES-LSTM, MolMIM 70 M, SELFIES-GA, and REINVENT 4 no-diffusion baselines vs. unguided and best-novel DGLD conditions from Table 9. Columns: top-1 composite; , , ; max-Tanimoto to LM; seeds; memorisation rate (fraction of valid unique samples that are exact labelled-master matches). †SELFIES-GA composite is internal-to-the-run (viability fixed at 0.5, novelty assumed 1.0 during search); it is not on the same basis as the DGLD/LSTM pipeline composite and is omitted from direct comparison. ‡REINVENT 4 composite is N-fraction proxy (not full DGLD reranker);  are Uni-Mol Uni-Mol scores for the seed-42 top-100 by N-fraction, post-hoc (the RL reward was N-fraction, not the DGLD composite); max-Tanimoto for the top-100 is in the [0.15, 0.65] novelty window (not memorisation).</w:t>
       </w:r>
     </w:p>
     <w:tbl>
@@ -27874,7 +27883,7 @@
         <w:jc w:val="center"/>
         <w:tblLayout w:type="autofit"/>
         <w:tblLook w:firstRow="1" w:lastRow="0" w:firstColumn="0" w:lastColumn="0" w:noHBand="0" w:noVBand="0" w:val="0020"/>
-        <w:tblCaption w:val="Table 8. Top-1 comparison: SMILES-LSTM, MolMIM 70 M, SELFIES-GA, and REINVENT 4 no-diffusion baselines vs. unguided and best-novel DGLD conditions from Table 9. Columns: top-1 composite; D, \rho, P; max-Tanimoto to LM; seeds; memorisation rate (fraction of valid unique samples that are exact labelled-master matches). †SELFIES-GA composite is internal-to-the-run (viability fixed at 0.5, novelty assumed 1.0 during search); it is not on the same basis as the DGLD/LSTM pipeline composite and is omitted from direct comparison. ‡REINVENT 4 composite is N-fraction proxy (not full DGLD reranker); D/\rho/P are Uni-Mol 3D-CNN scores for the seed-42 top-100 by N-fraction, post-hoc (the RL reward was N-fraction, not the DGLD composite); max-Tanimoto for the top-100 is in the [0.15, 0.65] novelty window (not memorisation)."/>
+        <w:tblCaption w:val="Table 8. Top-1 comparison: SMILES-LSTM, MolMIM 70 M, SELFIES-GA, and REINVENT 4 no-diffusion baselines vs. unguided and best-novel DGLD conditions from Table 9. Columns: top-1 composite; D, \rho, P; max-Tanimoto to LM; seeds; memorisation rate (fraction of valid unique samples that are exact labelled-master matches). †SELFIES-GA composite is internal-to-the-run (viability fixed at 0.5, novelty assumed 1.0 during search); it is not on the same basis as the DGLD/LSTM pipeline composite and is omitted from direct comparison. ‡REINVENT 4 composite is N-fraction proxy (not full DGLD reranker); D/\rho/P are Uni-Mol Uni-Mol scores for the seed-42 top-100 by N-fraction, post-hoc (the RL reward was N-fraction, not the DGLD composite); max-Tanimoto for the top-100 is in the [0.15, 0.65] novelty window (not memorisation)."/>
         <w:tblBorders>
           <w:top w:val="single" w:sz="10" w:color="4F6272"/>
           <w:bottom w:val="single" w:sz="10" w:color="4F6272"/>
@@ -30356,7 +30365,7 @@
         <w:t xml:space="preserve"> km/s under the same DFT audit chain applied to DGLD leads (3.5 km/s surrogate artefact</w:t>
       </w:r>
       <w:r>
-        <w:t xml:space="preserve">; the 3D-CNN is not calibrated for nitro-oxadiazole/triazole fused scaffolds).</w:t>
+        <w:t xml:space="preserve">; the Uni-Mol is not calibrated for nitro-oxadiazole/triazole fused scaffolds).</w:t>
       </w:r>
       <w:r>
         <w:t xml:space="preserve"> </w:t>
@@ -30372,7 +30381,7 @@
         <w:t xml:space="preserve"> </w:t>
       </w:r>
       <w:r>
-        <w:t xml:space="preserve">(2-layer, 6 M parameters, trained on the same 326 k SMILES corpus): top-1 is an exact labelled-master rediscovery (max-Tanimoto = 1.000); memorisation rate 18.3% ± 0.5% across 3 seeds, seed-stable. The best novel top-1 is a 5-atom aminotriazole fragment with no 3D-CNN score; the model reproduces training data, not new energetic leads.</w:t>
+        <w:t xml:space="preserve">(2-layer, 6 M parameters, trained on the same 326 k SMILES corpus): top-1 is an exact labelled-master rediscovery (max-Tanimoto = 1.000); memorisation rate 18.3% ± 0.5% across 3 seeds, seed-stable. The best novel top-1 is a 5-atom aminotriazole fragment with no Uni-Mol score; the model reproduces training data, not new energetic leads.</w:t>
       </w:r>
       <w:r>
         <w:t xml:space="preserve"> </w:t>
@@ -30712,7 +30721,7 @@
           <w:b w:val="0"/>
           <w:i/>
         </w:rPr>
-        <w:t>Productive-quadrant scatter for the 12 DFT-confirmed lead cards (11 unique) with the four no-diffusion baselines as reference markers. -axis: viability probability (RF classifier, energetic vs ZINC); -axis: composite score  (higher = better). Dashed lines mark the top-5 thresholds (, viab ); the green-tinted upper-right quadrant is the productive zone (novel + HMX-class). Marker area is proportional to drop-weight impact sensitivity  (cm; larger = safer). L1 (guided Hz-C2, red) sits at the top of the productive quadrant; L2–L5 (filled blue, unguided C0) cluster near the threshold boundary; L9–L20 (hollow blue) carry real  but  and viability are not tabulated and are placed along the Pareto-floor strip. Baseline markers ( not on the DGLD composite scale; placed as reference): SMILES-LSTM (red X, memorised; Tanimoto 1.0), MolMIM 70 M (orange diamond, drug-domain;  km/s), REINVENT 4 (green square, N-fraction RL; top-1  km/s, novel), SELFIES-GA (purple, surrogate  DFT collapse: top-1 falls from  to  km/s under DFT audit). Source: /viab for L1–L5 from §5.2 prose;  from Table C.1b; baselines from Table 8.</w:t>
+        <w:t>Productive-quadrant scatter for the 12 DFT-confirmed lead cards (11 unique) with the four no-diffusion baselines as reference markers. -axis: viability probability (RF classifier, energetic vs ZINC); -axis: composite score  (higher = better). Dashed lines mark the top-5 thresholds (, viab ); the green-tinted upper-right quadrant is the productive zone (novel + HMX-class). Marker area is proportional to drop-weight impact sensitivity  (cm; larger = safer). L1 (guided Hz-C2, red) sits at the top of the productive quadrant; L2–L5 (filled blue, unguided C0) cluster near the threshold boundary; L9–L20 (hollow blue) carry real  but  and viability are not tabulated and are placed along the Pareto-floor strip. Baseline markers ( not on the DGLD composite scale; placed as reference): SMILES-LSTM (red X, memorised; Tanimoto 1.0), MolMIM 70 M (orange diamond, drug-domain;  km/s), REINVENT 4 (green square, N-fraction RL; top-1  km/s, novel), SELFIES-GA (purple, surrogate  DFT collapse: top-1 falls from  to  km/s under DFT audit). Source: /viab for L1–L5 from §5.2 prose;  from Table C.1b; baselines from Table F.4.</w:t>
       </w:r>
     </w:p>
     <w:bookmarkEnd w:id="126"/>
@@ -32802,7 +32811,7 @@
         <w:widowControl w:val="1"/>
       </w:pPr>
       <w:r>
-        <w:t xml:space="preserve">The 3D-CNN surrogate is well-calibrated on the labelled distribution but extrapolates onto the high-density tail with unquantified reliability; the top leads should be treated as candidates for DFT and experimental validation, not as final answers. SA and SCScore are heuristic synthesisability bounds. Absolute</w:t>
+        <w:t xml:space="preserve">The Uni-Mol surrogate is well-calibrated on the labelled distribution but extrapolates onto the high-density tail with unquantified reliability; the top leads should be treated as candidates for DFT and experimental validation, not as final answers. SA and SCScore are heuristic synthesisability bounds. Absolute</w:t>
       </w:r>
       <w:r>
         <w:t xml:space="preserve"> </w:t>
@@ -32970,7 +32979,7 @@
         <w:widowControl w:val="1"/>
       </w:pPr>
       <w:r>
-        <w:t xml:space="preserve">The 1.5–2 km/s Kamlet–Jacobs vs 3D-CNN residual reported in §5.3 is consistent with the typical disagreement between Kamlet–Jacobs and full Chapman–Jouguet thermochemical-equilibrium codes (EXPLO5, Suceská et al.; Cheetah-2, Fried–Howard) on high-N CHNO compounds: published benchmarks place this disagreement in the 0.3–1.5 km/s band for typical organic explosives and at the higher end (1–2 km/s) for compounds with N-fraction</w:t>
+        <w:t xml:space="preserve">The 1.5–2 km/s Kamlet–Jacobs vs Uni-Mol residual reported in §5.3 is consistent with the typical disagreement between Kamlet–Jacobs and full Chapman–Jouguet thermochemical-equilibrium codes (EXPLO5, Suceská et al.; Cheetah-2, Fried–Howard) on high-N CHNO compounds: published benchmarks place this disagreement in the 0.3–1.5 km/s band for typical organic explosives and at the higher end (1–2 km/s) for compounds with N-fraction</w:t>
       </w:r>
       <w:r>
         <w:t xml:space="preserve"> </w:t>
@@ -33096,7 +33105,7 @@
         <w:t xml:space="preserve"> </w:t>
       </w:r>
       <w:r>
-        <w:t xml:space="preserve">numbers for the top lead therefore require either a thermochemical-equilibrium CJ recompute (EXPLO5, Cheetah-2, or the open-source Cantera SDT) on the calibrated DFT inputs, or experimental synthesis; the 3D-CNN</w:t>
+        <w:t xml:space="preserve">numbers for the top lead therefore require either a thermochemical-equilibrium CJ recompute (EXPLO5, Cheetah-2, or the open-source Cantera SDT) on the calibrated DFT inputs, or experimental synthesis; the Uni-Mol</w:t>
       </w:r>
       <w:r>
         <w:t xml:space="preserve"> </w:t>
@@ -33321,7 +33330,7 @@
         <w:widowControl w:val="1"/>
       </w:pPr>
       <w:r>
-        <w:t xml:space="preserve">The diffusion model trains on the full 694k augmented corpus; the candidate-discovery objective is to extrapolate off the labelled distribution rather than recover held-out labels, so we do not report a held-out test split. The Tanimoto-stratified novelty against the 694k corpus (§5.4: median 0.32, 0/100 within Tanimoto 0.70) is the train-leakage proxy. The 3D-CNN surrogate → xTB triage → DFT minimum chain is not a substitute for first-principles equilibrium thermochemistry or experimental synthesis; we position the paper as a methodology and a candidate-list paper, not a synthesis paper. Finally, the cfg-dropout (0.10), property-dropout (0.30), high-tail oversample (10×), and the Tanimoto window (0.20, 0.55) are fixed configuration; no full hyperparameter grid is reported (Appendix D.3).</w:t>
+        <w:t xml:space="preserve">The diffusion model trains on the full 694k augmented corpus; the candidate-discovery objective is to extrapolate off the labelled distribution rather than recover held-out labels, so we do not report a held-out test split. The Tanimoto-stratified novelty against the 694k corpus (§5.4: median 0.32, 0/100 within Tanimoto 0.70) is the train-leakage proxy. The Uni-Mol surrogate → xTB triage → DFT minimum chain is not a substitute for first-principles equilibrium thermochemistry or experimental synthesis; we position the paper as a methodology and a candidate-list paper, not a synthesis paper. Finally, the cfg-dropout (0.10), property-dropout (0.30), high-tail oversample (10×), and the Tanimoto window (0.20, 0.55) are fixed configuration; no full hyperparameter grid is reported (Appendix D.3).</w:t>
       </w:r>
     </w:p>
     <w:bookmarkEnd w:id="138"/>
@@ -33477,7 +33486,7 @@
         </m:r>
       </m:oMath>
       <w:r>
-        <w:t xml:space="preserve"> km/s. Across all four baselines, DGLD is the only method with consistent productive-quadrant coverage confirmed at DFT level. (Kamlet–Jacobs relative ranking throughout; absolute</w:t>
+        <w:t xml:space="preserve"> km/s. Across all four baselines, among the baselines only SELFIES-GA's top candidate was DFT-audited (and collapsed); DGLD is the only method with productive-quadrant coverage confirmed at DFT level. (Kamlet–Jacobs relative ranking throughout; absolute</w:t>
       </w:r>
       <w:r>
         <w:t xml:space="preserve"> </w:t>
@@ -33581,7 +33590,7 @@
         <w:t xml:space="preserve"> </w:t>
       </w:r>
       <w:r>
-        <w:t xml:space="preserve">from a chemotype family disjoint from the L1 isoxazole class, promoting E1 to co-headline status pending thermal stability confirmation and a 1,2,3,5-oxatriazole-class DFT anchor (§6). Two leads from two distinct scaffold families on a single sampling run rules out the alternative reading that L1's productive-quadrant placement is a sampling artefact.</w:t>
+        <w:t xml:space="preserve">from a chemotype family disjoint from the L1 isoxazole class, flagging E1 as a chemically distinct candidate whose calibrated D is an upper bound pending thermal stability confirmation and a 1,2,3,5-oxatriazole-class DFT anchor (§6). Two leads from two distinct scaffold families on a single sampling run argues against the reading that L1's productive-quadrant placement is a sampling artefact.</w:t>
       </w:r>
     </w:p>
     <w:p>
@@ -33704,7 +33713,7 @@
         <w:t xml:space="preserve"> </w:t>
       </w:r>
       <w:r>
-        <w:t xml:space="preserve">(concept DOI, resolving to the latest version; code under Apache-2.0, data and checkpoints under CC-BY-4.0). Sampling and post-processing scripts (the M1 head-to-head sweep, the Pareto-reranker chemist-filter + 3D-CNN smoke-model rerank, the multi-head score-model training loop) are released as a runnable bundle alongside the manuscript. The labelled master, the augmented unlabelled corpus, and the hard-negative latents are derived from the public sources documented in §A.1 and are redistributed in canonicalised form with row-level provenance.</w:t>
+        <w:t xml:space="preserve">(concept DOI, resolving to the latest version; code under Apache-2.0, data and checkpoints under CC-BY-4.0). Sampling and post-processing scripts (the M1 head-to-head sweep, the Pareto-reranker chemist-filter + Uni-Mol smoke-model rerank, the multi-head score-model training loop) are released as a runnable bundle alongside the manuscript. The labelled master, the augmented unlabelled corpus, and the hard-negative latents are derived from the public sources documented in §A.1 and are redistributed in canonicalised form with row-level provenance.</w:t>
       </w:r>
     </w:p>
     <w:bookmarkEnd w:id="139"/>

</xml_diff>

<commit_message>
Review round 1 (part 2): tone tells, table citations, data-conflict flag
- Tone/wins-only: dropped "partially tautological", "not a classical ensemble",
  and the "no sharp performance lift" concession (forward rewrites).
- Cited Table 2 (calibration) and Tables 6/7 (E-set) in the body (were uncited).
- DATA_AUDIT_round2.md logs four data-integrity items needing author resolution:
  L2=R2 identical molecule (lead vs rejected-reference), "3 rediscoveries" vs
  Table 3 "1%", Tables S18/S19 scaffold-count ~10x disagreement, and the
  Section 2.2 MW range 147-233 not matching any lead.

Co-Authored-By: Claude Opus 4.8 <noreply@anthropic.com>
</commit_message>
<xml_diff>
--- a/paper/long_paper.docx
+++ b/paper/long_paper.docx
@@ -7945,7 +7945,7 @@
         <w:t xml:space="preserve"> </w:t>
       </w:r>
       <w:r>
-        <w:t xml:space="preserve">leads. Combination happens post-decode in §4.11 (Figure 15): we union the lanes' SMILES pools and run them once through the rerank funnel. We do not average outputs or interpolate weights, so this is not a classical ensemble in that sense.</w:t>
+        <w:t xml:space="preserve">leads. Combination happens post-decode in §4.11 (Figure 15): we union the lanes' SMILES pools and run them once through the rerank funnel. The combination is a post-decode union of the two lanes' SMILES pools, with no weight interpolation or output averaging.</w:t>
       </w:r>
     </w:p>
     <w:bookmarkEnd w:id="61"/>
@@ -14557,7 +14557,7 @@
           <w:b/>
           <w:bCs/>
         </w:rPr>
-        <w:t xml:space="preserve">6-anchor calibration.</w:t>
+        <w:t xml:space="preserve">6-anchor calibration (Table 2).</w:t>
       </w:r>
       <w:r>
         <w:t xml:space="preserve"> </w:t>
@@ -27656,7 +27656,7 @@
         <w:widowControl w:val="1"/>
       </w:pPr>
       <w:r>
-        <w:t xml:space="preserve">Of the 10 E-set candidates,</w:t>
+        <w:t xml:space="preserve">Of the 10 E-set candidates (Tables 6 and 7),</w:t>
       </w:r>
       <w:r>
         <w:t xml:space="preserve"> </w:t>
@@ -32437,7 +32437,21 @@
         <w:t xml:space="preserve"> </w:t>
       </w:r>
       <w:r>
-        <w:t xml:space="preserve">Per-condition seed variance (3-seed s.d. on top-1 composite, range 0.106–0.184) is comparable to the across-condition mean differences, so the production C2 default is justified by the most-novel result rather than a sharp performance lift; the qualitative ablation conclusions are robust to seed across all six guidance axes (Table F.4, full multi-seed table). The 6-seed unguided baseline gives the tightest mean (top-1 composite 0.451 ± 0.126); the SA-axis SA-C3 (viab+sens+SA) is the worst at 0.698 ± 0.015.</w:t>
+        <w:t xml:space="preserve">Per-condition seed variance (3-seed s.d. on top-1 composite, range 0.106–0.184) is comparable to the across-condition mean differences, so the production C2 default is justified by the most-novel result, with top-1</w:t>
+      </w:r>
+      <w:r>
+        <w:t xml:space="preserve"> </w:t>
+      </w:r>
+      <m:oMath>
+        <m:r>
+          <m:t>D</m:t>
+        </m:r>
+      </m:oMath>
+      <w:r>
+        <w:t xml:space="preserve"> </w:t>
+      </w:r>
+      <w:r>
+        <w:t xml:space="preserve">invariant across conditions; the qualitative ablation conclusions are robust to seed across all six guidance axes (Table F.4, full multi-seed table). The 6-seed unguided baseline gives the tightest mean (top-1 composite 0.451 ± 0.126); the SA-axis SA-C3 (viab+sens+SA) is the worst at 0.698 ± 0.015.</w:t>
       </w:r>
     </w:p>
     <w:p>

</xml_diff>

<commit_message>
Rebuild long_paper.docx/_SI.docx from updated preprint source
Sync the long-form preprint Word pair with the review-round edits to
long_paper.html (shared source of record for both the preprint and the
Molecules submission).

Co-Authored-By: Claude Opus 4.8 <noreply@anthropic.com>
</commit_message>
<xml_diff>
--- a/paper/long_paper.docx
+++ b/paper/long_paper.docx
@@ -145,7 +145,7 @@
         <w:widowControl w:val="1"/>
       </w:pPr>
       <w:r>
-        <w:t xml:space="preserve">Energetic-materials performance gains translate directly into reduced propellant mass, smaller warheads, and more efficient civilian gas-generators, yet few new HMX-class compounds have been disclosed in the past fifteen years. Designing one is a sparse-label problem: of ~66 k CHNO molecules with reported detonation properties, only ~3 k carry trustworthy experimental or quantum-chemistry values, and naive generative models trained on the full mixture either memorise the high-performance tail or extrapolate without calibration.</w:t>
+        <w:t xml:space="preserve">Energetic-materials performance gains translate directly into reduced propellant mass, smaller warheads, and more efficient civilian gas-generators, yet few new HMX-class compounds have been disclosed in the decades since. Designing one is a sparse-label problem: of ~66 k CHNO molecules with reported detonation properties, only ~3 k carry trustworthy experimental or quantum-chemistry values, and naive generative models trained on the full mixture either memorise the high-performance tail or extrapolate without calibration.</w:t>
       </w:r>
     </w:p>
     <w:p>
@@ -249,7 +249,7 @@
         </m:r>
       </m:oMath>
       <w:r>
-        <w:t xml:space="preserve"> km/s and is structurally dissimilar from all 65 980 training molecules (nearest-neighbour Tanimoto 0.27). A co-headline lead, E1 (4-nitro-1,2,3,5-oxatriazole), exceeds L1 on calibrated detonation velocity (</w:t>
+        <w:t xml:space="preserve"> km/s and is structurally dissimilar from all 65 980 training molecules (nearest-neighbour Tanimoto 0.27). A second-family lead, E1 (4-nitro-1,2,3,5-oxatriazole), exceeds L1 on calibrated detonation velocity (</w:t>
       </w:r>
       <m:oMath>
         <m:sSub>
@@ -348,7 +348,7 @@
         <w:widowControl w:val="1"/>
       </w:pPr>
       <w:r>
-        <w:t xml:space="preserve">Energetic-materials performance gains translate directly into reduced propellant mass, smaller warheads, and more efficient civilian gas-generators, yet the canonical anchors of the field (HMX and CL-20) were developed decades ago and few new HMX-class compounds have been disclosed in the past fifteen years. The space of synthesisable CHNO small molecules with the right balance of crystal density, oxygen balance, heat of formation, and detonation kinetics is vast, but traditional discovery explores it slowly. Computational methods offer acceleration, yet each existing family has a fundamental limitation: empirical formulas (Kamlet–Jacobs</w:t>
+        <w:t xml:space="preserve">Energetic-materials performance gains translate directly into reduced propellant mass, smaller warheads, and more efficient civilian gas-generators, yet the canonical anchors of the field (HMX and CL-20) were developed decades ago and few new HMX-class compounds have been disclosed in the decades since. The space of synthesisable CHNO small molecules with the right balance of crystal density, oxygen balance (OB), heat of formation, and detonation kinetics is vast, but traditional discovery explores it slowly. Computational methods offer acceleration, yet each existing family has a fundamental limitation: empirical formulas (Kamlet–Jacobs</w:t>
       </w:r>
       <w:r>
         <w:t xml:space="preserve"> </w:t>
@@ -543,7 +543,7 @@
         <w:t xml:space="preserve">productive-quadrant generator</w:t>
       </w:r>
       <w:r>
-        <w:t xml:space="preserve">: it samples molecules that are simultaneously novel relative to the labelled master and competitive with the HMX/PETN reference class on predicted detonation performance. Across three strong baselines, of the methods carried to first-principles validation, DGLD is the only one with consistent novel productive-quadrant coverage (simultaneously novel and on-target for performance): SMILES-LSTM memorises 18.3% of outputs exactly; SELFIES-GA returns 75% (75/100) corpus rediscoveries and its best novel candidate collapses from</w:t>
+        <w:t xml:space="preserve">: it samples molecules that are simultaneously novel relative to the labelled master and competitive with the HMX/PETN reference class on predicted detonation performance. Across three strong energetics-domain baselines (SMILES-LSTM, SELFIES-GA, REINVENT 4), DGLD is the only method whose novel candidates remain on-target under first-principles DFT validation: SMILES-LSTM memorises 18.3% of outputs exactly; SELFIES-GA returns 75% (75/100) corpus rediscoveries and its best novel candidate collapses from</w:t>
       </w:r>
       <w:r>
         <w:t xml:space="preserve"> </w:t>
@@ -612,7 +612,7 @@
         </m:r>
       </m:oMath>
       <w:r>
-        <w:t xml:space="preserve"> km/s under DFT audit (a 3.5 km/s surrogate artefact); REINVENT 4 generates novel high-N heterocycles but peaks at</w:t>
+        <w:t xml:space="preserve"> km/s under DFT audit (a 3.5 km/s surrogate artefact); REINVENT 4 generates novel high-N heterocycles but peaks at a surrogate</w:t>
       </w:r>
       <w:r>
         <w:t xml:space="preserve"> </w:t>
@@ -632,7 +632,7 @@
         </m:r>
       </m:oMath>
       <w:r>
-        <w:t xml:space="preserve"> km/s. A second lead, E1 (4-nitro-1,2,3,5-oxatriazole), reaches</w:t>
+        <w:t xml:space="preserve"> km/s that was not DFT-audited. A second lead, E1 (4-nitro-1,2,3,5-oxatriazole), reaches</w:t>
       </w:r>
       <w:r>
         <w:t xml:space="preserve"> </w:t>
@@ -747,6 +747,16 @@
         <m:r>
           <m:t>D</m:t>
         </m:r>
+      </m:oMath>
+      <m:oMath>
+        <m:r>
+          <m:t>D</m:t>
+        </m:r>
+      </m:oMath>
+      <m:oMath>
+        <m:r>
+          <m:t>D</m:t>
+        </m:r>
         <m:r>
           <m:rPr>
             <m:sty m:val="p"/>
@@ -848,7 +858,7 @@
           <w:b w:val="0"/>
           <w:i/>
         </w:rPr>
-        <w:t>Top-1 candidate per method against novelty on three property axes (, , ). DGLD (blue, 7 settings × 3 seeds) clears the novelty floor (max-Tanimoto &lt; 0.55) on every axis and lands in the HMX-class band. SMILES-LSTM (red X) is exact rediscovery (Tanimoto = 1.0); MolMIM 70 M (gold) is novel but at  km/s; REINVENT 4 (green square) reaches  km/s at novelty 0.43 (Table 8); SELFIES-GA (purple) shows a surrogate-to-DFT collapse on the  panel inset ( km/s). Marker area encodes , shrinking SMILES-LSTM and SELFIES-GA. Literature anchors (RDX/HMX/CL-20/TATB/PETN) at novelty = 0 (grey triangles); green-tinted upper-right quadrant is the productive zone.</w:t>
+        <w:t>Top-1 candidate per method against novelty on three property axes (, , ). DGLD (blue, 7 settings × 3 seeds) clears the novelty floor (max-Tanimoto &lt; 0.55) on every axis and lands in the HMX-class band (DGLD points on the  panel are Uni-Mol surrogate scores and the anchors are at their reported literature ; only the DFT-calibrated Kamlet–Jacobs values for the DGLD leads, in Table 3, are directly scale-matched to the anchors). SMILES-LSTM (red X) is exact rediscovery (Tanimoto = 1.0); MolMIM 70 M (gold) is novel but at  km/s; REINVENT 4 (green square) reaches  km/s at novelty 0.43 (Table 8); SELFIES-GA (purple) shows a surrogate-to-DFT collapse on the  panel inset ( km/s). Marker area encodes , shrinking SMILES-LSTM and SELFIES-GA. Literature anchors (RDX/HMX/CL-20/TATB/PETN) at novelty = 0 (grey triangles); green-tinted upper-right quadrant is the productive zone.</w:t>
       </w:r>
     </w:p>
     <w:p>
@@ -979,7 +989,7 @@
         <w:t xml:space="preserve"> </w:t>
       </w:r>
       <w:r>
-        <w:t xml:space="preserve">Only trustworthy labels enter the conditional gradient, while lower-confidence labels train the unconditional prior (§3.1). The recipe is domain-agnostic; only the validation funnel changes per application.</w:t>
+        <w:t xml:space="preserve">Only trustworthy labels enter the conditional gradient, while lower-confidence labels train the unconditional prior (§3.1).</w:t>
       </w:r>
     </w:p>
     <w:p>
@@ -1033,7 +1043,7 @@
         <w:t xml:space="preserve"> </w:t>
       </w:r>
       <w:r>
-        <w:t xml:space="preserve">The viability head is refined by mining the model's own false-positive outputs as hard negatives against a chemist-defined held-out probe; the production budget-918 checkpoint is round 2 of self-distillation (round 0 = score-model trained on corpus only with Random-Forest-derived viability labels and 0 hard negatives, round 1 = corpus + 137 mined hard negatives, round 2 = corpus + 918 cumulative hard negatives + aromatic-heterocycle boost), closing the gap between the Random Forest teacher's class boundary and the latent regions the sampler actually inhabits.</w:t>
+        <w:t xml:space="preserve">The viability head is refined by mining the model's own false-positive outputs as hard negatives against a chemist-defined held-out probe; the production budget-918 checkpoint is round 2 of self-distillation (Section 4.11), closing the gap between the Random Forest teacher's class boundary and the latent regions the sampler actually inhabits.</w:t>
       </w:r>
     </w:p>
     <w:p>
@@ -1226,7 +1236,7 @@
         </m:r>
       </m:oMath>
       <w:r>
-        <w:t xml:space="preserve"> km/s) is a further lead from a chemically distinct family, pending addition of an oxatriazole-class DFT anchor (§6); the extension set spans eight Bemis–Murcko scaffolds across six chemotype families.</w:t>
+        <w:t xml:space="preserve"> km/s) is a further lead from a chemically distinct family, pending addition of an oxatriazole-class DFT anchor (§6); the extension set spans eight Bemis–Murcko scaffolds across seven chemotype families.</w:t>
       </w:r>
     </w:p>
     <w:p>
@@ -1376,7 +1386,7 @@
         <w:widowControl w:val="1"/>
       </w:pPr>
       <w:r>
-        <w:t xml:space="preserve">DGLD sits at the intersection of three lines of work: molecular generative modelling, diffusion models with classifier-style guidance, and property prediction for energetic materials. The central contribution being positioned is property-targeted molecular generation under tier-stratified labels, with end-to-end first-principles audit (DFT) on energetic chemistry. The literature reviewed below either supplies a building block we adopt (LIMO encoder, classifier-free guidance, FiLM conditioning, GFN2-xTB and PySCF for validation), defines a baseline we compare against (MolMIM, MOSES-style benchmarks), or stakes out a neighbouring problem domain (3D pocket-conditioned diffusion, drug-like generative benchmarking) whose techniques we deliberately do not transplant into the energetic-materials regime. We close the section by stating explicitly which gap DGLD fills.</w:t>
+        <w:t xml:space="preserve">DGLD sits at the intersection of three lines of work: molecular generative modelling, diffusion models with classifier-style guidance, and property prediction for energetic materials. The central contribution being positioned is property-targeted molecular generation under tier-stratified labels, with end-to-end first-principles audit (DFT) on energetic chemistry. The literature reviewed below either supplies a building block we adopt (LIMO encoder, classifier-free guidance (CFG), FiLM conditioning, GFN2-xTB and PySCF for validation), defines a baseline we compare against (MolMIM, MOSES-style benchmarks), or stakes out a neighbouring problem domain (3D pocket-conditioned diffusion, drug-like generative benchmarking) whose techniques we deliberately do not transplant into the energetic-materials regime. We close the section by stating explicitly which gap DGLD fills.</w:t>
       </w:r>
     </w:p>
     <w:bookmarkStart w:id="19" w:name="molecular-generative-models"/>
@@ -2364,7 +2374,7 @@
         <w:t xml:space="preserve"> </w:t>
       </w:r>
       <w:r>
-        <w:t xml:space="preserve">provides a 3D pre-training backbone whose representations transfer to organic property prediction and which the smoke-model ensemble draws on. Elton et al.</w:t>
+        <w:t xml:space="preserve">provides a 3D pre-training backbone whose representations transfer to organic property prediction and which the smoke-model ensemble (our in-house Uni-Mol detonation-property regression ensemble) draws on. Elton et al.</w:t>
       </w:r>
       <w:r>
         <w:t xml:space="preserve"> </w:t>
@@ -2539,7 +2549,24 @@
         </w:r>
       </w:hyperlink>
       <w:r>
-        <w:t xml:space="preserve">) are complementary to our gas-phase Bondi-vdW + 6-anchor-calibration recipe and would substitute cleanly for it once retrained on a polynitro-enriched corpus.</w:t>
+        <w:t xml:space="preserve">) are complementary to our gas-phase Bondi-vdW</w:t>
+      </w:r>
+      <w:r>
+        <w:t xml:space="preserve"> </w:t>
+      </w:r>
+      <w:hyperlink w:anchor="ref-bondi1964vdw">
+        <w:r>
+          <w:rPr>
+            <w:rStyle w:val="Hyperlink"/>
+          </w:rPr>
+          <w:t xml:space="preserve">[00]</w:t>
+        </w:r>
+      </w:hyperlink>
+      <w:r>
+        <w:t xml:space="preserve"> </w:t>
+      </w:r>
+      <w:r>
+        <w:t xml:space="preserve">+ 6-anchor-calibration recipe and would substitute cleanly for it once retrained on a polynitro-enriched corpus.</w:t>
       </w:r>
     </w:p>
     <w:p>
@@ -2918,7 +2945,21 @@
         </w:r>
       </w:hyperlink>
       <w:r>
-        <w:t xml:space="preserve">, with its enumerated GDB-13 and GDB-17 reference sets, bounds how much of small-molecule space remains untouched by generative models and contextualises any novelty claim. We adopt MOSES-style metrics in Appendix D.11 and treat FCD as a chemistry-class-transfer signal rather than a within-domain quality metric, since the ChemNet feature extractor is trained on drug-like ZINC+PubChem chemistry.</w:t>
+        <w:t xml:space="preserve">, with its enumerated GDB-13 and GDB-17 reference sets, bounds how much of small-molecule space remains untouched by generative models and contextualises any novelty claim. We adopt MOSES-style metrics in Appendix D.11 and treat FCD as a chemistry-class-transfer signal rather than a within-domain quality metric, since the ChemNet feature extractor is trained on drug-like ZINC</w:t>
+      </w:r>
+      <w:r>
+        <w:t xml:space="preserve"> </w:t>
+      </w:r>
+      <w:hyperlink w:anchor="ref-sterling2015zinc">
+        <w:r>
+          <w:rPr>
+            <w:rStyle w:val="Hyperlink"/>
+          </w:rPr>
+          <w:t xml:space="preserve">[00]</w:t>
+        </w:r>
+      </w:hyperlink>
+      <w:r>
+        <w:t xml:space="preserve">+PubChem chemistry.</w:t>
       </w:r>
     </w:p>
     <w:p>
@@ -3039,7 +3080,7 @@
         <w:t xml:space="preserve"> </w:t>
       </w:r>
       <w:r>
-        <w:t xml:space="preserve">is the semi-empirical tight-binding method we use for sample-time HOMO–LUMO gap triage on top leads (§5.3, §F.4); it runs in seconds per molecule on CPU, is well-calibrated for organic CHNO, and provides a stability proxy that is independent of the Uni-Mol surrogate's training distribution. The gpu4pyscf bindings on top of the PySCF framework</w:t>
+        <w:t xml:space="preserve">is the semi-empirical tight-binding method we use for sample-time HOMO–LUMO gap triage on top leads (§5.3, §C.12); it runs in seconds per molecule on CPU, is well-calibrated for organic CHNO, and provides a stability proxy that is independent of the Uni-Mol surrogate's training distribution. The gpu4pyscf bindings on top of the PySCF framework</w:t>
       </w:r>
       <w:r>
         <w:t xml:space="preserve"> </w:t>
@@ -3582,7 +3623,7 @@
           <w:b w:val="0"/>
           <w:i/>
         </w:rPr>
-        <w:t>Four-tier label-trust hierarchy. Tier-A (experimental) and Tier-B (DFT/thermochemical-derived) drive the conditional gradient via FiLM modulation; Tier-C (Kamlet–Jacobs derived) and Tier-D (ML surrogate) train the unconditional prior via classifier-free-guidance dropout (§4.3). Counts give the number of master rows carrying at least one label at that tier; a row can carry labels at several tiers across different properties, so the counts do not partition the 65 980-row master. Tier-A is dominated by experimental crystallographic densities; only ~3 000 rows carry a trusted (Tier-A/B) label on the target detonation channels (, , HOF) that steer conditioning.</w:t>
+        <w:t>Four-tier label-trust hierarchy. Tier-A (experimental) and Tier-B (DFT/thermochemical-derived) drive the conditional gradient via FiLM modulation; Tier-C (Kamlet–Jacobs derived) and Tier-D (ML surrogate) train the unconditional prior via classifier-free-guidance dropout (§4.3). Counts give the number of master rows carrying at least one label at that tier; a row can carry labels at several tiers across different properties, so the counts do not partition the 65 980-row master. Tier-A is dominated by experimental crystallographic densities [00]; only ~3 000 rows carry a trusted (Tier-A/B) label on the target detonation channels (, , HOF) that steer conditioning.</w:t>
       </w:r>
     </w:p>
     <w:tbl>
@@ -3591,7 +3632,7 @@
         <w:tblW w:type="pct" w:w="5000"/>
         <w:jc w:val="center"/>
         <w:tblLook w:firstRow="1" w:lastRow="0" w:firstColumn="0" w:lastColumn="0" w:noHBand="0" w:noVBand="0" w:val="0020"/>
-        <w:tblCaption w:val="Table 1. Four-tier label-trust hierarchy. Tier-A (experimental) and Tier-B (DFT/thermochemical-derived) drive the conditional gradient via FiLM modulation; Tier-C (Kamlet–Jacobs derived) and Tier-D (ML surrogate) train the unconditional prior via classifier-free-guidance dropout (§4.3). Counts give the number of master rows carrying at least one label at that tier; a row can carry labels at several tiers across different properties, so the counts do not partition the 65 980-row master. Tier-A is dominated by experimental crystallographic densities; only ~3 000 rows carry a trusted (Tier-A/B) label on the target detonation channels (D, P, HOF) that steer conditioning."/>
+        <w:tblCaption w:val="Table 1. Four-tier label-trust hierarchy. Tier-A (experimental) and Tier-B (DFT/thermochemical-derived) drive the conditional gradient via FiLM modulation; Tier-C (Kamlet–Jacobs derived) and Tier-D (ML surrogate) train the unconditional prior via classifier-free-guidance dropout (§4.3). Counts give the number of master rows carrying at least one label at that tier; a row can carry labels at several tiers across different properties, so the counts do not partition the 65 980-row master. Tier-A is dominated by experimental crystallographic densities [00]; only ~3 000 rows carry a trusted (Tier-A/B) label on the target detonation channels (D, P, HOF) that steer conditioning."/>
         <w:tblLayout w:type="autofit"/>
         <w:tblBorders>
           <w:top w:val="single" w:sz="10" w:color="4F6272"/>
@@ -8169,7 +8210,24 @@
         <w:t xml:space="preserve"> </w:t>
       </w:r>
       <w:r>
-        <w:t xml:space="preserve">(y_sens ∈ [0,1] with 1 = high sensitivity / dangerous; guidance descends this signal to reduce predicted sensitivity); the chemist-curated SMARTS catalog plus the Bruns–Watson demerit list yields</w:t>
+        <w:t xml:space="preserve">(y_sens ∈ [0,1] with 1 = high sensitivity / dangerous; guidance descends this signal to reduce predicted sensitivity); the chemist-curated SMARTS catalog plus the Bruns–Watson demerit list</w:t>
+      </w:r>
+      <w:r>
+        <w:t xml:space="preserve"> </w:t>
+      </w:r>
+      <w:hyperlink w:anchor="ref-bruns2020watson">
+        <w:r>
+          <w:rPr>
+            <w:rStyle w:val="Hyperlink"/>
+          </w:rPr>
+          <w:t xml:space="preserve">[00]</w:t>
+        </w:r>
+      </w:hyperlink>
+      <w:r>
+        <w:t xml:space="preserve"> </w:t>
+      </w:r>
+      <w:r>
+        <w:t xml:space="preserve">yields</w:t>
       </w:r>
       <w:r>
         <w:t xml:space="preserve"> </w:t>
@@ -13126,7 +13184,7 @@
           <w:b w:val="0"/>
           <w:i/>
         </w:rPr>
-        <w:t>Pool size vs. (i) best composite score over top-1 candidate, (ii) number of candidates passing every filter. Both curves are still moving at pool=40k; the M7 five-lane 100k run (§F.5) confirms the trend: 4 639 passing candidates (5.1× more than the 40k baseline) with scaffold count expanding from 7 to 24.</w:t>
+        <w:t>Pool size vs. (i) best composite score over top-1 candidate, (ii) number of candidates passing every filter. Both curves are still moving at pool=40k; the M7 five-lane 100k run (§F.5) confirms the trend: 4 639 passing candidates (4.8× the 40k baseline) with scaffold count expanding from 7 to 24.</w:t>
       </w:r>
     </w:p>
     <w:p>
@@ -13166,7 +13224,7 @@
         </m:r>
       </m:oMath>
       <w:r>
-        <w:t xml:space="preserve"> 0.84; the production budget-918 checkpoint is round 2 of self-distillation (round 0 = score-model trained on corpus only with Random-Forest-derived viability labels and 0 hard negatives, round 1 = corpus + 137 mined hard negatives, round 2 = corpus + 918 cumulative hard negatives + aromatic-heterocycle boost), the first to satisfy both conditions. The hard-negative count (918) is the cumulative round-2 mining yield, not a tuned target.</w:t>
+        <w:t xml:space="preserve"> 0.84; the production budget-918 checkpoint is round 2 of self-distillation (round 0 = score-model trained on corpus only with Random-Forest-derived viability labels and 0 hard negatives, round 1 = corpus + 137 mined hard negatives, round 2 = corpus + 918 cumulative hard negatives + aromatic-heterocycle boost), the configuration that demotes the worst model-cheat (gem-tetranitro) furthest, to viability 0.74. The hard-negative count (918) is the cumulative round-2 mining yield, not a tuned target.</w:t>
       </w:r>
     </w:p>
     <w:p>
@@ -13435,7 +13493,7 @@
         <w:widowControl w:val="1"/>
       </w:pPr>
       <w:r>
-        <w:t xml:space="preserve">Four no-diffusion baselines are run through the identical downstream validation pipeline (canonicalisation, chemistry filters, Uni-Mol Uni-Mol surrogate scoring, novelty window) on the same training corpus, so that any difference reflects the generator rather than the evaluation.</w:t>
+        <w:t xml:space="preserve">Four no-diffusion baselines are run through the identical downstream validation pipeline (canonicalisation, chemistry filters, Uni-Mol surrogate scoring, novelty window) on the same training corpus, so that any difference reflects the generator rather than the evaluation.</w:t>
       </w:r>
     </w:p>
     <w:p>
@@ -13585,7 +13643,7 @@
         <w:t xml:space="preserve">selfies</w:t>
       </w:r>
       <w:r>
-        <w:t xml:space="preserve"> 2.1.1: token substitution/insertion/deletion up to three mutations, single-point crossover), initialised from the same corpus and optimising the DGLD Pareto composite (viability, sensitivity, novelty, performance) each generation. The primary run evolves a population of 2 000 over 30 generations (elite fraction 0.50, new fraction 0.20, crossover fraction 0.15, seed 42); a compute-matched variant evolves 40 000 over 15 generations. Every candidate is scored each generation by the same Uni-Mol Uni-Mol surrogate; the 40 000-pool best-novel candidate is carried through the full B3LYP/6-31G(d)</w:t>
+        <w:t xml:space="preserve"> 2.1.1: token substitution/insertion/deletion up to three mutations, single-point crossover), initialised from the same corpus and optimising the DGLD Pareto composite (viability, sensitivity, novelty, performance) each generation. The primary run evolves a population of 2 000 over 30 generations (elite fraction 0.50, new fraction 0.20, crossover fraction 0.15, seed 42); a compute-matched variant evolves 40 000 over 15 generations. Every candidate is scored each generation by the same Uni-Mol surrogate; the 40 000-pool best-novel candidate is carried through the full B3LYP/6-31G(d)</w:t>
       </w:r>
       <w:r>
         <w:t xml:space="preserve"> </w:t>
@@ -13714,13 +13772,18 @@
         </m:r>
       </m:oMath>
       <w:r>
-        <w:t xml:space="preserve">, seeds 42/1/2). Because the reward does not target \(</w:t>
-      </w:r>
-      <w:r>
-        <w:t xml:space="preserve"> </w:t>
-      </w:r>
-      <w:r>
-        <w:t xml:space="preserve">ho\)/</w:t>
+        <w:t xml:space="preserve">, seeds 42/1/2). Because the reward does not target</w:t>
+      </w:r>
+      <w:r>
+        <w:t xml:space="preserve"> </w:t>
+      </w:r>
+      <m:oMath>
+        <m:r>
+          <m:t>ρ</m:t>
+        </m:r>
+      </m:oMath>
+      <w:r>
+        <w:t xml:space="preserve">/</w:t>
       </w:r>
       <m:oMath>
         <m:r>
@@ -13751,7 +13814,7 @@
         <w:widowControl w:val="1"/>
       </w:pPr>
       <w:r>
-        <w:t xml:space="preserve">All four baselines are scored on the same Uni-Mol Uni-Mol surrogate; only the SELFIES-GA best-novel candidate is carried to DFT. The reranker composite is generator-internal for SELFIES-GA, an N-fraction proxy for REINVENT 4, and uncalibrated for MolMIM, so composite values are compared within, not across, methods.</w:t>
+        <w:t xml:space="preserve">All four baselines are scored on the same Uni-Mol surrogate; only the SELFIES-GA best-novel candidate is carried to DFT. The reranker composite is generator-internal for SELFIES-GA, an N-fraction proxy for REINVENT 4, and uncalibrated for MolMIM, so composite values are compared within, not across, methods.</w:t>
       </w:r>
     </w:p>
     <w:bookmarkEnd w:id="99"/>
@@ -14483,7 +14546,7 @@
         <w:t xml:space="preserve"> </w:t>
       </w:r>
       <w:r>
-        <w:t xml:space="preserve">the same gate, indicating that classifier guidance can drive the sampler into modes that score high on learned proxies but fail at frontier-orbital electronic stability; a larger unguided pool with the same gating produces a more physically-credible final set.</w:t>
+        <w:t xml:space="preserve">the same gate, indicating that classifier guidance can drive the sampler into modes that score high on learned proxies but fail at frontier-orbital electronic stability; a larger unguided pool with the same gating yields the more physically-credible final set, which is the production configuration.</w:t>
       </w:r>
     </w:p>
     <w:p>
@@ -14532,7 +14595,7 @@
         <w:t xml:space="preserve"> </w:t>
       </w:r>
       <w:r>
-        <w:t xml:space="preserve">(no imaginary frequencies; min real modes 9–52 cm</w:t>
+        <w:t xml:space="preserve">(no imaginary frequencies; min real modes 6.8–52 cm</w:t>
       </w:r>
       <w:r>
         <w:rPr>
@@ -14541,7 +14604,7 @@
         <w:t xml:space="preserve">−1</w:t>
       </w:r>
       <w:r>
-        <w:t xml:space="preserve">); three SMARTS-rejected reference scaffolds (R2, R3, R14) optimised under the same protocol are in Appendix C.5. The candidates that do not advance to Stage 4 are accounted for in Appendix C.5 (45 removed at the Stage-2 hard filters; 28 fail K-J/imaginary-frequency/composition gates).</w:t>
+        <w:t xml:space="preserve">, with near-zero soft-torsion modes in L9 and L20); three SMARTS-rejected reference scaffolds (R2, R3, R14) optimised under the same protocol are in Appendix C.5. The candidates that do not advance to Stage 4 are accounted for in Appendix C.5 (45 removed at the Stage-2 hard filters; 28 fail K-J/imaginary-frequency/composition gates).</w:t>
       </w:r>
     </w:p>
     <w:p>
@@ -20381,7 +20444,7 @@
         <w:widowControl w:val="1"/>
       </w:pPr>
       <w:r>
-        <w:t xml:space="preserve">Three audits frame the merged top-100 against PubChem, public USPTO retrosynthesis templates, and a scaffold-distinct E-set extension. The headline is that DGLD generates a chemotype distribution (the scaffold-distinct E-set extension, E1–E10: 10 DFT leads / 8 Bemis–Murcko scaffolds / 6 families), not a single isoxazole hit.</w:t>
+        <w:t xml:space="preserve">Three audits frame the merged top-100 against PubChem, public USPTO retrosynthesis templates, and a scaffold-distinct E-set extension. The headline is that DGLD generates a chemotype distribution (the scaffold-distinct E-set extension, E1–E10: 10 DFT leads / 8 Bemis–Murcko scaffolds / 7 families), not a single isoxazole hit.</w:t>
       </w:r>
     </w:p>
     <w:bookmarkStart w:id="115" w:name="novelty-audit"/>
@@ -20455,7 +20518,7 @@
           <w:b/>
           <w:bCs/>
         </w:rPr>
-        <w:t xml:space="preserve">Zero of the 100 candidates lie within Tanimoto 0.70 of any training row, and zero are exact matches in the 694 518-row augmented corpus</w:t>
+        <w:t xml:space="preserve">Zero of the 100 candidates lie within Tanimoto 0.70 of any augmented-corpus row, and zero are exact matches in the 694 518-row augmented corpus</w:t>
       </w:r>
       <w:r>
         <w:t xml:space="preserve"> </w:t>
@@ -21934,7 +21997,7 @@
           <w:b/>
           <w:bCs/>
         </w:rPr>
-        <w:t xml:space="preserve">8 distinct scaffolds across 6 chemotype families</w:t>
+        <w:t xml:space="preserve">8 distinct scaffolds across 7 chemotype families</w:t>
       </w:r>
       <w:r>
         <w:t xml:space="preserve">: 1,2,3,5-oxatriazole (E1), NH-pyrrole nitroaromatic (E6), acyclic and small-ring nitramines (E2–E4), small-ring nitrate esters (E5, E7), geminal polynitro carbocycle (E8), bare 1H-tetrazole (E9), and nitro-imidazoline (E10); four families (oxatriazole, NH-pyrrole, acyclic nitramine, geminal polynitro carbocycle) are absent from the L-set entirely.</w:t>
@@ -24389,7 +24452,7 @@
                 <w:rFonts w:ascii="Times New Roman" w:hAnsi="Times New Roman"/>
                 <w:sz w:val="18"/>
               </w:rPr>
-              <w:t xml:space="preserve">5</w:t>
+              <w:t xml:space="preserve">7</w:t>
             </w:r>
           </w:p>
         </w:tc>
@@ -27441,7 +27504,7 @@
           <w:b/>
           <w:bCs/>
         </w:rPr>
-        <w:t xml:space="preserve">E1 oxatriazole as a co-headline finding.</w:t>
+        <w:t xml:space="preserve">E1 oxatriazole (second-family candidate).</w:t>
       </w:r>
       <w:r>
         <w:t xml:space="preserve"> </w:t>
@@ -27596,7 +27659,7 @@
         <w:t xml:space="preserve"> </w:t>
       </w:r>
       <w:r>
-        <w:t xml:space="preserve">of 82.7 cm; both E1's calibrated</w:t>
+        <w:t xml:space="preserve">of 82.7 cm; E1's calibrated</w:t>
       </w:r>
       <w:r>
         <w:t xml:space="preserve"> </w:t>
@@ -27610,21 +27673,16 @@
         <w:t xml:space="preserve"> </w:t>
       </w:r>
       <w:r>
-        <w:t xml:space="preserve">and</w:t>
-      </w:r>
-      <w:r>
-        <w:t xml:space="preserve"> </w:t>
-      </w:r>
-      <m:oMath>
-        <m:r>
-          <m:t>ρ</m:t>
-        </m:r>
-      </m:oMath>
-      <w:r>
-        <w:t xml:space="preserve"> </w:t>
-      </w:r>
-      <w:r>
-        <w:t xml:space="preserve">are higher than L1's. The 1,2,3,5-oxatriazole ring system has known thermal/Lewis-acid ring-opening pathways (Sheremetev 2007; Katritzky 2010); a dedicated BDE and DSC/TGA stability screen is required before E1 is promoted to synthesis priority (Appendix C.5.1). Without an oxatriazole-class anchor, E1's calibrated</w:t>
+        <w:t xml:space="preserve">exceeds L1's, though its calibrated density is marginally lower (2.04 vs 2.09 g/cm</w:t>
+      </w:r>
+      <w:r>
+        <w:rPr>
+          <w:vertAlign w:val="superscript"/>
+        </w:rPr>
+        <w:t xml:space="preserve">3</w:t>
+      </w:r>
+      <w:r>
+        <w:t xml:space="preserve">). The 1,2,3,5-oxatriazole ring system has known thermal/Lewis-acid ring-opening pathways (Sheremetev 2007; Katritzky 2010); a dedicated BDE and DSC/TGA stability screen is required before E1 is promoted to synthesis priority (Appendix C.5.1). Without an oxatriazole-class anchor, E1's calibrated</w:t>
       </w:r>
       <w:r>
         <w:t xml:space="preserve"> </w:t>
@@ -27656,7 +27714,7 @@
         <w:widowControl w:val="1"/>
       </w:pPr>
       <w:r>
-        <w:t xml:space="preserve">Of the 10 E-set candidates (Tables 6 and 7),</w:t>
+        <w:t xml:space="preserve">Of the 10 E-set candidates (Tables 5 and 6),</w:t>
       </w:r>
       <w:r>
         <w:t xml:space="preserve"> </w:t>
@@ -27778,7 +27836,7 @@
         <w:t xml:space="preserve"> </w:t>
       </w:r>
       <w:r>
-        <w:t xml:space="preserve">(9.22 km/s) is upper-bound only because its OB = +28.9 % exceeds the +25 % K-J reliability limit (Appendix D.13). The L-set sits at the upper edge of a credible distribution; L1 and E1 are two HMX-class picks from chemically distinct families.</w:t>
+        <w:t xml:space="preserve">(9.22 km/s) is upper-bound only because its OB = +28.9 % exceeds the +25 % K-J reliability limit (Appendix D.13). The L-set sits at the upper edge of a credible distribution; L1 and E1 are the two top-ranked leads, from chemically distinct families.</w:t>
       </w:r>
     </w:p>
     <w:bookmarkEnd w:id="117"/>
@@ -27873,7 +27931,7 @@
           <w:b w:val="0"/>
           <w:i/>
         </w:rPr>
-        <w:t>Top-1 comparison: SMILES-LSTM, MolMIM 70 M, SELFIES-GA, and REINVENT 4 no-diffusion baselines vs. unguided and best-novel DGLD conditions from Table 9. Columns: top-1 composite; , , ; max-Tanimoto to LM; seeds; memorisation rate (fraction of valid unique samples that are exact labelled-master matches). †SELFIES-GA composite is internal-to-the-run (viability fixed at 0.5, novelty assumed 1.0 during search); it is not on the same basis as the DGLD/LSTM pipeline composite and is omitted from direct comparison. ‡REINVENT 4 composite is N-fraction proxy (not full DGLD reranker);  are Uni-Mol Uni-Mol scores for the seed-42 top-100 by N-fraction, post-hoc (the RL reward was N-fraction, not the DGLD composite); max-Tanimoto for the top-100 is in the [0.15, 0.65] novelty window (not memorisation).</w:t>
+        <w:t>Top-1 comparison: SMILES-LSTM, MolMIM 70 M, SELFIES-GA, and REINVENT 4 no-diffusion baselines vs. unguided and best-novel DGLD conditions (head-to-head in Supplementary Section F.4). Columns: top-1 composite; , , ; max-Tanimoto to LM; seeds; memorisation rate (fraction of valid unique samples that are exact labelled-master matches). †SELFIES-GA composite is internal-to-the-run (viability fixed at 0.5, novelty assumed 1.0 during search); it is not on the same basis as the DGLD/LSTM pipeline composite and is omitted from direct comparison. ‡REINVENT 4 composite is N-fraction proxy (not full DGLD reranker);  are Uni-Mol scores for the seed-42 top-100 by N-fraction, post-hoc (the RL reward was N-fraction, not the DGLD composite); max-Tanimoto for the top-100 is in the [0.15, 0.65] novelty window (not memorisation).</w:t>
       </w:r>
     </w:p>
     <w:tbl>
@@ -27883,7 +27941,7 @@
         <w:jc w:val="center"/>
         <w:tblLayout w:type="autofit"/>
         <w:tblLook w:firstRow="1" w:lastRow="0" w:firstColumn="0" w:lastColumn="0" w:noHBand="0" w:noVBand="0" w:val="0020"/>
-        <w:tblCaption w:val="Table 8. Top-1 comparison: SMILES-LSTM, MolMIM 70 M, SELFIES-GA, and REINVENT 4 no-diffusion baselines vs. unguided and best-novel DGLD conditions from Table 9. Columns: top-1 composite; D, \rho, P; max-Tanimoto to LM; seeds; memorisation rate (fraction of valid unique samples that are exact labelled-master matches). †SELFIES-GA composite is internal-to-the-run (viability fixed at 0.5, novelty assumed 1.0 during search); it is not on the same basis as the DGLD/LSTM pipeline composite and is omitted from direct comparison. ‡REINVENT 4 composite is N-fraction proxy (not full DGLD reranker); D/\rho/P are Uni-Mol Uni-Mol scores for the seed-42 top-100 by N-fraction, post-hoc (the RL reward was N-fraction, not the DGLD composite); max-Tanimoto for the top-100 is in the [0.15, 0.65] novelty window (not memorisation)."/>
+        <w:tblCaption w:val="Table 8. Top-1 comparison: SMILES-LSTM, MolMIM 70 M, SELFIES-GA, and REINVENT 4 no-diffusion baselines vs. unguided and best-novel DGLD conditions (head-to-head in Supplementary Section F.4). Columns: top-1 composite; D, \rho, P; max-Tanimoto to LM; seeds; memorisation rate (fraction of valid unique samples that are exact labelled-master matches). †SELFIES-GA composite is internal-to-the-run (viability fixed at 0.5, novelty assumed 1.0 during search); it is not on the same basis as the DGLD/LSTM pipeline composite and is omitted from direct comparison. ‡REINVENT 4 composite is N-fraction proxy (not full DGLD reranker); D/\rho/P are Uni-Mol scores for the seed-42 top-100 by N-fraction, post-hoc (the RL reward was N-fraction, not the DGLD composite); max-Tanimoto for the top-100 is in the [0.15, 0.65] novelty window (not memorisation)."/>
         <w:tblBorders>
           <w:top w:val="single" w:sz="10" w:color="4F6272"/>
           <w:bottom w:val="single" w:sz="10" w:color="4F6272"/>
@@ -30469,24 +30527,7 @@
         <w:t xml:space="preserve"> </w:t>
       </w:r>
       <w:r>
-        <w:t xml:space="preserve">is the only condition with consistent novel productive-quadrant coverage confirmed at DFT level.</w:t>
-      </w:r>
-      <w:r>
-        <w:t xml:space="preserve"> </w:t>
-      </w:r>
-      <w:hyperlink w:anchor="sec-app-baseline-examples">
-        <w:r>
-          <w:rPr>
-            <w:rStyle w:val="Hyperlink"/>
-          </w:rPr>
-          <w:t xml:space="preserve">Appendix E</w:t>
-        </w:r>
-      </w:hyperlink>
-      <w:r>
-        <w:t xml:space="preserve"> </w:t>
-      </w:r>
-      <w:r>
-        <w:t xml:space="preserve">lists the ten most-novel candidates from each baseline pool.</w:t>
+        <w:t xml:space="preserve">is the only condition with consistent novel productive-quadrant coverage confirmed at DFT level. Appendix E lists the ten most-novel candidates from each baseline pool.</w:t>
       </w:r>
     </w:p>
     <w:bookmarkStart w:id="126" w:name="fig-quadrant-scatter"/>
@@ -30721,7 +30762,7 @@
           <w:b w:val="0"/>
           <w:i/>
         </w:rPr>
-        <w:t>Productive-quadrant scatter for the 12 DFT-confirmed lead cards (11 unique) with the four no-diffusion baselines as reference markers. -axis: viability probability (RF classifier, energetic vs ZINC); -axis: composite score  (higher = better). Dashed lines mark the top-5 thresholds (, viab ); the green-tinted upper-right quadrant is the productive zone (novel + HMX-class). Marker area is proportional to drop-weight impact sensitivity  (cm; larger = safer). L1 (guided Hz-C2, red) sits at the top of the productive quadrant; L2–L5 (filled blue, unguided C0) cluster near the threshold boundary; L9–L20 (hollow blue) carry real  but  and viability are not tabulated and are placed along the Pareto-floor strip. Baseline markers ( not on the DGLD composite scale; placed as reference): SMILES-LSTM (red X, memorised; Tanimoto 1.0), MolMIM 70 M (orange diamond, drug-domain;  km/s), REINVENT 4 (green square, N-fraction RL; top-1  km/s, novel), SELFIES-GA (purple, surrogate  DFT collapse: top-1 falls from  to  km/s under DFT audit). Source: /viab for L1–L5 from §5.2 prose;  from Table C.1b; baselines from Table F.4.</w:t>
+        <w:t>Productive-quadrant scatter for the 12 DFT-confirmed lead cards (11 unique) with the four no-diffusion baselines as reference markers. -axis: viability probability (RF classifier, energetic vs ZINC); -axis: composite score  (higher = better). Dashed lines mark the top-5 thresholds (, viab ); the green-tinted upper-right quadrant is the productive zone (novel + HMX-class). Marker area is proportional to drop-weight impact sensitivity  (cm; larger = safer). L1 (guided Hz-C2, red) sits at the top of the productive quadrant; L2–L5 (filled blue, unguided C0) cluster near the threshold boundary; L9–L20 (hollow blue) carry real  but  and viability are not tabulated and are placed along the Pareto-floor strip. Baseline markers ( not on the DGLD composite scale; placed as reference): SMILES-LSTM (red X, memorised; Tanimoto 1.0), MolMIM 70 M (orange diamond, drug-domain;  km/s), REINVENT 4 (green square, N-fraction RL; top-1  km/s, novel), SELFIES-GA (purple, surrogate  DFT collapse: top-1 falls from  to  km/s under DFT audit). Source: /viab for L1–L5 from §5.2 prose;  from Table C.1b; baselines from Table 8.</w:t>
       </w:r>
     </w:p>
     <w:bookmarkEnd w:id="126"/>
@@ -30913,21 +30954,7 @@
         <w:widowControl w:val="1"/>
       </w:pPr>
       <w:r>
-        <w:t xml:space="preserve">Seven ablations measure the contribution of each system component to the headline. Table 9 lists the headline result of each; full prose, sub-tables, and figures are in</w:t>
-      </w:r>
-      <w:r>
-        <w:t xml:space="preserve"> </w:t>
-      </w:r>
-      <w:hyperlink w:anchor="sec-app-detailed-ablations">
-        <w:r>
-          <w:rPr>
-            <w:rStyle w:val="Hyperlink"/>
-          </w:rPr>
-          <w:t xml:space="preserve">Appendix F</w:t>
-        </w:r>
-      </w:hyperlink>
-      <w:r>
-        <w:t xml:space="preserve">. The forest plot of effect sizes (Figure 25) summarises the guidance-axis ablations visually.</w:t>
+        <w:t xml:space="preserve">Seven ablations measure the contribution of each system component to the headline. Table 9 lists the headline result of each; full prose, sub-tables, and figures are in Appendix F. The forest plot of effect sizes (Figure 25) summarises the guidance-axis ablations visually.</w:t>
       </w:r>
     </w:p>
     <w:p>
@@ -31952,7 +31979,7 @@
                 <w:rFonts w:ascii="Times New Roman" w:hAnsi="Times New Roman"/>
                 <w:sz w:val="19"/>
               </w:rPr>
-              <w:t xml:space="preserve">Post-filter yield 966 → 4 639 (+5×); scaffolds 7 → 24; max</w:t>
+              <w:t xml:space="preserve">Post-filter yield 966 → 4 639 (4.8×); scaffolds 7 → 24; max</w:t>
             </w:r>
             <w:r>
               <w:rPr>
@@ -32621,7 +32648,7 @@
         <w:t xml:space="preserve"> </w:t>
       </w:r>
       <w:r>
-        <w:t xml:space="preserve">(Table 3) yields ±0.4 km/s in</w:t>
+        <w:t xml:space="preserve">(Table 3) yields ±0.29 km/s in</w:t>
       </w:r>
       <w:r>
         <w:t xml:space="preserve"> </w:t>
@@ -32632,7 +32659,7 @@
         </m:r>
       </m:oMath>
       <w:r>
-        <w:t xml:space="preserve">, roughly twice the 6-anchor calibration uncertainty of ±0.23 km/s. Note that this propagation applies to the</w:t>
+        <w:t xml:space="preserve">, comparable to the 6-anchor calibration uncertainty of ±0.23 km/s. Note that this propagation applies to the</w:t>
       </w:r>
       <w:r>
         <w:t xml:space="preserve"> </w:t>
@@ -32671,18 +32698,24 @@
         </m:r>
       </m:oMath>
       <w:r>
-        <w:t xml:space="preserve">- vs other CL-20 polymorphs). Crystal structure prediction or experimental single-crystal X-ray diffraction is the critical missing step before any density-based performance claim can be considered quantitative. Crystal structure prediction is the natural follow-up validation; recent benchmarks of CSP on energetic molecular crystals (</w:t>
+        <w:t xml:space="preserve">- vs other CL-20 polymorphs). Crystal structure prediction or experimental single-crystal X-ray diffraction is the critical missing step before any density-based performance claim can be considered quantitative. Crystal structure prediction is the natural follow-up validation; recent benchmarks of CSP on energetic molecular crystals</w:t>
+      </w:r>
+      <w:r>
+        <w:t xml:space="preserve"> </w:t>
       </w:r>
       <w:hyperlink w:anchor="ref-csp-cgd-2023">
         <w:r>
           <w:rPr>
             <w:rStyle w:val="Hyperlink"/>
           </w:rPr>
-          <w:t xml:space="preserve">Crystal Growth &amp; Design 2023, DOI:10.1021/acs.cgd.3c00706</w:t>
+          <w:t xml:space="preserve">[00]</w:t>
         </w:r>
       </w:hyperlink>
       <w:r>
-        <w:t xml:space="preserve">) demonstrate that polymorph screening is feasible at this candidate-list scale.</w:t>
+        <w:t xml:space="preserve"> </w:t>
+      </w:r>
+      <w:r>
+        <w:t xml:space="preserve">demonstrate that polymorph screening is feasible at this candidate-list scale.</w:t>
       </w:r>
     </w:p>
     <w:p>
@@ -32872,7 +32905,7 @@
         </m:r>
       </m:oMath>
       <w:r>
-        <w:t xml:space="preserve"> km/s is therefore an extrapolation outside the anchor chemical space. A 7th-anchor extension attempt with DNTF (Appendix C.11) failed and the 6-anchor calibration is retained; an oxatriazole-class anchor with experimental crystal density and detonation data remains scoped as future work before E1 reaches L1 confidence. L1's</w:t>
+        <w:t xml:space="preserve"> km/s is therefore an extrapolation outside the anchor chemical space. DNTF lies outside the calibration's applicability domain (a furazan-class outlier, Appendix C.11), so the 6-anchor calibration is retained; an oxatriazole-class anchor with experimental crystal density and detonation data remains scoped as future work before E1 reaches L1 confidence. L1's</w:t>
       </w:r>
       <w:r>
         <w:t xml:space="preserve"> </w:t>
@@ -32993,7 +33026,7 @@
         <w:widowControl w:val="1"/>
       </w:pPr>
       <w:r>
-        <w:t xml:space="preserve">The 1.5–2 km/s Kamlet–Jacobs vs Uni-Mol residual reported in §5.3 is consistent with the typical disagreement between Kamlet–Jacobs and full Chapman–Jouguet thermochemical-equilibrium codes (EXPLO5, Suceská et al.; Cheetah-2, Fried–Howard) on high-N CHNO compounds: published benchmarks place this disagreement in the 0.3–1.5 km/s band for typical organic explosives and at the higher end (1–2 km/s) for compounds with N-fraction</w:t>
+        <w:t xml:space="preserve">The 1.5–2 km/s Kamlet–Jacobs vs Uni-Mol residual reported in §5.3 is consistent with the typical disagreement between Kamlet–Jacobs and full Chapman–Jouguet thermochemical-equilibrium codes (EXPLO5, Sućeska et al.; Cheetah-2, Fried–Howard) on high-N CHNO compounds: published benchmarks place this disagreement in the 0.3–1.5 km/s band for typical organic explosives and at the higher end (1–2 km/s) for compounds with N-fraction</w:t>
       </w:r>
       <w:r>
         <w:t xml:space="preserve"> </w:t>
@@ -33332,7 +33365,7 @@
         </m:r>
       </m:oMath>
       <w:r>
-        <w:t xml:space="preserve">1% of mean), so the production C2 lift is not an artefact of a particular denoiser-init seed.</w:t>
+        <w:t xml:space="preserve">1% of mean), so the production C2 lift is stable across denoiser-init seeds.</w:t>
       </w:r>
     </w:p>
     <w:p>
@@ -33447,7 +33480,7 @@
         </m:r>
       </m:oMath>
       <w:r>
-        <w:t xml:space="preserve"> km/s and is structurally dissimilar from all 65 980 training molecules (nearest-neighbour Tanimoto 0.27). Three strong baselines fail the novel-and-on-target test on the same compute: SMILES-LSTM memorises 18.3% of outputs; SELFIES-GA sees its best novel candidate collapse to</w:t>
+        <w:t xml:space="preserve"> km/s and is structurally dissimilar from all 65 980 training molecules (nearest-neighbour Tanimoto 0.27). Three strong energetics-domain baselines fail the novel-and-on-target test on the same compute: SMILES-LSTM memorises 18.3% of outputs; SELFIES-GA sees its best novel candidate collapse to</w:t>
       </w:r>
       <w:r>
         <w:t xml:space="preserve"> </w:t>
@@ -33604,7 +33637,7 @@
         <w:t xml:space="preserve"> </w:t>
       </w:r>
       <w:r>
-        <w:t xml:space="preserve">from a chemotype family disjoint from the L1 isoxazole class, flagging E1 as a chemically distinct candidate whose calibrated D is an upper bound pending thermal stability confirmation and a 1,2,3,5-oxatriazole-class DFT anchor (§6). Two leads from two distinct scaffold families on a single sampling run argues against the reading that L1's productive-quadrant placement is a sampling artefact.</w:t>
+        <w:t xml:space="preserve">from a chemotype family disjoint from the L1 isoxazole class, flagging E1 as a chemically distinct candidate whose calibrated D is an upper bound pending thermal stability confirmation and a 1,2,3,5-oxatriazole-class DFT anchor (§6). L1 and E1 are two leads from two distinct scaffold families produced on a single sampling run, so the productive-quadrant coverage spans multiple chemotypes.</w:t>
       </w:r>
     </w:p>
     <w:p>

</xml_diff>

<commit_message>
Rebuild long_paper docx pair (E1 reframe sync)
Co-Authored-By: Claude Opus 4.8 <noreply@anthropic.com>
</commit_message>
<xml_diff>
--- a/paper/long_paper.docx
+++ b/paper/long_paper.docx
@@ -249,7 +249,7 @@
         </m:r>
       </m:oMath>
       <w:r>
-        <w:t xml:space="preserve"> km/s and is structurally dissimilar from all 65 980 training molecules (nearest-neighbour Tanimoto 0.27). A second-family lead, E1 (4-nitro-1,2,3,5-oxatriazole), exceeds L1 on calibrated detonation velocity (</w:t>
+        <w:t xml:space="preserve"> km/s and is structurally dissimilar from all 65 980 training molecules (nearest-neighbour Tanimoto 0.27). The unguided sampler also independently recovered E1 (4-nitro-1,2,3,5-oxatriazole), a known oxatriazole (PubChem CID 57438703) that exceeds L1 on calibrated detonation velocity (</w:t>
       </w:r>
       <m:oMath>
         <m:sSub>
@@ -632,7 +632,7 @@
         </m:r>
       </m:oMath>
       <w:r>
-        <w:t xml:space="preserve"> km/s that was not DFT-audited. A second lead, E1 (4-nitro-1,2,3,5-oxatriazole), reaches</w:t>
+        <w:t xml:space="preserve"> km/s that was not DFT-audited. Separately, the unguided sampler independently recovered E1 (4-nitro-1,2,3,5-oxatriazole), a known oxatriazole (PubChem CID 57438703) rather than a novel structure, reaching</w:t>
       </w:r>
       <w:r>
         <w:t xml:space="preserve"> </w:t>
@@ -1203,7 +1203,7 @@
         </m:r>
       </m:oMath>
       <w:r>
-        <w:t xml:space="preserve"> km/s (see §5.3 for K-J relative-ranking basis). E1 (1,2,3,5-oxatriazole family,</w:t>
+        <w:t xml:space="preserve"> km/s (see §5.3 for K-J relative-ranking basis). E1 (a known 1,2,3,5-oxatriazole, PubChem CID 57438703;</w:t>
       </w:r>
       <w:r>
         <w:t xml:space="preserve"> </w:t>
@@ -1236,7 +1236,7 @@
         </m:r>
       </m:oMath>
       <w:r>
-        <w:t xml:space="preserve"> km/s) is a further lead from a chemically distinct family, pending addition of an oxatriazole-class DFT anchor (§6); the extension set spans eight Bemis–Murcko scaffolds across seven chemotype families.</w:t>
+        <w:t xml:space="preserve"> km/s) is a structure the sampler independently recovered from a chemically distinct family, pending addition of an oxatriazole-class DFT anchor (§6); the extension set spans eight Bemis–Murcko scaffolds across seven chemotype families, of which E1, E6, and E9 are known compounds.</w:t>
       </w:r>
     </w:p>
     <w:p>
@@ -20257,7 +20257,7 @@
         <w:t xml:space="preserve"> </w:t>
       </w:r>
       <w:r>
-        <w:t xml:space="preserve">(Table 4); of the three that do (dinitramide, 1,2-dinitrohydrazine, N,N′-dinitrocarbodiimide), one is an exact match, and all three are established high-density CHNO motifs the model recovers.</w:t>
+        <w:t xml:space="preserve">(Table 4); of the three that do (dinitramide, 1,2-dinitrohydrazine, N,N′-dinitrocarbodiimide), one is an exact match, and all three are established high-density CHNO motifs the model recovers. Novelty here is assessed against PubChem and the labelled master; a full CAS Registry (SciFinder) check is recommended before a formal novelty claim, and the structurally simplest leads (L5, L19) warrant a targeted patent search.</w:t>
       </w:r>
       <w:r>
         <w:t xml:space="preserve"> </w:t>
@@ -27253,13 +27253,29 @@
           <w:b/>
           <w:bCs/>
         </w:rPr>
-        <w:t xml:space="preserve">E1 oxatriazole (second-family candidate).</w:t>
-      </w:r>
-      <w:r>
-        <w:t xml:space="preserve"> </w:t>
-      </w:r>
-      <w:r>
-        <w:t xml:space="preserve">Under the same 6-anchor calibration applied to L1, E1 (4-nitro-1,2,3,5-oxatriazole) reaches</w:t>
+        <w:t xml:space="preserve">E1 oxatriazole: independent recovery of a known structure.</w:t>
+      </w:r>
+      <w:r>
+        <w:t xml:space="preserve"> </w:t>
+      </w:r>
+      <w:r>
+        <w:t xml:space="preserve">E1 (4-nitro-1,2,3,5-oxatriazole) is a</w:t>
+      </w:r>
+      <w:r>
+        <w:t xml:space="preserve"> </w:t>
+      </w:r>
+      <w:r>
+        <w:rPr>
+          <w:i/>
+          <w:iCs/>
+        </w:rPr>
+        <w:t xml:space="preserve">known</w:t>
+      </w:r>
+      <w:r>
+        <w:t xml:space="preserve"> </w:t>
+      </w:r>
+      <w:r>
+        <w:t xml:space="preserve">compound (PubChem CID 57438703), not a novel structure; the unguided sampler surfaced it independently, an external check that DGLD reaches genuine energetic chemotypes. Under the same 6-anchor calibration applied to L1, E1 reaches</w:t>
       </w:r>
       <w:r>
         <w:t xml:space="preserve"> </w:t>
@@ -27585,7 +27601,7 @@
         <w:t xml:space="preserve"> </w:t>
       </w:r>
       <w:r>
-        <w:t xml:space="preserve">(9.22 km/s) is upper-bound only because its OB = +28.9 % exceeds the +25 % K-J reliability limit (Appendix D.13). The L-set sits at the upper edge of a credible distribution; L1 and E1 are the two top-ranked leads, from chemically distinct families.</w:t>
+        <w:t xml:space="preserve">(9.22 km/s) is upper-bound only because its OB = +28.9 % exceeds the +25 % K-J reliability limit (Appendix D.13). The L-set sits at the upper edge of a credible distribution; L1 is the top-ranked novel lead, and the sampler's independent recovery of the known oxatriazole E1 shows its reach spans chemically distinct families.</w:t>
       </w:r>
     </w:p>
     <w:bookmarkEnd w:id="117"/>
@@ -33308,7 +33324,7 @@
         <w:widowControl w:val="1"/>
       </w:pPr>
       <w:r>
-        <w:t xml:space="preserve">A second lead, E1 (4-nitro-1,2,3,5-oxatriazole), reaches</w:t>
+        <w:t xml:space="preserve">The unguided sampler independently recovered E1 (4-nitro-1,2,3,5-oxatriazole), a known oxatriazole (PubChem CID 57438703), reaching</w:t>
       </w:r>
       <w:r>
         <w:t xml:space="preserve"> </w:t>
@@ -33386,7 +33402,7 @@
         <w:t xml:space="preserve"> </w:t>
       </w:r>
       <w:r>
-        <w:t xml:space="preserve">from a chemotype family disjoint from the L1 isoxazole class, flagging E1 as a chemically distinct candidate whose calibrated D is an upper bound pending thermal stability confirmation and a 1,2,3,5-oxatriazole-class DFT anchor (§6). L1 and E1 are two leads from two distinct scaffold families produced on a single sampling run, so the productive-quadrant coverage spans multiple chemotypes.</w:t>
+        <w:t xml:space="preserve">from a chemotype family disjoint from the L1 isoxazole class, its recovery validates the sampler's scaffold reach rather than adding a novel lead, and its calibrated D is an upper bound pending thermal stability confirmation and a 1,2,3,5-oxatriazole-class DFT anchor (§6). L1 and E1 are two leads from two distinct scaffold families produced on a single sampling run, so the productive-quadrant coverage spans multiple chemotypes.</w:t>
       </w:r>
     </w:p>
     <w:p>

</xml_diff>

<commit_message>
Fix lead-cards figure to calibrated values + 3 SI cross-refs
#1 Figure (lead-cards grid): the plot read the summary JSON's kj_dft_cal/rho_cal,
which use a superseded calibration (L1 showed rho=2.53, D=9.52). Overrode with the
paper's Table 2 6-anchor-calibrated values (L1 now rho_cal=2.09, D_cal=8.25, matching
the caption and Table 2 for all 11 leads). Removed the baked-in 'Figure 19.' prefix
(the HTML caption numbers it Figure 3 in the Molecules layout). Regenerated + copied.

#2 SI Appendix B.1 cross-references corrected: self-distillation three-round schedule
-> Section 4.11 (was 4.14); per-head availability mask -> 4.10 (was 4.8); round-0
viability-label construction -> 4.9 (was 4.8). Fixed at source (§4.11->§4.8,
§4.5->§4.7, §4.5->§4.6) so the build remaps them correctly; the correct denoiser
§4.5 reference was left untouched.

Rebuilt molecules + long_paper HTML/docx.

Co-Authored-By: Claude Opus 4.8 <noreply@anthropic.com>
</commit_message>
<xml_diff>
--- a/paper/long_paper.docx
+++ b/paper/long_paper.docx
@@ -20289,7 +20289,7 @@
         <w:t xml:space="preserve"> </w:t>
       </w:r>
       <w:r>
-        <w:t xml:space="preserve">distant from the augmented corpus than from the labelled master alone, despite the augmented corpus being &gt;10× larger. The strengthened SMARTS catalog (N-nitroimines and open-chain polyazene/azo-nitro motifs) retains 77/100 of the merged top-100; the rank-1 trinitro-isoxazole survives (per-class breakdown in Appendix D.7). Applied to the DFT-audited set, this strengthened gate flags one N-nitroimine (oxime-nitrate-imidazoline) that the production gate had admitted as a lead; we reclassify it as reference R2 (Table C.1c) and exclude it, leaving 11 chem-pass leads (10 unique).</w:t>
+        <w:t xml:space="preserve">distant from the augmented corpus than from the labelled master alone, despite the augmented corpus being &gt;10× larger. The strengthened SMARTS catalog (N-nitroimines and open-chain polyazene/azo-nitro motifs) retains 77/100 of the merged top-100; the rank-1 trinitro-isoxazole survives (per-class breakdown in Appendix D.7). Applied to the DFT-audited set, this strengthened gate flags one N-nitroimine (oxime-nitrate-imidazoline) that the production SMARTS gate passes; it is tabulated as reference R2 (Table C.1c), not a chem-pass lead, so the confirmed set is 11 leads (10 unique).</w:t>
       </w:r>
     </w:p>
     <w:p>
@@ -27467,7 +27467,7 @@
         </m:r>
       </m:oMath>
       <w:r>
-        <w:t xml:space="preserve"> km/s is an extrapolation: it either places a second HMX-class lead from a chemotype family disjoint from L1's, or is an upper bound pending an oxatriazole-anchor recompute (a thermochemical-equilibrium CJ on calibrated inputs and an oxatriazole-class anchor extension are scoped as future work in §6).</w:t>
+        <w:t xml:space="preserve"> km/s is an extrapolation: read as a lower-confidence corroborating datapoint, it marks a second HMX-class-range performance point from a chemotype family disjoint from L1's (for a known structure, an external-validation signal rather than a new lead), or is an upper bound pending an oxatriazole-anchor recompute (a thermochemical-equilibrium CJ on calibrated inputs and an oxatriazole-class anchor extension are scoped as future work in §6).</w:t>
       </w:r>
     </w:p>
     <w:p>
@@ -33402,7 +33402,7 @@
         <w:t xml:space="preserve"> </w:t>
       </w:r>
       <w:r>
-        <w:t xml:space="preserve">from a chemotype family disjoint from the L1 isoxazole class, its recovery validates the sampler's scaffold reach rather than adding a novel lead, and its calibrated D is an upper bound pending thermal stability confirmation and a 1,2,3,5-oxatriazole-class DFT anchor (§6). L1 and E1 are two leads from two distinct scaffold families produced on a single sampling run, so the productive-quadrant coverage spans multiple chemotypes.</w:t>
+        <w:t xml:space="preserve">from a chemotype family disjoint from the L1 isoxazole class, its recovery validates the sampler's scaffold reach rather than adding a novel lead, and its calibrated D is an upper bound pending thermal stability confirmation and a 1,2,3,5-oxatriazole-class DFT anchor (§6). L1 is a novel productive-quadrant lead, and the same sampling run independently recovered the known oxatriazole E1 from a distinct scaffold family, external evidence that DGLD's scaffold reach spans multiple chemotypes.</w:t>
       </w:r>
     </w:p>
     <w:p>

</xml_diff>

<commit_message>
Tidy low-severity nits: E-set known-note, trim E1 dup, define HOF, soften 'headline'
- Table 6 (E-set DFT) caption now marks E1/E6/E9 as known compounds (recovered, not
  novel), co-located with E1's bolded values (claims F3).
- Contribution-5 bullet: trimmed the E1 CID+D=9.00 restatement to a pointer, since
  the intro paragraph already carries it (structure I3).
- Defined 'heat of formation (HOF)' at first use (structure I4).
- Softened 'The headline is that DGLD generates a chemotype distribution' to
  'A scaffold-diversity audit shows...', since the E-set includes known members.

Rebuilt molecules + long_paper HTML/docx.

Co-Authored-By: Claude Opus 4.8 <noreply@anthropic.com>
</commit_message>
<xml_diff>
--- a/paper/long_paper.docx
+++ b/paper/long_paper.docx
@@ -348,7 +348,7 @@
         <w:widowControl w:val="1"/>
       </w:pPr>
       <w:r>
-        <w:t xml:space="preserve">Energetic-materials performance gains translate directly into reduced propellant mass, smaller warheads, and more efficient civilian gas-generators, yet the canonical anchors of the field (HMX and CL-20) were developed decades ago and few new HMX-class compounds have been disclosed in the decades since. The space of synthesisable CHNO small molecules with the right balance of crystal density, oxygen balance (OB), heat of formation, and detonation kinetics is vast, but traditional discovery explores it slowly. Computational methods offer acceleration, yet each existing family has a fundamental limitation: empirical formulas (Kamlet–Jacobs</w:t>
+        <w:t xml:space="preserve">Energetic-materials performance gains translate directly into reduced propellant mass, smaller warheads, and more efficient civilian gas-generators, yet the canonical anchors of the field (HMX and CL-20) were developed decades ago and few new HMX-class compounds have been disclosed in the decades since. The space of synthesisable CHNO small molecules with the right balance of crystal density, oxygen balance (OB), heat of formation (HOF), and detonation kinetics is vast, but traditional discovery explores it slowly. Computational methods offer acceleration, yet each existing family has a fundamental limitation: empirical formulas (Kamlet–Jacobs</w:t>
       </w:r>
       <w:r>
         <w:t xml:space="preserve"> </w:t>
@@ -1203,40 +1203,7 @@
         </m:r>
       </m:oMath>
       <w:r>
-        <w:t xml:space="preserve"> km/s (see §5.3 for K-J relative-ranking basis). E1 (a known 1,2,3,5-oxatriazole, PubChem CID 57438703;</w:t>
-      </w:r>
-      <w:r>
-        <w:t xml:space="preserve"> </w:t>
-      </w:r>
-      <m:oMath>
-        <m:sSub>
-          <m:e>
-            <m:r>
-              <m:t>D</m:t>
-            </m:r>
-          </m:e>
-          <m:sub>
-            <m:r>
-              <m:rPr>
-                <m:nor/>
-                <m:sty m:val="p"/>
-              </m:rPr>
-              <m:t>K-J,cal</m:t>
-            </m:r>
-          </m:sub>
-        </m:sSub>
-        <m:r>
-          <m:rPr>
-            <m:sty m:val="p"/>
-          </m:rPr>
-          <m:t>=</m:t>
-        </m:r>
-        <m:r>
-          <m:t>9.00</m:t>
-        </m:r>
-      </m:oMath>
-      <w:r>
-        <w:t xml:space="preserve"> km/s) is a structure the sampler independently recovered from a chemically distinct family, pending addition of an oxatriazole-class DFT anchor (§6); the extension set spans eight Bemis–Murcko scaffolds across seven chemotype families, of which E1, E6, and E9 are known compounds.</w:t>
+        <w:t xml:space="preserve"> km/s (see §5.3 for K-J relative-ranking basis). The unguided sampler additionally recovered the known oxatriazole E1 (above); the extension set spans eight Bemis–Murcko scaffolds across seven chemotype families, of which E1, E6, and E9 are known compounds.</w:t>
       </w:r>
     </w:p>
     <w:p>
@@ -20190,7 +20157,7 @@
         <w:widowControl w:val="1"/>
       </w:pPr>
       <w:r>
-        <w:t xml:space="preserve">Three audits frame the merged top-100 against PubChem, public USPTO retrosynthesis templates, and a scaffold-distinct E-set extension. The headline is that DGLD generates a chemotype distribution (the scaffold-distinct E-set extension, E1–E10: 10 DFT leads / 8 Bemis–Murcko scaffolds / 7 families), not a single isoxazole hit.</w:t>
+        <w:t xml:space="preserve">Three audits frame the merged top-100 against PubChem, public USPTO retrosynthesis templates, and a scaffold-distinct E-set extension. A scaffold-diversity audit shows DGLD spans a chemotype distribution (the scaffold-distinct E-set extension, E1–E10: 10 DFT leads / 8 Bemis–Murcko scaffolds / 7 families), not a single isoxazole hit.</w:t>
       </w:r>
     </w:p>
     <w:bookmarkStart w:id="115" w:name="novelty-audit"/>
@@ -24556,7 +24523,7 @@
           <w:b w:val="0"/>
           <w:i/>
         </w:rPr>
-        <w:t>Extension-set leads: DFT, 6-anchor calibration, Kamlet–Jacobs, and h50. Columns: lead ID, raw DFT density ρDFT (g/cm3), 6-anchor-calibrated density ρcal (g/cm3), raw DFT heat of formation HOFDFT (kJ/mol), calibrated HOFcal (kJ/mol), Kamlet–Jacobs detonation velocity on calibrated inputs DK-J,cal (km/s), Kamlet–Jacobs detonation pressure PK-J,cal (GPa), and Politzer–Murray BDE-correlated drop-weight impact sensitivity h50,BDE (cm). †E2 D and P are flagged: OB = +28.9 % exceeds the +25 % K-J reliability limit; these values are upper-bound estimates only (see §5.4 E2 audit). E9 K-J is undefined (OB &lt; −200 %).</w:t>
+        <w:t>Extension-set leads: DFT, 6-anchor calibration, Kamlet–Jacobs, and h50. Columns: lead ID, raw DFT density ρDFT (g/cm3), 6-anchor-calibrated density ρcal (g/cm3), raw DFT heat of formation HOFDFT (kJ/mol), calibrated HOFcal (kJ/mol), Kamlet–Jacobs detonation velocity on calibrated inputs DK-J,cal (km/s), Kamlet–Jacobs detonation pressure PK-J,cal (GPa), and Politzer–Murray BDE-correlated drop-weight impact sensitivity h50,BDE (cm). †E2 D and P are flagged: OB = +28.9 % exceeds the +25 % K-J reliability limit; these values are upper-bound estimates only (see §5.4 E2 audit). E9 K-J is undefined (OB &lt; −200 %). E1, E6, and E9 are known compounds (recovered, not novel; E1 PubChem CID 57438703, E6 CID 201040, E9 1H-tetrazole).</w:t>
       </w:r>
     </w:p>
     <w:tbl>
@@ -24565,7 +24532,7 @@
         <w:tblW w:type="pct" w:w="5000"/>
         <w:jc w:val="center"/>
         <w:tblLook w:firstRow="1" w:lastRow="0" w:firstColumn="0" w:lastColumn="0" w:noHBand="0" w:noVBand="0" w:val="0020"/>
-        <w:tblCaption w:val="Table 7. Extension-set leads: DFT, 6-anchor calibration, Kamlet–Jacobs, and h50. Columns: lead ID, raw DFT density ρDFT (g/cm3), 6-anchor-calibrated density ρcal (g/cm3), raw DFT heat of formation HOFDFT (kJ/mol), calibrated HOFcal (kJ/mol), Kamlet–Jacobs detonation velocity on calibrated inputs DK-J,cal (km/s), Kamlet–Jacobs detonation pressure PK-J,cal (GPa), and Politzer–Murray BDE-correlated drop-weight impact sensitivity h50,BDE (cm). †E2 D and P are flagged: OB = +28.9 % exceeds the +25 % K-J reliability limit; these values are upper-bound estimates only (see §5.4 E2 audit). E9 K-J is undefined (OB &lt; −200 %)."/>
+        <w:tblCaption w:val="Table 7. Extension-set leads: DFT, 6-anchor calibration, Kamlet–Jacobs, and h50. Columns: lead ID, raw DFT density ρDFT (g/cm3), 6-anchor-calibrated density ρcal (g/cm3), raw DFT heat of formation HOFDFT (kJ/mol), calibrated HOFcal (kJ/mol), Kamlet–Jacobs detonation velocity on calibrated inputs DK-J,cal (km/s), Kamlet–Jacobs detonation pressure PK-J,cal (GPa), and Politzer–Murray BDE-correlated drop-weight impact sensitivity h50,BDE (cm). †E2 D and P are flagged: OB = +28.9 % exceeds the +25 % K-J reliability limit; these values are upper-bound estimates only (see §5.4 E2 audit). E9 K-J is undefined (OB &lt; −200 %). E1, E6, and E9 are known compounds (recovered, not novel; E1 PubChem CID 57438703, E6 CID 201040, E9 1H-tetrazole)."/>
         <w:tblLayout w:type="autofit"/>
         <w:tblBorders>
           <w:top w:val="single" w:sz="10" w:color="4F6272"/>

</xml_diff>

<commit_message>
Handle flagged items: rename 'model-cheat'->'gaming molecule', References last, fix sabatini id
- Renamed the defined term 'model-cheat'/'cheat' -> 'gaming molecule' (introduced as
  'surrogate-gaming false positives' at first use) throughout - 20 occurrences - for a
  more formal register in Molecules.
- Moved the References section after the back-matter statements (MDPI template:
  ...Conflicts of Interest -> References). Citation integrity preserved (71/71 sequential).
- Renamed reference id ref-sabatini2018 -> ref-sabatini2016 to match the paper year
  (Sabatini & Oyler 2016); updated all 3 references to it.

Rebuilt molecules + long_paper HTML/docx.

Co-Authored-By: Claude Opus 4.8 <noreply@anthropic.com>
</commit_message>
<xml_diff>
--- a/paper/long_paper.docx
+++ b/paper/long_paper.docx
@@ -9571,7 +9571,7 @@
         <w:widowControl w:val="1"/>
       </w:pPr>
       <w:r>
-        <w:t xml:space="preserve">Round-0 viability labels combine SMARTS pass/fail with a Random Forest classifier trained on (energetic corpus, ZINC drug-like), a coarse two-class boundary. Self-distillation closes the gap between that boundary and the latent regions the diffusion sampler actually inhabits, by mining the model's own false-positive cheats and re-feeding them as labelled hard negatives.</w:t>
+        <w:t xml:space="preserve">Round-0 viability labels combine SMARTS pass/fail with a Random Forest classifier trained on (energetic corpus, ZINC drug-like), a coarse two-class boundary. Self-distillation closes the gap between that boundary and the latent regions the diffusion sampler actually inhabits, by mining the model's own surrogate-gaming false positives and re-feeding them as labelled hard negatives.</w:t>
       </w:r>
     </w:p>
     <w:p>
@@ -9797,7 +9797,7 @@
         <w:widowControl w:val="1"/>
       </w:pPr>
       <w:r>
-        <w:t xml:space="preserve">The stopping criterion is shown in the right-margin box of Figure 12: a held-out probe (7 anchors {RDX, HMX, TNT, FOX-7, PETN, TATB, NTO} and 5 cheats) must show every anchor at</w:t>
+        <w:t xml:space="preserve">The stopping criterion is shown in the right-margin box of Figure 12: a held-out probe (7 anchors {RDX, HMX, TNT, FOX-7, PETN, TATB, NTO} and 5 gaming molecules) must show every anchor at</w:t>
       </w:r>
       <w:r>
         <w:t xml:space="preserve"> </w:t>
@@ -9811,7 +9811,7 @@
         </m:r>
       </m:oMath>
       <w:r>
-        <w:t xml:space="preserve"> 0.86 AND every cheat at</w:t>
+        <w:t xml:space="preserve"> 0.86 AND every gaming molecule at</w:t>
       </w:r>
       <w:r>
         <w:t xml:space="preserve"> </w:t>
@@ -13191,7 +13191,7 @@
         </m:r>
       </m:oMath>
       <w:r>
-        <w:t xml:space="preserve"> 0.86 and every cheat at</w:t>
+        <w:t xml:space="preserve"> 0.86 and every gaming molecule at</w:t>
       </w:r>
       <w:r>
         <w:t xml:space="preserve"> </w:t>
@@ -13205,7 +13205,7 @@
         </m:r>
       </m:oMath>
       <w:r>
-        <w:t xml:space="preserve"> 0.84; the production budget-918 checkpoint is round 2 of self-distillation (round 0 = score-model trained on corpus only with Random-Forest-derived viability labels and 0 hard negatives, round 1 = corpus + 137 mined hard negatives, round 2 = corpus + 918 cumulative hard negatives + aromatic-heterocycle boost), the configuration that demotes the worst model-cheat (gem-tetranitro) furthest, to viability 0.74. The hard-negative count (918) is the cumulative round-2 mining yield, not a tuned target.</w:t>
+        <w:t xml:space="preserve"> 0.84; the production budget-918 checkpoint is round 2 of self-distillation (round 0 = score-model trained on corpus only with Random-Forest-derived viability labels and 0 hard negatives, round 1 = corpus + 137 mined hard negatives, round 2 = corpus + 918 cumulative hard negatives + aromatic-heterocycle boost), the configuration that demotes the worst gaming molecule (gem-tetranitro) furthest, to viability 0.74. The hard-negative count (918) is the cumulative round-2 mining yield, not a tuned target.</w:t>
       </w:r>
     </w:p>
     <w:p>
@@ -14334,7 +14334,7 @@
         <w:t xml:space="preserve"> </w:t>
       </w:r>
       <w:r>
-        <w:t xml:space="preserve">plane (Figure 2). Unguided single-objective ranking (without the gating layer) puts a polynitro-on-C2 model-cheat at the top; the gates correctly reject it (full SMARTS-trace and rejected-candidate property tabulation in Appendix D.7).</w:t>
+        <w:t xml:space="preserve">plane (Figure 2). Unguided single-objective ranking (without the gating layer) puts a polynitro-on-C2 gaming molecule at the top; the gates correctly reject it (full SMARTS-trace and rejected-candidate property tabulation in Appendix D.7).</w:t>
       </w:r>
     </w:p>
     <w:p>
@@ -20106,7 +20106,7 @@
       <w:r>
         <w:t xml:space="preserve">The polynitroisoxazole family is established in the energetic-materials literature (</w:t>
       </w:r>
-      <w:hyperlink w:anchor="ref-sabatini2018">
+      <w:hyperlink w:anchor="ref-sabatini2016">
         <w:r>
           <w:rPr>
             <w:rStyle w:val="Hyperlink"/>
@@ -31613,7 +31613,7 @@
                 <w:rFonts w:ascii="Times New Roman" w:hAnsi="Times New Roman"/>
                 <w:sz w:val="19"/>
               </w:rPr>
-              <w:t xml:space="preserve">Worst-offender model-cheat (gem-tetranitro) demoted by −0.10 absolute at 918; required for steer-off.</w:t>
+              <w:t xml:space="preserve">Worst-offender gaming molecule (gem-tetranitro) demoted by −0.10 absolute at 918; required for steer-off.</w:t>
             </w:r>
           </w:p>
         </w:tc>
@@ -35691,7 +35691,7 @@
         </w:rPr>
         <w:t xml:space="preserve">62. </w:t>
       </w:r>
-      <w:bookmarkStart w:id="204" w:name="ref-sabatini2018"/>
+      <w:bookmarkStart w:id="204" w:name="ref-sabatini2016"/>
       <w:r>
         <w:t xml:space="preserve">Sabatini, J. J., &amp; Oyler, K. D. (2016). Recent Advances in the Synthesis of High Explosive Materials.</w:t>
       </w:r>

</xml_diff>